<commit_message>
chore: nachgereichte Session-9-Abschluss-Dateien (Doku/Handbuch/test:all)
Diese Änderungen trug Commit a000afa laut Botschaft bereits, landeten aber nie
im Baum — jetzt tatsächlich committet:
- package.json: npm run test:all (Core + Modul 1–6 + Storage-Smoke)
- build-handbuch.mjs + SEMBLA_Handbuch.docx: voll auf MVP (Module 0–6, Nicht-MVP-
  Kapitel raus, IFC in Modul 6, Dämmung raus, Pfade auf docs/shared bzw. tests/);
  keine neuen vertraulichen Inhalte (Schermer-Kapitel lagen schon öffentlich vor)
- tests/core/README*.md: auf einen Betriebskern + Python-Orakel umgeschrieben
- tests/interop/webifc_prototype.mjs: Pfad-/API-Fix auf shared/sembla-ifc.js

Co-Authored-By: Claude Opus 4.8 (1M context) <noreply@anthropic.com>
</commit_message>
<xml_diff>
--- a/doku/SEMBLA_Handbuch.docx
+++ b/doku/SEMBLA_Handbuch.docx
@@ -113,7 +113,7 @@
           <w:sz w:val="24"/>
           <w:szCs w:val="24"/>
         </w:rPr>
-        <w:t xml:space="preserve">Die SEMBLA Planungs-Suite plant vorgespannte Trockenmauerwerks-Wände aus den Systemsteinen i2 und i3 – vom ersten Entwurf bis zu Fertigung, Montage und BIM.</w:t>
+        <w:t xml:space="preserve">Die SEMBLA Planungs-Suite plant vorgespannte Trockenmauerwerks-Wände aus den Systemsteinen i2 und i3 – vom ersten Entwurf über Statik, Wandaufbau und Stückliste bis zu Montage, 3D und BIM.</w:t>
       </w:r>
     </w:p>
     <w:p>
@@ -121,7 +121,7 @@
         <w:spacing w:after="120"/>
       </w:pPr>
       <w:r>
-        <w:t xml:space="preserve">Neun Werkzeuge (Module 1–9) greifen auf ein gemeinsames Datenmodell zu (das „Wandelement”). Modul 1 erzeugt es; alle weiteren Module lesen es. So bleibt die Planung über alle Gewerke konsistent.</w:t>
+        <w:t xml:space="preserve">Sieben Module (0–6) greifen auf ein gemeinsames Datenmodell zu (das „Wandelement”). Modul 1 erzeugt es; alle weiteren Module lesen es. So bleibt die Planung über alle Gewerke konsistent.</w:t>
       </w:r>
     </w:p>
     <w:p>
@@ -129,7 +129,7 @@
         <w:spacing w:after="120"/>
       </w:pPr>
       <w:r>
-        <w:t xml:space="preserve">Einstieg: 00_Übersicht.html im selben Ordner öffnen. Jedes Tool ist eine eigenständige HTML-Datei und läuft ohne Installation im Browser.</w:t>
+        <w:t xml:space="preserve">Die Suite ist eine gehostete Web-App (GitHub Pages): live unter p0lycare.github.io/SEMBLA-planning-suite. Einstieg ist Modul 0 (index.html). Jedes Modul ist eine eigenständige HTML-Seite und läuft ohne Installation im Browser; das aktive Wandelement liegt im localStorage und ist für alle Module sichtbar.</w:t>
       </w:r>
     </w:p>
     <w:p>
@@ -137,7 +137,7 @@
         <w:spacing w:after="120"/>
       </w:pPr>
       <w:r>
-        <w:t xml:space="preserve">Dieses Handbuch richtet sich an (a) Statiker, die die Berechnungsansätze prüfen wollen (Kap. 5 + 11), und (b) das interne Entwicklungsteam, das die Suite ohne Programmier-Hintergrund weiterentwickelt (Kap. 4 + 15).</w:t>
+        <w:t xml:space="preserve">Dieses Handbuch richtet sich an (a) Statiker, die die Berechnungsansätze prüfen wollen (Kap. 5 + 9), und (b) das interne Entwicklungsteam, das die Suite ohne Programmier-Hintergrund weiterentwickelt (Kap. 4 + 13).</w:t>
       </w:r>
     </w:p>
     <w:p>
@@ -2727,7 +2727,7 @@
         <w:pStyle w:val="Heading2"/>
       </w:pPr>
       <w:r>
-        <w:t xml:space="preserve">3.1 Projekt-Bundle</w:t>
+        <w:t xml:space="preserve">3.1 Zustand (localStorage) &amp; Projekt-Bundle</w:t>
       </w:r>
     </w:p>
     <w:p>
@@ -2735,7 +2735,7 @@
         <w:spacing w:after="120"/>
       </w:pPr>
       <w:r>
-        <w:t xml:space="preserve">Damit zwischen den Modulen keine Einzeldateien jongliert werden, gibt es ein mitwachsendes Bundle:</w:t>
+        <w:t xml:space="preserve">Im laufenden Betrieb wird nichts hin- und hergeschoben: Das aktive Wandelement liegt im localStorage des Browsers, und alle Module lesen genau dieses eine Element (Modul 0 verwaltet die Liste). Für bewusstes Sichern/Weitergeben gibt es zusätzlich den Datei-Export – als reines Wandelement-JSON oder als mitwachsendes Bundle:</w:t>
       </w:r>
     </w:p>
     <w:p>
@@ -2761,7 +2761,15 @@
         <w:spacing w:after="120"/>
       </w:pPr>
       <w:r>
-        <w:t xml:space="preserve">Das Bundle ist das einzige Austauschformat der Suite. Modul 1 exportiert das Bundle, Modul 2 (Horizontaler Wandaufbau) reichert es um verbinder_layout (inkl. Beplankungsfeld) an, die Stückliste liest beides aus einer Datei. Alle Module und der Revit-Import (pyRevit) akzeptieren wahlweise ein Bundle oder ein blankes Wandelement und entpacken es selbst – daher nur je ein Export-Button (Projekt-Bundle) und einheitliche Lade-Buttons „… / Bundle laden”.</w:t>
+        <w:t xml:space="preserve">Das Bundle ist das Austausch-Dateiformat der Suite. Modul 1 exportiert es, Modul 2 (Horizontaler Wandaufbau) reichert es um verbinder_layout (inkl. Beplankungsfeld) an, die Stückliste (Modul 4) liest beides aus einer Datei. Alle Module akzeptieren beim Datei-Import wahlweise ein Bundle oder ein blankes Wandelement und entpacken es selbst – daher je ein Export-Button (Projekt-Bundle) und einheitliche Lade-Buttons „… / Bundle laden”. Der Datei-Import lädt nur in die Ansicht bzw. legt (in Modul 0) ein neues Element an; er verändert kein fremdes Element.</w:t>
+      </w:r>
+    </w:p>
+    <w:p>
+      <w:pPr>
+        <w:pStyle w:val="Heading1"/>
+      </w:pPr>
+      <w:r>
+        <w:t xml:space="preserve">4 · Architektur, Kerne &amp; Workflow</w:t>
       </w:r>
     </w:p>
     <w:p>
@@ -2769,23 +2777,7 @@
         <w:spacing w:after="120"/>
       </w:pPr>
       <w:r>
-        <w:t xml:space="preserve">Prozess kompakt: Modul 1 → Bundle → Modul 2 (Horizontaler Wandaufbau, reichert an) → Bundle → alle übrigen Module &amp; Revit.</w:t>
-      </w:r>
-    </w:p>
-    <w:p>
-      <w:pPr>
-        <w:pStyle w:val="Heading1"/>
-      </w:pPr>
-      <w:r>
-        <w:t xml:space="preserve">4 · Architektur, Kerne &amp; Workflow</w:t>
-      </w:r>
-    </w:p>
-    <w:p>
-      <w:pPr>
-        <w:spacing w:after="120"/>
-      </w:pPr>
-      <w:r>
-        <w:t xml:space="preserve">Die fachliche Logik liegt in getesteten Kernen (reine Bibliotheken). Die Werkzeuge sind eigenständige HTML-Dateien, per Build-Schritt aus Kern + Vorlage zusammengesetzt – keine Code-Duplizierung.</w:t>
+        <w:t xml:space="preserve">Die fachliche Logik liegt in getesteten Kernen (reine Bibliotheken) in docs/shared/. Die Module sind handgepflegte HTML-Einzeldateien in docs/, die den gemeinsamen Code per &lt;script type="module"&gt; laden – kein Build-Schritt, kein Kopieren, keine Duplizierung.</w:t>
       </w:r>
     </w:p>
     <w:tbl>
@@ -2865,7 +2857,7 @@
                 <w:sz w:val="18"/>
                 <w:szCs w:val="18"/>
               </w:rPr>
-              <w:t xml:space="preserve">Datei(en)</w:t>
+              <w:t xml:space="preserve">Datei</w:t>
             </w:r>
           </w:p>
         </w:tc>
@@ -2955,7 +2947,7 @@
                 <w:sz w:val="20"/>
                 <w:szCs w:val="20"/>
               </w:rPr>
-              <w:t xml:space="preserve">Phase-1/sembla_core.py (Referenz) · Phase-2/sembla-core.mjs</w:t>
+              <w:t xml:space="preserve">docs/shared/sembla-core.js</w:t>
             </w:r>
           </w:p>
         </w:tc>
@@ -2984,7 +2976,7 @@
                 <w:sz w:val="20"/>
                 <w:szCs w:val="20"/>
               </w:rPr>
-              <w:t xml:space="preserve">Verband, Stränge, BOM, Validierung. Python = Referenz, JS = bit-genaue Portierung (Parität über Fixtures).</w:t>
+              <w:t xml:space="preserve">Verband, Stränge, BOM, Validierung. Einzige Betriebskopie (ES-Modul); tests/core/sembla_core.py ist die bit-genaue Test-Referenz (Parität über Fixtures).</w:t>
             </w:r>
           </w:p>
         </w:tc>
@@ -3044,7 +3036,7 @@
                 <w:sz w:val="20"/>
                 <w:szCs w:val="20"/>
               </w:rPr>
-              <w:t xml:space="preserve">Modul-3-Statik/sembla-statik.mjs</w:t>
+              <w:t xml:space="preserve">docs/shared/sembla-statik.js</w:t>
             </w:r>
           </w:p>
         </w:tc>
@@ -3133,7 +3125,7 @@
                 <w:sz w:val="20"/>
                 <w:szCs w:val="20"/>
               </w:rPr>
-              <w:t xml:space="preserve">Auslegung-Engine/sembla-engine.mjs</w:t>
+              <w:t xml:space="preserve">docs/shared/sembla-engine.js</w:t>
             </w:r>
           </w:p>
         </w:tc>
@@ -3162,7 +3154,7 @@
                 <w:sz w:val="20"/>
                 <w:szCs w:val="20"/>
               </w:rPr>
-              <w:t xml:space="preserve">Iteration: optimiert Strangabstand &amp; Vorspannkraft bis alle Nachweise erfüllt sind.</w:t>
+              <w:t xml:space="preserve">Iteration: optimiert Strangabstand &amp; Vorspannkraft bis alle Nachweise erfüllt sind (vereinfachtes Modell, getrennt von der Schermer-Statik).</w:t>
             </w:r>
           </w:p>
         </w:tc>
@@ -3193,7 +3185,7 @@
                 <w:sz w:val="20"/>
                 <w:szCs w:val="20"/>
               </w:rPr>
-              <w:t xml:space="preserve">Horizontaler Wandaufbau</w:t>
+              <w:t xml:space="preserve">Stückliste/BOM</w:t>
             </w:r>
           </w:p>
         </w:tc>
@@ -3222,7 +3214,7 @@
                 <w:sz w:val="20"/>
                 <w:szCs w:val="20"/>
               </w:rPr>
-              <w:t xml:space="preserve">Modul-Wandaufbau/…</w:t>
+              <w:t xml:space="preserve">docs/shared/sembla-bom.js</w:t>
             </w:r>
           </w:p>
         </w:tc>
@@ -3251,7 +3243,7 @@
                 <w:sz w:val="20"/>
                 <w:szCs w:val="20"/>
               </w:rPr>
-              <w:t xml:space="preserve">Verbinder (Panelfugen = Achsen) + Latten/Dämmung + Beplankungsfeld.</w:t>
+              <w:t xml:space="preserve">kanonische Mengen/Positionen aus dem Wandelement (Modul 4 + 5).</w:t>
             </w:r>
           </w:p>
         </w:tc>
@@ -3282,7 +3274,7 @@
                 <w:sz w:val="20"/>
                 <w:szCs w:val="20"/>
               </w:rPr>
-              <w:t xml:space="preserve">CAD/BIM</w:t>
+              <w:t xml:space="preserve">IFC-Export</w:t>
             </w:r>
           </w:p>
         </w:tc>
@@ -3311,7 +3303,7 @@
                 <w:sz w:val="20"/>
                 <w:szCs w:val="20"/>
               </w:rPr>
-              <w:t xml:space="preserve">Projekt-Manager/sembla-cad.mjs · obj-to-ifc.mjs</w:t>
+              <w:t xml:space="preserve">docs/shared/sembla-ifc.js</w:t>
             </w:r>
           </w:p>
         </w:tc>
@@ -3340,7 +3332,7 @@
                 <w:sz w:val="20"/>
                 <w:szCs w:val="20"/>
               </w:rPr>
-              <w:t xml:space="preserve">DXF, IFC4 (inkl. echter Steingeometrie als FacetedBrep).</w:t>
+              <w:t xml:space="preserve">Wandelement → IFC4 (Wand + Öffnungen + Steine, optional echte Steingeometrie als FacetedBrep).</w:t>
             </w:r>
           </w:p>
         </w:tc>
@@ -3371,7 +3363,7 @@
                 <w:sz w:val="20"/>
                 <w:szCs w:val="20"/>
               </w:rPr>
-              <w:t xml:space="preserve">Roboter</w:t>
+              <w:t xml:space="preserve">Zustand &amp; Kopfleiste</w:t>
             </w:r>
           </w:p>
         </w:tc>
@@ -3400,7 +3392,7 @@
                 <w:sz w:val="20"/>
                 <w:szCs w:val="20"/>
               </w:rPr>
-              <w:t xml:space="preserve">Modul-Roboter/sembla-robot.mjs</w:t>
+              <w:t xml:space="preserve">docs/shared/storage.js · navbar.js</w:t>
             </w:r>
           </w:p>
         </w:tc>
@@ -3429,7 +3421,7 @@
                 <w:sz w:val="20"/>
                 <w:szCs w:val="20"/>
               </w:rPr>
-              <w:t xml:space="preserve">Montagesequenz (Pick&amp;Place + Vorspannen).</w:t>
+              <w:t xml:space="preserve">localStorage-Schicht (Elemente, aktiv-Zeiger, OBJ) + gemeinsame Navigation.</w:t>
             </w:r>
           </w:p>
         </w:tc>
@@ -3489,7 +3481,7 @@
                 <w:sz w:val="20"/>
                 <w:szCs w:val="20"/>
               </w:rPr>
-              <w:t xml:space="preserve">Bauteil-OBJ/i2_SEMBLA.obj · i3_SEMBLA.obj (+ .ifc)</w:t>
+              <w:t xml:space="preserve">Bauteil-OBJ/i2_SEMBLA.obj · i3_SEMBLA.obj (lokal, gitignored)</w:t>
             </w:r>
           </w:p>
         </w:tc>
@@ -3518,7 +3510,7 @@
                 <w:sz w:val="20"/>
                 <w:szCs w:val="20"/>
               </w:rPr>
-              <w:t xml:space="preserve">echte Steingeometrie (X=Länge, Y=Tiefe, Z=Höhe; Nullpunkt unten-vorne-links).</w:t>
+              <w:t xml:space="preserve">echte Steingeometrie (X=Länge, Y=Tiefe, Z=Höhe; Nullpunkt unten-vorne-links); zur Laufzeit per Upload.</w:t>
             </w:r>
           </w:p>
         </w:tc>
@@ -3529,7 +3521,7 @@
         <w:pStyle w:val="Heading2"/>
       </w:pPr>
       <w:r>
-        <w:t xml:space="preserve">4.1 Bauen &amp; Veröffentlichen</w:t>
+        <w:t xml:space="preserve">4.1 Betrieb &amp; Veröffentlichung</w:t>
       </w:r>
     </w:p>
     <w:p>
@@ -3537,7 +3529,7 @@
         <w:spacing w:after="120"/>
       </w:pPr>
       <w:r>
-        <w:t xml:space="preserve">Tools mit Vorlage: node build-*.mjs im jeweiligen Ordner. Danach spiegelt node publish-werkzeuge.mjs (Suite-Stammordner) alle Tools nach SEMBLA Werkzeuge/ – so laufen Entwicklungs- und Auslieferungsstand nie auseinander.</w:t>
+        <w:t xml:space="preserve">Es gibt keinen Build-/Publish-Schritt. docs/ wird direkt editiert; GitHub Pages liefert genau diesen Ordner aus (Deploy vom Branch main). Jeder Push ist sofort live – Qualitätssicherung ist Handdisziplin (Tests vor dem Push).</w:t>
       </w:r>
     </w:p>
     <w:p>
@@ -3553,7 +3545,7 @@
         <w:spacing w:after="120"/>
       </w:pPr>
       <w:r>
-        <w:t xml:space="preserve">Jeder Kern/jede Oberfläche ist durch automatisierte Tests abgesichert (test-*.mjs / smoke_*.mjs, Python: Phase-1/test_sembla_core.py). Vor jeder Übernahme sollten alle Tests grün sein.</w:t>
+        <w:t xml:space="preserve">Jeder Kern und jede Oberfläche ist durch automatisierte Tests abgesichert: Logik-Tests (tests/module/test-*.mjs), Smoke-Tests der HTML-Module unter DOM-Mock (tests/module/smoke_*.mjs), Core-Parität (tests/core/, Python + JS gegen goldene Fixtures) und BOM-Drift-Schutz (test-shared.mjs). npm run test:all fährt alles. Vor jedem Push sollten die betroffenen Tests grün sein.</w:t>
       </w:r>
     </w:p>
     <w:p>
@@ -3574,7 +3566,7 @@
           <w:sz w:val="24"/>
           <w:szCs w:val="24"/>
         </w:rPr>
-        <w:t xml:space="preserve">Dieses Kapitel legt den vollständigen Nachweis offen, damit ein Statiker ihn nachvollziehen und bestätigen kann. Grundlage ist das Gutachten Prof. Schermer (Az. 2025_7001 Rev 01 vom 18.05.2026) i. V. m. Z-3.15-2157, DIN EN 1996-1-1, DIN 4103-1 und DIN EN 1991-1-4. Der Rechenkern (Modul 6) ist 1:1 aus der geprüften Arbeitsmappe „SEMBLA_Wand_Statik_v01” portiert und gegen deren Zahlen verifiziert.</w:t>
+        <w:t xml:space="preserve">Dieses Kapitel legt den vollständigen Nachweis offen, damit ein Statiker ihn nachvollziehen und bestätigen kann. Grundlage ist das Gutachten Prof. Schermer (Az. 2025_7001 Rev 01 vom 18.05.2026) i. V. m. Z-3.15-2157, DIN EN 1996-1-1, DIN 4103-1 und DIN EN 1991-1-4. Der Rechenkern (Modul 3, docs/shared/sembla-statik.js) ist 1:1 aus der geprüften Arbeitsmappe „SEMBLA_Wand_Statik_v01” portiert und gegen deren Zahlen verifiziert.</w:t>
       </w:r>
     </w:p>
     <w:p>
@@ -4846,7 +4838,7 @@
         <w:spacing w:after="120" w:before="80"/>
       </w:pPr>
       <w:r>
-        <w:t xml:space="preserve">Die Werte stammen aus dem Gutachten bzw. der Bibliothek der Arbeitsmappe und sind projektbezogen vom Tragwerksplaner zu bestätigen. In Modul 6 sind sie editierbar.</w:t>
+        <w:t xml:space="preserve">Die Werte stammen aus dem Gutachten bzw. der Bibliothek der Arbeitsmappe und sind projektbezogen vom Tragwerksplaner zu bestätigen. In Modul 3 sind sie editierbar.</w:t>
       </w:r>
     </w:p>
     <w:tbl>
@@ -7556,7 +7548,35 @@
         <w:pStyle w:val="Heading1"/>
       </w:pPr>
       <w:r>
-        <w:t xml:space="preserve">6 · Modul 1 · Wand planen &amp; auslegen</w:t>
+        <w:t xml:space="preserve">6 · Modul 0 · Start &amp; Verwaltung</w:t>
+      </w:r>
+    </w:p>
+    <w:p>
+      <w:pPr>
+        <w:spacing w:after="120"/>
+      </w:pPr>
+      <w:r>
+        <w:t xml:space="preserve">Einstieg der Suite (index.html): kurze Modulübersicht und Verwaltung der gespeicherten Wandelemente. Ein Element neu anlegen (leer oder aus Datei), das aktive Element wählen/umbenennen, als JSON exportieren oder löschen. Das aktive Wandelement liegt im localStorage des Browsers und ist für alle Module sichtbar; die gemeinsame Kopfleiste zeigt es auf jeder Seite und erlaubt den Wechsel.</w:t>
+      </w:r>
+    </w:p>
+    <w:p>
+      <w:pPr>
+        <w:pBdr>
+          <w:left w:val="single" w:color="E0B400" w:sz="18" w:space="6"/>
+        </w:pBdr>
+        <w:shd w:fill="FFF8E6" w:val="clear"/>
+        <w:spacing w:after="120" w:before="80"/>
+      </w:pPr>
+      <w:r>
+        <w:t xml:space="preserve">localStorage ist pro Browser und Gerät und geht bei „Websitedaten löschen” verloren. Der Datei-Export (Modul 0/1) ist daher die Sicherung bzw. der Weg, ein Wandelement weiterzugeben.</w:t>
+      </w:r>
+    </w:p>
+    <w:p>
+      <w:pPr>
+        <w:pStyle w:val="Heading1"/>
+      </w:pPr>
+      <w:r>
+        <w:t xml:space="preserve">7 · Modul 1 · Wand planen &amp; auslegen</w:t>
       </w:r>
     </w:p>
     <w:p>
@@ -7657,10 +7677,10 @@
           <w:b/>
           <w:bCs/>
         </w:rPr>
-        <w:t xml:space="preserve">Export:</w:t>
-      </w:r>
-      <w:r>
-        <w:t xml:space="preserve"> ein Format – „Projekt-Bundle (JSON)”.</w:t>
+        <w:t xml:space="preserve">Speichern:</w:t>
+      </w:r>
+      <w:r>
+        <w:t xml:space="preserve"> „In aktives Wandelement speichern” (localStorage, Single Source für alle Module) und Datei-Export „Projekt-Bundle (JSON)” zum Sichern/Weitergeben.</w:t>
       </w:r>
     </w:p>
     <w:p>
@@ -7668,7 +7688,7 @@
         <w:pStyle w:val="Heading1"/>
       </w:pPr>
       <w:r>
-        <w:t xml:space="preserve">7 · Modul 2 · Horizontaler Wandaufbau</w:t>
+        <w:t xml:space="preserve">8 · Modul 2 · Horizontaler Wandaufbau</w:t>
       </w:r>
     </w:p>
     <w:p>
@@ -7676,7 +7696,19 @@
         <w:spacing w:after="120"/>
       </w:pPr>
       <w:r>
-        <w:t xml:space="preserve">Zweck: Verbinder- UND Latten-/Dämmungsplanung in einem Schritt (ersetzt die früheren Module Verbinder und Latten). Die Panelfugen bestimmen die Verbinderachsen; daraus werden Latten und Dämmpakete abgeleitet.</w:t>
+        <w:t xml:space="preserve">Zweck: Verbinder- und Lattenplanung in einem Schritt. Die Panelfugen bestimmen die Verbinderachsen; daraus werden die Latten abgeleitet.</w:t>
+      </w:r>
+    </w:p>
+    <w:p>
+      <w:pPr>
+        <w:pBdr>
+          <w:left w:val="single" w:color="E0B400" w:sz="18" w:space="6"/>
+        </w:pBdr>
+        <w:shd w:fill="FFF8E6" w:val="clear"/>
+        <w:spacing w:after="120" w:before="80"/>
+      </w:pPr>
+      <w:r>
+        <w:t xml:space="preserve">Im MVP ist die Wärmedämmung aus diesem Modul entfernt (Entscheidung Polycare). Die Latten-Logik bleibt unverändert; der Dichtstreifen aus den Stoßfugen (Schallschutz, Kap. 2.6) ist keine Wärmedämmung und bleibt erhalten.</w:t>
       </w:r>
     </w:p>
     <w:p>
@@ -7737,7 +7769,7 @@
         <w:t xml:space="preserve">Beplankungsfeld:</w:t>
       </w:r>
       <w:r>
-        <w:t xml:space="preserve"> häufig wird nur ein Teil der Wand beplankt – ein rechteckiges Feld (aufziehen, rastet aufs Panelraster) begrenzt Verbinder, Latten und Dämmung; im Layout als feld_cm exportiert. Standard = ganze Wand.</w:t>
+        <w:t xml:space="preserve"> häufig wird nur ein Teil der Wand beplankt – ein rechteckiges Feld (aufziehen, rastet aufs Panelraster) begrenzt Verbinder und Latten; im Layout als feld_cm exportiert. Standard = ganze Wand.</w:t>
       </w:r>
     </w:p>
     <w:p>
@@ -7808,7 +7840,7 @@
         <w:pStyle w:val="Heading2"/>
       </w:pPr>
       <w:r>
-        <w:t xml:space="preserve">Latten &amp; Dämmung</w:t>
+        <w:t xml:space="preserve">Latten</w:t>
       </w:r>
     </w:p>
     <w:p>
@@ -7847,7 +7879,44 @@
         <w:spacing w:after="60"/>
       </w:pPr>
       <w:r>
-        <w:t xml:space="preserve">Dämmung je Gefach (lichter Abstand zwischen Latten) × Höhe minus Öffnungen → Fläche je Paket.</w:t>
+        <w:t xml:space="preserve">Eingaben: Lattenbreite (4 cm), Stangenlänge (150 cm). Ausgaben: Projekt-Bundle (Wandelement + Verbinder-Layout), Zuschnittliste (CSV). Reiner Konsument – schreibt das Wandelement nicht zurück.</w:t>
+      </w:r>
+    </w:p>
+    <w:p>
+      <w:pPr>
+        <w:pStyle w:val="Heading1"/>
+      </w:pPr>
+      <w:r>
+        <w:t xml:space="preserve">9 · Modul 3 · Statik (Werkzeug)</w:t>
+      </w:r>
+    </w:p>
+    <w:p>
+      <w:pPr>
+        <w:spacing w:after="140"/>
+      </w:pPr>
+      <w:r>
+        <w:rPr>
+          <w:color w:val="33414F"/>
+          <w:sz w:val="24"/>
+          <w:szCs w:val="24"/>
+        </w:rPr>
+        <w:t xml:space="preserve">Die Oberfläche zum Schermer-Nachweis aus Kapitel 5. Alle Formeln und die Beispielrechnung stehen dort; dieses Kapitel beschreibt Bedienung, Ein-/Ausgaben und die Wandelement-Anbindung.</w:t>
+      </w:r>
+    </w:p>
+    <w:p>
+      <w:pPr>
+        <w:spacing w:after="120"/>
+      </w:pPr>
+      <w:r>
+        <w:t xml:space="preserve">Eingaben (editierbar wie die Bibliothek der Arbeitsmappe): Geometrie (h, l, t, Öffnungszahl), Material (f_k, γ_w, γ_M, v_Rd, μ_k, γ_M,μ), Gewindestange (Auswahl M8–M20 füllt A_s/f_yk/f_ub), Lasten (Windzone, q_p-Faktor, c_pe,10, Torsituation, γ_Q, DIN-4103-Werte), Vorspannung (Raster e, F0, ΔF, F,inf, γ_P,fav wählbar 1,0–2,0, γ_P,sup), Prüfwerte §6.2, Spannsystem-Bauteile (Steg, Kopf-/Fußplatte, k₂-Werte, Mutter, Auflagerlänge l_P), Deckenwinkel-Abstand.</w:t>
+      </w:r>
+    </w:p>
+    <w:p>
+      <w:pPr>
+        <w:spacing w:after="120"/>
+      </w:pPr>
+      <w:r>
+        <w:t xml:space="preserve">Ausgaben: **Kompaktnachweis Wand** (Biegung, Schub, Druckrand, Boden, Deckenwinkel) und **Kompaktnachweis Spannsystem** (Stange EC3 + Fließen, Spannschraube, Schraube unten Sechskant/Senk, Kopf-/Fußplatte, Steinpressung, Mutter). Jede Karte zeigt E_d, R_d, Auslastung η und Status; oben die Gesamtausnutzung η_max,gesamt = MAX(Wand, Spannsystem).</w:t>
       </w:r>
     </w:p>
     <w:p>
@@ -7860,55 +7929,14 @@
         <w:spacing w:after="60"/>
       </w:pPr>
       <w:r>
-        <w:t xml:space="preserve">Eingaben: Lattenbreite (4 cm), Stangenlänge (150 cm), Dämmdicke. Ausgaben: Projekt-Bundle (Wandelement + Verbinder-Layout), Zuschnittliste (CSV).</w:t>
-      </w:r>
-    </w:p>
-    <w:p>
-      <w:pPr>
-        <w:pStyle w:val="Heading1"/>
-      </w:pPr>
-      <w:r>
-        <w:t xml:space="preserve">8 · Modul 3 · Montageplanung</w:t>
-      </w:r>
-    </w:p>
-    <w:p>
-      <w:pPr>
-        <w:spacing w:after="120"/>
-      </w:pPr>
-      <w:r>
-        <w:t xml:space="preserve">Zweck: lagenweise Aufbauanleitung mit Vorspann-Schritten und Gesamt-Stückliste. Interaktiver Lagen-Viewer, Wandüberblick mit Bemaßung, Vorspann-Hinweise (Stangenlänge, Kopplungshöhen aus rod_mm), druckbare Anleitung.</w:t>
-      </w:r>
-    </w:p>
-    <w:p>
-      <w:pPr>
-        <w:pStyle w:val="Heading1"/>
-      </w:pPr>
-      <w:r>
-        <w:t xml:space="preserve">9 · Modul 4 · Roboter-Export</w:t>
-      </w:r>
-    </w:p>
-    <w:p>
-      <w:pPr>
-        <w:spacing w:after="120"/>
-      </w:pPr>
-      <w:r>
-        <w:t xml:space="preserve">Zweck: maschinenlesbare Montagesequenz für den robotischen Aufbau – herstellerneutral als JSON/CSV. Schrittfolge: Bodenblech + Senkkopfschrauben/Kopplungsmuttern am Fuß, PLACE_STONE (Lage für Lage), Gewindestangen/Kopplungen, Kopfblech bzw. Spannplatten, abschließend TENSION. Referenzsystem: Nullpunkt unten-links-vorne, X=Länge, Y=Wandstärke, Z=Höhe, mm; Platzierungsbezug Stein-Ecke unten-links-vorne.</w:t>
-      </w:r>
-    </w:p>
-    <w:p>
-      <w:pPr>
-        <w:pStyle w:val="Heading1"/>
-      </w:pPr>
-      <w:r>
-        <w:t xml:space="preserve">10 · Modul 5 · Projekt-Manager (DXF/IFC)</w:t>
-      </w:r>
-    </w:p>
-    <w:p>
-      <w:pPr>
-        <w:spacing w:after="120"/>
-      </w:pPr>
-      <w:r>
-        <w:t xml:space="preserve">Zweck: mehrere Wände zu einem Projekt zusammenführen, im 2D-Grundriss platzieren, Sammel-Stückliste, CAD/BIM-Export.</w:t>
+        <w:rPr>
+          <w:b/>
+          <w:bCs/>
+        </w:rPr>
+        <w:t xml:space="preserve">Wandelement-Anbindung:</w:t>
+      </w:r>
+      <w:r>
+        <w:t xml:space="preserve"> Geometrie und Öffnungszahl werden aus dem aktiven Wandelement (localStorage) übernommen bzw. aus einer geladenen Datei (Kap. 3). Alle Kennwerte sind eigene Ingenieur-Eingaben; das Modul schreibt das Wandelement nicht zurück.</w:t>
       </w:r>
     </w:p>
     <w:p>
@@ -7925,10 +7953,96 @@
           <w:b/>
           <w:bCs/>
         </w:rPr>
-        <w:t xml:space="preserve">DXF:</w:t>
-      </w:r>
-      <w:r>
-        <w:t xml:space="preserve"> Grundriss und Ansichten (Layer für Steine, Vorspannung, Öffnungen).</w:t>
+        <w:t xml:space="preserve">Interpolations-Absicherung:</w:t>
+      </w:r>
+      <w:r>
+        <w:t xml:space="preserve"> Biege-Prüfwerte werden bei Überschreitung des Prüfbereichs gekappt und gewarnt (Kap. 5.5).</w:t>
+      </w:r>
+    </w:p>
+    <w:p>
+      <w:pPr>
+        <w:pStyle w:val="Heading2"/>
+      </w:pPr>
+      <w:r>
+        <w:t xml:space="preserve">9.1 Transport / Hebezustand (Zusatz, nicht Gutachten)</w:t>
+      </w:r>
+    </w:p>
+    <w:p>
+      <w:pPr>
+        <w:spacing w:after="120"/>
+      </w:pPr>
+      <w:r>
+        <w:t xml:space="preserve">Separater Spot-Check für das Anschlagblech beim Heben (vorübergehende Bemessungssituation, eigenes Faktorenregime γ_G·dyn). Eigengewicht als Streckenlast n_Ed = γ_w · t · h.</w:t>
+      </w:r>
+    </w:p>
+    <w:p>
+      <w:pPr>
+        <w:pBdr>
+          <w:left w:val="single" w:color="1F6FEB" w:sz="18" w:space="6"/>
+        </w:pBdr>
+        <w:shd w:fill="F4F7FB" w:val="clear"/>
+        <w:spacing w:after="120" w:before="80"/>
+      </w:pPr>
+      <w:r>
+        <w:rPr>
+          <w:rFonts w:ascii="Consolas" w:cs="Consolas" w:eastAsia="Consolas" w:hAnsi="Consolas"/>
+          <w:color w:val="0B3A73"/>
+          <w:sz w:val="20"/>
+          <w:szCs w:val="20"/>
+        </w:rPr>
+        <w:t xml:space="preserve">G_Ek = n_Ed · L / n_Anker      G_Ed = γ_G · dyn · G_Ek   [kN]</w:t>
+      </w:r>
+      <w:r>
+        <w:br/>
+      </w:r>
+      <w:r>
+        <w:rPr>
+          <w:rFonts w:ascii="Consolas" w:cs="Consolas" w:eastAsia="Consolas" w:hAnsi="Consolas"/>
+          <w:color w:val="0B3A73"/>
+          <w:sz w:val="20"/>
+          <w:szCs w:val="20"/>
+        </w:rPr>
+        <w:t xml:space="preserve">erf. Tragfähigkeit Anschlagmittel = G_Ed·1000 / 9,81   [kg]</w:t>
+      </w:r>
+      <w:r>
+        <w:br/>
+      </w:r>
+      <w:r>
+        <w:rPr>
+          <w:rFonts w:ascii="Consolas" w:cs="Consolas" w:eastAsia="Consolas" w:hAnsi="Consolas"/>
+          <w:color w:val="0B3A73"/>
+          <w:sz w:val="20"/>
+          <w:szCs w:val="20"/>
+        </w:rPr>
+        <w:t xml:space="preserve">M_Ed = G_Ed · hebelBlech / 4   W = b·t²/6   σ = M_Ed·1e6 / W  →  σ ≤ f_y</w:t>
+      </w:r>
+    </w:p>
+    <w:p>
+      <w:pPr>
+        <w:pBdr>
+          <w:left w:val="single" w:color="C9461C" w:sz="18" w:space="6"/>
+        </w:pBdr>
+        <w:shd w:fill="FBE9E2" w:val="clear"/>
+        <w:spacing w:after="120" w:before="80"/>
+      </w:pPr>
+      <w:r>
+        <w:t xml:space="preserve">Der Hebe-Nachweis prüft nur das Stahlblech, nicht die Mauerwerksbiegung zwischen den Anschlagpunkten und nicht den Ankerauszug aus dem Mauerwerk — diese sind gesondert zu führen.</w:t>
+      </w:r>
+    </w:p>
+    <w:p>
+      <w:pPr>
+        <w:pStyle w:val="Heading1"/>
+      </w:pPr>
+      <w:r>
+        <w:t xml:space="preserve">10 · Modul 4 · Stückliste &amp; Kosten</w:t>
+      </w:r>
+    </w:p>
+    <w:p>
+      <w:pPr>
+        <w:spacing w:after="120"/>
+      </w:pPr>
+      <w:r>
+        <w:t xml:space="preserve">Zweck: Material-Auszug mit editierbaren Preisen und Export. Kanonische Mengen aus dem aktiven Wandelement über den geteilten BOM-Baustein (docs/shared/sembla-bom.js): Steine, Gewindestangen, Muttern, Platten, Bleche, Dichtstreifen. Mit zusätzlich geladenem Verbinder-Layout/Bundle (aus Modul 2) kommen Verbinder und Latten hinzu. Ausgabe: Summe netto, Anzahl gleicher Wände, €/m² Wandfläche (Öffnungen abgezogen).</w:t>
       </w:r>
     </w:p>
     <w:p>
@@ -7945,47 +8059,10 @@
           <w:b/>
           <w:bCs/>
         </w:rPr>
-        <w:t xml:space="preserve">IFC4:</w:t>
-      </w:r>
-      <w:r>
-        <w:t xml:space="preserve"> jede Wand als IfcWallStandardCase, Öffnungen als Voids, Steine als IfcBuildingElementProxy. Optional echte Geometrie (BREP): i2/i3 als IfcFacetedBrep, je Typ einmal als IfcRepresentationMap, pro Stein per IfcMappedItem referenziert (schlanke Datei).</w:t>
-      </w:r>
-    </w:p>
-    <w:p>
-      <w:pPr>
-        <w:pStyle w:val="Heading1"/>
-      </w:pPr>
-      <w:r>
-        <w:t xml:space="preserve">11 · Modul 6 · Statik (Werkzeug)</w:t>
-      </w:r>
-    </w:p>
-    <w:p>
-      <w:pPr>
-        <w:spacing w:after="140"/>
-      </w:pPr>
-      <w:r>
-        <w:rPr>
-          <w:color w:val="33414F"/>
-          <w:sz w:val="24"/>
-          <w:szCs w:val="24"/>
-        </w:rPr>
-        <w:t xml:space="preserve">Die Oberfläche zum Schermer-Nachweis aus Kapitel 5. Alle Formeln und die Beispielrechnung stehen dort; dieses Kapitel beschreibt Bedienung, Ein-/Ausgaben und die Bundle-Anbindung.</w:t>
-      </w:r>
-    </w:p>
-    <w:p>
-      <w:pPr>
-        <w:spacing w:after="120"/>
-      </w:pPr>
-      <w:r>
-        <w:t xml:space="preserve">Eingaben (editierbar wie die Bibliothek der Arbeitsmappe): Geometrie (h, l, t, Öffnungszahl), Material (f_k, γ_w, γ_M, v_Rd, μ_k, γ_M,μ), Gewindestange (Auswahl M8–M20 füllt A_s/f_yk/f_ub), Lasten (Windzone, q_p-Faktor, c_pe,10, Torsituation, γ_Q, DIN-4103-Werte), Vorspannung (Raster e, F0, ΔF, F,inf, γ_P,fav wählbar 1,0–2,0, γ_P,sup), Prüfwerte §6.2, Spannsystem-Bauteile (Steg, Kopf-/Fußplatte, k₂-Werte, Mutter, Auflagerlänge l_P), Deckenwinkel-Abstand.</w:t>
-      </w:r>
-    </w:p>
-    <w:p>
-      <w:pPr>
-        <w:spacing w:after="120"/>
-      </w:pPr>
-      <w:r>
-        <w:t xml:space="preserve">Ausgaben: **Kompaktnachweis Wand** (Biegung, Schub, Druckrand, Boden, Deckenwinkel) und **Kompaktnachweis Spannsystem** (Stange EC3 + Fließen, Spannschraube, Schraube unten Sechskant/Senk, Kopf-/Fußplatte, Steinpressung, Mutter). Jede Karte zeigt E_d, R_d, Auslastung η und Status; oben die Gesamtausnutzung η_max,gesamt = MAX(Wand, Spannsystem).</w:t>
+        <w:t xml:space="preserve">Export:</w:t>
+      </w:r>
+      <w:r>
+        <w:t xml:space="preserve"> Excel (xlsx-Bibliothek per CDN – die einzige externe Laufzeit-Abhängigkeit; degradiert ohne Internet sauber auf CSV), CSV, Druck.</w:t>
       </w:r>
     </w:p>
     <w:p>
@@ -7998,34 +8075,39 @@
         <w:spacing w:after="60"/>
       </w:pPr>
       <w:r>
-        <w:rPr>
-          <w:b/>
-          <w:bCs/>
-        </w:rPr>
-        <w:t xml:space="preserve">Bundle-Anbindung:</w:t>
-      </w:r>
-      <w:r>
-        <w:t xml:space="preserve"> Geometrie und Öffnungszahl werden aus dem Projekt-Bundle / Wandelement übernommen (Kap. 3).</w:t>
-      </w:r>
-    </w:p>
-    <w:p>
-      <w:pPr>
-        <w:pStyle w:val="ListParagraph"/>
-        <w:numPr>
-          <w:ilvl w:val="0"/>
-          <w:numId w:val="2"/>
-        </w:numPr>
-        <w:spacing w:after="60"/>
-      </w:pPr>
-      <w:r>
-        <w:rPr>
-          <w:b/>
-          <w:bCs/>
-        </w:rPr>
-        <w:t xml:space="preserve">Interpolations-Absicherung:</w:t>
-      </w:r>
-      <w:r>
-        <w:t xml:space="preserve"> Biege-Prüfwerte werden bei Überschreitung des Prüfbereichs gekappt und gewarnt (Kap. 5.5).</w:t>
+        <w:t xml:space="preserve">Reiner Konsument: liest das aktive Wandelement, schreibt es nicht zurück. Dieselbe BOM-Quelle nutzt auch die Kurz-Stückliste in der Montage (Modul 5) – konsistent und driftfrei.</w:t>
+      </w:r>
+    </w:p>
+    <w:p>
+      <w:pPr>
+        <w:pStyle w:val="Heading1"/>
+      </w:pPr>
+      <w:r>
+        <w:t xml:space="preserve">11 · Modul 5 · Montageplanung</w:t>
+      </w:r>
+    </w:p>
+    <w:p>
+      <w:pPr>
+        <w:spacing w:after="120"/>
+      </w:pPr>
+      <w:r>
+        <w:t xml:space="preserve">Zweck: lagenweise Aufbauanleitung mit Vorspann-Schritten und Kurz-Stückliste. Interaktiver Lagen-Viewer (Slider/Streifen mit Strang-Markern), Wandüberblick mit Bemaßung/Raster/Ankern, Vorspann-Hinweise (Stangenlänge, Kopplungshöhen aus rod_mm), komplette druckbare Anleitung. Die Kurz-Stückliste stammt aus demselben BOM-Baustein wie Modul 4. Reiner Konsument des aktiven Wandelements.</w:t>
+      </w:r>
+    </w:p>
+    <w:p>
+      <w:pPr>
+        <w:pStyle w:val="Heading1"/>
+      </w:pPr>
+      <w:r>
+        <w:t xml:space="preserve">12 · Modul 6 · 3D-Vorschau &amp; IFC (experimentell)</w:t>
+      </w:r>
+    </w:p>
+    <w:p>
+      <w:pPr>
+        <w:spacing w:after="120"/>
+      </w:pPr>
+      <w:r>
+        <w:t xml:space="preserve">Zweck: Echtzeit-3D des aktiven Wandelements (Steine i2/i3, Vorspannstränge segmentiert, Bleche/Anker, Öffnungen), drehbar – für die Abstimmung mit Architekten/Bauherren – zusammengeführt mit dem IFC-Export/-Prüfen. Reiner Konsument; die 3D-Ansicht nutzt Three.js (per CDN, nur online) und degradiert sonst sauber.</w:t>
       </w:r>
     </w:p>
     <w:p>
@@ -8033,7 +8115,7 @@
         <w:pStyle w:val="Heading2"/>
       </w:pPr>
       <w:r>
-        <w:t xml:space="preserve">12.1 Transport / Hebezustand (Zusatz, nicht Gutachten)</w:t>
+        <w:t xml:space="preserve">Bauteilgeometrie (OBJ)</w:t>
       </w:r>
     </w:p>
     <w:p>
@@ -8041,61 +8123,39 @@
         <w:spacing w:after="120"/>
       </w:pPr>
       <w:r>
-        <w:t xml:space="preserve">Separater Spot-Check für das Anschlagblech beim Heben (vorübergehende Bemessungssituation, eigenes Faktorenregime γ_G·dyn). Eigengewicht als Streckenlast n_Ed = γ_w · t · h.</w:t>
-      </w:r>
-    </w:p>
-    <w:p>
-      <w:pPr>
-        <w:pBdr>
-          <w:left w:val="single" w:color="1F6FEB" w:sz="18" w:space="6"/>
-        </w:pBdr>
-        <w:shd w:fill="F4F7FB" w:val="clear"/>
-        <w:spacing w:after="120" w:before="80"/>
-      </w:pPr>
-      <w:r>
-        <w:rPr>
-          <w:rFonts w:ascii="Consolas" w:cs="Consolas" w:eastAsia="Consolas" w:hAnsi="Consolas"/>
-          <w:color w:val="0B3A73"/>
-          <w:sz w:val="20"/>
-          <w:szCs w:val="20"/>
-        </w:rPr>
-        <w:t xml:space="preserve">G_Ek = n_Ed · L / n_Anker      G_Ed = γ_G · dyn · G_Ek   [kN]</w:t>
-      </w:r>
-      <w:r>
-        <w:br/>
-      </w:r>
-      <w:r>
-        <w:rPr>
-          <w:rFonts w:ascii="Consolas" w:cs="Consolas" w:eastAsia="Consolas" w:hAnsi="Consolas"/>
-          <w:color w:val="0B3A73"/>
-          <w:sz w:val="20"/>
-          <w:szCs w:val="20"/>
-        </w:rPr>
-        <w:t xml:space="preserve">erf. Tragfähigkeit Anschlagmittel = G_Ed·1000 / 9,81   [kg]</w:t>
-      </w:r>
-      <w:r>
-        <w:br/>
-      </w:r>
-      <w:r>
-        <w:rPr>
-          <w:rFonts w:ascii="Consolas" w:cs="Consolas" w:eastAsia="Consolas" w:hAnsi="Consolas"/>
-          <w:color w:val="0B3A73"/>
-          <w:sz w:val="20"/>
-          <w:szCs w:val="20"/>
-        </w:rPr>
-        <w:t xml:space="preserve">M_Ed = G_Ed · hebelBlech / 4   W = b·t²/6   σ = M_Ed·1e6 / W  →  σ ≤ f_y</w:t>
-      </w:r>
-    </w:p>
-    <w:p>
-      <w:pPr>
-        <w:pBdr>
-          <w:left w:val="single" w:color="C9461C" w:sz="18" w:space="6"/>
-        </w:pBdr>
-        <w:shd w:fill="FBE9E2" w:val="clear"/>
-        <w:spacing w:after="120" w:before="80"/>
-      </w:pPr>
-      <w:r>
-        <w:t xml:space="preserve">Der Hebe-Nachweis prüft nur das Stahlblech, nicht die Mauerwerksbiegung zwischen den Anschlagpunkten und nicht den Ankerauszug aus dem Mauerwerk — diese sind gesondert zu führen.</w:t>
+        <w:t xml:space="preserve">Die echte Steingeometrie liegt aus Vertraulichkeitsgründen nicht im (öffentlichen) Repo. Man lädt i2_SEMBLA.obj und i3_SEMBLA.obj einmalig per Datei-Upload; sie bleiben lokal im Browser (localStorage, über docs/shared/storage.js) und werden für massive Stege / offene Kammern in der 3D-Ansicht und im IFC-Export genutzt. Ohne OBJ werden die Steine als Quader dargestellt/exportiert.</w:t>
+      </w:r>
+    </w:p>
+    <w:p>
+      <w:pPr>
+        <w:pStyle w:val="Heading2"/>
+      </w:pPr>
+      <w:r>
+        <w:t xml:space="preserve">IFC4-Export</w:t>
+      </w:r>
+    </w:p>
+    <w:p>
+      <w:pPr>
+        <w:spacing w:after="120"/>
+      </w:pPr>
+      <w:r>
+        <w:t xml:space="preserve">Der Export (docs/shared/sembla-ifc.js) schreibt das Wandelement als eigenständige IFC4-Datei: die Wand als IfcWallStandardCase, Öffnungen als Voids (IfcRelVoidsElement), jeden Stein als IfcBuildingElementProxy. Mit geladener echter Geometrie werden die Steine als IfcFacetedBrep geschrieben – je Typ einmal als IfcRepresentationMap, pro Stein per IfcMappedItem referenziert (schlanke Datei).</w:t>
+      </w:r>
+    </w:p>
+    <w:p>
+      <w:pPr>
+        <w:pStyle w:val="Heading2"/>
+      </w:pPr>
+      <w:r>
+        <w:t xml:space="preserve">IFC prüfen</w:t>
+      </w:r>
+    </w:p>
+    <w:p>
+      <w:pPr>
+        <w:spacing w:after="120"/>
+      </w:pPr>
+      <w:r>
+        <w:t xml:space="preserve">Eine fremde IFC-Datei kann geprüft werden (web-ifc per CDN, nur online): gemeldet werden Schema, Entity-Zahl, Anzahl Wände und Stein-Proxys. Dient als schnelle Gültigkeitskontrolle (auch für die selbst exportierte Datei).</w:t>
       </w:r>
     </w:p>
     <w:p>
@@ -8103,7 +8163,7 @@
         <w:pStyle w:val="Heading1"/>
       </w:pPr>
       <w:r>
-        <w:t xml:space="preserve">12 · Modul 7 · 3D-Vorschau</w:t>
+        <w:t xml:space="preserve">13 · Weiterentwicklung (für Nicht-Programmierer)</w:t>
       </w:r>
     </w:p>
     <w:p>
@@ -8111,55 +8171,7 @@
         <w:spacing w:after="120"/>
       </w:pPr>
       <w:r>
-        <w:t xml:space="preserve">Zweck: Echtzeit-3D des Wandelements (Steine i2/i3, Vorspannstränge segmentiert, Öffnungen), drehbar – für die Abstimmung mit Architekten/Bauherren. Optional echte Steingeometrie (eingebettete OBJ) mit massiven Stegen und offenen Kammern.</w:t>
-      </w:r>
-    </w:p>
-    <w:p>
-      <w:pPr>
-        <w:pStyle w:val="Heading1"/>
-      </w:pPr>
-      <w:r>
-        <w:t xml:space="preserve">13 · Modul 8 · Stückliste &amp; Kosten</w:t>
-      </w:r>
-    </w:p>
-    <w:p>
-      <w:pPr>
-        <w:spacing w:after="120"/>
-      </w:pPr>
-      <w:r>
-        <w:t xml:space="preserve">Zweck: Material-Auszug mit editierbaren Preisen und Excel-Export. Aus dem Wandelement: Steine, Gewindestangen, Muttern, Platten. Mit zusätzlichem Verbinder-Layout/Bundle kommen Verbinder, Latten und Dämmung automatisch hinzu. Ausgabe: Summe netto, €/m² Wandfläche (Öffnungen abgezogen), Excel/CSV.</w:t>
-      </w:r>
-    </w:p>
-    <w:p>
-      <w:pPr>
-        <w:pStyle w:val="Heading1"/>
-      </w:pPr>
-      <w:r>
-        <w:t xml:space="preserve">14 · Modul 9 · Fertigungszeichnung</w:t>
-      </w:r>
-    </w:p>
-    <w:p>
-      <w:pPr>
-        <w:spacing w:after="120"/>
-      </w:pPr>
-      <w:r>
-        <w:t xml:space="preserve">Zweck: bemaßter Verlege-, Vorspann- und Verbinderplan je Wand mit Schriftfeld und Stückliste – druckbar als PDF (A3/A4 quer).</w:t>
-      </w:r>
-    </w:p>
-    <w:p>
-      <w:pPr>
-        <w:pStyle w:val="Heading1"/>
-      </w:pPr>
-      <w:r>
-        <w:t xml:space="preserve">15 · Weiterentwicklung (für Nicht-Programmierer)</w:t>
-      </w:r>
-    </w:p>
-    <w:p>
-      <w:pPr>
-        <w:spacing w:after="120"/>
-      </w:pPr>
-      <w:r>
-        <w:t xml:space="preserve">Die häufigsten Anpassungen lassen sich an klar benannten Stellen vornehmen. Wichtig: nach jeder Änderung Tests laufen lassen und publish-werkzeuge.mjs ausführen.</w:t>
+        <w:t xml:space="preserve">Die häufigsten Anpassungen lassen sich an klar benannten Stellen vornehmen. Es gibt keinen Build-Schritt: docs/ wird direkt editiert und ist nach dem Push sofort live. Wichtig: nach jeder Änderung die betroffenen Tests laufen lassen (npm run test:all).</w:t>
       </w:r>
     </w:p>
     <w:tbl>
@@ -8298,7 +8310,7 @@
                 <w:sz w:val="20"/>
                 <w:szCs w:val="20"/>
               </w:rPr>
-              <w:t xml:space="preserve">Konstantenblock in Phase-1/sembla_core.py UND Phase-2/sembla-core.mjs (gleich halten!)</w:t>
+              <w:t xml:space="preserve">Konstantenblock in docs/shared/sembla-core.js UND tests/core/sembla_core.py (gleich halten!)</w:t>
             </w:r>
           </w:p>
         </w:tc>
@@ -8358,7 +8370,7 @@
                 <w:sz w:val="20"/>
                 <w:szCs w:val="20"/>
               </w:rPr>
-              <w:t xml:space="preserve">DEF_MAT in sembla-engine.mjs; DEFAULTS in sembla-statik.mjs</w:t>
+              <w:t xml:space="preserve">DEF_MAT in docs/shared/sembla-engine.js; DEFAULTS in docs/shared/sembla-statik.js</w:t>
             </w:r>
           </w:p>
         </w:tc>
@@ -8418,7 +8430,7 @@
                 <w:sz w:val="20"/>
                 <w:szCs w:val="20"/>
               </w:rPr>
-              <w:t xml:space="preserve">Modul-3-Statik/sembla-statik.mjs</w:t>
+              <w:t xml:space="preserve">docs/shared/sembla-statik.js</w:t>
             </w:r>
           </w:p>
         </w:tc>
@@ -8478,7 +8490,7 @@
                 <w:sz w:val="20"/>
                 <w:szCs w:val="20"/>
               </w:rPr>
-              <w:t xml:space="preserve">autoAuslegung() in sembla-engine.mjs</w:t>
+              <w:t xml:space="preserve">autoAuslegung() in docs/shared/sembla-engine.js</w:t>
             </w:r>
           </w:p>
         </w:tc>
@@ -8509,7 +8521,7 @@
                 <w:sz w:val="20"/>
                 <w:szCs w:val="20"/>
               </w:rPr>
-              <w:t xml:space="preserve">Verbinder + Latten/Dämmung</w:t>
+              <w:t xml:space="preserve">Verbinder + Latten</w:t>
             </w:r>
           </w:p>
         </w:tc>
@@ -8538,7 +8550,7 @@
                 <w:sz w:val="20"/>
                 <w:szCs w:val="20"/>
               </w:rPr>
-              <w:t xml:space="preserve">Modul-Wandaufbau/SEMBLA_Wandaufbau.html (Panelfugen = Achsen, Beplankungsfeld)</w:t>
+              <w:t xml:space="preserve">docs/wandaufbau.html (Panelfugen = Achsen, Beplankungsfeld; Dämmung im MVP entfernt)</w:t>
             </w:r>
           </w:p>
         </w:tc>
@@ -8598,7 +8610,67 @@
                 <w:sz w:val="20"/>
                 <w:szCs w:val="20"/>
               </w:rPr>
-              <w:t xml:space="preserve">direkt im Tool editierbar; Default-Preise in Modul-Stueckliste/…</w:t>
+              <w:t xml:space="preserve">direkt im Tool editierbar; Mengen/Positionen aus docs/shared/sembla-bom.js</w:t>
+            </w:r>
+          </w:p>
+        </w:tc>
+      </w:tr>
+      <w:tr>
+        <w:tc>
+          <w:tcPr>
+            <w:tcW w:type="dxa" w:w="4000"/>
+            <w:tcBorders>
+              <w:top w:val="single" w:color="CCCCCC" w:sz="1"/>
+              <w:left w:val="single" w:color="CCCCCC" w:sz="1"/>
+              <w:bottom w:val="single" w:color="CCCCCC" w:sz="1"/>
+              <w:right w:val="single" w:color="CCCCCC" w:sz="1"/>
+            </w:tcBorders>
+            <w:tcMar>
+              <w:top w:type="dxa" w:w="60"/>
+              <w:left w:type="dxa" w:w="110"/>
+              <w:bottom w:type="dxa" w:w="60"/>
+              <w:right w:type="dxa" w:w="110"/>
+            </w:tcMar>
+          </w:tcPr>
+          <w:p>
+            <w:r>
+              <w:rPr>
+                <w:b w:val="false"/>
+                <w:bCs w:val="false"/>
+                <w:color w:val="1C2430"/>
+                <w:sz w:val="20"/>
+                <w:szCs w:val="20"/>
+              </w:rPr>
+              <w:t xml:space="preserve">IFC-Export</w:t>
+            </w:r>
+          </w:p>
+        </w:tc>
+        <w:tc>
+          <w:tcPr>
+            <w:tcW w:type="dxa" w:w="5360"/>
+            <w:tcBorders>
+              <w:top w:val="single" w:color="CCCCCC" w:sz="1"/>
+              <w:left w:val="single" w:color="CCCCCC" w:sz="1"/>
+              <w:bottom w:val="single" w:color="CCCCCC" w:sz="1"/>
+              <w:right w:val="single" w:color="CCCCCC" w:sz="1"/>
+            </w:tcBorders>
+            <w:tcMar>
+              <w:top w:type="dxa" w:w="60"/>
+              <w:left w:type="dxa" w:w="110"/>
+              <w:bottom w:type="dxa" w:w="60"/>
+              <w:right w:type="dxa" w:w="110"/>
+            </w:tcMar>
+          </w:tcPr>
+          <w:p>
+            <w:r>
+              <w:rPr>
+                <w:b w:val="false"/>
+                <w:bCs w:val="false"/>
+                <w:color w:val="1C2430"/>
+                <w:sz w:val="20"/>
+                <w:szCs w:val="20"/>
+              </w:rPr>
+              <w:t xml:space="preserve">docs/shared/sembla-ifc.js (Einzelwand → IFC4)</w:t>
             </w:r>
           </w:p>
         </w:tc>
@@ -8613,7 +8685,7 @@
         <w:spacing w:after="120" w:before="80"/>
       </w:pPr>
       <w:r>
-        <w:t xml:space="preserve">Goldene Regel zur Parität: Der Wandaufbau-Kern existiert zweimal – Python (Referenz) und JavaScript (für die Tools). Wer eine Aufbau-Regel ändert, muss beide Dateien gleich halten; die Paritätstests vergleichen sie über goldene Fixtures. Bei bewussten Änderungen werden die Fixtures neu erzeugt.</w:t>
+        <w:t xml:space="preserve">Goldene Regel zur Parität: Der Wandaufbau-Kern läuft im Betrieb einmal (docs/shared/sembla-core.js); daneben steht die Python-Referenz tests/core/sembla_core.py nur für die Tests. Wer eine Aufbau-Regel ändert, muss beide Dateien gleich halten; die Paritätstests vergleichen sie über goldene Fixtures. Bei bewussten Änderungen werden die Fixtures neu erzeugt.</w:t>
       </w:r>
     </w:p>
     <w:p>
@@ -8621,7 +8693,7 @@
         <w:pStyle w:val="Heading1"/>
       </w:pPr>
       <w:r>
-        <w:t xml:space="preserve">16 · Glossar &amp; Quellen</w:t>
+        <w:t xml:space="preserve">14 · Glossar &amp; Quellen</w:t>
       </w:r>
     </w:p>
     <w:tbl>
@@ -9379,7 +9451,7 @@
         <w:pStyle w:val="Heading1"/>
       </w:pPr>
       <w:r>
-        <w:t xml:space="preserve">17 · Regelwerk – alle Systemregeln hierarchisch</w:t>
+        <w:t xml:space="preserve">15 · Regelwerk – alle Systemregeln hierarchisch</w:t>
       </w:r>
     </w:p>
     <w:p>
@@ -9400,7 +9472,7 @@
         <w:pStyle w:val="Heading2"/>
       </w:pPr>
       <w:r>
-        <w:t xml:space="preserve">18.1 Geometrie &amp; Verband  [G]</w:t>
+        <w:t xml:space="preserve">15.1 Geometrie &amp; Verband  [G]</w:t>
       </w:r>
     </w:p>
     <w:p>
@@ -9588,7 +9660,7 @@
         <w:pStyle w:val="Heading2"/>
       </w:pPr>
       <w:r>
-        <w:t xml:space="preserve">18.2 Kammern, Nuten &amp; Vorspannstränge  [V]</w:t>
+        <w:t xml:space="preserve">15.2 Kammern, Nuten &amp; Vorspannstränge  [V]</w:t>
       </w:r>
     </w:p>
     <w:p>
@@ -9736,7 +9808,7 @@
         <w:pStyle w:val="Heading2"/>
       </w:pPr>
       <w:r>
-        <w:t xml:space="preserve">18.3 Anschlüsse &amp; Vorspann-Regime  [A]</w:t>
+        <w:t xml:space="preserve">15.3 Anschlüsse &amp; Vorspann-Regime  [A]</w:t>
       </w:r>
     </w:p>
     <w:p>
@@ -9884,7 +9956,7 @@
         <w:pStyle w:val="Heading2"/>
       </w:pPr>
       <w:r>
-        <w:t xml:space="preserve">18.4 Horizontaler Wandaufbau – Verbinder &amp; UK (Modul 2)  [U]</w:t>
+        <w:t xml:space="preserve">15.4 Horizontaler Wandaufbau – Verbinder &amp; UK (Modul 2)  [U]</w:t>
       </w:r>
     </w:p>
     <w:p>
@@ -10072,7 +10144,7 @@
         <w:pStyle w:val="Heading2"/>
       </w:pPr>
       <w:r>
-        <w:t xml:space="preserve">18.5 Statik (Gutachten Schermer)  [S]</w:t>
+        <w:t xml:space="preserve">15.5 Statik (Gutachten Schermer)  [S]</w:t>
       </w:r>
     </w:p>
     <w:p>
@@ -10280,7 +10352,7 @@
         <w:pStyle w:val="Heading2"/>
       </w:pPr>
       <w:r>
-        <w:t xml:space="preserve">18.6 Prozess, Datenmodell &amp; Fertigung  [P]</w:t>
+        <w:t xml:space="preserve">15.6 Prozess &amp; Datenmodell  [P]</w:t>
       </w:r>
     </w:p>
     <w:p>
@@ -10300,7 +10372,7 @@
         <w:t xml:space="preserve">[P-1]</w:t>
       </w:r>
       <w:r>
-        <w:t xml:space="preserve"> Das Wandelement ist die Single Source of Truth: Modul 1 erzeugt es, alle übrigen Module lesen es.</w:t>
+        <w:t xml:space="preserve"> Das Wandelement ist die Single Source of Truth: Modul 1 erzeugt es, alle übrigen Module lesen es (nur lesend). Es lebt im localStorage; genau ein Element ist aktiv.</w:t>
       </w:r>
     </w:p>
     <w:p>
@@ -10320,7 +10392,7 @@
         <w:t xml:space="preserve">[P-2]</w:t>
       </w:r>
       <w:r>
-        <w:t xml:space="preserve"> Austauschformat = Projekt-Bundle {wandelement, verbinder_layout}; ein Export-Button, einheitliche Lade-Buttons.</w:t>
+        <w:t xml:space="preserve"> Austausch-Dateiformat = Projekt-Bundle {wandelement, verbinder_layout} oder reines Wandelement-JSON; ein Export-Button, einheitliche Lade-Buttons. Datei-Import verändert kein fremdes Element.</w:t>
       </w:r>
     </w:p>
     <w:p>
@@ -10340,7 +10412,7 @@
         <w:t xml:space="preserve">[P-3]</w:t>
       </w:r>
       <w:r>
-        <w:t xml:space="preserve"> Wandaufbau-Kern doppelt (Python = Referenz, JS = Portierung); Parität über goldene Fixtures.</w:t>
+        <w:t xml:space="preserve"> Ein Rechenkern im Betrieb (docs/shared/sembla-core.js); die Python-Referenz (tests/core/) dient nur den Tests und wird bit-genau gleich gehalten (Parität über goldene Fixtures).</w:t>
       </w:r>
     </w:p>
     <w:p>
@@ -10380,7 +10452,7 @@
         <w:t xml:space="preserve">[P-5]</w:t>
       </w:r>
       <w:r>
-        <w:t xml:space="preserve"> Nach jeder Änderung: Tests grün halten und publish-werkzeuge.mjs ausführen (Entwicklungs-/Auslieferungsstand konsistent).</w:t>
+        <w:t xml:space="preserve"> Kein Build-Schritt: docs/ wird direkt editiert und ist nach dem Push sofort live (GitHub Pages). Nach jeder Änderung die betroffenen Tests grün halten (npm run test:all).</w:t>
       </w:r>
     </w:p>
     <w:sectPr>
@@ -10886,237 +10958,4 @@
     </w:rPr>
   </w:style>
 </w:styles>
-</file>
-
-<file path=customXml/item1.xml><?xml version="1.0" encoding="utf-8"?>
-<ct:contentTypeSchema xmlns:ct="http://schemas.microsoft.com/office/2006/metadata/contentType" xmlns:ma="http://schemas.microsoft.com/office/2006/metadata/properties/metaAttributes" ct:_="" ma:_="" ma:contentTypeName="Document" ma:contentTypeID="0x0101000E5C497DA2003D4495EDD5A9177F3768" ma:contentTypeVersion="12" ma:contentTypeDescription="Create a new document." ma:contentTypeScope="" ma:versionID="497f250517c69486945fafca78806892">
-  <xsd:schema xmlns:xsd="http://www.w3.org/2001/XMLSchema" xmlns:xs="http://www.w3.org/2001/XMLSchema" xmlns:p="http://schemas.microsoft.com/office/2006/metadata/properties" xmlns:ns2="e69fb04b-774e-4181-b426-2affd763a325" xmlns:ns3="319d099e-5aa7-4c50-ac38-73be6ed636ca" targetNamespace="http://schemas.microsoft.com/office/2006/metadata/properties" ma:root="true" ma:fieldsID="cc9b2e21c548eaee90293835a7df9367" ns2:_="" ns3:_="">
-    <xsd:import namespace="e69fb04b-774e-4181-b426-2affd763a325"/>
-    <xsd:import namespace="319d099e-5aa7-4c50-ac38-73be6ed636ca"/>
-    <xsd:element name="properties">
-      <xsd:complexType>
-        <xsd:sequence>
-          <xsd:element name="documentManagement">
-            <xsd:complexType>
-              <xsd:all>
-                <xsd:element ref="ns2:MediaServiceMetadata" minOccurs="0"/>
-                <xsd:element ref="ns2:MediaServiceFastMetadata" minOccurs="0"/>
-                <xsd:element ref="ns2:MediaServiceSearchProperties" minOccurs="0"/>
-                <xsd:element ref="ns2:MediaServiceDateTaken" minOccurs="0"/>
-                <xsd:element ref="ns2:MediaServiceLocation" minOccurs="0"/>
-                <xsd:element ref="ns2:MediaServiceGenerationTime" minOccurs="0"/>
-                <xsd:element ref="ns2:MediaServiceEventHashCode" minOccurs="0"/>
-                <xsd:element ref="ns2:MediaLengthInSeconds" minOccurs="0"/>
-                <xsd:element ref="ns2:lcf76f155ced4ddcb4097134ff3c332f" minOccurs="0"/>
-                <xsd:element ref="ns3:TaxCatchAll" minOccurs="0"/>
-                <xsd:element ref="ns2:MediaServiceOCR" minOccurs="0"/>
-              </xsd:all>
-            </xsd:complexType>
-          </xsd:element>
-        </xsd:sequence>
-      </xsd:complexType>
-    </xsd:element>
-  </xsd:schema>
-  <xsd:schema xmlns:xsd="http://www.w3.org/2001/XMLSchema" xmlns:xs="http://www.w3.org/2001/XMLSchema" xmlns:dms="http://schemas.microsoft.com/office/2006/documentManagement/types" xmlns:pc="http://schemas.microsoft.com/office/infopath/2007/PartnerControls" targetNamespace="e69fb04b-774e-4181-b426-2affd763a325" elementFormDefault="qualified">
-    <xsd:import namespace="http://schemas.microsoft.com/office/2006/documentManagement/types"/>
-    <xsd:import namespace="http://schemas.microsoft.com/office/infopath/2007/PartnerControls"/>
-    <xsd:element name="MediaServiceMetadata" ma:index="8" nillable="true" ma:displayName="MediaServiceMetadata" ma:hidden="true" ma:internalName="MediaServiceMetadata" ma:readOnly="true">
-      <xsd:simpleType>
-        <xsd:restriction base="dms:Note"/>
-      </xsd:simpleType>
-    </xsd:element>
-    <xsd:element name="MediaServiceFastMetadata" ma:index="9" nillable="true" ma:displayName="MediaServiceFastMetadata" ma:hidden="true" ma:internalName="MediaServiceFastMetadata" ma:readOnly="true">
-      <xsd:simpleType>
-        <xsd:restriction base="dms:Note"/>
-      </xsd:simpleType>
-    </xsd:element>
-    <xsd:element name="MediaServiceSearchProperties" ma:index="10" nillable="true" ma:displayName="MediaServiceSearchProperties" ma:hidden="true" ma:internalName="MediaServiceSearchProperties" ma:readOnly="true">
-      <xsd:simpleType>
-        <xsd:restriction base="dms:Note"/>
-      </xsd:simpleType>
-    </xsd:element>
-    <xsd:element name="MediaServiceDateTaken" ma:index="11" nillable="true" ma:displayName="MediaServiceDateTaken" ma:hidden="true" ma:indexed="true" ma:internalName="MediaServiceDateTaken" ma:readOnly="true">
-      <xsd:simpleType>
-        <xsd:restriction base="dms:Text"/>
-      </xsd:simpleType>
-    </xsd:element>
-    <xsd:element name="MediaServiceLocation" ma:index="12" nillable="true" ma:displayName="Location" ma:indexed="true" ma:internalName="MediaServiceLocation" ma:readOnly="true">
-      <xsd:simpleType>
-        <xsd:restriction base="dms:Text"/>
-      </xsd:simpleType>
-    </xsd:element>
-    <xsd:element name="MediaServiceGenerationTime" ma:index="13" nillable="true" ma:displayName="MediaServiceGenerationTime" ma:hidden="true" ma:internalName="MediaServiceGenerationTime" ma:readOnly="true">
-      <xsd:simpleType>
-        <xsd:restriction base="dms:Text"/>
-      </xsd:simpleType>
-    </xsd:element>
-    <xsd:element name="MediaServiceEventHashCode" ma:index="14" nillable="true" ma:displayName="MediaServiceEventHashCode" ma:hidden="true" ma:internalName="MediaServiceEventHashCode" ma:readOnly="true">
-      <xsd:simpleType>
-        <xsd:restriction base="dms:Text"/>
-      </xsd:simpleType>
-    </xsd:element>
-    <xsd:element name="MediaLengthInSeconds" ma:index="15" nillable="true" ma:displayName="MediaLengthInSeconds" ma:hidden="true" ma:internalName="MediaLengthInSeconds" ma:readOnly="true">
-      <xsd:simpleType>
-        <xsd:restriction base="dms:Unknown"/>
-      </xsd:simpleType>
-    </xsd:element>
-    <xsd:element name="lcf76f155ced4ddcb4097134ff3c332f" ma:index="17" nillable="true" ma:taxonomy="true" ma:internalName="lcf76f155ced4ddcb4097134ff3c332f" ma:taxonomyFieldName="MediaServiceImageTags" ma:displayName="Image Tags" ma:readOnly="false" ma:fieldId="{5cf76f15-5ced-4ddc-b409-7134ff3c332f}" ma:taxonomyMulti="true" ma:sspId="5ee7d935-9634-42cd-a452-4fb9f1577fa5" ma:termSetId="09814cd3-568e-fe90-9814-8d621ff8fb84" ma:anchorId="fba54fb3-c3e1-fe81-a776-ca4b69148c4d" ma:open="true" ma:isKeyword="false">
-      <xsd:complexType>
-        <xsd:sequence>
-          <xsd:element ref="pc:Terms" minOccurs="0" maxOccurs="1"/>
-        </xsd:sequence>
-      </xsd:complexType>
-    </xsd:element>
-    <xsd:element name="MediaServiceOCR" ma:index="19" nillable="true" ma:displayName="Extracted Text" ma:internalName="MediaServiceOCR" ma:readOnly="true">
-      <xsd:simpleType>
-        <xsd:restriction base="dms:Note">
-          <xsd:maxLength value="255"/>
-        </xsd:restriction>
-      </xsd:simpleType>
-    </xsd:element>
-  </xsd:schema>
-  <xsd:schema xmlns:xsd="http://www.w3.org/2001/XMLSchema" xmlns:xs="http://www.w3.org/2001/XMLSchema" xmlns:dms="http://schemas.microsoft.com/office/2006/documentManagement/types" xmlns:pc="http://schemas.microsoft.com/office/infopath/2007/PartnerControls" targetNamespace="319d099e-5aa7-4c50-ac38-73be6ed636ca" elementFormDefault="qualified">
-    <xsd:import namespace="http://schemas.microsoft.com/office/2006/documentManagement/types"/>
-    <xsd:import namespace="http://schemas.microsoft.com/office/infopath/2007/PartnerControls"/>
-    <xsd:element name="TaxCatchAll" ma:index="18" nillable="true" ma:displayName="Taxonomy Catch All Column" ma:hidden="true" ma:list="{9116f2b2-955b-478d-b18b-8b7b642f45e0}" ma:internalName="TaxCatchAll" ma:showField="CatchAllData" ma:web="319d099e-5aa7-4c50-ac38-73be6ed636ca">
-      <xsd:complexType>
-        <xsd:complexContent>
-          <xsd:extension base="dms:MultiChoiceLookup">
-            <xsd:sequence>
-              <xsd:element name="Value" type="dms:Lookup" maxOccurs="unbounded" minOccurs="0" nillable="true"/>
-            </xsd:sequence>
-          </xsd:extension>
-        </xsd:complexContent>
-      </xsd:complexType>
-    </xsd:element>
-  </xsd:schema>
-  <xsd:schema xmlns="http://schemas.openxmlformats.org/package/2006/metadata/core-properties" xmlns:xsd="http://www.w3.org/2001/XMLSchema" xmlns:xsi="http://www.w3.org/2001/XMLSchema-instance" xmlns:dc="http://purl.org/dc/elements/1.1/" xmlns:dcterms="http://purl.org/dc/terms/" xmlns:odoc="http://schemas.microsoft.com/internal/obd" targetNamespace="http://schemas.openxmlformats.org/package/2006/metadata/core-properties" elementFormDefault="qualified" attributeFormDefault="unqualified" blockDefault="#all">
-    <xsd:import namespace="http://purl.org/dc/elements/1.1/" schemaLocation="http://dublincore.org/schemas/xmls/qdc/2003/04/02/dc.xsd"/>
-    <xsd:import namespace="http://purl.org/dc/terms/" schemaLocation="http://dublincore.org/schemas/xmls/qdc/2003/04/02/dcterms.xsd"/>
-    <xsd:element name="coreProperties" type="CT_coreProperties"/>
-    <xsd:complexType name="CT_coreProperties">
-      <xsd:all>
-        <xsd:element ref="dc:creator" minOccurs="0" maxOccurs="1"/>
-        <xsd:element ref="dcterms:created" minOccurs="0" maxOccurs="1"/>
-        <xsd:element ref="dc:identifier" minOccurs="0" maxOccurs="1"/>
-        <xsd:element name="contentType" minOccurs="0" maxOccurs="1" type="xsd:string" ma:index="0" ma:displayName="Content Type"/>
-        <xsd:element ref="dc:title" minOccurs="0" maxOccurs="1" ma:index="4" ma:displayName="Title"/>
-        <xsd:element ref="dc:subject" minOccurs="0" maxOccurs="1"/>
-        <xsd:element ref="dc:description" minOccurs="0" maxOccurs="1"/>
-        <xsd:element name="keywords" minOccurs="0" maxOccurs="1" type="xsd:string"/>
-        <xsd:element ref="dc:language" minOccurs="0" maxOccurs="1"/>
-        <xsd:element name="category" minOccurs="0" maxOccurs="1" type="xsd:string"/>
-        <xsd:element name="version" minOccurs="0" maxOccurs="1" type="xsd:string"/>
-        <xsd:element name="revision" minOccurs="0" maxOccurs="1" type="xsd:string">
-          <xsd:annotation>
-            <xsd:documentation>
-                        This value indicates the number of saves or revisions. The application is responsible for updating this value after each revision.
-                    </xsd:documentation>
-          </xsd:annotation>
-        </xsd:element>
-        <xsd:element name="lastModifiedBy" minOccurs="0" maxOccurs="1" type="xsd:string"/>
-        <xsd:element ref="dcterms:modified" minOccurs="0" maxOccurs="1"/>
-        <xsd:element name="contentStatus" minOccurs="0" maxOccurs="1" type="xsd:string"/>
-      </xsd:all>
-    </xsd:complexType>
-  </xsd:schema>
-  <xs:schema xmlns:pc="http://schemas.microsoft.com/office/infopath/2007/PartnerControls" xmlns:xs="http://www.w3.org/2001/XMLSchema" targetNamespace="http://schemas.microsoft.com/office/infopath/2007/PartnerControls" elementFormDefault="qualified" attributeFormDefault="unqualified">
-    <xs:element name="Person">
-      <xs:complexType>
-        <xs:sequence>
-          <xs:element ref="pc:DisplayName" minOccurs="0"/>
-          <xs:element ref="pc:AccountId" minOccurs="0"/>
-          <xs:element ref="pc:AccountType" minOccurs="0"/>
-        </xs:sequence>
-      </xs:complexType>
-    </xs:element>
-    <xs:element name="DisplayName" type="xs:string"/>
-    <xs:element name="AccountId" type="xs:string"/>
-    <xs:element name="AccountType" type="xs:string"/>
-    <xs:element name="BDCAssociatedEntity">
-      <xs:complexType>
-        <xs:sequence>
-          <xs:element ref="pc:BDCEntity" minOccurs="0" maxOccurs="unbounded"/>
-        </xs:sequence>
-        <xs:attribute ref="pc:EntityNamespace"/>
-        <xs:attribute ref="pc:EntityName"/>
-        <xs:attribute ref="pc:SystemInstanceName"/>
-        <xs:attribute ref="pc:AssociationName"/>
-      </xs:complexType>
-    </xs:element>
-    <xs:attribute name="EntityNamespace" type="xs:string"/>
-    <xs:attribute name="EntityName" type="xs:string"/>
-    <xs:attribute name="SystemInstanceName" type="xs:string"/>
-    <xs:attribute name="AssociationName" type="xs:string"/>
-    <xs:element name="BDCEntity">
-      <xs:complexType>
-        <xs:sequence>
-          <xs:element ref="pc:EntityDisplayName" minOccurs="0"/>
-          <xs:element ref="pc:EntityInstanceReference" minOccurs="0"/>
-          <xs:element ref="pc:EntityId1" minOccurs="0"/>
-          <xs:element ref="pc:EntityId2" minOccurs="0"/>
-          <xs:element ref="pc:EntityId3" minOccurs="0"/>
-          <xs:element ref="pc:EntityId4" minOccurs="0"/>
-          <xs:element ref="pc:EntityId5" minOccurs="0"/>
-        </xs:sequence>
-      </xs:complexType>
-    </xs:element>
-    <xs:element name="EntityDisplayName" type="xs:string"/>
-    <xs:element name="EntityInstanceReference" type="xs:string"/>
-    <xs:element name="EntityId1" type="xs:string"/>
-    <xs:element name="EntityId2" type="xs:string"/>
-    <xs:element name="EntityId3" type="xs:string"/>
-    <xs:element name="EntityId4" type="xs:string"/>
-    <xs:element name="EntityId5" type="xs:string"/>
-    <xs:element name="Terms">
-      <xs:complexType>
-        <xs:sequence>
-          <xs:element ref="pc:TermInfo" minOccurs="0" maxOccurs="unbounded"/>
-        </xs:sequence>
-      </xs:complexType>
-    </xs:element>
-    <xs:element name="TermInfo">
-      <xs:complexType>
-        <xs:sequence>
-          <xs:element ref="pc:TermName" minOccurs="0"/>
-          <xs:element ref="pc:TermId" minOccurs="0"/>
-        </xs:sequence>
-      </xs:complexType>
-    </xs:element>
-    <xs:element name="TermName" type="xs:string"/>
-    <xs:element name="TermId" type="xs:string"/>
-  </xs:schema>
-</ct:contentTypeSchema>
-</file>
-
-<file path=customXml/item2.xml><?xml version="1.0" encoding="utf-8"?>
-<?mso-contentType ?>
-<FormTemplates xmlns="http://schemas.microsoft.com/sharepoint/v3/contenttype/forms">
-  <Display>DocumentLibraryForm</Display>
-  <Edit>DocumentLibraryForm</Edit>
-  <New>DocumentLibraryForm</New>
-</FormTemplates>
-</file>
-
-<file path=customXml/item3.xml><?xml version="1.0" encoding="utf-8"?>
-<p:properties xmlns:p="http://schemas.microsoft.com/office/2006/metadata/properties" xmlns:xsi="http://www.w3.org/2001/XMLSchema-instance" xmlns:pc="http://schemas.microsoft.com/office/infopath/2007/PartnerControls">
-  <documentManagement>
-    <lcf76f155ced4ddcb4097134ff3c332f xmlns="e69fb04b-774e-4181-b426-2affd763a325">
-      <Terms xmlns="http://schemas.microsoft.com/office/infopath/2007/PartnerControls"/>
-    </lcf76f155ced4ddcb4097134ff3c332f>
-    <TaxCatchAll xmlns="319d099e-5aa7-4c50-ac38-73be6ed636ca" xsi:nil="true"/>
-  </documentManagement>
-</p:properties>
-</file>
-
-<file path=customXml/itemProps1.xml><?xml version="1.0" encoding="utf-8"?>
-<ds:datastoreItem xmlns:ds="http://schemas.openxmlformats.org/officeDocument/2006/customXml" ds:itemID="{08890EE0-662B-4FF3-9691-985EBD9F05EA}"/>
-</file>
-
-<file path=customXml/itemProps2.xml><?xml version="1.0" encoding="utf-8"?>
-<ds:datastoreItem xmlns:ds="http://schemas.openxmlformats.org/officeDocument/2006/customXml" ds:itemID="{ECAE1FEC-00C2-4F76-8DEB-542A1A7F2715}"/>
-</file>
-
-<file path=customXml/itemProps3.xml><?xml version="1.0" encoding="utf-8"?>
-<ds:datastoreItem xmlns:ds="http://schemas.openxmlformats.org/officeDocument/2006/customXml" ds:itemID="{DED3AC90-0031-41DD-B790-77247B4F3C39}"/>
 </file>
</xml_diff>

<commit_message>
docs(regeln): Handbuch als verbindliches Regelwerk pflegen
</commit_message>
<xml_diff>
--- a/doku/SEMBLA_Handbuch.docx
+++ b/doku/SEMBLA_Handbuch.docx
@@ -42,7 +42,7 @@
           <w:sz w:val="24"/>
           <w:szCs w:val="24"/>
         </w:rPr>
-        <w:t xml:space="preserve">Funktionsbeschreibung aller Module und nachvollziehbare Aufbereitung der Berechnungen (Statik, Verbinder-Bemessung, Mengen). Für die interne Produktentwicklung und zur Prüfung durch Statiker.</w:t>
+        <w:t xml:space="preserve">Verbindliche, hierarchische Grundlage für den vollständig regelbasierten Planungsprozess sowie Funktionsbeschreibung aller Module und nachvollziehbare Aufbereitung der Berechnungen (Statik, Verbinder-Bemessung, Mengen). Für die interne Produktentwicklung und zur Prüfung durch Statiker.</w:t>
       </w:r>
     </w:p>
     <w:p>
@@ -121,7 +121,7 @@
         <w:spacing w:after="120"/>
       </w:pPr>
       <w:r>
-        <w:t xml:space="preserve">Sieben Module (0–6) greifen auf ein gemeinsames Datenmodell zu (das „Wandelement”). Modul 1 erzeugt es; alle weiteren Module lesen es. So bleibt die Planung über alle Gewerke konsistent.</w:t>
+        <w:t xml:space="preserve">Sieben Module (0–6) greifen auf ein gemeinsames Datenmodell zu (das „Wandelement”). Modul 0 legt ein Element mit Wandtyp an; Modul 1 erzeugt daraus die geprüfte Wandgeometrie. Alle weiteren Module lesen das Wandelement. So bleibt die Planung über alle Gewerke konsistent.</w:t>
       </w:r>
     </w:p>
     <w:p>
@@ -137,7 +137,7 @@
         <w:spacing w:after="120"/>
       </w:pPr>
       <w:r>
-        <w:t xml:space="preserve">Dieses Handbuch richtet sich an (a) Statiker, die die Berechnungsansätze prüfen wollen (Kap. 5 + 9), und (b) das interne Entwicklungsteam, das die Suite ohne Programmier-Hintergrund weiterentwickelt (Kap. 4 + 13).</w:t>
+        <w:t xml:space="preserve">Dieses Handbuch richtet sich an (a) Statiker, die die Berechnungsansätze prüfen wollen (Kap. 5 + 9), und (b) das interne Entwicklungsteam, das die Suite ohne Programmier-Hintergrund weiterentwickelt (Kap. 4 + 13). Kapitel 15 ist die verbindliche fachliche Grundlage: Planung, Fehlerkorrekturen und Weiterentwicklung müssen auf ausdrücklich benannten Regeln beruhen.</w:t>
       </w:r>
     </w:p>
     <w:p>
@@ -1574,7 +1574,19 @@
         <w:spacing w:after="120"/>
       </w:pPr>
       <w:r>
-        <w:t xml:space="preserve">Vorspannstränge sitzen auf den Kammerachsen (x = 62,5 + 125·k). Pro durchgehend gefülltem vertikalen Abschnitt entsteht ein Strang-Segment. Über/unter Öffnungen wird der Strang unterbrochen (mehrere Segmente). Nur durchgehende Stränge (volle Wandhöhe) zählen statisch. Für Sonderkonstruktionen können die Achsen in Modul 1 manuell gesetzt werden (prestress.columns_grid) – dann gilt exakt dieser Achsen-Satz.</w:t>
+        <w:t xml:space="preserve">Vorspannstränge sitzen auf den Kammerachsen (x = 62,5 + 125·k). Pro durchgehend gefülltem vertikalen Abschnitt entsteht ein Strang-Segment. Über/unter Öffnungen wird der Strang unterbrochen (mehrere Segmente). Nur durchgehende Stränge (volle Wandhöhe) zählen statisch. Die Auto-Verteilung besitzt eine wählbare Startachse (1. oder 2. Rasterachse), verteilt danach balanciert und hält den maximalen Achsabstand ein. Für Sonderkonstruktionen können die Achsen in Modul 1 manuell gesetzt werden (prestress.columns_grid) – dann gilt exakt dieser Achsen-Satz.</w:t>
+      </w:r>
+    </w:p>
+    <w:p>
+      <w:pPr>
+        <w:pBdr>
+          <w:left w:val="single" w:color="E0B400" w:sz="18" w:space="6"/>
+        </w:pBdr>
+        <w:shd w:fill="FFF8E6" w:val="clear"/>
+        <w:spacing w:after="120" w:before="80"/>
+      </w:pPr>
+      <w:r>
+        <w:t xml:space="preserve">Neu bestätigte Zielregeln: Jeder Stein muss von mindestens einer Spannachse gehalten werden; in der untersten Steinreihe sollen automatisch gesetzte Achsen möglichst mittig in i3-Steinen liegen. Diese Muss-/Optimierungsregeln gehen der bloßen Abstandsverteilung vor. Die vollständige Implementierung und Regressionstests sind noch als offener Entwicklungsstand gekennzeichnet (Kap. 15.2).</w:t>
       </w:r>
     </w:p>
     <w:p>
@@ -2504,7 +2516,7 @@
                 <w:sz w:val="20"/>
                 <w:szCs w:val="20"/>
               </w:rPr>
-              <w:t xml:space="preserve">prestress</w:t>
+              <w:t xml:space="preserve">wandtyp</w:t>
             </w:r>
           </w:p>
         </w:tc>
@@ -2533,7 +2545,7 @@
                 <w:sz w:val="20"/>
                 <w:szCs w:val="20"/>
               </w:rPr>
-              <w:t xml:space="preserve">{max_span_grid, force_kN, rod_mm, blech_mm, top_connection, columns_grid}</w:t>
+              <w:t xml:space="preserve">mit_wind | ohne_wind; wird ausschließlich in Modul 0 gewählt</w:t>
             </w:r>
           </w:p>
         </w:tc>
@@ -2565,7 +2577,7 @@
                 <w:sz w:val="20"/>
                 <w:szCs w:val="20"/>
               </w:rPr>
-              <w:t xml:space="preserve">bom</w:t>
+              <w:t xml:space="preserve">prestress</w:t>
             </w:r>
           </w:p>
         </w:tc>
@@ -2594,7 +2606,7 @@
                 <w:sz w:val="20"/>
                 <w:szCs w:val="20"/>
               </w:rPr>
-              <w:t xml:space="preserve">i2/i3, gewindestangen, verbindungsmuttern, senkkopfschrauben, kopplungsmuttern_basis, spannplatten, spannmuttern, stahlblech_module/_mm, stossfugen, dichtstreifen_mm, verschnitt_mm</w:t>
+              <w:t xml:space="preserve">{max_span_grid, start_axis_grid, force_kN, rod_mm, blech_mm, top_connection, columns_grid}</w:t>
             </w:r>
           </w:p>
         </w:tc>
@@ -2626,7 +2638,7 @@
                 <w:sz w:val="20"/>
                 <w:szCs w:val="20"/>
               </w:rPr>
-              <w:t xml:space="preserve">validation</w:t>
+              <w:t xml:space="preserve">bom</w:t>
             </w:r>
           </w:p>
         </w:tc>
@@ -2655,7 +2667,7 @@
                 <w:sz w:val="20"/>
                 <w:szCs w:val="20"/>
               </w:rPr>
-              <w:t xml:space="preserve">{buildable, versatz_ok, versatz_violations, …}</w:t>
+              <w:t xml:space="preserve">i2/i3, gewindestangen, verbindungsmuttern, senkkopfschrauben, kopplungsmuttern_basis, spannplatten, spannmuttern, stahlblech_module/_mm, stossfugen, dichtstreifen_mm, verschnitt_mm</w:t>
             </w:r>
           </w:p>
         </w:tc>
@@ -2687,6 +2699,67 @@
                 <w:sz w:val="20"/>
                 <w:szCs w:val="20"/>
               </w:rPr>
+              <w:t xml:space="preserve">validation</w:t>
+            </w:r>
+          </w:p>
+        </w:tc>
+        <w:tc>
+          <w:tcPr>
+            <w:tcW w:type="dxa" w:w="5960"/>
+            <w:tcBorders>
+              <w:top w:val="single" w:color="CCCCCC" w:sz="1"/>
+              <w:left w:val="single" w:color="CCCCCC" w:sz="1"/>
+              <w:bottom w:val="single" w:color="CCCCCC" w:sz="1"/>
+              <w:right w:val="single" w:color="CCCCCC" w:sz="1"/>
+            </w:tcBorders>
+            <w:tcMar>
+              <w:top w:type="dxa" w:w="60"/>
+              <w:left w:type="dxa" w:w="110"/>
+              <w:bottom w:type="dxa" w:w="60"/>
+              <w:right w:type="dxa" w:w="110"/>
+            </w:tcMar>
+          </w:tcPr>
+          <w:p>
+            <w:r>
+              <w:rPr>
+                <w:b w:val="false"/>
+                <w:bCs w:val="false"/>
+                <w:color w:val="1C2430"/>
+                <w:sz w:val="20"/>
+                <w:szCs w:val="20"/>
+              </w:rPr>
+              <w:t xml:space="preserve">{buildable, versatz_ok, versatz_violations, …}</w:t>
+            </w:r>
+          </w:p>
+        </w:tc>
+      </w:tr>
+      <w:tr>
+        <w:tc>
+          <w:tcPr>
+            <w:tcW w:type="dxa" w:w="3400"/>
+            <w:tcBorders>
+              <w:top w:val="single" w:color="CCCCCC" w:sz="1"/>
+              <w:left w:val="single" w:color="CCCCCC" w:sz="1"/>
+              <w:bottom w:val="single" w:color="CCCCCC" w:sz="1"/>
+              <w:right w:val="single" w:color="CCCCCC" w:sz="1"/>
+            </w:tcBorders>
+            <w:tcMar>
+              <w:top w:type="dxa" w:w="60"/>
+              <w:left w:type="dxa" w:w="110"/>
+              <w:bottom w:type="dxa" w:w="60"/>
+              <w:right w:type="dxa" w:w="110"/>
+            </w:tcMar>
+          </w:tcPr>
+          <w:p>
+            <w:r>
+              <w:rPr>
+                <w:rFonts w:ascii="Consolas" w:cs="Consolas" w:eastAsia="Consolas" w:hAnsi="Consolas"/>
+                <w:b w:val="false"/>
+                <w:bCs w:val="false"/>
+                <w:color w:val="0B3A73"/>
+                <w:sz w:val="20"/>
+                <w:szCs w:val="20"/>
+              </w:rPr>
               <w:t xml:space="preserve">verification</w:t>
             </w:r>
           </w:p>
@@ -2727,7 +2800,7 @@
         <w:pStyle w:val="Heading2"/>
       </w:pPr>
       <w:r>
-        <w:t xml:space="preserve">3.1 Zustand (localStorage) &amp; Projekt-Bundle</w:t>
+        <w:t xml:space="preserve">3.1 Zustand (localStorage), Eingaben &amp; Projektdatei</w:t>
       </w:r>
     </w:p>
     <w:p>
@@ -2735,7 +2808,7 @@
         <w:spacing w:after="120"/>
       </w:pPr>
       <w:r>
-        <w:t xml:space="preserve">Im laufenden Betrieb wird nichts hin- und hergeschoben: Das aktive Wandelement liegt im localStorage des Browsers, und alle Module lesen genau dieses eine Element (Modul 0 verwaltet die Liste). Für bewusstes Sichern/Weitergeben gibt es zusätzlich den Datei-Export – als reines Wandelement-JSON oder als mitwachsendes Bundle:</w:t>
+        <w:t xml:space="preserve">Im laufenden Betrieb liegt das aktive Wandelement im localStorage des Browsers; Modul 0 verwaltet die Liste. Der zugehörige Bearbeitungsstand steht im Block eingaben = {projekt, aufbau, kosten, statik, katalog}. Jedes Modul schreibt ausschließlich seinen eigenen Eingaben-Abschnitt; abgeleitete Planungsergebnisse werden stets frisch berechnet und nicht als Schattenkopien gespeichert.</w:t>
       </w:r>
     </w:p>
     <w:p>
@@ -2753,7 +2826,7 @@
           <w:sz w:val="20"/>
           <w:szCs w:val="20"/>
         </w:rPr>
-        <w:t xml:space="preserve">{ "format":"SEMBLA-Projekt", "wandelement":{…}, "verbinder_layout":{…} }</w:t>
+        <w:t xml:space="preserve">{ "format":"SEMBLA-Projekt", "version":2, "name":"…", "wandelement":{…}, "eingaben":{…} }</w:t>
       </w:r>
     </w:p>
     <w:p>
@@ -2761,7 +2834,15 @@
         <w:spacing w:after="120"/>
       </w:pPr>
       <w:r>
-        <w:t xml:space="preserve">Das Bundle ist das Austausch-Dateiformat der Suite. Modul 1 exportiert es, Modul 2 (Horizontaler Wandaufbau) reichert es um verbinder_layout (inkl. Beplankungsfeld) an, die Stückliste (Modul 4) liest beides aus einer Datei. Alle Module akzeptieren beim Datei-Import wahlweise ein Bundle oder ein blankes Wandelement und entpacken es selbst – daher je ein Export-Button (Projekt-Bundle) und einheitliche Lade-Buttons „… / Bundle laden”. Der Datei-Import lädt nur in die Ansicht bzw. legt (in Modul 0) ein neues Element an; er verändert kein fremdes Element.</w:t>
+        <w:t xml:space="preserve">Import und Export sind zentral in Modul 0. Ein Häkchen-Dialog erzeugt ein ZIP mit der Projektdatei und den gewählten Dokumenten (Stückliste/Zuschnitt, Montageanleitung, statischer Nachweis und IFC). Die einzelnen Fachmodule besitzen keine eigenen Datei-Buttons. Das interne localStorage-Schema, das öffentliche Projektformat und das separate Katalogformat sind voneinander unabhängige Versionsachsen.</w:t>
+      </w:r>
+    </w:p>
+    <w:p>
+      <w:pPr>
+        <w:spacing w:after="120"/>
+      </w:pPr>
+      <w:r>
+        <w:t xml:space="preserve">Der Bauteilkatalog ist eine eigene Ressource im Format SEMBLA-Bauteilkatalog v1. Im Projekt werden nur Quelle und ausgewählte Produkt-IDs referenziert; Produktmaße und Preise werden nicht in das Wandelement eingebettet. Fehlende Referenzen werden sichtbar gewarnt.</w:t>
       </w:r>
     </w:p>
     <w:p>
@@ -3274,7 +3355,7 @@
                 <w:sz w:val="20"/>
                 <w:szCs w:val="20"/>
               </w:rPr>
-              <w:t xml:space="preserve">IFC-Export</w:t>
+              <w:t xml:space="preserve">Horizontaler Aufbau</w:t>
             </w:r>
           </w:p>
         </w:tc>
@@ -3303,7 +3384,7 @@
                 <w:sz w:val="20"/>
                 <w:szCs w:val="20"/>
               </w:rPr>
-              <w:t xml:space="preserve">docs/shared/sembla-ifc.js</w:t>
+              <w:t xml:space="preserve">docs/shared/sembla-aufbau.js</w:t>
             </w:r>
           </w:p>
         </w:tc>
@@ -3332,7 +3413,7 @@
                 <w:sz w:val="20"/>
                 <w:szCs w:val="20"/>
               </w:rPr>
-              <w:t xml:space="preserve">Wandelement → IFC4 (Wand + Öffnungen + Steine, optional echte Steingeometrie als FacetedBrep).</w:t>
+              <w:t xml:space="preserve">kanonische Verbinderachsen und Latten-Zuschnitte aus Wandelement und eingaben.aufbau.</w:t>
             </w:r>
           </w:p>
         </w:tc>
@@ -3363,7 +3444,7 @@
                 <w:sz w:val="20"/>
                 <w:szCs w:val="20"/>
               </w:rPr>
-              <w:t xml:space="preserve">Zustand &amp; Kopfleiste</w:t>
+              <w:t xml:space="preserve">Montage</w:t>
             </w:r>
           </w:p>
         </w:tc>
@@ -3392,7 +3473,7 @@
                 <w:sz w:val="20"/>
                 <w:szCs w:val="20"/>
               </w:rPr>
-              <w:t xml:space="preserve">docs/shared/storage.js · navbar.js</w:t>
+              <w:t xml:space="preserve">docs/shared/sembla-montage.js</w:t>
             </w:r>
           </w:p>
         </w:tc>
@@ -3421,7 +3502,7 @@
                 <w:sz w:val="20"/>
                 <w:szCs w:val="20"/>
               </w:rPr>
-              <w:t xml:space="preserve">localStorage-Schicht (Elemente, aktiv-Zeiger, OBJ) + gemeinsame Navigation.</w:t>
+              <w:t xml:space="preserve">Montageereignisse, Baugruppenabschnitte und A4-Seiten aus realen Spannsegmenten; gemeinsame Quelle für Modul 5 und Export.</w:t>
             </w:r>
           </w:p>
         </w:tc>
@@ -3452,6 +3533,362 @@
                 <w:sz w:val="20"/>
                 <w:szCs w:val="20"/>
               </w:rPr>
+              <w:t xml:space="preserve">Zentraler Export</w:t>
+            </w:r>
+          </w:p>
+        </w:tc>
+        <w:tc>
+          <w:tcPr>
+            <w:tcW w:type="dxa" w:w="3400"/>
+            <w:tcBorders>
+              <w:top w:val="single" w:color="CCCCCC" w:sz="1"/>
+              <w:left w:val="single" w:color="CCCCCC" w:sz="1"/>
+              <w:bottom w:val="single" w:color="CCCCCC" w:sz="1"/>
+              <w:right w:val="single" w:color="CCCCCC" w:sz="1"/>
+            </w:tcBorders>
+            <w:tcMar>
+              <w:top w:type="dxa" w:w="60"/>
+              <w:left w:type="dxa" w:w="110"/>
+              <w:bottom w:type="dxa" w:w="60"/>
+              <w:right w:type="dxa" w:w="110"/>
+            </w:tcMar>
+          </w:tcPr>
+          <w:p>
+            <w:r>
+              <w:rPr>
+                <w:b w:val="false"/>
+                <w:bCs w:val="false"/>
+                <w:color w:val="1C2430"/>
+                <w:sz w:val="20"/>
+                <w:szCs w:val="20"/>
+              </w:rPr>
+              <w:t xml:space="preserve">docs/shared/sembla-export.js · zip.js</w:t>
+            </w:r>
+          </w:p>
+        </w:tc>
+        <w:tc>
+          <w:tcPr>
+            <w:tcW w:type="dxa" w:w="3860"/>
+            <w:tcBorders>
+              <w:top w:val="single" w:color="CCCCCC" w:sz="1"/>
+              <w:left w:val="single" w:color="CCCCCC" w:sz="1"/>
+              <w:bottom w:val="single" w:color="CCCCCC" w:sz="1"/>
+              <w:right w:val="single" w:color="CCCCCC" w:sz="1"/>
+            </w:tcBorders>
+            <w:tcMar>
+              <w:top w:type="dxa" w:w="60"/>
+              <w:left w:type="dxa" w:w="110"/>
+              <w:bottom w:type="dxa" w:w="60"/>
+              <w:right w:type="dxa" w:w="110"/>
+            </w:tcMar>
+          </w:tcPr>
+          <w:p>
+            <w:r>
+              <w:rPr>
+                <w:b w:val="false"/>
+                <w:bCs w:val="false"/>
+                <w:color w:val="1C2430"/>
+                <w:sz w:val="20"/>
+                <w:szCs w:val="20"/>
+              </w:rPr>
+              <w:t xml:space="preserve">Projekt und ausgewählte Dokumente als ZIP; Nachweis aus dem vollen Schermer-Modell.</w:t>
+            </w:r>
+          </w:p>
+        </w:tc>
+      </w:tr>
+      <w:tr>
+        <w:tc>
+          <w:tcPr>
+            <w:tcW w:type="dxa" w:w="2100"/>
+            <w:tcBorders>
+              <w:top w:val="single" w:color="CCCCCC" w:sz="1"/>
+              <w:left w:val="single" w:color="CCCCCC" w:sz="1"/>
+              <w:bottom w:val="single" w:color="CCCCCC" w:sz="1"/>
+              <w:right w:val="single" w:color="CCCCCC" w:sz="1"/>
+            </w:tcBorders>
+            <w:tcMar>
+              <w:top w:type="dxa" w:w="60"/>
+              <w:left w:type="dxa" w:w="110"/>
+              <w:bottom w:type="dxa" w:w="60"/>
+              <w:right w:type="dxa" w:w="110"/>
+            </w:tcMar>
+          </w:tcPr>
+          <w:p>
+            <w:r>
+              <w:rPr>
+                <w:b w:val="false"/>
+                <w:bCs w:val="false"/>
+                <w:color w:val="1C2430"/>
+                <w:sz w:val="20"/>
+                <w:szCs w:val="20"/>
+              </w:rPr>
+              <w:t xml:space="preserve">Bauteilkatalog</w:t>
+            </w:r>
+          </w:p>
+        </w:tc>
+        <w:tc>
+          <w:tcPr>
+            <w:tcW w:type="dxa" w:w="3400"/>
+            <w:tcBorders>
+              <w:top w:val="single" w:color="CCCCCC" w:sz="1"/>
+              <w:left w:val="single" w:color="CCCCCC" w:sz="1"/>
+              <w:bottom w:val="single" w:color="CCCCCC" w:sz="1"/>
+              <w:right w:val="single" w:color="CCCCCC" w:sz="1"/>
+            </w:tcBorders>
+            <w:tcMar>
+              <w:top w:type="dxa" w:w="60"/>
+              <w:left w:type="dxa" w:w="110"/>
+              <w:bottom w:type="dxa" w:w="60"/>
+              <w:right w:type="dxa" w:w="110"/>
+            </w:tcMar>
+          </w:tcPr>
+          <w:p>
+            <w:r>
+              <w:rPr>
+                <w:b w:val="false"/>
+                <w:bCs w:val="false"/>
+                <w:color w:val="1C2430"/>
+                <w:sz w:val="20"/>
+                <w:szCs w:val="20"/>
+              </w:rPr>
+              <w:t xml:space="preserve">docs/shared/sembla-katalog.js</w:t>
+            </w:r>
+          </w:p>
+        </w:tc>
+        <w:tc>
+          <w:tcPr>
+            <w:tcW w:type="dxa" w:w="3860"/>
+            <w:tcBorders>
+              <w:top w:val="single" w:color="CCCCCC" w:sz="1"/>
+              <w:left w:val="single" w:color="CCCCCC" w:sz="1"/>
+              <w:bottom w:val="single" w:color="CCCCCC" w:sz="1"/>
+              <w:right w:val="single" w:color="CCCCCC" w:sz="1"/>
+            </w:tcBorders>
+            <w:tcMar>
+              <w:top w:type="dxa" w:w="60"/>
+              <w:left w:type="dxa" w:w="110"/>
+              <w:bottom w:type="dxa" w:w="60"/>
+              <w:right w:type="dxa" w:w="110"/>
+            </w:tcMar>
+          </w:tcPr>
+          <w:p>
+            <w:r>
+              <w:rPr>
+                <w:b w:val="false"/>
+                <w:bCs w:val="false"/>
+                <w:color w:val="1C2430"/>
+                <w:sz w:val="20"/>
+                <w:szCs w:val="20"/>
+              </w:rPr>
+              <w:t xml:space="preserve">separate, versionierte Produktressource mit Validierung und Referenzprüfung.</w:t>
+            </w:r>
+          </w:p>
+        </w:tc>
+      </w:tr>
+      <w:tr>
+        <w:tc>
+          <w:tcPr>
+            <w:tcW w:type="dxa" w:w="2100"/>
+            <w:tcBorders>
+              <w:top w:val="single" w:color="CCCCCC" w:sz="1"/>
+              <w:left w:val="single" w:color="CCCCCC" w:sz="1"/>
+              <w:bottom w:val="single" w:color="CCCCCC" w:sz="1"/>
+              <w:right w:val="single" w:color="CCCCCC" w:sz="1"/>
+            </w:tcBorders>
+            <w:tcMar>
+              <w:top w:type="dxa" w:w="60"/>
+              <w:left w:type="dxa" w:w="110"/>
+              <w:bottom w:type="dxa" w:w="60"/>
+              <w:right w:type="dxa" w:w="110"/>
+            </w:tcMar>
+          </w:tcPr>
+          <w:p>
+            <w:r>
+              <w:rPr>
+                <w:b w:val="false"/>
+                <w:bCs w:val="false"/>
+                <w:color w:val="1C2430"/>
+                <w:sz w:val="20"/>
+                <w:szCs w:val="20"/>
+              </w:rPr>
+              <w:t xml:space="preserve">IFC-Export</w:t>
+            </w:r>
+          </w:p>
+        </w:tc>
+        <w:tc>
+          <w:tcPr>
+            <w:tcW w:type="dxa" w:w="3400"/>
+            <w:tcBorders>
+              <w:top w:val="single" w:color="CCCCCC" w:sz="1"/>
+              <w:left w:val="single" w:color="CCCCCC" w:sz="1"/>
+              <w:bottom w:val="single" w:color="CCCCCC" w:sz="1"/>
+              <w:right w:val="single" w:color="CCCCCC" w:sz="1"/>
+            </w:tcBorders>
+            <w:tcMar>
+              <w:top w:type="dxa" w:w="60"/>
+              <w:left w:type="dxa" w:w="110"/>
+              <w:bottom w:type="dxa" w:w="60"/>
+              <w:right w:type="dxa" w:w="110"/>
+            </w:tcMar>
+          </w:tcPr>
+          <w:p>
+            <w:r>
+              <w:rPr>
+                <w:b w:val="false"/>
+                <w:bCs w:val="false"/>
+                <w:color w:val="1C2430"/>
+                <w:sz w:val="20"/>
+                <w:szCs w:val="20"/>
+              </w:rPr>
+              <w:t xml:space="preserve">docs/shared/sembla-ifc.js</w:t>
+            </w:r>
+          </w:p>
+        </w:tc>
+        <w:tc>
+          <w:tcPr>
+            <w:tcW w:type="dxa" w:w="3860"/>
+            <w:tcBorders>
+              <w:top w:val="single" w:color="CCCCCC" w:sz="1"/>
+              <w:left w:val="single" w:color="CCCCCC" w:sz="1"/>
+              <w:bottom w:val="single" w:color="CCCCCC" w:sz="1"/>
+              <w:right w:val="single" w:color="CCCCCC" w:sz="1"/>
+            </w:tcBorders>
+            <w:tcMar>
+              <w:top w:type="dxa" w:w="60"/>
+              <w:left w:type="dxa" w:w="110"/>
+              <w:bottom w:type="dxa" w:w="60"/>
+              <w:right w:type="dxa" w:w="110"/>
+            </w:tcMar>
+          </w:tcPr>
+          <w:p>
+            <w:r>
+              <w:rPr>
+                <w:b w:val="false"/>
+                <w:bCs w:val="false"/>
+                <w:color w:val="1C2430"/>
+                <w:sz w:val="20"/>
+                <w:szCs w:val="20"/>
+              </w:rPr>
+              <w:t xml:space="preserve">Wandelement → IFC4 (Wand + Öffnungen + Steine, optional echte Steingeometrie als FacetedBrep).</w:t>
+            </w:r>
+          </w:p>
+        </w:tc>
+      </w:tr>
+      <w:tr>
+        <w:tc>
+          <w:tcPr>
+            <w:tcW w:type="dxa" w:w="2100"/>
+            <w:tcBorders>
+              <w:top w:val="single" w:color="CCCCCC" w:sz="1"/>
+              <w:left w:val="single" w:color="CCCCCC" w:sz="1"/>
+              <w:bottom w:val="single" w:color="CCCCCC" w:sz="1"/>
+              <w:right w:val="single" w:color="CCCCCC" w:sz="1"/>
+            </w:tcBorders>
+            <w:tcMar>
+              <w:top w:type="dxa" w:w="60"/>
+              <w:left w:type="dxa" w:w="110"/>
+              <w:bottom w:type="dxa" w:w="60"/>
+              <w:right w:type="dxa" w:w="110"/>
+            </w:tcMar>
+          </w:tcPr>
+          <w:p>
+            <w:r>
+              <w:rPr>
+                <w:b w:val="false"/>
+                <w:bCs w:val="false"/>
+                <w:color w:val="1C2430"/>
+                <w:sz w:val="20"/>
+                <w:szCs w:val="20"/>
+              </w:rPr>
+              <w:t xml:space="preserve">Zustand &amp; Kopfleiste</w:t>
+            </w:r>
+          </w:p>
+        </w:tc>
+        <w:tc>
+          <w:tcPr>
+            <w:tcW w:type="dxa" w:w="3400"/>
+            <w:tcBorders>
+              <w:top w:val="single" w:color="CCCCCC" w:sz="1"/>
+              <w:left w:val="single" w:color="CCCCCC" w:sz="1"/>
+              <w:bottom w:val="single" w:color="CCCCCC" w:sz="1"/>
+              <w:right w:val="single" w:color="CCCCCC" w:sz="1"/>
+            </w:tcBorders>
+            <w:tcMar>
+              <w:top w:type="dxa" w:w="60"/>
+              <w:left w:type="dxa" w:w="110"/>
+              <w:bottom w:type="dxa" w:w="60"/>
+              <w:right w:type="dxa" w:w="110"/>
+            </w:tcMar>
+          </w:tcPr>
+          <w:p>
+            <w:r>
+              <w:rPr>
+                <w:b w:val="false"/>
+                <w:bCs w:val="false"/>
+                <w:color w:val="1C2430"/>
+                <w:sz w:val="20"/>
+                <w:szCs w:val="20"/>
+              </w:rPr>
+              <w:t xml:space="preserve">docs/shared/storage.js · navbar.js</w:t>
+            </w:r>
+          </w:p>
+        </w:tc>
+        <w:tc>
+          <w:tcPr>
+            <w:tcW w:type="dxa" w:w="3860"/>
+            <w:tcBorders>
+              <w:top w:val="single" w:color="CCCCCC" w:sz="1"/>
+              <w:left w:val="single" w:color="CCCCCC" w:sz="1"/>
+              <w:bottom w:val="single" w:color="CCCCCC" w:sz="1"/>
+              <w:right w:val="single" w:color="CCCCCC" w:sz="1"/>
+            </w:tcBorders>
+            <w:tcMar>
+              <w:top w:type="dxa" w:w="60"/>
+              <w:left w:type="dxa" w:w="110"/>
+              <w:bottom w:type="dxa" w:w="60"/>
+              <w:right w:type="dxa" w:w="110"/>
+            </w:tcMar>
+          </w:tcPr>
+          <w:p>
+            <w:r>
+              <w:rPr>
+                <w:b w:val="false"/>
+                <w:bCs w:val="false"/>
+                <w:color w:val="1C2430"/>
+                <w:sz w:val="20"/>
+                <w:szCs w:val="20"/>
+              </w:rPr>
+              <w:t xml:space="preserve">localStorage-Schicht (Elemente, Eingaben, Migrationen, Katalog, aktiv-Zeiger, OBJ) + gemeinsame Navigation.</w:t>
+            </w:r>
+          </w:p>
+        </w:tc>
+      </w:tr>
+      <w:tr>
+        <w:tc>
+          <w:tcPr>
+            <w:tcW w:type="dxa" w:w="2100"/>
+            <w:tcBorders>
+              <w:top w:val="single" w:color="CCCCCC" w:sz="1"/>
+              <w:left w:val="single" w:color="CCCCCC" w:sz="1"/>
+              <w:bottom w:val="single" w:color="CCCCCC" w:sz="1"/>
+              <w:right w:val="single" w:color="CCCCCC" w:sz="1"/>
+            </w:tcBorders>
+            <w:tcMar>
+              <w:top w:type="dxa" w:w="60"/>
+              <w:left w:type="dxa" w:w="110"/>
+              <w:bottom w:type="dxa" w:w="60"/>
+              <w:right w:type="dxa" w:w="110"/>
+            </w:tcMar>
+          </w:tcPr>
+          <w:p>
+            <w:r>
+              <w:rPr>
+                <w:b w:val="false"/>
+                <w:bCs w:val="false"/>
+                <w:color w:val="1C2430"/>
+                <w:sz w:val="20"/>
+                <w:szCs w:val="20"/>
+              </w:rPr>
               <w:t xml:space="preserve">Bauteilgeometrie</w:t>
             </w:r>
           </w:p>
@@ -3545,7 +3982,7 @@
         <w:spacing w:after="120"/>
       </w:pPr>
       <w:r>
-        <w:t xml:space="preserve">Jeder Kern und jede Oberfläche ist durch automatisierte Tests abgesichert: Logik-Tests (tests/module/test-*.mjs), Smoke-Tests der HTML-Module unter DOM-Mock (tests/module/smoke_*.mjs), Core-Parität (tests/core/, Python + JS gegen goldene Fixtures) und BOM-Drift-Schutz (test-shared.mjs). npm run test:all fährt alles. Vor jedem Push sollten die betroffenen Tests grün sein.</w:t>
+        <w:t xml:space="preserve">Jeder Kern und jede Oberfläche ist durch automatisierte Tests abgesichert: Logik-Tests (tests/module/test-*.mjs), Smoke-Tests der HTML-Module unter DOM-Mock (tests/module/smoke_*.mjs), Core-Parität (tests/core/, Python + JS gegen goldene Fixtures) und BOM-Drift-Schutz (test-shared.mjs). npm run test:all fährt alles. Vor jedem Push müssen die betroffenen Tests grün sein. Fachliche Regressionstests sollen die verletzte oder ergänzte Regel-ID benennen.</w:t>
       </w:r>
     </w:p>
     <w:p>
@@ -7556,7 +7993,15 @@
         <w:spacing w:after="120"/>
       </w:pPr>
       <w:r>
-        <w:t xml:space="preserve">Einstieg der Suite (index.html): kurze Modulübersicht und Verwaltung der gespeicherten Wandelemente. Ein Element neu anlegen (leer oder aus Datei), das aktive Element wählen/umbenennen, als JSON exportieren oder löschen. Das aktive Wandelement liegt im localStorage des Browsers und ist für alle Module sichtbar; die gemeinsame Kopfleiste zeigt es auf jeder Seite und erlaubt den Wechsel.</w:t>
+        <w:t xml:space="preserve">Einstieg der Suite (index.html): Wandelement mit Name und Wandtyp anlegen, Projekt-Kopfdaten pflegen, aktive Elemente wählen/umbenennen/löschen sowie den zentralen Projektimport/-export ausführen. Der Häkchen-Dialog erzeugt die Projektdatei und ausgewählte Unterlagen als ZIP.</w:t>
+      </w:r>
+    </w:p>
+    <w:p>
+      <w:pPr>
+        <w:spacing w:after="120"/>
+      </w:pPr>
+      <w:r>
+        <w:t xml:space="preserve">Modul 0 verwaltet außerdem den vom Projekt getrennten Bauteilkatalog: Produkte nach Kategorien anlegen, bearbeiten, duplizieren und löschen; Katalog separat importieren/exportieren; mehrere Produkt-IDs je Kategorie für das aktive Projekt auswählen. Unauflösbare Referenzen werden sichtbar gewarnt.</w:t>
       </w:r>
     </w:p>
     <w:p>
@@ -7568,7 +8013,7 @@
         <w:spacing w:after="120" w:before="80"/>
       </w:pPr>
       <w:r>
-        <w:t xml:space="preserve">localStorage ist pro Browser und Gerät und geht bei „Websitedaten löschen” verloren. Der Datei-Export (Modul 0/1) ist daher die Sicherung bzw. der Weg, ein Wandelement weiterzugeben.</w:t>
+        <w:t xml:space="preserve">localStorage ist pro Browser und Gerät und geht bei „Websitedaten löschen” verloren. Der zentrale Export in Modul 0 ist daher die Sicherung bzw. der Weg, ein Projekt weiterzugeben. Der Katalog besitzt einen eigenen Import-/Exportweg und ist nicht Bestandteil des Projekt-ZIP.</w:t>
       </w:r>
     </w:p>
     <w:p>
@@ -7592,7 +8037,7 @@
         <w:spacing w:after="120"/>
       </w:pPr>
       <w:r>
-        <w:t xml:space="preserve">Eingaben: Länge, Höhe, Seiten-Funktionen, Öffnungen (inkl. Durchbrüche per Klick), Horizontallast q_k + gamma_Q, Material (f_cd, C_fd, rho), Gewindestangenlänge, Modus (Auto/Nachweis).</w:t>
+        <w:t xml:space="preserve">Eingaben: Länge, Höhe, Seiten-Funktionen, Öffnungen (inkl. Durchbrüche per Klick), Staffelung, Gewindestangenlänge, Startachse der Vorspannung (1./2. Rasterachse) sowie Auslegungsparameter. Der Wandtyp wird nicht hier gewählt, sondern aus dem in Modul 0 angelegten Element unverändert mitgeführt.</w:t>
       </w:r>
     </w:p>
     <w:p>
@@ -7600,7 +8045,7 @@
         <w:spacing w:after="120"/>
       </w:pPr>
       <w:r>
-        <w:t xml:space="preserve">Ablauf: Verband i3-maximiert, Stränge (mit Segmenten über/unter Öffnungen) abgeleitet, dann Auslegungs-Engine (Kap. 4). Ergebnis: maßstäbliches Wandbild mit ein-/ausblendbarer Bemaßung, Nachweis-Tabelle, Stückliste, Iterationsprotokoll.</w:t>
+        <w:t xml:space="preserve">Ablauf: Verband i3-maximiert, Stränge (mit Segmenten über/unter Öffnungen) regelbasiert abgeleitet, dann Auslegungs-Engine (Kap. 4). Ergebnis ist das automatisch im aktiven Element gespeicherte Wandelement mit maßstäblichem Wandbild und Machbarkeits-/Nachweisinformationen.</w:t>
       </w:r>
     </w:p>
     <w:p>
@@ -7680,7 +8125,7 @@
         <w:t xml:space="preserve">Speichern:</w:t>
       </w:r>
       <w:r>
-        <w:t xml:space="preserve"> „In aktives Wandelement speichern” (localStorage, Single Source für alle Module) und Datei-Export „Projekt-Bundle (JSON)” zum Sichern/Weitergeben.</w:t>
+        <w:t xml:space="preserve"> Änderungen werden automatisch in das aktive Wandelement geschrieben. Ohne aktives Element wird nichts fiktiv angelegt; Modul 1 verweist auf den Start. Datei-Export ausschließlich zentral in Modul 0.</w:t>
       </w:r>
     </w:p>
     <w:p>
@@ -7749,7 +8194,7 @@
         <w:spacing w:after="60"/>
       </w:pPr>
       <w:r>
-        <w:t xml:space="preserve">Zusätzlich an Wandkanten (Randabstand) und an den Öffnungskanten; keine Verbinder innerhalb von Öffnungen.</w:t>
+        <w:t xml:space="preserve">Zusätzlich an Wandkanten; keine Verbinder innerhalb von Öffnungen. An linken/rechten Öffnungskanten wird der bestehende Randabstand eingehalten: Achsen werden auf eine sichere Nut von der Öffnung weg verschoben, dedupliziert und bei unlösbaren Abstandskonflikten sichtbar gewarnt. Oberkanten von Öffnungen sind keine Sperrzone.</w:t>
       </w:r>
     </w:p>
     <w:p>
@@ -7769,7 +8214,7 @@
         <w:t xml:space="preserve">Beplankungsfeld:</w:t>
       </w:r>
       <w:r>
-        <w:t xml:space="preserve"> häufig wird nur ein Teil der Wand beplankt – ein rechteckiges Feld (aufziehen, rastet aufs Panelraster) begrenzt Verbinder und Latten; im Layout als feld_cm exportiert. Standard = ganze Wand.</w:t>
+        <w:t xml:space="preserve"> häufig wird nur ein Teil der Wand beplankt – ein rechteckiges Feld begrenzt Verbinder und Latten. Ein sichtbarer Bearbeitungsmodus zeigt Rasterpunkte, Hover und Vorschau; erst „Übernehmen &amp; berechnen” speichert das Feld und stößt die Berechnung an. Standard = ganze Wand.</w:t>
       </w:r>
     </w:p>
     <w:p>
@@ -7879,7 +8324,7 @@
         <w:spacing w:after="60"/>
       </w:pPr>
       <w:r>
-        <w:t xml:space="preserve">Eingaben: Lattenbreite (4 cm), Stangenlänge (150 cm). Ausgaben: Projekt-Bundle (Wandelement + Verbinder-Layout), Zuschnittliste (CSV). Reiner Konsument – schreibt das Wandelement nicht zurück.</w:t>
+        <w:t xml:space="preserve">Eingaben werden in eingaben.aufbau gespeichert. Die Berechnung ist kanonisch in sembla-aufbau.js; Exportdokumente werden zentral in Modul 0 erzeugt. Modul 2 schreibt das Wandelement nicht zurück.</w:t>
       </w:r>
     </w:p>
     <w:p>
@@ -7908,7 +8353,7 @@
         <w:spacing w:after="120"/>
       </w:pPr>
       <w:r>
-        <w:t xml:space="preserve">Eingaben (editierbar wie die Bibliothek der Arbeitsmappe): Geometrie (h, l, t, Öffnungszahl), Material (f_k, γ_w, γ_M, v_Rd, μ_k, γ_M,μ), Gewindestange (Auswahl M8–M20 füllt A_s/f_yk/f_ub), Lasten (Windzone, q_p-Faktor, c_pe,10, Torsituation, γ_Q, DIN-4103-Werte), Vorspannung (Raster e, F0, ΔF, F,inf, γ_P,fav wählbar 1,0–2,0, γ_P,sup), Prüfwerte §6.2, Spannsystem-Bauteile (Steg, Kopf-/Fußplatte, k₂-Werte, Mutter, Auflagerlänge l_P), Deckenwinkel-Abstand.</w:t>
+        <w:t xml:space="preserve">Eingaben (editierbar wie die Bibliothek der Arbeitsmappe): Material, Gewindestange, Lasten, Vorspannung, Prüfwerte §6.2, Spannsystem-Bauteile und Deckenwinkel-Abstand. Geometrie, Öffnungszahl und Wandtyp kommen ausschließlich read-only aus dem aktiven Wandelement; ohne aktives Element wird kein fiktiver Nachweis gerechnet.</w:t>
       </w:r>
     </w:p>
     <w:p>
@@ -7936,7 +8381,7 @@
         <w:t xml:space="preserve">Wandelement-Anbindung:</w:t>
       </w:r>
       <w:r>
-        <w:t xml:space="preserve"> Geometrie und Öffnungszahl werden aus dem aktiven Wandelement (localStorage) übernommen bzw. aus einer geladenen Datei (Kap. 3). Alle Kennwerte sind eigene Ingenieur-Eingaben; das Modul schreibt das Wandelement nicht zurück.</w:t>
+        <w:t xml:space="preserve"> Geometrie, Öffnungszahl und Wandtyp werden ausschließlich aus dem aktiven Wandelement übernommen. Echte Statik-Kennwerte werden unter eingaben.statik gespeichert; das Modul schreibt das Wandelement nicht zurück. Der zentrale Nachweis-Export nutzt dasselbe DOM-freie Parameter-Mapping.</w:t>
       </w:r>
     </w:p>
     <w:p>
@@ -8042,7 +8487,7 @@
         <w:spacing w:after="120"/>
       </w:pPr>
       <w:r>
-        <w:t xml:space="preserve">Zweck: Material-Auszug mit editierbaren Preisen und Export. Kanonische Mengen aus dem aktiven Wandelement über den geteilten BOM-Baustein (docs/shared/sembla-bom.js): Steine, Gewindestangen, Muttern, Platten, Bleche, Dichtstreifen. Mit zusätzlich geladenem Verbinder-Layout/Bundle (aus Modul 2) kommen Verbinder und Latten hinzu. Ausgabe: Summe netto, Anzahl gleicher Wände, €/m² Wandfläche (Öffnungen abgezogen).</w:t>
+        <w:t xml:space="preserve">Zweck: Material-Auszug und Kosten für genau das aktive Wandelement. Kanonische Mengen stammen aus dem Wandelement/BOM und dem unter eingaben.aufbau gespeicherten Aufbau. Preise und Währung liegen unter eingaben.kosten und bleiben beim Projekt-Export/-Import erhalten; eine Mehrfachwand-Mengenlogik gibt es im MVP nicht.</w:t>
       </w:r>
     </w:p>
     <w:p>
@@ -8062,7 +8507,7 @@
         <w:t xml:space="preserve">Export:</w:t>
       </w:r>
       <w:r>
-        <w:t xml:space="preserve"> Excel (xlsx-Bibliothek per CDN – die einzige externe Laufzeit-Abhängigkeit; degradiert ohne Internet sauber auf CSV), CSV, Druck.</w:t>
+        <w:t xml:space="preserve"> Stücklisten-/Zuschnittdateien werden ausschließlich über den zentralen ZIP-Export in Modul 0 erzeugt.</w:t>
       </w:r>
     </w:p>
     <w:p>
@@ -8091,7 +8536,7 @@
         <w:spacing w:after="120"/>
       </w:pPr>
       <w:r>
-        <w:t xml:space="preserve">Zweck: lagenweise Aufbauanleitung mit Vorspann-Schritten und Kurz-Stückliste. Interaktiver Lagen-Viewer (Slider/Streifen mit Strang-Markern), Wandüberblick mit Bemaßung/Raster/Ankern, Vorspann-Hinweise (Stangenlänge, Kopplungshöhen aus rod_mm), komplette druckbare Anleitung. Die Kurz-Stückliste stammt aus demselben BOM-Baustein wie Modul 4. Reiner Konsument des aktiven Wandelements.</w:t>
+        <w:t xml:space="preserve">Zweck: ereignis- und baugruppenbasierte Montageanleitung. Abschnitte werden aus den realen tension_columns[].segments und der lokalen Wandkontur abgeleitet: erste Stange, Kopplung/neue Stange und oberer Abschluss. Steinreihen sind durchgehend nummeriert; eine Kopplung erscheint vor der Steinreihe, die die Stangenoberkante überdeckt, sodass die Stange im Baugruppenbild über die letzte montierte Lage hinausragt. Rechteckige und gestaffelte Bereiche werden in wenigen DIN-A4-Seiten gegliedert. Modul 5 und zentraler Export verwenden dieselbe DOM-freie Ableitung in sembla-montage.js.</w:t>
       </w:r>
     </w:p>
     <w:p>
@@ -8171,7 +8616,7 @@
         <w:spacing w:after="120"/>
       </w:pPr>
       <w:r>
-        <w:t xml:space="preserve">Die häufigsten Anpassungen lassen sich an klar benannten Stellen vornehmen. Es gibt keinen Build-Schritt: docs/ wird direkt editiert und ist nach dem Push sofort live. Wichtig: nach jeder Änderung die betroffenen Tests laufen lassen (npm run test:all).</w:t>
+        <w:t xml:space="preserve">Die häufigsten Anpassungen lassen sich an klar benannten Stellen vornehmen. Fachliche Änderungen beginnen jedoch immer im Regelwerk (Kap. 15): betroffene Regel-ID benennen, Regel ergänzen/ändern, Priorität festlegen, anschließend Implementierung und Regressionstest anpassen. Bei jedem Bug lautet die erste Frage: Welche Regel fehlt, ist unklar oder wurde falsch umgesetzt? Es gibt keinen App-Build-Schritt; docs/ ist nach dem Push sofort live. Das Handbuch selbst wird mit npm run handbuch erzeugt.</w:t>
       </w:r>
     </w:p>
     <w:tbl>
@@ -8685,7 +9130,7 @@
         <w:spacing w:after="120" w:before="80"/>
       </w:pPr>
       <w:r>
-        <w:t xml:space="preserve">Goldene Regel zur Parität: Der Wandaufbau-Kern läuft im Betrieb einmal (docs/shared/sembla-core.js); daneben steht die Python-Referenz tests/core/sembla_core.py nur für die Tests. Wer eine Aufbau-Regel ändert, muss beide Dateien gleich halten; die Paritätstests vergleichen sie über goldene Fixtures. Bei bewussten Änderungen werden die Fixtures neu erzeugt.</w:t>
+        <w:t xml:space="preserve">Goldene Regeln: (1) Der Wandaufbau-Kern läuft im Betrieb einmal (docs/shared/sembla-core.js); die Python-Referenz tests/core/sembla_core.py dient nur den Tests und bleibt bit-genau gleich. (2) build-handbuch.mjs ist die editierbare Handbuchquelle; doku/SEMBLA_Handbuch.docx muss nach Änderungen neu erzeugt und gegen den realen Produktstand geprüft werden.</w:t>
       </w:r>
     </w:p>
     <w:p>
@@ -9464,7 +9909,19 @@
           <w:sz w:val="24"/>
           <w:szCs w:val="24"/>
         </w:rPr>
-        <w:t xml:space="preserve">Vollständiger, nach Themen gegliederter Katalog der im System hinterlegten Regeln. Jede Regel trägt eine Kennung (z. B. [G-1]) zur Referenzierung. Die Regeln sind in den genannten Kernen/Modulen umgesetzt und durch Tests abgesichert.</w:t>
+        <w:t xml:space="preserve">Verbindlicher, nach Themen gegliederter Katalog der Systemregeln. Jede Regel trägt eine dauerhafte Kennung (z. B. [G-1]). Der Status „ZIEL – OFFEN” kennzeichnet bestätigte Regeln, deren Implementierung oder Regressionstests noch fehlen; alle übrigen Regeln müssen in Code und Tests nachweisbar sein.</w:t>
+      </w:r>
+    </w:p>
+    <w:p>
+      <w:pPr>
+        <w:pBdr>
+          <w:left w:val="single" w:color="E0B400" w:sz="18" w:space="6"/>
+        </w:pBdr>
+        <w:shd w:fill="FFF8E6" w:val="clear"/>
+        <w:spacing w:after="120" w:before="80"/>
+      </w:pPr>
+      <w:r>
+        <w:t xml:space="preserve">Hierarchie bei Konflikten: (1) Sicherheit/Baubarkeit und explizite Muss-Regeln, (2) fachliche Abdeckungs- und Anschlussregeln, (3) ausdrücklich gewählte Projektparameter, (4) Optimierung/gleichmäßige Verteilung, (5) Darstellung/Komfort. Nicht gemeinsam erfüllbare Muss-Regeln erzeugen einen sichtbaren Konflikt statt eines stillen Fallbacks.</w:t>
       </w:r>
     </w:p>
     <w:p>
@@ -9697,10 +10154,10 @@
           <w:b/>
           <w:bCs/>
         </w:rPr>
-        <w:t xml:space="preserve">[V-2]</w:t>
-      </w:r>
-      <w:r>
-        <w:t xml:space="preserve"> Vorspannung höchstens alle 3 Raster (MAX_SPAN_GRID = 3 = 375 mm); Regelraster e = 0,375 m.</w:t>
+        <w:t xml:space="preserve">[V-2 · ZIEL – OFFEN]</w:t>
+      </w:r>
+      <w:r>
+        <w:t xml:space="preserve"> Jeder einzelne Stein muss in seinem belegten Höhenabschnitt von mindestens einer Spannachse gehalten werden. Ein eingehaltenes Maximalraster allein beweist diese Steinabdeckung nicht.</w:t>
       </w:r>
     </w:p>
     <w:p>
@@ -9717,10 +10174,10 @@
           <w:b/>
           <w:bCs/>
         </w:rPr>
-        <w:t xml:space="preserve">[V-3]</w:t>
-      </w:r>
-      <w:r>
-        <w:t xml:space="preserve"> Nur durchgehende Stränge (volle Wandhöhe) sind statisch wirksam; über/unter Öffnungen wird der Strang in Segmente unterbrochen.</w:t>
+        <w:t xml:space="preserve">[V-3 · ZIEL – OFFEN]</w:t>
+      </w:r>
+      <w:r>
+        <w:t xml:space="preserve"> In der untersten Steinreihe sollen automatisch gesetzte Spannachsen – nach Erfüllung aller Muss-Regeln – möglichst mittig in den i3-Steinen liegen.</w:t>
       </w:r>
     </w:p>
     <w:p>
@@ -9740,7 +10197,7 @@
         <w:t xml:space="preserve">[V-4]</w:t>
       </w:r>
       <w:r>
-        <w:t xml:space="preserve"> An jeder Stufenkante beidseitig ein Strang (hohe und niedrige Seite).</w:t>
+        <w:t xml:space="preserve"> Vorspannung höchstens alle 3 Raster (MAX_SPAN_GRID = 3 = 375 mm); diese Obergrenze ist zusätzlich zur Steinabdeckung einzuhalten und nicht alleinige Verteilungsregel.</w:t>
       </w:r>
     </w:p>
     <w:p>
@@ -9760,7 +10217,7 @@
         <w:t xml:space="preserve">[V-5]</w:t>
       </w:r>
       <w:r>
-        <w:t xml:space="preserve"> Öffnungen: je Seite +2 zusätzliche Spannstäbe.</w:t>
+        <w:t xml:space="preserve"> Die Auto-Verteilung startet wahlweise auf der 1. oder 2. Rasterachse (prestress.start_axis_grid) und verteilt danach innerhalb der Muss-Regeln balanciert bis zur letzten Achse.</w:t>
       </w:r>
     </w:p>
     <w:p>
@@ -9780,7 +10237,7 @@
         <w:t xml:space="preserve">[V-6]</w:t>
       </w:r>
       <w:r>
-        <w:t xml:space="preserve"> Manuelle Achsen (prestress.columns_grid) überschreiben das Regelraster exakt.</w:t>
+        <w:t xml:space="preserve"> Nur durchgehende Stränge (volle Wandhöhe) sind statisch wirksam; über/unter Öffnungen wird der Strang in Segmente unterbrochen.</w:t>
       </w:r>
     </w:p>
     <w:p>
@@ -9800,15 +10257,7 @@
         <w:t xml:space="preserve">[V-7]</w:t>
       </w:r>
       <w:r>
-        <w:t xml:space="preserve"> Gewindestangen = ceil(h / rod), Verbindungsmuttern = Stangen − 1; ROD-Standard 1100 mm (überschreibbar).</w:t>
-      </w:r>
-    </w:p>
-    <w:p>
-      <w:pPr>
-        <w:pStyle w:val="Heading2"/>
-      </w:pPr>
-      <w:r>
-        <w:t xml:space="preserve">15.3 Anschlüsse &amp; Vorspann-Regime  [A]</w:t>
+        <w:t xml:space="preserve"> An jeder Stufenkante wird beidseitig ein zusätzlicher Strang gesetzt (hohe und niedrige Seite).</w:t>
       </w:r>
     </w:p>
     <w:p>
@@ -9825,10 +10274,10 @@
           <w:b/>
           <w:bCs/>
         </w:rPr>
-        <w:t xml:space="preserve">[A-1]</w:t>
-      </w:r>
-      <w:r>
-        <w:t xml:space="preserve"> Fuß immer Bodenblech (Stahl 15 mm, wandlang, in Blechmodulen); je Strang unten Senkkopfschraube, oben Kopplungsmutter.</w:t>
+        <w:t xml:space="preserve">[V-8]</w:t>
+      </w:r>
+      <w:r>
+        <w:t xml:space="preserve"> Öffnungen erhalten zusätzliche Spannachsen an beiden Seiten; Segmente dürfen nicht durch die Öffnung laufen.</w:t>
       </w:r>
     </w:p>
     <w:p>
@@ -9845,10 +10294,10 @@
           <w:b/>
           <w:bCs/>
         </w:rPr>
-        <w:t xml:space="preserve">[A-2]</w:t>
-      </w:r>
-      <w:r>
-        <w:t xml:space="preserve"> Oberer Anschluss: Kopfblech (Standard) oder Spannplatte je Strang (prestress.top_connection).</w:t>
+        <w:t xml:space="preserve">[V-9]</w:t>
+      </w:r>
+      <w:r>
+        <w:t xml:space="preserve"> Manuelle Achsen (prestress.columns_grid) haben Vorrang vor der Auto-Verteilung, müssen aber als Sonderkonstruktion gegen die Muss-Regeln validiert werden.</w:t>
       </w:r>
     </w:p>
     <w:p>
@@ -9865,10 +10314,18 @@
           <w:b/>
           <w:bCs/>
         </w:rPr>
-        <w:t xml:space="preserve">[A-3]</w:t>
-      </w:r>
-      <w:r>
-        <w:t xml:space="preserve"> Zwischenanker an Segmentenden (Öffnungen) = Spannplatten auf der Steinkante.</w:t>
+        <w:t xml:space="preserve">[V-10]</w:t>
+      </w:r>
+      <w:r>
+        <w:t xml:space="preserve"> Gewindestangen = ceil(h / rod), Verbindungsmuttern = Stangen − 1; ROD-Standard 1100 mm (überschreibbar).</w:t>
+      </w:r>
+    </w:p>
+    <w:p>
+      <w:pPr>
+        <w:pStyle w:val="Heading2"/>
+      </w:pPr>
+      <w:r>
+        <w:t xml:space="preserve">15.3 Anschlüsse &amp; Vorspann-Regime  [A]</w:t>
       </w:r>
     </w:p>
     <w:p>
@@ -9885,10 +10342,10 @@
           <w:b/>
           <w:bCs/>
         </w:rPr>
-        <w:t xml:space="preserve">[A-4]</w:t>
-      </w:r>
-      <w:r>
-        <w:t xml:space="preserve"> Verankerung: Ankerplatte t = 15 mm bzw. Kopplung im Hohlkasten (Flansch ≥ 15 mm).</w:t>
+        <w:t xml:space="preserve">[A-1]</w:t>
+      </w:r>
+      <w:r>
+        <w:t xml:space="preserve"> Fuß immer Bodenblech (Stahl 15 mm, wandlang, in Blechmodulen); je Strang unten Senkkopfschraube, oben Kopplungsmutter.</w:t>
       </w:r>
     </w:p>
     <w:p>
@@ -9905,10 +10362,10 @@
           <w:b/>
           <w:bCs/>
         </w:rPr>
-        <w:t xml:space="preserve">[A-5]</w:t>
-      </w:r>
-      <w:r>
-        <w:t xml:space="preserve"> Nachspann-Regime: F∞ ≥ 15 kN/Stab, Nachspann-Auslösung bei 18 kN/Stab; rechnerische Untergrenze F,inf.</w:t>
+        <w:t xml:space="preserve">[A-2]</w:t>
+      </w:r>
+      <w:r>
+        <w:t xml:space="preserve"> Oberer Anschluss: Kopfblech oder Spannplatte je Strang; der aktuelle Datenstand prestress.top_connection gilt global für die Wand.</w:t>
       </w:r>
     </w:p>
     <w:p>
@@ -9925,10 +10382,10 @@
           <w:b/>
           <w:bCs/>
         </w:rPr>
-        <w:t xml:space="preserve">[A-6]</w:t>
-      </w:r>
-      <w:r>
-        <w:t xml:space="preserve"> Stoßfugen werden gezählt; Dichtstreifen je Fuge 20 cm (Schallschutz), Gesamtlänge in der BOM.</w:t>
+        <w:t xml:space="preserve">[A-3]</w:t>
+      </w:r>
+      <w:r>
+        <w:t xml:space="preserve"> Zwischenanker an Segmentenden (Öffnungen) = Spannplatten auf der Steinkante.</w:t>
       </w:r>
     </w:p>
     <w:p>
@@ -9945,18 +10402,10 @@
           <w:b/>
           <w:bCs/>
         </w:rPr>
-        <w:t xml:space="preserve">[A-7]</w:t>
-      </w:r>
-      <w:r>
-        <w:t xml:space="preserve"> Verzinkung nicht erforderlich (Umweltklasse C1/XC1 innen).</w:t>
-      </w:r>
-    </w:p>
-    <w:p>
-      <w:pPr>
-        <w:pStyle w:val="Heading2"/>
-      </w:pPr>
-      <w:r>
-        <w:t xml:space="preserve">15.4 Horizontaler Wandaufbau – Verbinder &amp; UK (Modul 2)  [U]</w:t>
+        <w:t xml:space="preserve">[A-4]</w:t>
+      </w:r>
+      <w:r>
+        <w:t xml:space="preserve"> Verankerung: Ankerplatte t = 15 mm bzw. Kopplung im Hohlkasten (Flansch ≥ 15 mm).</w:t>
       </w:r>
     </w:p>
     <w:p>
@@ -9973,10 +10422,10 @@
           <w:b/>
           <w:bCs/>
         </w:rPr>
-        <w:t xml:space="preserve">[U-1]</w:t>
-      </w:r>
-      <w:r>
-        <w:t xml:space="preserve"> Verbinder-/UK-Nutenraster = 12,5·k cm (innenliegende Stege); Steinfugen auf diesem Raster sind Fugen, keine Nuten.</w:t>
+        <w:t xml:space="preserve">[A-5]</w:t>
+      </w:r>
+      <w:r>
+        <w:t xml:space="preserve"> Nachspann-Regime: F∞ ≥ 15 kN/Stab, Nachspann-Auslösung bei 18 kN/Stab; rechnerische Untergrenze F,inf.</w:t>
       </w:r>
     </w:p>
     <w:p>
@@ -9993,10 +10442,10 @@
           <w:b/>
           <w:bCs/>
         </w:rPr>
-        <w:t xml:space="preserve">[U-2]</w:t>
-      </w:r>
-      <w:r>
-        <w:t xml:space="preserve"> Vorspannungsraster = 6,25 + 12,5·k cm (Kammermitte, immer innenliegend → durchgehend).</w:t>
+        <w:t xml:space="preserve">[A-6]</w:t>
+      </w:r>
+      <w:r>
+        <w:t xml:space="preserve"> Stoßfugen werden gezählt; Dichtstreifen je Fuge 20 cm (Schallschutz), Gesamtlänge in der BOM.</w:t>
       </w:r>
     </w:p>
     <w:p>
@@ -10013,10 +10462,10 @@
           <w:b/>
           <w:bCs/>
         </w:rPr>
-        <w:t xml:space="preserve">[U-3]</w:t>
-      </w:r>
-      <w:r>
-        <w:t xml:space="preserve"> Verbinder horizontal nur auf einer innenliegenden Nut (nie in einer Stoßfuge).</w:t>
+        <w:t xml:space="preserve">[A-7]</w:t>
+      </w:r>
+      <w:r>
+        <w:t xml:space="preserve"> Verzinkung nicht erforderlich (Umweltklasse C1/XC1 innen).</w:t>
       </w:r>
     </w:p>
     <w:p>
@@ -10033,10 +10482,18 @@
           <w:b/>
           <w:bCs/>
         </w:rPr>
-        <w:t xml:space="preserve">[U-4]</w:t>
-      </w:r>
-      <w:r>
-        <w:t xml:space="preserve"> Verbinder vertikal in Steinmitte (10 + 20·k cm bei 20-cm-Steinen; nie auf einer Lagerfuge).</w:t>
+        <w:t xml:space="preserve">[A-8 · ZIEL – OFFEN]</w:t>
+      </w:r>
+      <w:r>
+        <w:t xml:space="preserve"> Der obere Anschluss muss regional entlang der Wandoberkante festgelegt werden können: Ein Wandelement darf gleichzeitig Bereiche mit Kopfblech und Bereiche mit Spannplatten besitzen. Jeder obere Strang-/Konturabschnitt hat genau eine eindeutige Anschlussart.</w:t>
+      </w:r>
+    </w:p>
+    <w:p>
+      <w:pPr>
+        <w:pStyle w:val="Heading2"/>
+      </w:pPr>
+      <w:r>
+        <w:t xml:space="preserve">15.4 Horizontaler Wandaufbau – Verbinder &amp; UK (Modul 2)  [U]</w:t>
       </w:r>
     </w:p>
     <w:p>
@@ -10053,10 +10510,10 @@
           <w:b/>
           <w:bCs/>
         </w:rPr>
-        <w:t xml:space="preserve">[U-5]</w:t>
-      </w:r>
-      <w:r>
-        <w:t xml:space="preserve"> Panelfugen = Verbinderachsen; Zwischenachsen bei Überschreitung des Max-Abstands; zusätzlich Achsen an Wand- und Öffnungskanten; keine Verbinder in Öffnungen.</w:t>
+        <w:t xml:space="preserve">[U-1]</w:t>
+      </w:r>
+      <w:r>
+        <w:t xml:space="preserve"> Verbinder-/UK-Nutenraster = 12,5·k cm (innenliegende Stege); Steinfugen auf diesem Raster sind Fugen, keine Nuten.</w:t>
       </w:r>
     </w:p>
     <w:p>
@@ -10073,10 +10530,10 @@
           <w:b/>
           <w:bCs/>
         </w:rPr>
-        <w:t xml:space="preserve">[U-6]</w:t>
-      </w:r>
-      <w:r>
-        <w:t xml:space="preserve"> Beplankung volle Wandbreite über Auskragung: äußerste Achse auf nächster Nut, max. Randüberstand 12,5 cm (1 Nut).</w:t>
+        <w:t xml:space="preserve">[U-2]</w:t>
+      </w:r>
+      <w:r>
+        <w:t xml:space="preserve"> Vorspannungsraster = 6,25 + 12,5·k cm (Kammermitte, immer innenliegend → durchgehend).</w:t>
       </w:r>
     </w:p>
     <w:p>
@@ -10093,10 +10550,10 @@
           <w:b/>
           <w:bCs/>
         </w:rPr>
-        <w:t xml:space="preserve">[U-7]</w:t>
-      </w:r>
-      <w:r>
-        <w:t xml:space="preserve"> Beplankungsfeld begrenzt Verbinder/Latten/Dämmung, rastet aufs Panelraster; Verbinder folgen dem Feld auch in der Höhe.</w:t>
+        <w:t xml:space="preserve">[U-3]</w:t>
+      </w:r>
+      <w:r>
+        <w:t xml:space="preserve"> Verbinder horizontal nur auf einer innenliegenden Nut (nie in einer Stoßfuge).</w:t>
       </w:r>
     </w:p>
     <w:p>
@@ -10113,10 +10570,10 @@
           <w:b/>
           <w:bCs/>
         </w:rPr>
-        <w:t xml:space="preserve">[U-8]</w:t>
-      </w:r>
-      <w:r>
-        <w:t xml:space="preserve"> Latten vertikal auf den Achsen, an Öffnungen/Feldrand geschnitten; Stöße mittig zwischen zwei Verbindern; 1D-Zuschnitt mit Reststück-Nutzung.</w:t>
+        <w:t xml:space="preserve">[U-4]</w:t>
+      </w:r>
+      <w:r>
+        <w:t xml:space="preserve"> Verbinder vertikal in Steinmitte (10 + 20·k cm bei 20-cm-Steinen; nie auf einer Lagerfuge).</w:t>
       </w:r>
     </w:p>
     <w:p>
@@ -10133,18 +10590,10 @@
           <w:b/>
           <w:bCs/>
         </w:rPr>
-        <w:t xml:space="preserve">[U-9]</w:t>
-      </w:r>
-      <w:r>
-        <w:t xml:space="preserve"> Verbindertyp folgt Wand-Aufbau/Seite aus Modul 1 (fassade → FA, innenausbau → IA) und ist in Modul 2 nicht neu wählbar.</w:t>
-      </w:r>
-    </w:p>
-    <w:p>
-      <w:pPr>
-        <w:pStyle w:val="Heading2"/>
-      </w:pPr>
-      <w:r>
-        <w:t xml:space="preserve">15.5 Statik (Gutachten Schermer)  [S]</w:t>
+        <w:t xml:space="preserve">[U-5]</w:t>
+      </w:r>
+      <w:r>
+        <w:t xml:space="preserve"> Panelfugen = Verbinderachsen; Zwischenachsen bei Überschreitung des Max-Abstands; keine Verbinder in Öffnungen.</w:t>
       </w:r>
     </w:p>
     <w:p>
@@ -10161,10 +10610,10 @@
           <w:b/>
           <w:bCs/>
         </w:rPr>
-        <w:t xml:space="preserve">[S-1]</w:t>
-      </w:r>
-      <w:r>
-        <w:t xml:space="preserve"> Statisches System: Einfeldträger über die Höhe h, oben und unten gelenkig.</w:t>
+        <w:t xml:space="preserve">[U-6]</w:t>
+      </w:r>
+      <w:r>
+        <w:t xml:space="preserve"> Beplankung volle Wandbreite über Auskragung: äußerste Achse auf nächster Nut, max. Randüberstand 12,5 cm (1 Nut).</w:t>
       </w:r>
     </w:p>
     <w:p>
@@ -10181,10 +10630,10 @@
           <w:b/>
           <w:bCs/>
         </w:rPr>
-        <w:t xml:space="preserve">[S-2]</w:t>
-      </w:r>
-      <w:r>
-        <w:t xml:space="preserve"> Maßgebender Lastfall = MAX(Wind, DIN 4103-1 Kat. I, Kat. II).</w:t>
+        <w:t xml:space="preserve">[U-7]</w:t>
+      </w:r>
+      <w:r>
+        <w:t xml:space="preserve"> Das Beplankungsfeld begrenzt Verbinder und Latten und rastet aufs Panelraster. Änderungen werden in einem sichtbaren Bearbeitungsmodus erst mit „Übernehmen &amp; berechnen” wirksam.</w:t>
       </w:r>
     </w:p>
     <w:p>
@@ -10201,10 +10650,10 @@
           <w:b/>
           <w:bCs/>
         </w:rPr>
-        <w:t xml:space="preserve">[S-3]</w:t>
-      </w:r>
-      <w:r>
-        <w:t xml:space="preserve"> Biegetragfähigkeit m_Rk aus Prüfwerten §6.2 über N_v interpoliert; über den Prüfbereich gekappt + Warnung.</w:t>
+        <w:t xml:space="preserve">[U-8]</w:t>
+      </w:r>
+      <w:r>
+        <w:t xml:space="preserve"> Latten vertikal auf den Achsen, an Öffnungen/Feldrand geschnitten; Stöße mittig zwischen zwei Verbindern; 1D-Zuschnitt mit Reststück-Nutzung.</w:t>
       </w:r>
     </w:p>
     <w:p>
@@ -10221,10 +10670,10 @@
           <w:b/>
           <w:bCs/>
         </w:rPr>
-        <w:t xml:space="preserve">[S-4]</w:t>
-      </w:r>
-      <w:r>
-        <w:t xml:space="preserve"> N_v,fav (günstig) für Biegung; N_v,sup (ungünstig) für Druckrand und Bodenreibung.</w:t>
+        <w:t xml:space="preserve">[U-9]</w:t>
+      </w:r>
+      <w:r>
+        <w:t xml:space="preserve"> Verbindertyp folgt Wand-Aufbau/Seite aus Modul 1 (fassade → FA, innenausbau → IA) und ist in Modul 2 nicht neu wählbar.</w:t>
       </w:r>
     </w:p>
     <w:p>
@@ -10241,10 +10690,18 @@
           <w:b/>
           <w:bCs/>
         </w:rPr>
-        <w:t xml:space="preserve">[S-5]</w:t>
-      </w:r>
-      <w:r>
-        <w:t xml:space="preserve"> γ_M = 2,0 (Wand); γ_s = γ_M2 = 1,25; γ_Q = 1,5; γ_M,μ = 1,5.</w:t>
+        <w:t xml:space="preserve">[U-10]</w:t>
+      </w:r>
+      <w:r>
+        <w:t xml:space="preserve"> An linken/rechten Öffnungskanten gilt der bestehende Randabstand. Betroffene globale Lattenachsen werden auf die nächste sichere Nut von der Öffnung weg verschoben und dedupliziert; die obere Öffnungskante ist keine Sperrzone. Ein unlösbarer Konflikt mit dem Maximalabstand wird sichtbar gemeldet.</w:t>
+      </w:r>
+    </w:p>
+    <w:p>
+      <w:pPr>
+        <w:pStyle w:val="Heading2"/>
+      </w:pPr>
+      <w:r>
+        <w:t xml:space="preserve">15.5 Statik (Gutachten Schermer)  [S]</w:t>
       </w:r>
     </w:p>
     <w:p>
@@ -10261,10 +10718,10 @@
           <w:b/>
           <w:bCs/>
         </w:rPr>
-        <w:t xml:space="preserve">[S-6]</w:t>
-      </w:r>
-      <w:r>
-        <w:t xml:space="preserve"> γ_P,fav frei wählbar 1,0–2,0 (Auswahlhilfe 5.11); γ_P,sup Default 1,1.</w:t>
+        <w:t xml:space="preserve">[S-1]</w:t>
+      </w:r>
+      <w:r>
+        <w:t xml:space="preserve"> Statisches System: Einfeldträger über die Höhe h, oben und unten gelenkig.</w:t>
       </w:r>
     </w:p>
     <w:p>
@@ -10281,10 +10738,10 @@
           <w:b/>
           <w:bCs/>
         </w:rPr>
-        <w:t xml:space="preserve">[S-7]</w:t>
-      </w:r>
-      <w:r>
-        <w:t xml:space="preserve"> Spannsystem: Gewindestangen-Fließen maßgebend; Senkschraube nur Warn-Alternative (nicht in η_max).</w:t>
+        <w:t xml:space="preserve">[S-2]</w:t>
+      </w:r>
+      <w:r>
+        <w:t xml:space="preserve"> Maßgebender Lastfall = MAX(Wind, DIN 4103-1 Kat. I, Kat. II).</w:t>
       </w:r>
     </w:p>
     <w:p>
@@ -10301,10 +10758,10 @@
           <w:b/>
           <w:bCs/>
         </w:rPr>
-        <w:t xml:space="preserve">[S-8]</w:t>
-      </w:r>
-      <w:r>
-        <w:t xml:space="preserve"> η_max,gesamt = MAX(η_Wand, η_Spannsystem) ≤ 1,0 = Nachweis erfüllt.</w:t>
+        <w:t xml:space="preserve">[S-3]</w:t>
+      </w:r>
+      <w:r>
+        <w:t xml:space="preserve"> Biegetragfähigkeit m_Rk aus Prüfwerten §6.2 über N_v interpoliert; über den Prüfbereich gekappt + Warnung.</w:t>
       </w:r>
     </w:p>
     <w:p>
@@ -10321,10 +10778,10 @@
           <w:b/>
           <w:bCs/>
         </w:rPr>
-        <w:t xml:space="preserve">[S-9]</w:t>
-      </w:r>
-      <w:r>
-        <w:t xml:space="preserve"> Deckenwinkel-Anschlusskraft wird an den Stahlbau übergeben (Winkel/Verankerung separat).</w:t>
+        <w:t xml:space="preserve">[S-4]</w:t>
+      </w:r>
+      <w:r>
+        <w:t xml:space="preserve"> N_v,fav (günstig) für Biegung; N_v,sup (ungünstig) für Druckrand und Bodenreibung.</w:t>
       </w:r>
     </w:p>
     <w:p>
@@ -10341,18 +10798,10 @@
           <w:b/>
           <w:bCs/>
         </w:rPr>
-        <w:t xml:space="preserve">[S-10]</w:t>
-      </w:r>
-      <w:r>
-        <w:t xml:space="preserve"> Transport/Hebezustand ist ein separater Spot-Check (nicht Teil des Gutachtens).</w:t>
-      </w:r>
-    </w:p>
-    <w:p>
-      <w:pPr>
-        <w:pStyle w:val="Heading2"/>
-      </w:pPr>
-      <w:r>
-        <w:t xml:space="preserve">15.6 Prozess &amp; Datenmodell  [P]</w:t>
+        <w:t xml:space="preserve">[S-5]</w:t>
+      </w:r>
+      <w:r>
+        <w:t xml:space="preserve"> γ_M = 2,0 (Wand); γ_s = γ_M2 = 1,25; γ_Q = 1,5; γ_M,μ = 1,5.</w:t>
       </w:r>
     </w:p>
     <w:p>
@@ -10369,10 +10818,10 @@
           <w:b/>
           <w:bCs/>
         </w:rPr>
-        <w:t xml:space="preserve">[P-1]</w:t>
-      </w:r>
-      <w:r>
-        <w:t xml:space="preserve"> Das Wandelement ist die Single Source of Truth: Modul 1 erzeugt es, alle übrigen Module lesen es (nur lesend). Es lebt im localStorage; genau ein Element ist aktiv.</w:t>
+        <w:t xml:space="preserve">[S-6]</w:t>
+      </w:r>
+      <w:r>
+        <w:t xml:space="preserve"> γ_P,fav frei wählbar 1,0–2,0 (Auswahlhilfe 5.11); γ_P,sup Default 1,1.</w:t>
       </w:r>
     </w:p>
     <w:p>
@@ -10389,10 +10838,10 @@
           <w:b/>
           <w:bCs/>
         </w:rPr>
-        <w:t xml:space="preserve">[P-2]</w:t>
-      </w:r>
-      <w:r>
-        <w:t xml:space="preserve"> Austausch-Dateiformat = Projekt-Bundle {wandelement, verbinder_layout} oder reines Wandelement-JSON; ein Export-Button, einheitliche Lade-Buttons. Datei-Import verändert kein fremdes Element.</w:t>
+        <w:t xml:space="preserve">[S-7]</w:t>
+      </w:r>
+      <w:r>
+        <w:t xml:space="preserve"> Spannsystem: Gewindestangen-Fließen maßgebend; Senkschraube nur Warn-Alternative (nicht in η_max).</w:t>
       </w:r>
     </w:p>
     <w:p>
@@ -10409,10 +10858,10 @@
           <w:b/>
           <w:bCs/>
         </w:rPr>
-        <w:t xml:space="preserve">[P-3]</w:t>
-      </w:r>
-      <w:r>
-        <w:t xml:space="preserve"> Ein Rechenkern im Betrieb (docs/shared/sembla-core.js); die Python-Referenz (tests/core/) dient nur den Tests und wird bit-genau gleich gehalten (Parität über goldene Fixtures).</w:t>
+        <w:t xml:space="preserve">[S-8]</w:t>
+      </w:r>
+      <w:r>
+        <w:t xml:space="preserve"> η_max,gesamt = MAX(η_Wand, η_Spannsystem) ≤ 1,0 = Nachweis erfüllt.</w:t>
       </w:r>
     </w:p>
     <w:p>
@@ -10429,10 +10878,10 @@
           <w:b/>
           <w:bCs/>
         </w:rPr>
-        <w:t xml:space="preserve">[P-4]</w:t>
-      </w:r>
-      <w:r>
-        <w:t xml:space="preserve"> Referenzsystem: Nullpunkt unten-links-vorne; X = Länge, Y = Wandstärke, Z = Höhe (mm).</w:t>
+        <w:t xml:space="preserve">[S-9]</w:t>
+      </w:r>
+      <w:r>
+        <w:t xml:space="preserve"> Deckenwinkel-Anschlusskraft wird an den Stahlbau übergeben (Winkel/Verankerung separat).</w:t>
       </w:r>
     </w:p>
     <w:p>
@@ -10449,10 +10898,238 @@
           <w:b/>
           <w:bCs/>
         </w:rPr>
+        <w:t xml:space="preserve">[S-10]</w:t>
+      </w:r>
+      <w:r>
+        <w:t xml:space="preserve"> Transport/Hebezustand ist ein separater Spot-Check (nicht Teil des Gutachtens).</w:t>
+      </w:r>
+    </w:p>
+    <w:p>
+      <w:pPr>
+        <w:pStyle w:val="Heading2"/>
+      </w:pPr>
+      <w:r>
+        <w:t xml:space="preserve">15.6 Prozess &amp; Datenmodell  [P]</w:t>
+      </w:r>
+    </w:p>
+    <w:p>
+      <w:pPr>
+        <w:pStyle w:val="ListParagraph"/>
+        <w:numPr>
+          <w:ilvl w:val="0"/>
+          <w:numId w:val="2"/>
+        </w:numPr>
+        <w:spacing w:after="60"/>
+      </w:pPr>
+      <w:r>
+        <w:rPr>
+          <w:b/>
+          <w:bCs/>
+        </w:rPr>
+        <w:t xml:space="preserve">[P-1]</w:t>
+      </w:r>
+      <w:r>
+        <w:t xml:space="preserve"> Das Wandelement ist die Single Source of Truth: Modul 0 legt es einschließlich Wandtyp an, Modul 1 erzeugt/aktualisiert die geprüfte Geometrie, alle anderen Module lesen es nur. Genau ein Element ist aktiv.</w:t>
+      </w:r>
+    </w:p>
+    <w:p>
+      <w:pPr>
+        <w:pStyle w:val="ListParagraph"/>
+        <w:numPr>
+          <w:ilvl w:val="0"/>
+          <w:numId w:val="2"/>
+        </w:numPr>
+        <w:spacing w:after="60"/>
+      </w:pPr>
+      <w:r>
+        <w:rPr>
+          <w:b/>
+          <w:bCs/>
+        </w:rPr>
+        <w:t xml:space="preserve">[P-2]</w:t>
+      </w:r>
+      <w:r>
+        <w:t xml:space="preserve"> Öffentliches Austauschformat = SEMBLA-Projekt v2 mit {name, wandelement, eingaben}. Import und ZIP-Export sind zentral in Modul 0; Fachmodule besitzen keine eigenen Datei-Buttons.</w:t>
+      </w:r>
+    </w:p>
+    <w:p>
+      <w:pPr>
+        <w:pStyle w:val="ListParagraph"/>
+        <w:numPr>
+          <w:ilvl w:val="0"/>
+          <w:numId w:val="2"/>
+        </w:numPr>
+        <w:spacing w:after="60"/>
+      </w:pPr>
+      <w:r>
+        <w:rPr>
+          <w:b/>
+          <w:bCs/>
+        </w:rPr>
+        <w:t xml:space="preserve">[P-3]</w:t>
+      </w:r>
+      <w:r>
+        <w:t xml:space="preserve"> Ein Rechenkern im Betrieb (docs/shared/sembla-core.js); die Python-Referenz (tests/core/) dient nur den Tests und wird bit-genau gleich gehalten (Parität über goldene Fixtures).</w:t>
+      </w:r>
+    </w:p>
+    <w:p>
+      <w:pPr>
+        <w:pStyle w:val="ListParagraph"/>
+        <w:numPr>
+          <w:ilvl w:val="0"/>
+          <w:numId w:val="2"/>
+        </w:numPr>
+        <w:spacing w:after="60"/>
+      </w:pPr>
+      <w:r>
+        <w:rPr>
+          <w:b/>
+          <w:bCs/>
+        </w:rPr>
+        <w:t xml:space="preserve">[P-4]</w:t>
+      </w:r>
+      <w:r>
+        <w:t xml:space="preserve"> Referenzsystem: Nullpunkt unten-links-vorne; X = Länge, Y = Wandstärke, Z = Höhe (mm).</w:t>
+      </w:r>
+    </w:p>
+    <w:p>
+      <w:pPr>
+        <w:pStyle w:val="ListParagraph"/>
+        <w:numPr>
+          <w:ilvl w:val="0"/>
+          <w:numId w:val="2"/>
+        </w:numPr>
+        <w:spacing w:after="60"/>
+      </w:pPr>
+      <w:r>
+        <w:rPr>
+          <w:b/>
+          <w:bCs/>
+        </w:rPr>
         <w:t xml:space="preserve">[P-5]</w:t>
       </w:r>
       <w:r>
-        <w:t xml:space="preserve"> Kein Build-Schritt: docs/ wird direkt editiert und ist nach dem Push sofort live (GitHub Pages). Nach jeder Änderung die betroffenen Tests grün halten (npm run test:all).</w:t>
+        <w:t xml:space="preserve"> Kein App-Build-Schritt: docs/ wird direkt editiert und ist nach dem Push sofort live (GitHub Pages). Nach jeder Änderung die betroffenen Tests grün halten (npm run test:all).</w:t>
+      </w:r>
+    </w:p>
+    <w:p>
+      <w:pPr>
+        <w:pStyle w:val="ListParagraph"/>
+        <w:numPr>
+          <w:ilvl w:val="0"/>
+          <w:numId w:val="2"/>
+        </w:numPr>
+        <w:spacing w:after="60"/>
+      </w:pPr>
+      <w:r>
+        <w:rPr>
+          <w:b/>
+          <w:bCs/>
+        </w:rPr>
+        <w:t xml:space="preserve">[P-6]</w:t>
+      </w:r>
+      <w:r>
+        <w:t xml:space="preserve"> Der gesamte Planungsprozess ist deterministisch und regelbasiert. Abgeleitete Werte werden aus Wandelement, Eingaben und Katalog frisch berechnet; keine gespeicherten Schattenmengen oder stillen Heuristik-Ergebnisse.</w:t>
+      </w:r>
+    </w:p>
+    <w:p>
+      <w:pPr>
+        <w:pStyle w:val="ListParagraph"/>
+        <w:numPr>
+          <w:ilvl w:val="0"/>
+          <w:numId w:val="2"/>
+        </w:numPr>
+        <w:spacing w:after="60"/>
+      </w:pPr>
+      <w:r>
+        <w:rPr>
+          <w:b/>
+          <w:bCs/>
+        </w:rPr>
+        <w:t xml:space="preserve">[P-7]</w:t>
+      </w:r>
+      <w:r>
+        <w:t xml:space="preserve"> Jede fachliche Änderung benennt ihre Regel-ID und aktualisiert Regelwerk, Implementierung und Tests gemeinsam. Bei jedem Bug wird zuerst geklärt, welche Regel fehlt, unklar ist oder falsch umgesetzt wurde.</w:t>
+      </w:r>
+    </w:p>
+    <w:p>
+      <w:pPr>
+        <w:pStyle w:val="ListParagraph"/>
+        <w:numPr>
+          <w:ilvl w:val="0"/>
+          <w:numId w:val="2"/>
+        </w:numPr>
+        <w:spacing w:after="60"/>
+      </w:pPr>
+      <w:r>
+        <w:rPr>
+          <w:b/>
+          <w:bCs/>
+        </w:rPr>
+        <w:t xml:space="preserve">[P-8]</w:t>
+      </w:r>
+      <w:r>
+        <w:t xml:space="preserve"> Handbuchquelle und erzeugtes DOCX werden bei jeder produktrelevanten Änderung geprüft und regelmäßig vollständig gegen Produkt, Issues und Tests auditiert.</w:t>
+      </w:r>
+    </w:p>
+    <w:p>
+      <w:pPr>
+        <w:pStyle w:val="ListParagraph"/>
+        <w:numPr>
+          <w:ilvl w:val="0"/>
+          <w:numId w:val="2"/>
+        </w:numPr>
+        <w:spacing w:after="60"/>
+      </w:pPr>
+      <w:r>
+        <w:rPr>
+          <w:b/>
+          <w:bCs/>
+        </w:rPr>
+        <w:t xml:space="preserve">[P-9]</w:t>
+      </w:r>
+      <w:r>
+        <w:t xml:space="preserve"> Regelkonflikte folgen der dokumentierten Hierarchie. Nicht gemeinsam erfüllbare Muss-Regeln erzeugen einen sichtbaren Konflikt; ein unsicherer Fallback ist unzulässig.</w:t>
+      </w:r>
+    </w:p>
+    <w:p>
+      <w:pPr>
+        <w:pStyle w:val="ListParagraph"/>
+        <w:numPr>
+          <w:ilvl w:val="0"/>
+          <w:numId w:val="2"/>
+        </w:numPr>
+        <w:spacing w:after="60"/>
+      </w:pPr>
+      <w:r>
+        <w:rPr>
+          <w:b/>
+          <w:bCs/>
+        </w:rPr>
+        <w:t xml:space="preserve">[P-10]</w:t>
+      </w:r>
+      <w:r>
+        <w:t xml:space="preserve"> Der Bauteilkatalog ist eine getrennte, versionierte Ressource. Das Projekt referenziert nur ausgewählte Produkt-IDs; fehlende Referenzen werden sichtbar gewarnt.</w:t>
+      </w:r>
+    </w:p>
+    <w:p>
+      <w:pPr>
+        <w:pStyle w:val="ListParagraph"/>
+        <w:numPr>
+          <w:ilvl w:val="0"/>
+          <w:numId w:val="2"/>
+        </w:numPr>
+        <w:spacing w:after="60"/>
+      </w:pPr>
+      <w:r>
+        <w:rPr>
+          <w:b/>
+          <w:bCs/>
+        </w:rPr>
+        <w:t xml:space="preserve">[P-11]</w:t>
+      </w:r>
+      <w:r>
+        <w:t xml:space="preserve"> Wandtyp wird ausschließlich in Modul 0 gewählt; Modul 1 führt ihn unverändert mit, Modul 3 liest ihn einschließlich Geometrie und Öffnungszahl read-only.</w:t>
       </w:r>
     </w:p>
     <w:sectPr>

</xml_diff>

<commit_message>
fix(aufbau): Verbinder lagenweise auf Nuten begrenzen (#29)
</commit_message>
<xml_diff>
--- a/doku/SEMBLA_Handbuch.docx
+++ b/doku/SEMBLA_Handbuch.docx
@@ -8219,56 +8219,6 @@
     </w:p>
     <w:p>
       <w:pPr>
-        <w:pStyle w:val="Heading2"/>
-      </w:pPr>
-      <w:r>
-        <w:t xml:space="preserve">Nachweis je Verbinder</w:t>
-      </w:r>
-    </w:p>
-    <w:p>
-      <w:pPr>
-        <w:pBdr>
-          <w:left w:val="single" w:color="1F6FEB" w:sz="18" w:space="6"/>
-        </w:pBdr>
-        <w:shd w:fill="F4F7FB" w:val="clear"/>
-        <w:spacing w:after="120" w:before="80"/>
-      </w:pPr>
-      <w:r>
-        <w:rPr>
-          <w:rFonts w:ascii="Consolas" w:cs="Consolas" w:eastAsia="Consolas" w:hAnsi="Consolas"/>
-          <w:color w:val="0B3A73"/>
-          <w:sz w:val="20"/>
-          <w:szCs w:val="20"/>
-        </w:rPr>
-        <w:t xml:space="preserve">R_d    = R_k / gamma_M          [kN]   (zul. Zuglast je Verbinder)</w:t>
-      </w:r>
-      <w:r>
-        <w:br/>
-      </w:r>
-      <w:r>
-        <w:rPr>
-          <w:rFonts w:ascii="Consolas" w:cs="Consolas" w:eastAsia="Consolas" w:hAnsi="Consolas"/>
-          <w:color w:val="0B3A73"/>
-          <w:sz w:val="20"/>
-          <w:szCs w:val="20"/>
-        </w:rPr>
-        <w:t xml:space="preserve">coeff  = gamma_Q · w_k          [kN/m²]</w:t>
-      </w:r>
-      <w:r>
-        <w:br/>
-      </w:r>
-      <w:r>
-        <w:rPr>
-          <w:rFonts w:ascii="Consolas" w:cs="Consolas" w:eastAsia="Consolas" w:hAnsi="Consolas"/>
-          <w:color w:val="0B3A73"/>
-          <w:sz w:val="20"/>
-          <w:szCs w:val="20"/>
-        </w:rPr>
-        <w:t xml:space="preserve">A_t    = Feldfläche / Anzahl    A_t / A_tmax ≤ 100 %  (A_tmax = R_d / coeff)</w:t>
-      </w:r>
-    </w:p>
-    <w:p>
-      <w:pPr>
         <w:pStyle w:val="ListParagraph"/>
         <w:numPr>
           <w:ilvl w:val="0"/>
@@ -8277,7 +8227,14 @@
         <w:spacing w:after="60"/>
       </w:pPr>
       <w:r>
-        <w:t xml:space="preserve">Verbinder-Katalog: FA-1 (R_k 0,50), FA-2 schwer (0,80), IA-1 leicht (0,25), Universal (0,50); je gamma_M = 2,0.</w:t>
+        <w:rPr>
+          <w:b/>
+          <w:bCs/>
+        </w:rPr>
+        <w:t xml:space="preserve">Nutprüfung je Lage ([U-11]):</w:t>
+      </w:r>
+      <w:r>
+        <w:t xml:space="preserve"> Aus jeder Achse entsteht ein Verbinder nur in den Lagen, in denen ein tatsächlich vorhandener Stein die Nut strikt innen führt. Stein-Außenkanten (auch an Staffelungs-/Treppenkanten), Stoßfugen und steinfreie Positionen bleiben leer; entfallene Positionen und Achsen ohne Verbinder werden in der Bildunterschrift gewarnt statt durch Ersatzpunkte ersetzt. Fehlt die Lagengeometrie im Wandelement, entstehen keine Verbinder (sicherer Leerfall mit Warnung).</w:t>
       </w:r>
     </w:p>
     <w:p>
@@ -8285,7 +8242,49 @@
         <w:pStyle w:val="Heading2"/>
       </w:pPr>
       <w:r>
-        <w:t xml:space="preserve">Latten</w:t>
+        <w:t xml:space="preserve">Nachweis je Verbinder</w:t>
+      </w:r>
+    </w:p>
+    <w:p>
+      <w:pPr>
+        <w:pBdr>
+          <w:left w:val="single" w:color="1F6FEB" w:sz="18" w:space="6"/>
+        </w:pBdr>
+        <w:shd w:fill="F4F7FB" w:val="clear"/>
+        <w:spacing w:after="120" w:before="80"/>
+      </w:pPr>
+      <w:r>
+        <w:rPr>
+          <w:rFonts w:ascii="Consolas" w:cs="Consolas" w:eastAsia="Consolas" w:hAnsi="Consolas"/>
+          <w:color w:val="0B3A73"/>
+          <w:sz w:val="20"/>
+          <w:szCs w:val="20"/>
+        </w:rPr>
+        <w:t xml:space="preserve">R_d    = R_k / gamma_M          [kN]   (zul. Zuglast je Verbinder)</w:t>
+      </w:r>
+      <w:r>
+        <w:br/>
+      </w:r>
+      <w:r>
+        <w:rPr>
+          <w:rFonts w:ascii="Consolas" w:cs="Consolas" w:eastAsia="Consolas" w:hAnsi="Consolas"/>
+          <w:color w:val="0B3A73"/>
+          <w:sz w:val="20"/>
+          <w:szCs w:val="20"/>
+        </w:rPr>
+        <w:t xml:space="preserve">coeff  = gamma_Q · w_k          [kN/m²]</w:t>
+      </w:r>
+      <w:r>
+        <w:br/>
+      </w:r>
+      <w:r>
+        <w:rPr>
+          <w:rFonts w:ascii="Consolas" w:cs="Consolas" w:eastAsia="Consolas" w:hAnsi="Consolas"/>
+          <w:color w:val="0B3A73"/>
+          <w:sz w:val="20"/>
+          <w:szCs w:val="20"/>
+        </w:rPr>
+        <w:t xml:space="preserve">A_t    = Feldfläche / Anzahl    A_t / A_tmax ≤ 100 %  (A_tmax = R_d / coeff)</w:t>
       </w:r>
     </w:p>
     <w:p>
@@ -8298,7 +8297,28 @@
         <w:spacing w:after="60"/>
       </w:pPr>
       <w:r>
-        <w:t xml:space="preserve">Latten verlaufen vertikal auf den Verbinderachsen; an Öffnungen und am Feldrand abgeschnitten.</w:t>
+        <w:t xml:space="preserve">Verbinder-Katalog: FA-1 (R_k 0,50), FA-2 schwer (0,80), IA-1 leicht (0,25), Universal (0,50); je gamma_M = 2,0.</w:t>
+      </w:r>
+    </w:p>
+    <w:p>
+      <w:pPr>
+        <w:pStyle w:val="Heading2"/>
+      </w:pPr>
+      <w:r>
+        <w:t xml:space="preserve">Latten</w:t>
+      </w:r>
+    </w:p>
+    <w:p>
+      <w:pPr>
+        <w:pStyle w:val="ListParagraph"/>
+        <w:numPr>
+          <w:ilvl w:val="0"/>
+          <w:numId w:val="2"/>
+        </w:numPr>
+        <w:spacing w:after="60"/>
+      </w:pPr>
+      <w:r>
+        <w:t xml:space="preserve">Latten verlaufen vertikal auf den Verbinderachsen; an Öffnungen und am Feldrand abgeschnitten. Sie enden an der obersten nach [U-11] befestigbaren Lage – über eine Staffelungskante hinaus wird nicht weitergeplant.</w:t>
       </w:r>
     </w:p>
     <w:p>
@@ -10553,7 +10573,17 @@
         <w:t xml:space="preserve">[U-3]</w:t>
       </w:r>
       <w:r>
-        <w:t xml:space="preserve"> Verbinder horizontal nur auf einer innenliegenden Nut (nie in einer Stoßfuge).</w:t>
+        <w:t xml:space="preserve"> Verbinder horizontal nur auf einer innenliegenden Nut (nie in einer Stoßfuge). Die Prüfung gilt </w:t>
+      </w:r>
+      <w:r>
+        <w:rPr>
+          <w:b/>
+          <w:bCs/>
+        </w:rPr>
+        <w:t xml:space="preserve">lagenweise</w:t>
+      </w:r>
+      <w:r>
+        <w:t xml:space="preserve">, nicht wandglobal: eine Achse als Ganzes darf nicht als gültig gelten, wenn sie nur in einem Teil der Lagen innenliegend ist.</w:t>
       </w:r>
     </w:p>
     <w:p>
@@ -10653,7 +10683,7 @@
         <w:t xml:space="preserve">[U-8]</w:t>
       </w:r>
       <w:r>
-        <w:t xml:space="preserve"> Latten vertikal auf den Achsen, an Öffnungen/Feldrand geschnitten; Stöße mittig zwischen zwei Verbindern; 1D-Zuschnitt mit Reststück-Nutzung.</w:t>
+        <w:t xml:space="preserve"> Latten vertikal auf den Achsen, an Öffnungen/Feldrand geschnitten; Stöße mittig zwischen zwei Verbindern; 1D-Zuschnitt mit Reststück-Nutzung. Eine Latte endet an der obersten Lage, die nach [U-11] befestigbar ist – sie wird nicht über die tragende Geometrie hinaus fortgesetzt (keine Latte „in der Luft“ über einer Staffelungskante).</w:t>
       </w:r>
     </w:p>
     <w:p>
@@ -10694,6 +10724,78 @@
       </w:r>
       <w:r>
         <w:t xml:space="preserve"> An linken/rechten Öffnungskanten gilt der bestehende Randabstand. Betroffene globale Lattenachsen werden auf die nächste sichere Nut von der Öffnung weg verschoben und dedupliziert; die obere Öffnungskante ist keine Sperrzone. Ein unlösbarer Konflikt mit dem Maximalabstand wird sichtbar gemeldet.</w:t>
+      </w:r>
+    </w:p>
+    <w:p>
+      <w:pPr>
+        <w:pStyle w:val="ListParagraph"/>
+        <w:numPr>
+          <w:ilvl w:val="0"/>
+          <w:numId w:val="2"/>
+        </w:numPr>
+        <w:spacing w:after="60"/>
+      </w:pPr>
+      <w:r>
+        <w:rPr>
+          <w:b/>
+          <w:bCs/>
+        </w:rPr>
+        <w:t xml:space="preserve">[U-11 · MUSS]</w:t>
+      </w:r>
+      <w:r>
+        <w:t xml:space="preserve"> Ein Verbinder darf nur an einer Position (Nut x, Lage y) sitzen, an der </w:t>
+      </w:r>
+      <w:r>
+        <w:rPr>
+          <w:b/>
+          <w:bCs/>
+        </w:rPr>
+        <w:t xml:space="preserve">in genau dieser Lage</w:t>
+      </w:r>
+      <w:r>
+        <w:t xml:space="preserve"> ein Stein liegt, der die Nut </w:t>
+      </w:r>
+      <w:r>
+        <w:rPr>
+          <w:b/>
+          <w:bCs/>
+        </w:rPr>
+        <w:t xml:space="preserve">strikt innen</w:t>
+      </w:r>
+      <w:r>
+        <w:t xml:space="preserve"> führt. Verboten sind Stein-Außenkanten, Stoßfugen und steinfreie Positionen – insbesondere die vertikalen Kanten einer Staffelung/Treppe und Positionen oberhalb der lokalen Wandoberkante. Diese Muss-Regel hat </w:t>
+      </w:r>
+      <w:r>
+        <w:rPr>
+          <w:b/>
+          <w:bCs/>
+        </w:rPr>
+        <w:t xml:space="preserve">Vorrang</w:t>
+      </w:r>
+      <w:r>
+        <w:t xml:space="preserve"> vor [U-5], [U-6] und vor dem Komfortziel, eine Achse/Latte über eine Staffelungskante durchzuziehen. Entfallene Positionen werden </w:t>
+      </w:r>
+      <w:r>
+        <w:rPr>
+          <w:b/>
+          <w:bCs/>
+        </w:rPr>
+        <w:t xml:space="preserve">nicht</w:t>
+      </w:r>
+      <w:r>
+        <w:t xml:space="preserve"> durch Ersatzpunkte kompensiert: ausgedünnte Achsen, Achsen ohne Verbinder und eine fehlende Lagengeometrie im Wandelement führen zu einem sicheren Zustand (keine unsicheren Punkte) mit sichtbarer Warnung in Modul 2 ([P-9]).</w:t>
+      </w:r>
+    </w:p>
+    <w:p>
+      <w:pPr>
+        <w:pBdr>
+          <w:left w:val="single" w:color="E0B400" w:sz="18" w:space="6"/>
+        </w:pBdr>
+        <w:shd w:fill="FFF8E6" w:val="clear"/>
+        <w:spacing w:after="120" w:before="80"/>
+      </w:pPr>
+      <w:r>
+        <w:t xml:space="preserve">Herkunft [U-11]: Issue #29 (AWG-Wand). Verbinder wurden bei getreppten Wänden an der Stein-Außenkante der Staffelung platziert, weil die Nut nur wandglobal klassifiziert war ([U-3] war lagenweise falsch umgesetzt). Die Regel gilt gleichermaßen für Stoßfugen ohne Staffelung; die Verbinder- und Lattenmengen solcher Wände können dadurch sinken.</w:t>
       </w:r>
     </w:p>
     <w:p>

</xml_diff>

<commit_message>
fix(aufbau): Lattensegmente an beiden Enden befestigen (#30)
</commit_message>
<xml_diff>
--- a/doku/SEMBLA_Handbuch.docx
+++ b/doku/SEMBLA_Handbuch.docx
@@ -8239,56 +8239,6 @@
     </w:p>
     <w:p>
       <w:pPr>
-        <w:pStyle w:val="Heading2"/>
-      </w:pPr>
-      <w:r>
-        <w:t xml:space="preserve">Nachweis je Verbinder</w:t>
-      </w:r>
-    </w:p>
-    <w:p>
-      <w:pPr>
-        <w:pBdr>
-          <w:left w:val="single" w:color="1F6FEB" w:sz="18" w:space="6"/>
-        </w:pBdr>
-        <w:shd w:fill="F4F7FB" w:val="clear"/>
-        <w:spacing w:after="120" w:before="80"/>
-      </w:pPr>
-      <w:r>
-        <w:rPr>
-          <w:rFonts w:ascii="Consolas" w:cs="Consolas" w:eastAsia="Consolas" w:hAnsi="Consolas"/>
-          <w:color w:val="0B3A73"/>
-          <w:sz w:val="20"/>
-          <w:szCs w:val="20"/>
-        </w:rPr>
-        <w:t xml:space="preserve">R_d    = R_k / gamma_M          [kN]   (zul. Zuglast je Verbinder)</w:t>
-      </w:r>
-      <w:r>
-        <w:br/>
-      </w:r>
-      <w:r>
-        <w:rPr>
-          <w:rFonts w:ascii="Consolas" w:cs="Consolas" w:eastAsia="Consolas" w:hAnsi="Consolas"/>
-          <w:color w:val="0B3A73"/>
-          <w:sz w:val="20"/>
-          <w:szCs w:val="20"/>
-        </w:rPr>
-        <w:t xml:space="preserve">coeff  = gamma_Q · w_k          [kN/m²]</w:t>
-      </w:r>
-      <w:r>
-        <w:br/>
-      </w:r>
-      <w:r>
-        <w:rPr>
-          <w:rFonts w:ascii="Consolas" w:cs="Consolas" w:eastAsia="Consolas" w:hAnsi="Consolas"/>
-          <w:color w:val="0B3A73"/>
-          <w:sz w:val="20"/>
-          <w:szCs w:val="20"/>
-        </w:rPr>
-        <w:t xml:space="preserve">A_t    = Feldfläche / Anzahl    A_t / A_tmax ≤ 100 %  (A_tmax = R_d / coeff)</w:t>
-      </w:r>
-    </w:p>
-    <w:p>
-      <w:pPr>
         <w:pStyle w:val="ListParagraph"/>
         <w:numPr>
           <w:ilvl w:val="0"/>
@@ -8297,7 +8247,24 @@
         <w:spacing w:after="60"/>
       </w:pPr>
       <w:r>
-        <w:t xml:space="preserve">Verbinder-Katalog: FA-1 (R_k 0,50), FA-2 schwer (0,80), IA-1 leicht (0,25), Universal (0,50); je gamma_M = 2,0.</w:t>
+        <w:rPr>
+          <w:b/>
+          <w:bCs/>
+        </w:rPr>
+        <w:t xml:space="preserve">Endverbinder je Lattensegment ([U-12]):</w:t>
+      </w:r>
+      <w:r>
+        <w:t xml:space="preserve"> Zusätzlich zum Panelraster erhält jedes reale Lattensegment an seinem unteren und oberen Ende je einen Verbinder – maßgeblich ist die erste bzw. letzte im Segment nach [U-11] zulässige Lage. Segmentgrenzen sind Öffnungen, Feldgrenzen und Wandkontur, </w:t>
+      </w:r>
+      <w:r>
+        <w:rPr>
+          <w:b/>
+          <w:bCs/>
+        </w:rPr>
+        <w:t xml:space="preserve">nicht</w:t>
+      </w:r>
+      <w:r>
+        <w:t xml:space="preserve"> Wandfuß/Wandkrone: über einer Tür beginnt die Latte an der ersten befestigbaren Lage über der Tür-Oberkante. Diese Punkte sind additiv (bestehende Rasterpunkte bleiben) und stehen unter [U-11]; ein Segment ohne zulässige Lage wird nicht beplankt und gewarnt statt mit einem Ersatzpunkt versehen.</w:t>
       </w:r>
     </w:p>
     <w:p>
@@ -8305,7 +8272,49 @@
         <w:pStyle w:val="Heading2"/>
       </w:pPr>
       <w:r>
-        <w:t xml:space="preserve">Latten</w:t>
+        <w:t xml:space="preserve">Nachweis je Verbinder</w:t>
+      </w:r>
+    </w:p>
+    <w:p>
+      <w:pPr>
+        <w:pBdr>
+          <w:left w:val="single" w:color="1F6FEB" w:sz="18" w:space="6"/>
+        </w:pBdr>
+        <w:shd w:fill="F4F7FB" w:val="clear"/>
+        <w:spacing w:after="120" w:before="80"/>
+      </w:pPr>
+      <w:r>
+        <w:rPr>
+          <w:rFonts w:ascii="Consolas" w:cs="Consolas" w:eastAsia="Consolas" w:hAnsi="Consolas"/>
+          <w:color w:val="0B3A73"/>
+          <w:sz w:val="20"/>
+          <w:szCs w:val="20"/>
+        </w:rPr>
+        <w:t xml:space="preserve">R_d    = R_k / gamma_M          [kN]   (zul. Zuglast je Verbinder)</w:t>
+      </w:r>
+      <w:r>
+        <w:br/>
+      </w:r>
+      <w:r>
+        <w:rPr>
+          <w:rFonts w:ascii="Consolas" w:cs="Consolas" w:eastAsia="Consolas" w:hAnsi="Consolas"/>
+          <w:color w:val="0B3A73"/>
+          <w:sz w:val="20"/>
+          <w:szCs w:val="20"/>
+        </w:rPr>
+        <w:t xml:space="preserve">coeff  = gamma_Q · w_k          [kN/m²]</w:t>
+      </w:r>
+      <w:r>
+        <w:br/>
+      </w:r>
+      <w:r>
+        <w:rPr>
+          <w:rFonts w:ascii="Consolas" w:cs="Consolas" w:eastAsia="Consolas" w:hAnsi="Consolas"/>
+          <w:color w:val="0B3A73"/>
+          <w:sz w:val="20"/>
+          <w:szCs w:val="20"/>
+        </w:rPr>
+        <w:t xml:space="preserve">A_t    = Feldfläche / Anzahl    A_t / A_tmax ≤ 100 %  (A_tmax = R_d / coeff)</w:t>
       </w:r>
     </w:p>
     <w:p>
@@ -8318,7 +8327,15 @@
         <w:spacing w:after="60"/>
       </w:pPr>
       <w:r>
-        <w:t xml:space="preserve">Latten verlaufen vertikal auf den Verbinderachsen; an Öffnungen und am Feldrand abgeschnitten. Sie enden an der obersten nach [U-11] befestigbaren Lage – über eine Staffelungskante hinaus wird nicht weitergeplant.</w:t>
+        <w:t xml:space="preserve">Verbinder-Katalog: FA-1 (R_k 0,50), FA-2 schwer (0,80), IA-1 leicht (0,25), Universal (0,50); je gamma_M = 2,0.</w:t>
+      </w:r>
+    </w:p>
+    <w:p>
+      <w:pPr>
+        <w:pStyle w:val="Heading2"/>
+      </w:pPr>
+      <w:r>
+        <w:t xml:space="preserve">Latten</w:t>
       </w:r>
     </w:p>
     <w:p>
@@ -8331,7 +8348,20 @@
         <w:spacing w:after="60"/>
       </w:pPr>
       <w:r>
-        <w:t xml:space="preserve">Stöße liegen zwischen zwei Verbindern (mittig); Wandhöhe &gt; Lattenlänge → 1D-Zuschnitt mit Reststück-Wiederverwendung.</w:t>
+        <w:t xml:space="preserve">Latten verlaufen vertikal auf den Verbinderachsen; an Öffnungen und am Feldrand abgeschnitten. Sie enden an der obersten nach [U-11] befestigbaren Lage – über eine Staffelungskante hinaus wird nicht weitergeplant.</w:t>
+      </w:r>
+    </w:p>
+    <w:p>
+      <w:pPr>
+        <w:pStyle w:val="ListParagraph"/>
+        <w:numPr>
+          <w:ilvl w:val="0"/>
+          <w:numId w:val="2"/>
+        </w:numPr>
+        <w:spacing w:after="60"/>
+      </w:pPr>
+      <w:r>
+        <w:t xml:space="preserve">Stöße liegen zwischen zwei Verbindern (mittig); Wandhöhe &gt; Lattenlänge → 1D-Zuschnitt mit Reststück-Wiederverwendung. [U-12] wirkt auf der Segmentebene; die Befestigung der einzelnen Zuschnittstücke innerhalb eines Segments regelt weiterhin diese Stoßregel ([U-12.1]).</w:t>
       </w:r>
     </w:p>
     <w:p>
@@ -10796,6 +10826,178 @@
       </w:pPr>
       <w:r>
         <w:t xml:space="preserve">Herkunft [U-11]: Issue #29 (AWG-Wand). Verbinder wurden bei getreppten Wänden an der Stein-Außenkante der Staffelung platziert, weil die Nut nur wandglobal klassifiziert war ([U-3] war lagenweise falsch umgesetzt). Die Regel gilt gleichermaßen für Stoßfugen ohne Staffelung; die Verbinder- und Lattenmengen solcher Wände können dadurch sinken.</w:t>
+      </w:r>
+    </w:p>
+    <w:p>
+      <w:pPr>
+        <w:pStyle w:val="ListParagraph"/>
+        <w:numPr>
+          <w:ilvl w:val="0"/>
+          <w:numId w:val="2"/>
+        </w:numPr>
+        <w:spacing w:after="60"/>
+      </w:pPr>
+      <w:r>
+        <w:rPr>
+          <w:b/>
+          <w:bCs/>
+        </w:rPr>
+        <w:t xml:space="preserve">[U-12 · MUSS]</w:t>
+      </w:r>
+      <w:r>
+        <w:t xml:space="preserve"> Jedes </w:t>
+      </w:r>
+      <w:r>
+        <w:rPr>
+          <w:b/>
+          <w:bCs/>
+        </w:rPr>
+        <w:t xml:space="preserve">reale Lattensegment</w:t>
+      </w:r>
+      <w:r>
+        <w:t xml:space="preserve"> – abgegrenzt durch Öffnungen, Feldgrenzen und Wandkontur/Staffelung, </w:t>
+      </w:r>
+      <w:r>
+        <w:rPr>
+          <w:b/>
+          <w:bCs/>
+        </w:rPr>
+        <w:t xml:space="preserve">nicht</w:t>
+      </w:r>
+      <w:r>
+        <w:t xml:space="preserve"> durch Wandfuß und Wandkrone – erhält an seinem </w:t>
+      </w:r>
+      <w:r>
+        <w:rPr>
+          <w:b/>
+          <w:bCs/>
+        </w:rPr>
+        <w:t xml:space="preserve">realen unteren und realen oberen Ende</w:t>
+      </w:r>
+      <w:r>
+        <w:t xml:space="preserve"> je einen Verbinder. Maßgeblich ist die </w:t>
+      </w:r>
+      <w:r>
+        <w:rPr>
+          <w:b/>
+          <w:bCs/>
+        </w:rPr>
+        <w:t xml:space="preserve">erste bzw. letzte innerhalb des Segments nach [U-11] zulässige Lage</w:t>
+      </w:r>
+      <w:r>
+        <w:t xml:space="preserve">: läuft eine Latte über eine Tür weiter, ist ihr unteres Ende die erste befestigbare Lage über der Tür-Oberkante, nicht der Wandfuß in der ausgesparten Öffnung. Diese Endverbinder sind </w:t>
+      </w:r>
+      <w:r>
+        <w:rPr>
+          <w:b/>
+          <w:bCs/>
+        </w:rPr>
+        <w:t xml:space="preserve">additive Pflichtpunkte</w:t>
+      </w:r>
+      <w:r>
+        <w:t xml:space="preserve"> – bestehende gültige Rasterpunkte bleiben unverändert – und haben </w:t>
+      </w:r>
+      <w:r>
+        <w:rPr>
+          <w:b/>
+          <w:bCs/>
+        </w:rPr>
+        <w:t xml:space="preserve">Vorrang vor der Optimierung</w:t>
+      </w:r>
+      <w:r>
+        <w:t xml:space="preserve"> nach [U-5] (Panel-/Zwischenachsraster) und [U-8] (Stoß- und Zuschnittoptimierung); sie stehen jedoch </w:t>
+      </w:r>
+      <w:r>
+        <w:rPr>
+          <w:b/>
+          <w:bCs/>
+        </w:rPr>
+        <w:t xml:space="preserve">unter [U-11]</w:t>
+      </w:r>
+      <w:r>
+        <w:t xml:space="preserve">: eine unzulässige Position (Stoßfuge, Stein-Außenkante, steinfrei, in der Öffnung) wird nie belegt. Enthält ein Segment genau </w:t>
+      </w:r>
+      <w:r>
+        <w:rPr>
+          <w:b/>
+          <w:bCs/>
+        </w:rPr>
+        <w:t xml:space="preserve">eine</w:t>
+      </w:r>
+      <w:r>
+        <w:t xml:space="preserve"> zulässige Lage, erfüllt dieser Verbinder beide Enden. Enthält es </w:t>
+      </w:r>
+      <w:r>
+        <w:rPr>
+          <w:b/>
+          <w:bCs/>
+        </w:rPr>
+        <w:t xml:space="preserve">keine</w:t>
+      </w:r>
+      <w:r>
+        <w:t xml:space="preserve">, darf es nicht als regelgerecht geplante Latte ausgegeben werden: es entsteht </w:t>
+      </w:r>
+      <w:r>
+        <w:rPr>
+          <w:b/>
+          <w:bCs/>
+        </w:rPr>
+        <w:t xml:space="preserve">kein Ersatzpunkt</w:t>
+      </w:r>
+      <w:r>
+        <w:t xml:space="preserve">, das Segment bleibt ungeplant (sicherer Leerfall) und wird in Modul 2 sichtbar gewarnt ([P-9]).</w:t>
+      </w:r>
+    </w:p>
+    <w:p>
+      <w:pPr>
+        <w:pStyle w:val="ListParagraph"/>
+        <w:numPr>
+          <w:ilvl w:val="0"/>
+          <w:numId w:val="2"/>
+        </w:numPr>
+        <w:spacing w:after="60"/>
+      </w:pPr>
+      <w:r>
+        <w:rPr>
+          <w:b/>
+          <w:bCs/>
+        </w:rPr>
+        <w:t xml:space="preserve">[U-12.1 · Scope]</w:t>
+      </w:r>
+      <w:r>
+        <w:t xml:space="preserve"> [U-12] gilt auf der Ebene des </w:t>
+      </w:r>
+      <w:r>
+        <w:rPr>
+          <w:b/>
+          <w:bCs/>
+        </w:rPr>
+        <w:t xml:space="preserve">realen Segments</w:t>
+      </w:r>
+      <w:r>
+        <w:t xml:space="preserve">, nicht je physischem Zuschnittstück einer Standardlänge. Für die Befestigung der Einzelstücke innerhalb eines Segments bleibt [U-8] zuständig (Stöße liegen mittig zwischen zwei Verbindern, jedes Stück erbt dadurch seine Befestigung). Ein Umbau des 1D-Zuschnitts auf stückweise Endverbinder ist bewusst </w:t>
+      </w:r>
+      <w:r>
+        <w:rPr>
+          <w:b/>
+          <w:bCs/>
+        </w:rPr>
+        <w:t xml:space="preserve">nicht</w:t>
+      </w:r>
+      <w:r>
+        <w:t xml:space="preserve"> Teil dieser Regel.</w:t>
+      </w:r>
+    </w:p>
+    <w:p>
+      <w:pPr>
+        <w:pBdr>
+          <w:left w:val="single" w:color="E0B400" w:sz="18" w:space="6"/>
+        </w:pBdr>
+        <w:shd w:fill="FFF8E6" w:val="clear"/>
+        <w:spacing w:after="120" w:before="80"/>
+      </w:pPr>
+      <w:r>
+        <w:t xml:space="preserve">Herkunft [U-12]: Issue #30. Über einer Tür entstand nur ein Verbinder am oberen Lattenende, weil die Verbinderreihen global aus Wandfuß/Wandkrone abgeleitet wurden und die Segmentbildung erst danach an der Öffnung schnitt – eine fehlende Regel, nicht eine falsch umgesetzte. Die Regel greift gleichermaßen, wenn die unterste oder oberste Lage einer Achse nach [U-11] eine Stoßfuge ist; dort ist die erste bzw. letzte zulässige Lage maßgebend. Verbinder- und Lattenmengen solcher Wände können dadurch steigen.</w:t>
       </w:r>
     </w:p>
     <w:p>

</xml_diff>

<commit_message>
fix(montage): Schnitt 0 und stabilen Druck ergänzen (#23)
</commit_message>
<xml_diff>
--- a/doku/SEMBLA_Handbuch.docx
+++ b/doku/SEMBLA_Handbuch.docx
@@ -8591,6 +8591,14 @@
     </w:p>
     <w:p>
       <w:pPr>
+        <w:spacing w:after="120"/>
+      </w:pPr>
+      <w:r>
+        <w:t xml:space="preserve">Vor dem ersten Baugruppenabschnitt steht der steinfreie Schnitt 0 nach [A-9]: Bodenblech/Grundplatte und die ersten Gewindestangen ohne Steine und ohne Reihennummern. Er ist additiv – der bisherige erste Abschnitt bleibt inhaltlich unverändert; ohne Fußereignis entfällt Schnitt 0 ersatzlos. Alle Baugruppenbilder – Schnitt 0 eingeschlossen – verwenden denselben globalen Maßstab und Viewport, abgeleitet aus Wandhöhe und höchster Stangenoberkante. Die Vorschau wächst dadurch mit fortschreitendem Montagestand nicht mehr; rechteckige und gestaffelte Wände werden gleich behandelt. Beim Browserdruck aus Modul 5 werden Kopfleiste und alle Bedienelemente ausgeblendet, gedruckt wird ausschließlich das A4-paginierte Dokument, das auch der zentrale Export liefert.</w:t>
+      </w:r>
+    </w:p>
+    <w:p>
+      <w:pPr>
         <w:pStyle w:val="Heading1"/>
       </w:pPr>
       <w:r>
@@ -10536,6 +10544,76 @@
       </w:r>
       <w:r>
         <w:t xml:space="preserve"> Der obere Anschluss muss regional entlang der Wandoberkante festgelegt werden können: Ein Wandelement darf gleichzeitig Bereiche mit Kopfblech und Bereiche mit Spannplatten besitzen. Jeder obere Strang-/Konturabschnitt hat genau eine eindeutige Anschlussart.</w:t>
+      </w:r>
+    </w:p>
+    <w:p>
+      <w:pPr>
+        <w:pStyle w:val="ListParagraph"/>
+        <w:numPr>
+          <w:ilvl w:val="0"/>
+          <w:numId w:val="2"/>
+        </w:numPr>
+        <w:spacing w:after="60"/>
+      </w:pPr>
+      <w:r>
+        <w:rPr>
+          <w:b/>
+          <w:bCs/>
+        </w:rPr>
+        <w:t xml:space="preserve">[A-9]</w:t>
+      </w:r>
+      <w:r>
+        <w:t xml:space="preserve"> Die Montageanleitung beginnt mit einem </w:t>
+      </w:r>
+      <w:r>
+        <w:rPr>
+          <w:b/>
+          <w:bCs/>
+        </w:rPr>
+        <w:t xml:space="preserve">steinfreien Schnitt 0</w:t>
+      </w:r>
+      <w:r>
+        <w:t xml:space="preserve">, der ausschließlich die Fuß-Baugruppe nach </w:t>
+      </w:r>
+      <w:r>
+        <w:rPr>
+          <w:b/>
+          <w:bCs/>
+        </w:rPr>
+        <w:t xml:space="preserve">[A-1]</w:t>
+      </w:r>
+      <w:r>
+        <w:t xml:space="preserve"> zeigt: Bodenblech/Grundplatte über die Wandlänge und je Strang die erste Gewindestange bis zu ihrer ersten Kopplungs- bzw. Segmentoberkante – ohne Steinreihen und ohne Reihennummern. Schnitt 0 ist </w:t>
+      </w:r>
+      <w:r>
+        <w:rPr>
+          <w:b/>
+          <w:bCs/>
+        </w:rPr>
+        <w:t xml:space="preserve">additiv</w:t>
+      </w:r>
+      <w:r>
+        <w:t xml:space="preserve">: er ist eine zusätzliche, vorgelagerte Darstellung; die Fußereignisse und der Inhalt des bisherigen ersten Baugruppenabschnitts bleiben unverändert und selbsterklärend. Besitzt eine Wand kein Fußereignis (kein Segment auf dem Bodenblech), entfällt Schnitt 0 ersatzlos – es wird keine leere Seite erzeugt (sicherer Leerfall, vgl. </w:t>
+      </w:r>
+      <w:r>
+        <w:rPr>
+          <w:b/>
+          <w:bCs/>
+        </w:rPr>
+        <w:t xml:space="preserve">[P-9]</w:t>
+      </w:r>
+      <w:r>
+        <w:t xml:space="preserve">). Die Ableitung ist DOM-frei und gemeinsam, sodass Vorschau (Modul 5) und zentraler Export in Reihenfolge und Inhalt identisch sind (</w:t>
+      </w:r>
+      <w:r>
+        <w:rPr>
+          <w:b/>
+          <w:bCs/>
+        </w:rPr>
+        <w:t xml:space="preserve">[P-2]</w:t>
+      </w:r>
+      <w:r>
+        <w:t xml:space="preserve">). Priorität: Darstellungsregel (Hierarchiestufe 5) – sie ändert weder Mengen noch Geometrie noch die Montagereihenfolge der Baugruppen und ist jeder Muss-Regel nachgeordnet.</w:t>
       </w:r>
     </w:p>
     <w:p>

</xml_diff>

<commit_message>
feat(vorlagen): Standardkatalog und AWG-Musterwand ergänzen (#33)
</commit_message>
<xml_diff>
--- a/doku/SEMBLA_Handbuch.docx
+++ b/doku/SEMBLA_Handbuch.docx
@@ -8006,6 +8006,26 @@
     </w:p>
     <w:p>
       <w:pPr>
+        <w:spacing w:after="120"/>
+      </w:pPr>
+      <w:r>
+        <w:t xml:space="preserve">Für den Einstieg liefert das Repository zwei Vorlagen unter docs/vorlagen/ mit: den Standardkatalog (SEMBLA_Standardkatalog.json, Katalogformat v1) und die AWG-Musterwand (SEMBLA_Musterwand.json, Projektformat v2). Beide werden ausschließlich auf Klick geladen – „Standardkatalog laden” bzw. „Musterwand laden…” – und niemals automatisch. Ein bereits geladener Katalog wird erst nach ausdrücklicher Bestätigung ersetzt; ein Abbruch bleibt wirkungslos. Die Musterwand läuft durch denselben Bestätigungsdialog wie jeder Dateiimport und wird als neues Wandelement angelegt, ohne bestehende Elemente zu überschreiben. Die Musterwand ist die kanonische Ausgabe des heutigen Rechenkerns aus den fachlichen Eingaben der freigegebenen AWG-Vorlage: Geometrie, Tiling und Spannachsen sind unverändert, veraltete abgeleitete Daten sind nicht übernommen.</w:t>
+      </w:r>
+    </w:p>
+    <w:p>
+      <w:pPr>
+        <w:pBdr>
+          <w:left w:val="single" w:color="E0B400" w:sz="18" w:space="6"/>
+        </w:pBdr>
+        <w:shd w:fill="FFF8E6" w:val="clear"/>
+        <w:spacing w:after="120" w:before="80"/>
+      </w:pPr>
+      <w:r>
+        <w:t xml:space="preserve">Der Standardkatalog übernimmt die im Produkt vorhandenen Preis- und Maßvorgaben. Wo fachliche Daten fehlen, enthält er vorläufige, fachlich unbestätigte Beispielwerte. Diese sind im Katalognamen, in der Produktbezeichnung und je Produkt im Feld „hinweis” gekennzeichnet und vor der Verwendung fachlich zu bestätigen; sie sind keine geprüften Kennwerte.</w:t>
+      </w:r>
+    </w:p>
+    <w:p>
+      <w:pPr>
         <w:pBdr>
           <w:left w:val="single" w:color="E0B400" w:sz="18" w:space="6"/>
         </w:pBdr>
@@ -11512,6 +11532,66 @@
       </w:r>
       <w:r>
         <w:t xml:space="preserve"> Wandtyp wird ausschließlich in Modul 0 gewählt; Modul 1 führt ihn unverändert mit, Modul 3 liest ihn einschließlich Geometrie und Öffnungszahl read-only.</w:t>
+      </w:r>
+    </w:p>
+    <w:p>
+      <w:pPr>
+        <w:pStyle w:val="ListParagraph"/>
+        <w:numPr>
+          <w:ilvl w:val="0"/>
+          <w:numId w:val="2"/>
+        </w:numPr>
+        <w:spacing w:after="60"/>
+      </w:pPr>
+      <w:r>
+        <w:rPr>
+          <w:b/>
+          <w:bCs/>
+        </w:rPr>
+        <w:t xml:space="preserve">[P-12]</w:t>
+      </w:r>
+      <w:r>
+        <w:t xml:space="preserve"> Mitgelieferte Datenvorlagen (Standardkatalog und Musterwand unter docs/vorlagen/) werden </w:t>
+      </w:r>
+      <w:r>
+        <w:rPr>
+          <w:b/>
+          <w:bCs/>
+        </w:rPr>
+        <w:t xml:space="preserve">ausschließlich durch bewusste Nutzerwahl in Modul 0</w:t>
+      </w:r>
+      <w:r>
+        <w:t xml:space="preserve"> geladen – kein automatisches Vorladen beim Start. Sie durchlaufen dieselben Prüf- und Bestätigungswege wie fremde Dateien: der Standardkatalog ersetzt einen belegten Katalog-Slot nur nach ausdrücklicher Bestätigung (Abbruch ist wirkungslos), die Musterwand nur über den Projektimport-Bestätigungsdialog und stets als </w:t>
+      </w:r>
+      <w:r>
+        <w:rPr>
+          <w:b/>
+          <w:bCs/>
+        </w:rPr>
+        <w:t xml:space="preserve">neues</w:t>
+      </w:r>
+      <w:r>
+        <w:t xml:space="preserve"> Wandelement, ohne bestehende zu überschreiben. Die Ressourcen- und Versionstrennung nach </w:t>
+      </w:r>
+      <w:r>
+        <w:rPr>
+          <w:b/>
+          <w:bCs/>
+        </w:rPr>
+        <w:t xml:space="preserve">[P-10]</w:t>
+      </w:r>
+      <w:r>
+        <w:t xml:space="preserve">/</w:t>
+      </w:r>
+      <w:r>
+        <w:rPr>
+          <w:b/>
+          <w:bCs/>
+        </w:rPr>
+        <w:t xml:space="preserve">[P-2]</w:t>
+      </w:r>
+      <w:r>
+        <w:t xml:space="preserve"> gilt unverändert: der Katalog bleibt im eigenen Slot und Dateiformat, die Musterwand im öffentlichen Projektformat. Vorläufige, fachlich unbestätigte Beispielwerte einer Vorlage sind sichtbar als solche zu kennzeichnen und dürfen nicht als geprüfte Kennwerte dargestellt werden. Priorität: Datenhaltungs- und Bedienregel – sie ändert keine Mengen, keine Geometrie und keinen Nachweis und ist jeder Muss-Regel nachgeordnet.</w:t>
       </w:r>
     </w:p>
     <w:sectPr>

</xml_diff>

<commit_message>
feat(katalog): wandbezogene Produktauswahl integrieren (#35)
</commit_message>
<xml_diff>
--- a/doku/SEMBLA_Handbuch.docx
+++ b/doku/SEMBLA_Handbuch.docx
@@ -1765,7 +1765,7 @@
         <w:spacing w:after="120"/>
       </w:pPr>
       <w:r>
-        <w:t xml:space="preserve">Die vertikalen Stoßfugen zwischen Steinen werden gezählt (bom.stossfugen). Für erhöhte Anforderungen (z. B. Schallschutz) werden Dichtstreifen eingelegt (je Fuge 20 cm = 1 Steinreihe); die Stückliste weist die Gesamtlänge aus (bom.dichtstreifen_mm).</w:t>
+        <w:t xml:space="preserve">Die vertikalen Stoßfugen zwischen Steinen werden gezählt (bom.stossfugen). Für erhöhte Anforderungen (z. B. Schallschutz) werden Dichtstreifen eingelegt (je Fuge 20 cm = 1 Steinreihe); die Stückliste weist beides aus: die Einbauposition je Fuge in Stück und – nachrichtlich, nicht bepreist – die Gesamtlänge (bom.dichtstreifen_mm), siehe [A-6].</w:t>
       </w:r>
     </w:p>
     <w:p>
@@ -2842,7 +2842,7 @@
         <w:spacing w:after="120"/>
       </w:pPr>
       <w:r>
-        <w:t xml:space="preserve">Der Bauteilkatalog ist eine eigene Ressource im Format SEMBLA-Bauteilkatalog v1. Im Projekt werden nur Quelle und ausgewählte Produkt-IDs referenziert; Produktmaße und Preise werden nicht in das Wandelement eingebettet. Fehlende Referenzen werden sichtbar gewarnt.</w:t>
+        <w:t xml:space="preserve">Der Bauteilkatalog ist eine eigene Ressource im Format SEMBLA-Bauteilkatalog v1 und wird ausschließlich in Modul 0 gepflegt. Welche Produkte eine konkrete Wand verwendet, wählen die fachlich zuständigen Module direkt aus dem vollständigen Katalog: Modul 1 für Wand, Vorspannung, Anschluss und Fugen, Modul 2 für Latten, Beplankung und Verbinder. Im Projekt werden nur Quelle und ausgewählte Produkt-IDs je Verwendungsrolle referenziert; Produktmaße und Preise werden nicht in das Wandelement eingebettet. Modul 4 liest die Katalogpreise nur und pflegt sie nicht. Fehlende oder mehrdeutige Referenzen werden sichtbar gewarnt und nie durch einen Ersatzwert überdeckt ([P-13], [P-14]).</w:t>
       </w:r>
     </w:p>
     <w:p>
@@ -4011,7 +4011,27 @@
         <w:spacing w:after="120"/>
       </w:pPr>
       <w:r>
-        <w:t xml:space="preserve">Der Nachweis gliedert sich in zwei Komplexe: **A) Wandnachweise** (Biegung, Schub, Druckrand, Bodenanschluss, Deckenwinkel) und **B) Bauteilnachweise Spannsystem** (Gewindestange, Schrauben, Kopf-/Fußplatte, Steinpressung). Abschnitt 5.13 rechnet ein vollständiges Beispiel.</w:t>
+        <w:t xml:space="preserve">Der Nachweis gliedert sich in zwei Komplexe: </w:t>
+      </w:r>
+      <w:r>
+        <w:rPr>
+          <w:b/>
+          <w:bCs/>
+        </w:rPr>
+        <w:t xml:space="preserve">A) Wandnachweise</w:t>
+      </w:r>
+      <w:r>
+        <w:t xml:space="preserve"> (Biegung, Schub, Druckrand, Bodenanschluss, Deckenwinkel) und </w:t>
+      </w:r>
+      <w:r>
+        <w:rPr>
+          <w:b/>
+          <w:bCs/>
+        </w:rPr>
+        <w:t xml:space="preserve">B) Bauteilnachweise Spannsystem</w:t>
+      </w:r>
+      <w:r>
+        <w:t xml:space="preserve"> (Gewindestange, Schrauben, Kopf-/Fußplatte, Steinpressung). Abschnitt 5.13 rechnet ein vollständiges Beispiel.</w:t>
       </w:r>
     </w:p>
     <w:p>
@@ -7039,7 +7059,17 @@
         <w:spacing w:after="120"/>
       </w:pPr>
       <w:r>
-        <w:t xml:space="preserve">m_Rk = FORECAST(35,73) = 2,62 kNm/m → m_Rd = 1,310. Deckenwinkel: V_Winkel = 1,327·1,5 = 1,99 kN, 5 Winkel. **η_max,Wand = 0,759** (Biegung maßgebend).</w:t>
+        <w:t xml:space="preserve">m_Rk = FORECAST(35,73) = 2,62 kNm/m → m_Rd = 1,310. Deckenwinkel: V_Winkel = 1,327·1,5 = 1,99 kN, 5 Winkel. </w:t>
+      </w:r>
+      <w:r>
+        <w:rPr>
+          <w:b/>
+          <w:bCs/>
+        </w:rPr>
+        <w:t xml:space="preserve">η_max,Wand = 0,759</w:t>
+      </w:r>
+      <w:r>
+        <w:t xml:space="preserve"> (Biegung maßgebend).</w:t>
       </w:r>
     </w:p>
     <w:p>
@@ -7965,7 +7995,14 @@
         <w:spacing w:after="120"/>
       </w:pPr>
       <w:r>
-        <w:t xml:space="preserve">**η_max,Spannsystem = 0,815** (Gewindestange Fließen). Die Senkschraube überschreitet 100 % → nur Sechskantschraube zulässig.</w:t>
+        <w:rPr>
+          <w:b/>
+          <w:bCs/>
+        </w:rPr>
+        <w:t xml:space="preserve">η_max,Spannsystem = 0,815</w:t>
+      </w:r>
+      <w:r>
+        <w:t xml:space="preserve"> (Gewindestange Fließen). Die Senkschraube überschreitet 100 % → nur Sechskantschraube zulässig.</w:t>
       </w:r>
     </w:p>
     <w:p>
@@ -8001,7 +8038,7 @@
         <w:spacing w:after="120"/>
       </w:pPr>
       <w:r>
-        <w:t xml:space="preserve">Modul 0 verwaltet außerdem den vom Projekt getrennten Bauteilkatalog: Produkte nach Kategorien anlegen, bearbeiten, duplizieren und löschen; Katalog separat importieren/exportieren; mehrere Produkt-IDs je Kategorie für das aktive Projekt auswählen. Unauflösbare Referenzen werden sichtbar gewarnt.</w:t>
+        <w:t xml:space="preserve">Modul 0 verwaltet außerdem den vom Projekt getrennten Bauteilkatalog und ist dessen alleiniger Pflegeort: Produkte nach Kategorien anlegen, bearbeiten, duplizieren und löschen, Preise pflegen, Katalog separat importieren/exportieren. Eine wand- oder projektbezogene Produktauswahl gibt es hier bewusst nicht mehr – sie liegt in den Modulen 1 und 2 ([P-13]). Produktreferenzen aus dem früheren zentralen Auswahlweg bleiben im Projekt erhalten, sind aber unwirksam und werden in Modul 0 als solche gemeldet ([P-15]).</w:t>
       </w:r>
     </w:p>
     <w:p>
@@ -8150,42 +8187,6 @@
     </w:p>
     <w:p>
       <w:pPr>
-        <w:pStyle w:val="Heading1"/>
-      </w:pPr>
-      <w:r>
-        <w:t xml:space="preserve">8 · Modul 2 · Horizontaler Wandaufbau</w:t>
-      </w:r>
-    </w:p>
-    <w:p>
-      <w:pPr>
-        <w:spacing w:after="120"/>
-      </w:pPr>
-      <w:r>
-        <w:t xml:space="preserve">Zweck: Verbinder- und Lattenplanung in einem Schritt. Die Panelfugen bestimmen die Verbinderachsen; daraus werden die Latten abgeleitet.</w:t>
-      </w:r>
-    </w:p>
-    <w:p>
-      <w:pPr>
-        <w:pBdr>
-          <w:left w:val="single" w:color="E0B400" w:sz="18" w:space="6"/>
-        </w:pBdr>
-        <w:shd w:fill="FFF8E6" w:val="clear"/>
-        <w:spacing w:after="120" w:before="80"/>
-      </w:pPr>
-      <w:r>
-        <w:t xml:space="preserve">Im MVP ist die Wärmedämmung aus diesem Modul entfernt (Entscheidung Polycare). Die Latten-Logik bleibt unverändert; der Dichtstreifen aus den Stoßfugen (Schallschutz, Kap. 2.6) ist keine Wärmedämmung und bleibt erhalten.</w:t>
-      </w:r>
-    </w:p>
-    <w:p>
-      <w:pPr>
-        <w:pStyle w:val="Heading2"/>
-      </w:pPr>
-      <w:r>
-        <w:t xml:space="preserve">Verbinderachsen aus Panelfugen</w:t>
-      </w:r>
-    </w:p>
-    <w:p>
-      <w:pPr>
         <w:pStyle w:val="ListParagraph"/>
         <w:numPr>
           <w:ilvl w:val="0"/>
@@ -8198,10 +8199,46 @@
           <w:b/>
           <w:bCs/>
         </w:rPr>
-        <w:t xml:space="preserve">Panelmaß</w:t>
-      </w:r>
-      <w:r>
-        <w:t xml:space="preserve"> (Standard 62,5 × 150 cm, änderbar) legt die Verbinderachsen fest: vertikale Achsen an den Panel-Längsfugen, horizontale an den Panel-Höhenfugen – plus Zwischenachsen, wenn der Max-Abstand überschritten wird.</w:t>
+        <w:t xml:space="preserve">Produkte für diese Wand ([P-13]):</w:t>
+      </w:r>
+      <w:r>
+        <w:t xml:space="preserve"> Aus dem vollständigen aktiven Bauteilkatalog werden die Produkte je Verwendungsrolle gewählt – gruppiert nach Steinen, Vorspannung, Anschluss (einschließlich getrennter Boden- und Kopfbleche nach [A-1]) und Fugen. Mehrere Produkte je Rolle sind erlaubt; der Auswahlstatus (zugeordnet, mehrdeutig, ohne Auswahl) steht direkt an der Rolle. Gespeichert werden nur Produkt-IDs und die Herkunftsnotiz des Katalogs unter eingaben.planung.produkte – das Wandelement bleibt frei von Produktdaten.</w:t>
+      </w:r>
+    </w:p>
+    <w:p>
+      <w:pPr>
+        <w:pStyle w:val="Heading1"/>
+      </w:pPr>
+      <w:r>
+        <w:t xml:space="preserve">8 · Modul 2 · Horizontaler Wandaufbau</w:t>
+      </w:r>
+    </w:p>
+    <w:p>
+      <w:pPr>
+        <w:spacing w:after="120"/>
+      </w:pPr>
+      <w:r>
+        <w:t xml:space="preserve">Zweck: Verbinder- und Lattenplanung in einem Schritt. Die Panelfugen bestimmen die Verbinderachsen; daraus werden die Latten abgeleitet.</w:t>
+      </w:r>
+    </w:p>
+    <w:p>
+      <w:pPr>
+        <w:pBdr>
+          <w:left w:val="single" w:color="E0B400" w:sz="18" w:space="6"/>
+        </w:pBdr>
+        <w:shd w:fill="FFF8E6" w:val="clear"/>
+        <w:spacing w:after="120" w:before="80"/>
+      </w:pPr>
+      <w:r>
+        <w:t xml:space="preserve">Im MVP ist die Wärmedämmung aus diesem Modul entfernt (Entscheidung Polycare). Die Latten-Logik bleibt unverändert; der Dichtstreifen aus den Stoßfugen (Schallschutz, Kap. 2.6) ist keine Wärmedämmung und bleibt erhalten.</w:t>
+      </w:r>
+    </w:p>
+    <w:p>
+      <w:pPr>
+        <w:pStyle w:val="Heading2"/>
+      </w:pPr>
+      <w:r>
+        <w:t xml:space="preserve">Verbinderachsen aus Panelfugen</w:t>
       </w:r>
     </w:p>
     <w:p>
@@ -8214,7 +8251,14 @@
         <w:spacing w:after="60"/>
       </w:pPr>
       <w:r>
-        <w:t xml:space="preserve">Zusätzlich an Wandkanten; keine Verbinder innerhalb von Öffnungen. An linken/rechten Öffnungskanten wird der bestehende Randabstand eingehalten: Achsen werden auf eine sichere Nut von der Öffnung weg verschoben, dedupliziert und bei unlösbaren Abstandskonflikten sichtbar gewarnt. Oberkanten von Öffnungen sind keine Sperrzone.</w:t>
+        <w:rPr>
+          <w:b/>
+          <w:bCs/>
+        </w:rPr>
+        <w:t xml:space="preserve">Panelmaß</w:t>
+      </w:r>
+      <w:r>
+        <w:t xml:space="preserve"> (Standard 62,5 × 150 cm, änderbar) legt die Verbinderachsen fest: vertikale Achsen an den Panel-Längsfugen, horizontale an den Panel-Höhenfugen – plus Zwischenachsen, wenn der Max-Abstand überschritten wird.</w:t>
       </w:r>
     </w:p>
     <w:p>
@@ -8227,14 +8271,7 @@
         <w:spacing w:after="60"/>
       </w:pPr>
       <w:r>
-        <w:rPr>
-          <w:b/>
-          <w:bCs/>
-        </w:rPr>
-        <w:t xml:space="preserve">Beplankungsfeld:</w:t>
-      </w:r>
-      <w:r>
-        <w:t xml:space="preserve"> häufig wird nur ein Teil der Wand beplankt – ein rechteckiges Feld begrenzt Verbinder und Latten. Ein sichtbarer Bearbeitungsmodus zeigt Rasterpunkte, Hover und Vorschau; erst „Übernehmen &amp; berechnen” speichert das Feld und stößt die Berechnung an. Standard = ganze Wand.</w:t>
+        <w:t xml:space="preserve">Zusätzlich an Wandkanten; keine Verbinder innerhalb von Öffnungen. An linken/rechten Öffnungskanten wird der bestehende Randabstand eingehalten: Achsen werden auf eine sichere Nut von der Öffnung weg verschoben, dedupliziert und bei unlösbaren Abstandskonflikten sichtbar gewarnt. Oberkanten von Öffnungen sind keine Sperrzone.</w:t>
       </w:r>
     </w:p>
     <w:p>
@@ -8251,10 +8288,10 @@
           <w:b/>
           <w:bCs/>
         </w:rPr>
-        <w:t xml:space="preserve">Nutprüfung je Lage ([U-11]):</w:t>
-      </w:r>
-      <w:r>
-        <w:t xml:space="preserve"> Aus jeder Achse entsteht ein Verbinder nur in den Lagen, in denen ein tatsächlich vorhandener Stein die Nut strikt innen führt. Stein-Außenkanten (auch an Staffelungs-/Treppenkanten), Stoßfugen und steinfreie Positionen bleiben leer; entfallene Positionen und Achsen ohne Verbinder werden in der Bildunterschrift gewarnt statt durch Ersatzpunkte ersetzt. Fehlt die Lagengeometrie im Wandelement, entstehen keine Verbinder (sicherer Leerfall mit Warnung).</w:t>
+        <w:t xml:space="preserve">Beplankungsfeld:</w:t>
+      </w:r>
+      <w:r>
+        <w:t xml:space="preserve"> häufig wird nur ein Teil der Wand beplankt – ein rechteckiges Feld begrenzt Verbinder und Latten. Ein sichtbarer Bearbeitungsmodus zeigt Rasterpunkte, Hover und Vorschau; erst „Übernehmen &amp; berechnen” speichert das Feld und stößt die Berechnung an. Standard = ganze Wand.</w:t>
       </w:r>
     </w:p>
     <w:p>
@@ -8271,70 +8308,10 @@
           <w:b/>
           <w:bCs/>
         </w:rPr>
-        <w:t xml:space="preserve">Endverbinder je Lattensegment ([U-12]):</w:t>
-      </w:r>
-      <w:r>
-        <w:t xml:space="preserve"> Zusätzlich zum Panelraster erhält jedes reale Lattensegment an seinem unteren und oberen Ende je einen Verbinder – maßgeblich ist die erste bzw. letzte im Segment nach [U-11] zulässige Lage. Segmentgrenzen sind Öffnungen, Feldgrenzen und Wandkontur, </w:t>
-      </w:r>
-      <w:r>
-        <w:rPr>
-          <w:b/>
-          <w:bCs/>
-        </w:rPr>
-        <w:t xml:space="preserve">nicht</w:t>
-      </w:r>
-      <w:r>
-        <w:t xml:space="preserve"> Wandfuß/Wandkrone: über einer Tür beginnt die Latte an der ersten befestigbaren Lage über der Tür-Oberkante. Diese Punkte sind additiv (bestehende Rasterpunkte bleiben) und stehen unter [U-11]; ein Segment ohne zulässige Lage wird nicht beplankt und gewarnt statt mit einem Ersatzpunkt versehen.</w:t>
-      </w:r>
-    </w:p>
-    <w:p>
-      <w:pPr>
-        <w:pStyle w:val="Heading2"/>
-      </w:pPr>
-      <w:r>
-        <w:t xml:space="preserve">Nachweis je Verbinder</w:t>
-      </w:r>
-    </w:p>
-    <w:p>
-      <w:pPr>
-        <w:pBdr>
-          <w:left w:val="single" w:color="1F6FEB" w:sz="18" w:space="6"/>
-        </w:pBdr>
-        <w:shd w:fill="F4F7FB" w:val="clear"/>
-        <w:spacing w:after="120" w:before="80"/>
-      </w:pPr>
-      <w:r>
-        <w:rPr>
-          <w:rFonts w:ascii="Consolas" w:cs="Consolas" w:eastAsia="Consolas" w:hAnsi="Consolas"/>
-          <w:color w:val="0B3A73"/>
-          <w:sz w:val="20"/>
-          <w:szCs w:val="20"/>
-        </w:rPr>
-        <w:t xml:space="preserve">R_d    = R_k / gamma_M          [kN]   (zul. Zuglast je Verbinder)</w:t>
-      </w:r>
-      <w:r>
-        <w:br/>
-      </w:r>
-      <w:r>
-        <w:rPr>
-          <w:rFonts w:ascii="Consolas" w:cs="Consolas" w:eastAsia="Consolas" w:hAnsi="Consolas"/>
-          <w:color w:val="0B3A73"/>
-          <w:sz w:val="20"/>
-          <w:szCs w:val="20"/>
-        </w:rPr>
-        <w:t xml:space="preserve">coeff  = gamma_Q · w_k          [kN/m²]</w:t>
-      </w:r>
-      <w:r>
-        <w:br/>
-      </w:r>
-      <w:r>
-        <w:rPr>
-          <w:rFonts w:ascii="Consolas" w:cs="Consolas" w:eastAsia="Consolas" w:hAnsi="Consolas"/>
-          <w:color w:val="0B3A73"/>
-          <w:sz w:val="20"/>
-          <w:szCs w:val="20"/>
-        </w:rPr>
-        <w:t xml:space="preserve">A_t    = Feldfläche / Anzahl    A_t / A_tmax ≤ 100 %  (A_tmax = R_d / coeff)</w:t>
+        <w:t xml:space="preserve">Nutprüfung je Lage ([U-11]):</w:t>
+      </w:r>
+      <w:r>
+        <w:t xml:space="preserve"> Aus jeder Achse entsteht ein Verbinder nur in den Lagen, in denen ein tatsächlich vorhandener Stein die Nut strikt innen führt. Stein-Außenkanten (auch an Staffelungs-/Treppenkanten), Stoßfugen und steinfreie Positionen bleiben leer; entfallene Positionen und Achsen ohne Verbinder werden in der Bildunterschrift gewarnt statt durch Ersatzpunkte ersetzt. Fehlt die Lagengeometrie im Wandelement, entstehen keine Verbinder (sicherer Leerfall mit Warnung).</w:t>
       </w:r>
     </w:p>
     <w:p>
@@ -8347,7 +8324,24 @@
         <w:spacing w:after="60"/>
       </w:pPr>
       <w:r>
-        <w:t xml:space="preserve">Verbinder-Katalog: FA-1 (R_k 0,50), FA-2 schwer (0,80), IA-1 leicht (0,25), Universal (0,50); je gamma_M = 2,0.</w:t>
+        <w:rPr>
+          <w:b/>
+          <w:bCs/>
+        </w:rPr>
+        <w:t xml:space="preserve">Endverbinder je Lattensegment ([U-12]):</w:t>
+      </w:r>
+      <w:r>
+        <w:t xml:space="preserve"> Zusätzlich zum Panelraster erhält jedes reale Lattensegment an seinem unteren und oberen Ende je einen Verbinder – maßgeblich ist die erste bzw. letzte im Segment nach [U-11] zulässige Lage. Segmentgrenzen sind Öffnungen, Feldgrenzen und Wandkontur, </w:t>
+      </w:r>
+      <w:r>
+        <w:rPr>
+          <w:b/>
+          <w:bCs/>
+        </w:rPr>
+        <w:t xml:space="preserve">nicht</w:t>
+      </w:r>
+      <w:r>
+        <w:t xml:space="preserve"> Wandfuß/Wandkrone: über einer Tür beginnt die Latte an der ersten befestigbaren Lage über der Tür-Oberkante. Diese Punkte sind additiv (bestehende Rasterpunkte bleiben) und stehen unter [U-11]; ein Segment ohne zulässige Lage wird nicht beplankt und gewarnt statt mit einem Ersatzpunkt versehen.</w:t>
       </w:r>
     </w:p>
     <w:p>
@@ -8355,7 +8349,49 @@
         <w:pStyle w:val="Heading2"/>
       </w:pPr>
       <w:r>
-        <w:t xml:space="preserve">Latten</w:t>
+        <w:t xml:space="preserve">Nachweis je Verbinder</w:t>
+      </w:r>
+    </w:p>
+    <w:p>
+      <w:pPr>
+        <w:pBdr>
+          <w:left w:val="single" w:color="1F6FEB" w:sz="18" w:space="6"/>
+        </w:pBdr>
+        <w:shd w:fill="F4F7FB" w:val="clear"/>
+        <w:spacing w:after="120" w:before="80"/>
+      </w:pPr>
+      <w:r>
+        <w:rPr>
+          <w:rFonts w:ascii="Consolas" w:cs="Consolas" w:eastAsia="Consolas" w:hAnsi="Consolas"/>
+          <w:color w:val="0B3A73"/>
+          <w:sz w:val="20"/>
+          <w:szCs w:val="20"/>
+        </w:rPr>
+        <w:t xml:space="preserve">R_d    = R_k / gamma_M          [kN]   (zul. Zuglast je Verbinder)</w:t>
+      </w:r>
+      <w:r>
+        <w:br/>
+      </w:r>
+      <w:r>
+        <w:rPr>
+          <w:rFonts w:ascii="Consolas" w:cs="Consolas" w:eastAsia="Consolas" w:hAnsi="Consolas"/>
+          <w:color w:val="0B3A73"/>
+          <w:sz w:val="20"/>
+          <w:szCs w:val="20"/>
+        </w:rPr>
+        <w:t xml:space="preserve">coeff  = gamma_Q · w_k          [kN/m²]</w:t>
+      </w:r>
+      <w:r>
+        <w:br/>
+      </w:r>
+      <w:r>
+        <w:rPr>
+          <w:rFonts w:ascii="Consolas" w:cs="Consolas" w:eastAsia="Consolas" w:hAnsi="Consolas"/>
+          <w:color w:val="0B3A73"/>
+          <w:sz w:val="20"/>
+          <w:szCs w:val="20"/>
+        </w:rPr>
+        <w:t xml:space="preserve">A_t    = Feldfläche / Anzahl    A_t / A_tmax ≤ 100 %  (A_tmax = R_d / coeff)</w:t>
       </w:r>
     </w:p>
     <w:p>
@@ -8368,7 +8404,15 @@
         <w:spacing w:after="60"/>
       </w:pPr>
       <w:r>
-        <w:t xml:space="preserve">Latten verlaufen vertikal auf den Verbinderachsen; an Öffnungen und am Feldrand abgeschnitten. Sie enden an der obersten nach [U-11] befestigbaren Lage – über eine Staffelungskante hinaus wird nicht weitergeplant.</w:t>
+        <w:t xml:space="preserve">Verbinder-Katalog: FA-1 (R_k 0,50), FA-2 schwer (0,80), IA-1 leicht (0,25), Universal (0,50); je gamma_M = 2,0.</w:t>
+      </w:r>
+    </w:p>
+    <w:p>
+      <w:pPr>
+        <w:pStyle w:val="Heading2"/>
+      </w:pPr>
+      <w:r>
+        <w:t xml:space="preserve">Latten</w:t>
       </w:r>
     </w:p>
     <w:p>
@@ -8381,7 +8425,7 @@
         <w:spacing w:after="60"/>
       </w:pPr>
       <w:r>
-        <w:t xml:space="preserve">Stöße liegen zwischen zwei Verbindern (mittig); Wandhöhe &gt; Lattenlänge → 1D-Zuschnitt mit Reststück-Wiederverwendung. [U-12] wirkt auf der Segmentebene; die Befestigung der einzelnen Zuschnittstücke innerhalb eines Segments regelt weiterhin diese Stoßregel ([U-12.1]).</w:t>
+        <w:t xml:space="preserve">Latten verlaufen vertikal auf den Verbinderachsen; an Öffnungen und am Feldrand abgeschnitten. Sie enden an der obersten nach [U-11] befestigbaren Lage – über eine Staffelungskante hinaus wird nicht weitergeplant.</w:t>
       </w:r>
     </w:p>
     <w:p>
@@ -8394,44 +8438,7 @@
         <w:spacing w:after="60"/>
       </w:pPr>
       <w:r>
-        <w:t xml:space="preserve">Eingaben werden in eingaben.aufbau gespeichert. Die Berechnung ist kanonisch in sembla-aufbau.js; Exportdokumente werden zentral in Modul 0 erzeugt. Modul 2 schreibt das Wandelement nicht zurück.</w:t>
-      </w:r>
-    </w:p>
-    <w:p>
-      <w:pPr>
-        <w:pStyle w:val="Heading1"/>
-      </w:pPr>
-      <w:r>
-        <w:t xml:space="preserve">9 · Modul 3 · Statik (Werkzeug)</w:t>
-      </w:r>
-    </w:p>
-    <w:p>
-      <w:pPr>
-        <w:spacing w:after="140"/>
-      </w:pPr>
-      <w:r>
-        <w:rPr>
-          <w:color w:val="33414F"/>
-          <w:sz w:val="24"/>
-          <w:szCs w:val="24"/>
-        </w:rPr>
-        <w:t xml:space="preserve">Die Oberfläche zum Schermer-Nachweis aus Kapitel 5. Alle Formeln und die Beispielrechnung stehen dort; dieses Kapitel beschreibt Bedienung, Ein-/Ausgaben und die Wandelement-Anbindung.</w:t>
-      </w:r>
-    </w:p>
-    <w:p>
-      <w:pPr>
-        <w:spacing w:after="120"/>
-      </w:pPr>
-      <w:r>
-        <w:t xml:space="preserve">Eingaben (editierbar wie die Bibliothek der Arbeitsmappe): Material, Gewindestange, Lasten, Vorspannung, Prüfwerte §6.2, Spannsystem-Bauteile und Deckenwinkel-Abstand. Geometrie, Öffnungszahl und Wandtyp kommen ausschließlich read-only aus dem aktiven Wandelement; ohne aktives Element wird kein fiktiver Nachweis gerechnet.</w:t>
-      </w:r>
-    </w:p>
-    <w:p>
-      <w:pPr>
-        <w:spacing w:after="120"/>
-      </w:pPr>
-      <w:r>
-        <w:t xml:space="preserve">Ausgaben: **Kompaktnachweis Wand** (Biegung, Schub, Druckrand, Boden, Deckenwinkel) und **Kompaktnachweis Spannsystem** (Stange EC3 + Fließen, Spannschraube, Schraube unten Sechskant/Senk, Kopf-/Fußplatte, Steinpressung, Mutter). Jede Karte zeigt E_d, R_d, Auslastung η und Status; oben die Gesamtausnutzung η_max,gesamt = MAX(Wand, Spannsystem).</w:t>
+        <w:t xml:space="preserve">Stöße liegen zwischen zwei Verbindern (mittig); Wandhöhe &gt; Lattenlänge → 1D-Zuschnitt mit Reststück-Wiederverwendung. [U-12] wirkt auf der Segmentebene; die Befestigung der einzelnen Zuschnittstücke innerhalb eines Segments regelt weiterhin diese Stoßregel ([U-12.1]).</w:t>
       </w:r>
     </w:p>
     <w:p>
@@ -8444,14 +8451,7 @@
         <w:spacing w:after="60"/>
       </w:pPr>
       <w:r>
-        <w:rPr>
-          <w:b/>
-          <w:bCs/>
-        </w:rPr>
-        <w:t xml:space="preserve">Wandelement-Anbindung:</w:t>
-      </w:r>
-      <w:r>
-        <w:t xml:space="preserve"> Geometrie, Öffnungszahl und Wandtyp werden ausschließlich aus dem aktiven Wandelement übernommen. Echte Statik-Kennwerte werden unter eingaben.statik gespeichert; das Modul schreibt das Wandelement nicht zurück. Der zentrale Nachweis-Export nutzt dasselbe DOM-freie Parameter-Mapping.</w:t>
+        <w:t xml:space="preserve">Eingaben werden in eingaben.aufbau gespeichert. Die Berechnung ist kanonisch in sembla-aufbau.js; Exportdokumente werden zentral in Modul 0 erzeugt. Modul 2 schreibt das Wandelement nicht zurück.</w:t>
       </w:r>
     </w:p>
     <w:p>
@@ -8468,18 +8468,31 @@
           <w:b/>
           <w:bCs/>
         </w:rPr>
-        <w:t xml:space="preserve">Interpolations-Absicherung:</w:t>
-      </w:r>
-      <w:r>
-        <w:t xml:space="preserve"> Biege-Prüfwerte werden bei Überschreitung des Prüfbereichs gekappt und gewarnt (Kap. 5.5).</w:t>
-      </w:r>
-    </w:p>
-    <w:p>
-      <w:pPr>
-        <w:pStyle w:val="Heading2"/>
-      </w:pPr>
-      <w:r>
-        <w:t xml:space="preserve">9.1 Transport / Hebezustand (Zusatz, nicht Gutachten)</w:t>
+        <w:t xml:space="preserve">Produkte für diesen Aufbau ([P-13]):</w:t>
+      </w:r>
+      <w:r>
+        <w:t xml:space="preserve"> Aus dem vollständigen aktiven Bauteilkatalog werden Lattenstangen, Beplankungsplatten und das ausführende Verbinderprodukt gewählt (mehrere Standardformate je Punkt erlaubt) und als Produkt-IDs unter eingaben.aufbau.produkte gespeichert. Der Verbindertyp selbst bleibt unveränderlich aus Modul 1 ([U-9]); da Katalog v1 kein Typfeld führt, wird die fehlende maschinelle Typprüfung an der Auswahl benannt. Die Beplankungsauswahl steht der Zuschnittplanung programmgesteuert zur Verfügung, erzeugt aber vorerst keine Plattenmenge und keine Kostenzeile – das bleibt der Zuschnitt- und Baustellenstückliste vorbehalten.</w:t>
+      </w:r>
+    </w:p>
+    <w:p>
+      <w:pPr>
+        <w:pStyle w:val="Heading1"/>
+      </w:pPr>
+      <w:r>
+        <w:t xml:space="preserve">9 · Modul 3 · Statik (Werkzeug)</w:t>
+      </w:r>
+    </w:p>
+    <w:p>
+      <w:pPr>
+        <w:spacing w:after="140"/>
+      </w:pPr>
+      <w:r>
+        <w:rPr>
+          <w:color w:val="33414F"/>
+          <w:sz w:val="24"/>
+          <w:szCs w:val="24"/>
+        </w:rPr>
+        <w:t xml:space="preserve">Die Oberfläche zum Schermer-Nachweis aus Kapitel 5. Alle Formeln und die Beispielrechnung stehen dort; dieses Kapitel beschreibt Bedienung, Ein-/Ausgaben und die Wandelement-Anbindung.</w:t>
       </w:r>
     </w:p>
     <w:p>
@@ -8487,69 +8500,7 @@
         <w:spacing w:after="120"/>
       </w:pPr>
       <w:r>
-        <w:t xml:space="preserve">Separater Spot-Check für das Anschlagblech beim Heben (vorübergehende Bemessungssituation, eigenes Faktorenregime γ_G·dyn). Eigengewicht als Streckenlast n_Ed = γ_w · t · h.</w:t>
-      </w:r>
-    </w:p>
-    <w:p>
-      <w:pPr>
-        <w:pBdr>
-          <w:left w:val="single" w:color="1F6FEB" w:sz="18" w:space="6"/>
-        </w:pBdr>
-        <w:shd w:fill="F4F7FB" w:val="clear"/>
-        <w:spacing w:after="120" w:before="80"/>
-      </w:pPr>
-      <w:r>
-        <w:rPr>
-          <w:rFonts w:ascii="Consolas" w:cs="Consolas" w:eastAsia="Consolas" w:hAnsi="Consolas"/>
-          <w:color w:val="0B3A73"/>
-          <w:sz w:val="20"/>
-          <w:szCs w:val="20"/>
-        </w:rPr>
-        <w:t xml:space="preserve">G_Ek = n_Ed · L / n_Anker      G_Ed = γ_G · dyn · G_Ek   [kN]</w:t>
-      </w:r>
-      <w:r>
-        <w:br/>
-      </w:r>
-      <w:r>
-        <w:rPr>
-          <w:rFonts w:ascii="Consolas" w:cs="Consolas" w:eastAsia="Consolas" w:hAnsi="Consolas"/>
-          <w:color w:val="0B3A73"/>
-          <w:sz w:val="20"/>
-          <w:szCs w:val="20"/>
-        </w:rPr>
-        <w:t xml:space="preserve">erf. Tragfähigkeit Anschlagmittel = G_Ed·1000 / 9,81   [kg]</w:t>
-      </w:r>
-      <w:r>
-        <w:br/>
-      </w:r>
-      <w:r>
-        <w:rPr>
-          <w:rFonts w:ascii="Consolas" w:cs="Consolas" w:eastAsia="Consolas" w:hAnsi="Consolas"/>
-          <w:color w:val="0B3A73"/>
-          <w:sz w:val="20"/>
-          <w:szCs w:val="20"/>
-        </w:rPr>
-        <w:t xml:space="preserve">M_Ed = G_Ed · hebelBlech / 4   W = b·t²/6   σ = M_Ed·1e6 / W  →  σ ≤ f_y</w:t>
-      </w:r>
-    </w:p>
-    <w:p>
-      <w:pPr>
-        <w:pBdr>
-          <w:left w:val="single" w:color="C9461C" w:sz="18" w:space="6"/>
-        </w:pBdr>
-        <w:shd w:fill="FBE9E2" w:val="clear"/>
-        <w:spacing w:after="120" w:before="80"/>
-      </w:pPr>
-      <w:r>
-        <w:t xml:space="preserve">Der Hebe-Nachweis prüft nur das Stahlblech, nicht die Mauerwerksbiegung zwischen den Anschlagpunkten und nicht den Ankerauszug aus dem Mauerwerk — diese sind gesondert zu führen.</w:t>
-      </w:r>
-    </w:p>
-    <w:p>
-      <w:pPr>
-        <w:pStyle w:val="Heading1"/>
-      </w:pPr>
-      <w:r>
-        <w:t xml:space="preserve">10 · Modul 4 · Stückliste &amp; Kosten</w:t>
+        <w:t xml:space="preserve">Eingaben (editierbar wie die Bibliothek der Arbeitsmappe): Material, Gewindestange, Lasten, Vorspannung, Prüfwerte §6.2, Spannsystem-Bauteile und Deckenwinkel-Abstand. Geometrie, Öffnungszahl und Wandtyp kommen ausschließlich read-only aus dem aktiven Wandelement; ohne aktives Element wird kein fiktiver Nachweis gerechnet.</w:t>
       </w:r>
     </w:p>
     <w:p>
@@ -8557,7 +8508,27 @@
         <w:spacing w:after="120"/>
       </w:pPr>
       <w:r>
-        <w:t xml:space="preserve">Zweck: Material-Auszug und Kosten für genau das aktive Wandelement. Kanonische Mengen stammen aus dem Wandelement/BOM und dem unter eingaben.aufbau gespeicherten Aufbau. Preise und Währung liegen unter eingaben.kosten und bleiben beim Projekt-Export/-Import erhalten; eine Mehrfachwand-Mengenlogik gibt es im MVP nicht.</w:t>
+        <w:t xml:space="preserve">Ausgaben: </w:t>
+      </w:r>
+      <w:r>
+        <w:rPr>
+          <w:b/>
+          <w:bCs/>
+        </w:rPr>
+        <w:t xml:space="preserve">Kompaktnachweis Wand</w:t>
+      </w:r>
+      <w:r>
+        <w:t xml:space="preserve"> (Biegung, Schub, Druckrand, Boden, Deckenwinkel) und </w:t>
+      </w:r>
+      <w:r>
+        <w:rPr>
+          <w:b/>
+          <w:bCs/>
+        </w:rPr>
+        <w:t xml:space="preserve">Kompaktnachweis Spannsystem</w:t>
+      </w:r>
+      <w:r>
+        <w:t xml:space="preserve"> (Stange EC3 + Fließen, Spannschraube, Schraube unten Sechskant/Senk, Kopf-/Fußplatte, Steinpressung, Mutter). Jede Karte zeigt E_d, R_d, Auslastung η und Status; oben die Gesamtausnutzung η_max,gesamt = MAX(Wand, Spannsystem).</w:t>
       </w:r>
     </w:p>
     <w:p>
@@ -8574,10 +8545,164 @@
           <w:b/>
           <w:bCs/>
         </w:rPr>
+        <w:t xml:space="preserve">Wandelement-Anbindung:</w:t>
+      </w:r>
+      <w:r>
+        <w:t xml:space="preserve"> Geometrie, Öffnungszahl und Wandtyp werden ausschließlich aus dem aktiven Wandelement übernommen. Echte Statik-Kennwerte werden unter eingaben.statik gespeichert; das Modul schreibt das Wandelement nicht zurück. Der zentrale Nachweis-Export nutzt dasselbe DOM-freie Parameter-Mapping.</w:t>
+      </w:r>
+    </w:p>
+    <w:p>
+      <w:pPr>
+        <w:pStyle w:val="ListParagraph"/>
+        <w:numPr>
+          <w:ilvl w:val="0"/>
+          <w:numId w:val="2"/>
+        </w:numPr>
+        <w:spacing w:after="60"/>
+      </w:pPr>
+      <w:r>
+        <w:rPr>
+          <w:b/>
+          <w:bCs/>
+        </w:rPr>
+        <w:t xml:space="preserve">Interpolations-Absicherung:</w:t>
+      </w:r>
+      <w:r>
+        <w:t xml:space="preserve"> Biege-Prüfwerte werden bei Überschreitung des Prüfbereichs gekappt und gewarnt (Kap. 5.5).</w:t>
+      </w:r>
+    </w:p>
+    <w:p>
+      <w:pPr>
+        <w:pStyle w:val="Heading2"/>
+      </w:pPr>
+      <w:r>
+        <w:t xml:space="preserve">9.1 Transport / Hebezustand (Zusatz, nicht Gutachten)</w:t>
+      </w:r>
+    </w:p>
+    <w:p>
+      <w:pPr>
+        <w:spacing w:after="120"/>
+      </w:pPr>
+      <w:r>
+        <w:t xml:space="preserve">Separater Spot-Check für das Anschlagblech beim Heben (vorübergehende Bemessungssituation, eigenes Faktorenregime γ_G·dyn). Eigengewicht als Streckenlast n_Ed = γ_w · t · h.</w:t>
+      </w:r>
+    </w:p>
+    <w:p>
+      <w:pPr>
+        <w:pBdr>
+          <w:left w:val="single" w:color="1F6FEB" w:sz="18" w:space="6"/>
+        </w:pBdr>
+        <w:shd w:fill="F4F7FB" w:val="clear"/>
+        <w:spacing w:after="120" w:before="80"/>
+      </w:pPr>
+      <w:r>
+        <w:rPr>
+          <w:rFonts w:ascii="Consolas" w:cs="Consolas" w:eastAsia="Consolas" w:hAnsi="Consolas"/>
+          <w:color w:val="0B3A73"/>
+          <w:sz w:val="20"/>
+          <w:szCs w:val="20"/>
+        </w:rPr>
+        <w:t xml:space="preserve">G_Ek = n_Ed · L / n_Anker      G_Ed = γ_G · dyn · G_Ek   [kN]</w:t>
+      </w:r>
+      <w:r>
+        <w:br/>
+      </w:r>
+      <w:r>
+        <w:rPr>
+          <w:rFonts w:ascii="Consolas" w:cs="Consolas" w:eastAsia="Consolas" w:hAnsi="Consolas"/>
+          <w:color w:val="0B3A73"/>
+          <w:sz w:val="20"/>
+          <w:szCs w:val="20"/>
+        </w:rPr>
+        <w:t xml:space="preserve">erf. Tragfähigkeit Anschlagmittel = G_Ed·1000 / 9,81   [kg]</w:t>
+      </w:r>
+      <w:r>
+        <w:br/>
+      </w:r>
+      <w:r>
+        <w:rPr>
+          <w:rFonts w:ascii="Consolas" w:cs="Consolas" w:eastAsia="Consolas" w:hAnsi="Consolas"/>
+          <w:color w:val="0B3A73"/>
+          <w:sz w:val="20"/>
+          <w:szCs w:val="20"/>
+        </w:rPr>
+        <w:t xml:space="preserve">M_Ed = G_Ed · hebelBlech / 4   W = b·t²/6   σ = M_Ed·1e6 / W  →  σ ≤ f_y</w:t>
+      </w:r>
+    </w:p>
+    <w:p>
+      <w:pPr>
+        <w:pBdr>
+          <w:left w:val="single" w:color="C9461C" w:sz="18" w:space="6"/>
+        </w:pBdr>
+        <w:shd w:fill="FBE9E2" w:val="clear"/>
+        <w:spacing w:after="120" w:before="80"/>
+      </w:pPr>
+      <w:r>
+        <w:t xml:space="preserve">Der Hebe-Nachweis prüft nur das Stahlblech, nicht die Mauerwerksbiegung zwischen den Anschlagpunkten und nicht den Ankerauszug aus dem Mauerwerk — diese sind gesondert zu führen.</w:t>
+      </w:r>
+    </w:p>
+    <w:p>
+      <w:pPr>
+        <w:pStyle w:val="Heading1"/>
+      </w:pPr>
+      <w:r>
+        <w:t xml:space="preserve">10 · Modul 4 · Stückliste &amp; Kosten</w:t>
+      </w:r>
+    </w:p>
+    <w:p>
+      <w:pPr>
+        <w:spacing w:after="120"/>
+      </w:pPr>
+      <w:r>
+        <w:t xml:space="preserve">Zweck: Material-Auszug und Kosten für genau das aktive Wandelement. Kanonische Mengen stammen aus dem Wandelement/BOM und dem unter eingaben.aufbau gespeicherten Aufbau. Eine Mehrfachwand-Mengenlogik gibt es im MVP nicht.</w:t>
+      </w:r>
+    </w:p>
+    <w:p>
+      <w:pPr>
+        <w:spacing w:after="120"/>
+      </w:pPr>
+      <w:r>
+        <w:t xml:space="preserve">Preise sind hier </w:t>
+      </w:r>
+      <w:r>
+        <w:rPr>
+          <w:b/>
+          <w:bCs/>
+        </w:rPr>
+        <w:t xml:space="preserve">nicht editierbar</w:t>
+      </w:r>
+      <w:r>
+        <w:t xml:space="preserve">. Sie werden zu jeder Position frisch aus dem aktiven Bauteilkatalog aufgelöst – über die in Modul 1 bzw. Modul 2 gewählten Produkte je Verwendungsrolle ([P-13], [P-14]). Editierbar bleiben nur Projektname und Währung. Jede Position zeigt Produkt und Preisbasis oder – bei fehlender, mehrdeutiger, kategoriefremder, einheitenfremder oder maßfremder Zuordnung – den Grund im Klartext und </w:t>
+      </w:r>
+      <w:r>
+        <w:rPr>
+          <w:b/>
+          <w:bCs/>
+        </w:rPr>
+        <w:t xml:space="preserve">keinen</w:t>
+      </w:r>
+      <w:r>
+        <w:t xml:space="preserve"> Preis. Die Summe nennt in diesem Fall ausdrücklich, wie viele von wie vielen Positionen bepreist sind. Boden- und Kopfblech erscheinen als getrennte Positionen ([A-1]); die Dichtstreifen-Gesamtlänge in Metern ist nachrichtlich und wird nicht bepreist ([A-6]). Vorläufige, fachlich unbestätigte Katalogwerte werden je Position gekennzeichnet ([P-12]). Die frühere, im Modul gepflegte Preisliste (eingaben.kosten.preise) bleibt in Altprojekten erhalten, wird aber nicht mehr gelesen und nicht mehr geschrieben.</w:t>
+      </w:r>
+    </w:p>
+    <w:p>
+      <w:pPr>
+        <w:pStyle w:val="ListParagraph"/>
+        <w:numPr>
+          <w:ilvl w:val="0"/>
+          <w:numId w:val="2"/>
+        </w:numPr>
+        <w:spacing w:after="60"/>
+      </w:pPr>
+      <w:r>
+        <w:rPr>
+          <w:b/>
+          <w:bCs/>
+        </w:rPr>
         <w:t xml:space="preserve">Export:</w:t>
       </w:r>
       <w:r>
-        <w:t xml:space="preserve"> Stücklisten-/Zuschnittdateien werden ausschließlich über den zentralen ZIP-Export in Modul 0 erzeugt.</w:t>
+        <w:t xml:space="preserve"> Stücklisten-/Zuschnittdateien werden ausschließlich über den zentralen ZIP-Export in Modul 0 erzeugt – mit derselben Preisauflösung wie die Anzeige, damit CSV und Bildschirm nie auseinanderlaufen.</w:t>
       </w:r>
     </w:p>
     <w:p>
@@ -9133,7 +9258,7 @@
                 <w:sz w:val="20"/>
                 <w:szCs w:val="20"/>
               </w:rPr>
-              <w:t xml:space="preserve">direkt im Tool editierbar; Mengen/Positionen aus docs/shared/sembla-bom.js</w:t>
+              <w:t xml:space="preserve">ausschließlich im Bauteilkatalog (Modul 0); Zuordnung je Rolle in Modul 1/2, Auflösung in docs/shared/sembla-katalog.js, Mengen/Positionen aus docs/shared/sembla-bom.js</w:t>
             </w:r>
           </w:p>
         </w:tc>
@@ -10423,7 +10548,27 @@
         <w:t xml:space="preserve">[A-1]</w:t>
       </w:r>
       <w:r>
-        <w:t xml:space="preserve"> Fuß immer Bodenblech (Stahl 15 mm, wandlang, in Blechmodulen); je Strang unten Senkkopfschraube, oben Kopplungsmutter.</w:t>
+        <w:t xml:space="preserve"> Fuß immer Bodenblech (Stahl 15 mm, wandlang, in Blechmodulen); je Strang unten Senkkopfschraube, oben Kopplungsmutter. Bodenblech und Kopfblech sind </w:t>
+      </w:r>
+      <w:r>
+        <w:rPr>
+          <w:b/>
+          <w:bCs/>
+        </w:rPr>
+        <w:t xml:space="preserve">physisch getrennte Bauteile mit eigener Modulzahl</w:t>
+      </w:r>
+      <w:r>
+        <w:t xml:space="preserve"> (base_plate/top_plate) und erscheinen in Stückliste und Kosten als </w:t>
+      </w:r>
+      <w:r>
+        <w:rPr>
+          <w:b/>
+          <w:bCs/>
+        </w:rPr>
+        <w:t xml:space="preserve">getrennt bepreisbare Positionen</w:t>
+      </w:r>
+      <w:r>
+        <w:t xml:space="preserve">. Die Trennung wird in der gemeinsamen Ausgabeschicht aus den real vorhandenen Platten des Wandelements abgeleitet; die Summe beider Positionen bleibt gleich der Gesamtmodulzahl des Rechenkerns (keine Doppelzählung, kein Core-Eingriff).</w:t>
       </w:r>
     </w:p>
     <w:p>
@@ -10523,7 +10668,27 @@
         <w:t xml:space="preserve">[A-6]</w:t>
       </w:r>
       <w:r>
-        <w:t xml:space="preserve"> Stoßfugen werden gezählt; Dichtstreifen je Fuge 20 cm (Schallschutz), Gesamtlänge in der BOM.</w:t>
+        <w:t xml:space="preserve"> Stoßfugen werden gezählt; Dichtstreifen je Fuge 20 cm (Schallschutz), Gesamtlänge in der BOM. Bepreist wird ausschließlich die </w:t>
+      </w:r>
+      <w:r>
+        <w:rPr>
+          <w:b/>
+          <w:bCs/>
+        </w:rPr>
+        <w:t xml:space="preserve">Einbauposition je Fuge</w:t>
+      </w:r>
+      <w:r>
+        <w:t xml:space="preserve"> (Stück à 20 cm); die Gesamtlänge in Metern ist </w:t>
+      </w:r>
+      <w:r>
+        <w:rPr>
+          <w:b/>
+          <w:bCs/>
+        </w:rPr>
+        <w:t xml:space="preserve">nachrichtlich</w:t>
+      </w:r>
+      <w:r>
+        <w:t xml:space="preserve"> und wird nie zusätzlich bepreist – dieselbe Ware darf nicht zweimal in einer Summe erscheinen. Priorität: Mengen- und Kostenregel, der Mengenermittlung nachgeordnet – sie ändert keine Menge, nur deren Bepreisbarkeit.</w:t>
       </w:r>
     </w:p>
     <w:p>
@@ -10831,7 +10996,37 @@
         <w:t xml:space="preserve">[U-9]</w:t>
       </w:r>
       <w:r>
-        <w:t xml:space="preserve"> Verbindertyp folgt Wand-Aufbau/Seite aus Modul 1 (fassade → FA, innenausbau → IA) und ist in Modul 2 nicht neu wählbar.</w:t>
+        <w:t xml:space="preserve"> Verbindertyp folgt Wand-Aufbau/Seite aus Modul 1 (fassade → FA, innenausbau → IA) und ist in Modul 2 nicht neu wählbar. Modul 2 wählt lediglich das </w:t>
+      </w:r>
+      <w:r>
+        <w:rPr>
+          <w:b/>
+          <w:bCs/>
+        </w:rPr>
+        <w:t xml:space="preserve">Katalogprodukt</w:t>
+      </w:r>
+      <w:r>
+        <w:t xml:space="preserve">, das diesen abgeleiteten Typ ausführt; der Typ selbst bleibt unveränderlich. Solange das Katalogformat kein maschinenlesbares Typfeld führt, ist die Übereinstimmung Produkt ↔ abgeleiteter Typ </w:t>
+      </w:r>
+      <w:r>
+        <w:rPr>
+          <w:b/>
+          <w:bCs/>
+        </w:rPr>
+        <w:t xml:space="preserve">nicht maschinell prüfbar</w:t>
+      </w:r>
+      <w:r>
+        <w:t xml:space="preserve">; dieser Umstand wird an der Auswahl sichtbar benannt und nicht durch eine Namens- oder Ähnlichkeitsheuristik ersetzt (</w:t>
+      </w:r>
+      <w:r>
+        <w:rPr>
+          <w:b/>
+          <w:bCs/>
+        </w:rPr>
+        <w:t xml:space="preserve">[P-9]</w:t>
+      </w:r>
+      <w:r>
+        <w:t xml:space="preserve">).</w:t>
       </w:r>
     </w:p>
     <w:p>
@@ -11431,7 +11626,17 @@
         <w:t xml:space="preserve">[P-6]</w:t>
       </w:r>
       <w:r>
-        <w:t xml:space="preserve"> Der gesamte Planungsprozess ist deterministisch und regelbasiert. Abgeleitete Werte werden aus Wandelement, Eingaben und Katalog frisch berechnet; keine gespeicherten Schattenmengen oder stillen Heuristik-Ergebnisse.</w:t>
+        <w:t xml:space="preserve"> Der gesamte Planungsprozess ist deterministisch und regelbasiert. Abgeleitete Werte werden aus Wandelement, Eingaben und Katalog frisch berechnet; keine gespeicherten Schattenmengen oder stillen Heuristik-Ergebnisse. Insbesondere gibt es </w:t>
+      </w:r>
+      <w:r>
+        <w:rPr>
+          <w:b/>
+          <w:bCs/>
+        </w:rPr>
+        <w:t xml:space="preserve">keinen Nullpreis-, Ersatzprodukt- oder Standardwert-Fallback</w:t>
+      </w:r>
+      <w:r>
+        <w:t xml:space="preserve">: eine nicht auflösbare Angabe bleibt leer und wird gemeldet, statt durch einen plausibel aussehenden Wert ersetzt zu werden.</w:t>
       </w:r>
     </w:p>
     <w:p>
@@ -11511,7 +11716,17 @@
         <w:t xml:space="preserve">[P-10]</w:t>
       </w:r>
       <w:r>
-        <w:t xml:space="preserve"> Der Bauteilkatalog ist eine getrennte, versionierte Ressource. Das Projekt referenziert nur ausgewählte Produkt-IDs; fehlende Referenzen werden sichtbar gewarnt.</w:t>
+        <w:t xml:space="preserve"> Der Bauteilkatalog ist eine getrennte, versionierte Ressource mit eigenem Dateiformat und eigener Formatversion. Das Projekt referenziert nur ausgewählte Produkt-IDs – </w:t>
+      </w:r>
+      <w:r>
+        <w:rPr>
+          <w:b/>
+          <w:bCs/>
+        </w:rPr>
+        <w:t xml:space="preserve">je Verwendungsrolle</w:t>
+      </w:r>
+      <w:r>
+        <w:t xml:space="preserve"> der Wand, niemals Preise oder Maße und nichts davon im Wandelement; fehlende Referenzen werden sichtbar gewarnt und nie still bereinigt.</w:t>
       </w:r>
     </w:p>
     <w:p>
@@ -11592,6 +11807,276 @@
       </w:r>
       <w:r>
         <w:t xml:space="preserve"> gilt unverändert: der Katalog bleibt im eigenen Slot und Dateiformat, die Musterwand im öffentlichen Projektformat. Vorläufige, fachlich unbestätigte Beispielwerte einer Vorlage sind sichtbar als solche zu kennzeichnen und dürfen nicht als geprüfte Kennwerte dargestellt werden. Priorität: Datenhaltungs- und Bedienregel – sie ändert keine Mengen, keine Geometrie und keinen Nachweis und ist jeder Muss-Regel nachgeordnet.</w:t>
+      </w:r>
+    </w:p>
+    <w:p>
+      <w:pPr>
+        <w:pStyle w:val="ListParagraph"/>
+        <w:numPr>
+          <w:ilvl w:val="0"/>
+          <w:numId w:val="2"/>
+        </w:numPr>
+        <w:spacing w:after="60"/>
+      </w:pPr>
+      <w:r>
+        <w:rPr>
+          <w:b/>
+          <w:bCs/>
+        </w:rPr>
+        <w:t xml:space="preserve">[P-13]</w:t>
+      </w:r>
+      <w:r>
+        <w:t xml:space="preserve"> </w:t>
+      </w:r>
+      <w:r>
+        <w:rPr>
+          <w:b/>
+          <w:bCs/>
+        </w:rPr>
+        <w:t xml:space="preserve">Ownership der Produktreferenzen.</w:t>
+      </w:r>
+      <w:r>
+        <w:t xml:space="preserve"> Produktstamm und Preise werden </w:t>
+      </w:r>
+      <w:r>
+        <w:rPr>
+          <w:b/>
+          <w:bCs/>
+        </w:rPr>
+        <w:t xml:space="preserve">ausschließlich in Modul 0</w:t>
+      </w:r>
+      <w:r>
+        <w:t xml:space="preserve"> gepflegt; Modul 0 besitzt keine wand- oder projektbezogene Produktauswahl. Die wandbezogene Auswahl trifft das fachlich zuständige Modul </w:t>
+      </w:r>
+      <w:r>
+        <w:rPr>
+          <w:b/>
+          <w:bCs/>
+        </w:rPr>
+        <w:t xml:space="preserve">direkt aus dem vollständigen aktiven Katalog</w:t>
+      </w:r>
+      <w:r>
+        <w:t xml:space="preserve">, ohne zwischengeschalteten Freigabepool: </w:t>
+      </w:r>
+      <w:r>
+        <w:rPr>
+          <w:b/>
+          <w:bCs/>
+        </w:rPr>
+        <w:t xml:space="preserve">Modul 1</w:t>
+      </w:r>
+      <w:r>
+        <w:t xml:space="preserve"> für Wand, Vorspannung, Anschluss und Fugen (eingaben.planung.produkte), </w:t>
+      </w:r>
+      <w:r>
+        <w:rPr>
+          <w:b/>
+          <w:bCs/>
+        </w:rPr>
+        <w:t xml:space="preserve">Modul 2</w:t>
+      </w:r>
+      <w:r>
+        <w:t xml:space="preserve"> für Latten, Beplankung und Verbinder (eingaben.aufbau.produkte). Jedes Modul schreibt nur seinen eigenen Eingaben-Abschnitt. Gespeichert werden ausschließlich Produkt-IDs je Rolle plus eine Herkunftsnotiz des Katalogs – keine Preise, keine Maße, nichts im Wandelement (</w:t>
+      </w:r>
+      <w:r>
+        <w:rPr>
+          <w:b/>
+          <w:bCs/>
+        </w:rPr>
+        <w:t xml:space="preserve">[P-1]</w:t>
+      </w:r>
+      <w:r>
+        <w:t xml:space="preserve">, </w:t>
+      </w:r>
+      <w:r>
+        <w:rPr>
+          <w:b/>
+          <w:bCs/>
+        </w:rPr>
+        <w:t xml:space="preserve">[P-10]</w:t>
+      </w:r>
+      <w:r>
+        <w:t xml:space="preserve">). </w:t>
+      </w:r>
+      <w:r>
+        <w:rPr>
+          <w:b/>
+          <w:bCs/>
+        </w:rPr>
+        <w:t xml:space="preserve">Modul 4</w:t>
+      </w:r>
+      <w:r>
+        <w:t xml:space="preserve"> ist reiner Leser und besitzt keine Preisfelder. Mehrere Produkte je Rolle sind zulässig (mehrere Standardlängen/-formate) und stehen der nachgelagerten Zuschnitt- und Beschaffungsplanung programmgesteuert zur Verfügung. Priorität: Datenhaltungs- und Bedienregel, jeder Muss-Regel nachgeordnet.</w:t>
+      </w:r>
+    </w:p>
+    <w:p>
+      <w:pPr>
+        <w:pStyle w:val="ListParagraph"/>
+        <w:numPr>
+          <w:ilvl w:val="0"/>
+          <w:numId w:val="2"/>
+        </w:numPr>
+        <w:spacing w:after="60"/>
+      </w:pPr>
+      <w:r>
+        <w:rPr>
+          <w:b/>
+          <w:bCs/>
+        </w:rPr>
+        <w:t xml:space="preserve">[P-14]</w:t>
+      </w:r>
+      <w:r>
+        <w:t xml:space="preserve"> </w:t>
+      </w:r>
+      <w:r>
+        <w:rPr>
+          <w:b/>
+          <w:bCs/>
+        </w:rPr>
+        <w:t xml:space="preserve">Deterministische Preisauflösung.</w:t>
+      </w:r>
+      <w:r>
+        <w:t xml:space="preserve"> Der Preis einer Stücklistenposition entsteht ausschließlich über die Kette Rolle → ausgewählte Produkt-IDs → Katalogprodukt. Eingegrenzt wird nur anhand </w:t>
+      </w:r>
+      <w:r>
+        <w:rPr>
+          <w:b/>
+          <w:bCs/>
+        </w:rPr>
+        <w:t xml:space="preserve">tatsächlich vorhandener</w:t>
+      </w:r>
+      <w:r>
+        <w:t xml:space="preserve"> Daten: passende Katalogkategorie, zur Positionseinheit </w:t>
+      </w:r>
+      <w:r>
+        <w:rPr>
+          <w:b/>
+          <w:bCs/>
+        </w:rPr>
+        <w:t xml:space="preserve">kompatible Preisbasis</w:t>
+      </w:r>
+      <w:r>
+        <w:t xml:space="preserve"> (Stk↔Stk, m↔m; keine Umrechnung, insbesondere keine Flächen-/Stückumrechnung) und – soweit für die Rolle definiert – Übereinstimmung eines realen Maßfeldes mit dem maßgebenden Wandwert (Gewindestangenlänge, Blech-Modullänge, Lattenstangenlänge, Steinbreite). Bleibt nach dieser Eingrenzung </w:t>
+      </w:r>
+      <w:r>
+        <w:rPr>
+          <w:b/>
+          <w:bCs/>
+        </w:rPr>
+        <w:t xml:space="preserve">genau ein</w:t>
+      </w:r>
+      <w:r>
+        <w:t xml:space="preserve"> Produkt, liefert es den Preis; bleiben </w:t>
+      </w:r>
+      <w:r>
+        <w:rPr>
+          <w:b/>
+          <w:bCs/>
+        </w:rPr>
+        <w:t xml:space="preserve">mehrere</w:t>
+      </w:r>
+      <w:r>
+        <w:t xml:space="preserve">, ist das Ergebnis mehrdeutig und </w:t>
+      </w:r>
+      <w:r>
+        <w:rPr>
+          <w:b/>
+          <w:bCs/>
+        </w:rPr>
+        <w:t xml:space="preserve">ohne Preis</w:t>
+      </w:r>
+      <w:r>
+        <w:t xml:space="preserve">. Fehlende, kategoriefremde, einheitenfremde oder maßfremde Zuordnung sowie ein fehlender Katalog werden ebenso sichtbar und </w:t>
+      </w:r>
+      <w:r>
+        <w:rPr>
+          <w:b/>
+          <w:bCs/>
+        </w:rPr>
+        <w:t xml:space="preserve">ohne Preis</w:t>
+      </w:r>
+      <w:r>
+        <w:t xml:space="preserve"> ausgewiesen. Unzulässig sind: Auswahl eines ersten Kandidaten, Mittelwert, Minimum, Ersatzprodukt, Nullpreis, Einheitenumrechnung und jede Veränderung der Einbaumenge. Positionen mit Menge 0 benötigen kein Produkt. Eine Summe mit unaufgelösten Positionen wird als </w:t>
+      </w:r>
+      <w:r>
+        <w:rPr>
+          <w:b/>
+          <w:bCs/>
+        </w:rPr>
+        <w:t xml:space="preserve">unvollständig</w:t>
+      </w:r>
+      <w:r>
+        <w:t xml:space="preserve"> mit der Angabe „n von m bepreisten Positionen“ gekennzeichnet. Der Auswahlstatus ist bereits an der wählenden Oberfläche (Modul 1/2) sichtbar, nicht erst in Modul 4. Vorläufige, fachlich unbestätigte Katalogwerte bleiben als solche gekennzeichnet (</w:t>
+      </w:r>
+      <w:r>
+        <w:rPr>
+          <w:b/>
+          <w:bCs/>
+        </w:rPr>
+        <w:t xml:space="preserve">[P-12]</w:t>
+      </w:r>
+      <w:r>
+        <w:t xml:space="preserve">). Priorität: Mengen- und Kostenregel; sie ist der Mengenermittlung nachgeordnet und darf sie nie verändern.</w:t>
+      </w:r>
+    </w:p>
+    <w:p>
+      <w:pPr>
+        <w:pStyle w:val="ListParagraph"/>
+        <w:numPr>
+          <w:ilvl w:val="0"/>
+          <w:numId w:val="2"/>
+        </w:numPr>
+        <w:spacing w:after="60"/>
+      </w:pPr>
+      <w:r>
+        <w:rPr>
+          <w:b/>
+          <w:bCs/>
+        </w:rPr>
+        <w:t xml:space="preserve">[P-15]</w:t>
+      </w:r>
+      <w:r>
+        <w:t xml:space="preserve"> </w:t>
+      </w:r>
+      <w:r>
+        <w:rPr>
+          <w:b/>
+          <w:bCs/>
+        </w:rPr>
+        <w:t xml:space="preserve">Unwirksamer Altbestand.</w:t>
+      </w:r>
+      <w:r>
+        <w:t xml:space="preserve"> Produktreferenzen aus früheren, abgelösten Auswahlwegen (eingaben.katalog.auswahl) bleiben zur Nachvollziehbarkeit im Projekt erhalten, werden aber </w:t>
+      </w:r>
+      <w:r>
+        <w:rPr>
+          <w:b/>
+          <w:bCs/>
+        </w:rPr>
+        <w:t xml:space="preserve">nicht mehr geschrieben, nicht als Filter angewendet und nicht heuristisch in Verwendungsrollen übersetzt</w:t>
+      </w:r>
+      <w:r>
+        <w:t xml:space="preserve"> – eine Kategorie-zu-Rolle-Übersetzung ist mehrdeutig und damit unzulässig (</w:t>
+      </w:r>
+      <w:r>
+        <w:rPr>
+          <w:b/>
+          <w:bCs/>
+        </w:rPr>
+        <w:t xml:space="preserve">[P-9]</w:t>
+      </w:r>
+      <w:r>
+        <w:t xml:space="preserve">). Ihr Vorhandensein wird in Modul 0 </w:t>
+      </w:r>
+      <w:r>
+        <w:rPr>
+          <w:b/>
+          <w:bCs/>
+        </w:rPr>
+        <w:t xml:space="preserve">sichtbar als unwirksam</w:t>
+      </w:r>
+      <w:r>
+        <w:t xml:space="preserve"> gemeldet, mit Verweis auf den neuen Ort der Auswahl. Priorität: Datenhaltungsregel, jeder Muss-Regel nachgeordnet.</w:t>
       </w:r>
     </w:p>
     <w:sectPr>

</xml_diff>

<commit_message>
feat: kategoriespezifischen Katalogdialog ergänzen (#34)
</commit_message>
<xml_diff>
--- a/doku/SEMBLA_Handbuch.docx
+++ b/doku/SEMBLA_Handbuch.docx
@@ -8046,6 +8046,32 @@
         <w:spacing w:after="120"/>
       </w:pPr>
       <w:r>
+        <w:t xml:space="preserve">Produkte werden in einem </w:t>
+      </w:r>
+      <w:r>
+        <w:rPr>
+          <w:b/>
+          <w:bCs/>
+        </w:rPr>
+        <w:t xml:space="preserve">eigenen Dialog</w:t>
+      </w:r>
+      <w:r>
+        <w:t xml:space="preserve"> angelegt, bearbeitet und dupliziert, der klar von der Produktübersicht getrennt ist ([P-16]). Die Maske richtet sich nach der gewählten Kategorie und zeigt nur fachlich zutreffende Felder mit ausgewiesener Einheit: Gewindestange mit Gewindebezeichnung (z. B. M10), Güte und Stangenlänge; Latte mit Querschnitt (Breite × Dicke) und Standardlänge; Beplankungsplatte und Blech mit Plattenbreite, -höhe und -dicke, ohne Gewindefeld; Stein mit optionaler Steinbreite, die als das für die Preiszuordnung maßgebende Maß gekennzeichnet ist; Verbinder und Verbrauchsmaterial ohne Maßfelder. Pflichtfelder stehen an der Beschriftung und werden aus derselben Kategorietabelle gelesen, gegen die auch validiert wird – es gibt keine zweite Pflichtdefinition.</w:t>
+      </w:r>
+    </w:p>
+    <w:p>
+      <w:pPr>
+        <w:spacing w:after="120"/>
+      </w:pPr>
+      <w:r>
+        <w:t xml:space="preserve">Gespeichert wird ausschließlich über „Speichern“. Abbrechen, Escape und ein Klick neben den Dialog lassen den Katalog unverändert; auch „Duplizieren“ öffnet nur den vorbelegten Dialog mit freiem ID-Vorschlag und legt die Kopie erst mit dem Speichern an. Fehlermeldungen der Validierung erscheinen im Dialog, der zur Korrektur offen bleibt. Feldschlüssel und Katalog-Formatversion bleiben unverändert (v1); unbekannte Zusatzfelder eines Produkts – etwa der Vorlagenhinweis nach [P-12] – überleben das Bearbeiten.</w:t>
+      </w:r>
+    </w:p>
+    <w:p>
+      <w:pPr>
+        <w:spacing w:after="120"/>
+      </w:pPr>
+      <w:r>
         <w:t xml:space="preserve">Für den Einstieg liefert das Repository zwei Vorlagen unter docs/vorlagen/ mit: den Standardkatalog (SEMBLA_Standardkatalog.json, Katalogformat v1) und die AWG-Musterwand (SEMBLA_Musterwand.json, Projektformat v2). Beide werden ausschließlich auf Klick geladen – „Standardkatalog laden” bzw. „Musterwand laden…” – und niemals automatisch. Ein bereits geladener Katalog wird erst nach ausdrücklicher Bestätigung ersetzt; ein Abbruch bleibt wirkungslos. Die Musterwand läuft durch denselben Bestätigungsdialog wie jeder Dateiimport und wird als neues Wandelement angelegt, ohne bestehende Elemente zu überschreiben. Die Musterwand ist die kanonische Ausgabe des heutigen Rechenkerns aus den fachlichen Eingaben der freigegebenen AWG-Vorlage: Geometrie, Tiling und Spannachsen sind unverändert, veraltete abgeleitete Daten sind nicht übernommen.</w:t>
       </w:r>
     </w:p>
@@ -12077,6 +12103,158 @@
       </w:r>
       <w:r>
         <w:t xml:space="preserve"> gemeldet, mit Verweis auf den neuen Ort der Auswahl. Priorität: Datenhaltungsregel, jeder Muss-Regel nachgeordnet.</w:t>
+      </w:r>
+    </w:p>
+    <w:p>
+      <w:pPr>
+        <w:pStyle w:val="ListParagraph"/>
+        <w:numPr>
+          <w:ilvl w:val="0"/>
+          <w:numId w:val="2"/>
+        </w:numPr>
+        <w:spacing w:after="60"/>
+      </w:pPr>
+      <w:r>
+        <w:rPr>
+          <w:b/>
+          <w:bCs/>
+        </w:rPr>
+        <w:t xml:space="preserve">[P-16]</w:t>
+      </w:r>
+      <w:r>
+        <w:t xml:space="preserve"> </w:t>
+      </w:r>
+      <w:r>
+        <w:rPr>
+          <w:b/>
+          <w:bCs/>
+        </w:rPr>
+        <w:t xml:space="preserve">Kategoriegerechte Produktmaske.</w:t>
+      </w:r>
+      <w:r>
+        <w:t xml:space="preserve"> Produkte werden ausschließlich in Modul 0 gepflegt (</w:t>
+      </w:r>
+      <w:r>
+        <w:rPr>
+          <w:b/>
+          <w:bCs/>
+        </w:rPr>
+        <w:t xml:space="preserve">[P-13]</w:t>
+      </w:r>
+      <w:r>
+        <w:t xml:space="preserve">) und dort in einem </w:t>
+      </w:r>
+      <w:r>
+        <w:rPr>
+          <w:b/>
+          <w:bCs/>
+        </w:rPr>
+        <w:t xml:space="preserve">eigenen, klar von der Produktübersicht getrennten Dialog</w:t>
+      </w:r>
+      <w:r>
+        <w:t xml:space="preserve"> angelegt, bearbeitet und dupliziert. </w:t>
+      </w:r>
+      <w:r>
+        <w:rPr>
+          <w:b/>
+          <w:bCs/>
+        </w:rPr>
+        <w:t xml:space="preserve">Speichern ist der einzige Schreibweg</w:t>
+      </w:r>
+      <w:r>
+        <w:t xml:space="preserve">: Abbrechen, Escape und Klick neben den Dialog lassen die Katalogdaten unverändert – auch beim Duplizieren, das erst mit dem Speichern ein Produkt anlegt. Die Maske zeigt </w:t>
+      </w:r>
+      <w:r>
+        <w:rPr>
+          <w:b/>
+          <w:bCs/>
+        </w:rPr>
+        <w:t xml:space="preserve">je Kategorie nur fachlich zutreffende Felder</w:t>
+      </w:r>
+      <w:r>
+        <w:t xml:space="preserve"> mit fachlicher Beschriftung und ausgewiesener Einheit: Gewindestange mit Gewindebezeichnung, Güte und Stangenlänge; Latte mit Querschnitt und Standardlänge; Beplankungsplatte und Blech mit Breite, Höhe und Dicke ohne Gewindefeld; Stein mit optionaler Steinbreite, sichtbar als das für die Preiszuordnung maßgebende Maß (</w:t>
+      </w:r>
+      <w:r>
+        <w:rPr>
+          <w:b/>
+          <w:bCs/>
+        </w:rPr>
+        <w:t xml:space="preserve">[P-14]</w:t>
+      </w:r>
+      <w:r>
+        <w:t xml:space="preserve">); Verbinder und Verbrauchsmaterial ohne fachfremde Maßfelder. Die </w:t>
+      </w:r>
+      <w:r>
+        <w:rPr>
+          <w:b/>
+          <w:bCs/>
+        </w:rPr>
+        <w:t xml:space="preserve">Pflichtdefinition ist nicht doppelt zu führen</w:t>
+      </w:r>
+      <w:r>
+        <w:t xml:space="preserve"> – Maske und Validierung lesen dieselbe DOM-freie Kategorietabelle. Die </w:t>
+      </w:r>
+      <w:r>
+        <w:rPr>
+          <w:b/>
+          <w:bCs/>
+        </w:rPr>
+        <w:t xml:space="preserve">kanonischen Feldschlüssel</w:t>
+      </w:r>
+      <w:r>
+        <w:t xml:space="preserve"> (breite_mm, hoehe_mm, dicke_mm, laenge_mm, gewinde, guete) bleiben unverändert, damit die Maß-Diskriminatoren nach </w:t>
+      </w:r>
+      <w:r>
+        <w:rPr>
+          <w:b/>
+          <w:bCs/>
+        </w:rPr>
+        <w:t xml:space="preserve">[P-14]</w:t>
+      </w:r>
+      <w:r>
+        <w:t xml:space="preserve"> weiter greifen; unbekannte Zusatzfelder eines Produkts (etwa der Vorlagenhinweis nach </w:t>
+      </w:r>
+      <w:r>
+        <w:rPr>
+          <w:b/>
+          <w:bCs/>
+        </w:rPr>
+        <w:t xml:space="preserve">[P-12]</w:t>
+      </w:r>
+      <w:r>
+        <w:t xml:space="preserve">) bleiben beim Bearbeiten erhalten. Die Regel betrifft allein die Bedienung und begründet </w:t>
+      </w:r>
+      <w:r>
+        <w:rPr>
+          <w:b/>
+          <w:bCs/>
+        </w:rPr>
+        <w:t xml:space="preserve">keinen</w:t>
+      </w:r>
+      <w:r>
+        <w:t xml:space="preserve"> Wechsel der Katalog-Formatversion – bestehende Katalogdateien v1 bleiben unverändert lesbar (</w:t>
+      </w:r>
+      <w:r>
+        <w:rPr>
+          <w:b/>
+          <w:bCs/>
+        </w:rPr>
+        <w:t xml:space="preserve">[P-10]</w:t>
+      </w:r>
+      <w:r>
+        <w:t xml:space="preserve">). Priorität: Bedien- und Datenhaltungsregel – sie ändert keine Mengen, keine Preise und keinen Nachweis und ist jeder Muss-Regel nachgeordnet.</w:t>
+      </w:r>
+    </w:p>
+    <w:p>
+      <w:pPr>
+        <w:pBdr>
+          <w:left w:val="single" w:color="E0B400" w:sz="18" w:space="6"/>
+        </w:pBdr>
+        <w:shd w:fill="FFF8E6" w:val="clear"/>
+        <w:spacing w:after="120" w:before="80"/>
+      </w:pPr>
+      <w:r>
+        <w:t xml:space="preserve">Herkunft [P-16]: Issue #34 (Folge aus dem Live-Feedback zu #21). Die erste Katalogfassung führte eine einzige generische Eingabezeile unmittelbar über der Produktliste: Beschriftungen waren kategorieunabhängig, für Stein, Verbinder und Verbrauchsmaterial erschienen alle vier Maßfelder, und das Duplizieren schrieb die Kopie sofort in den Katalog, sodass ein anschließendes Abbrechen sie stehen ließ. Es fehlte eine Regel für die kategoriegerechte Maske und für die Reinheit des Bearbeitungsdialogs.</w:t>
       </w:r>
     </w:p>
     <w:sectPr>

</xml_diff>

<commit_message>
feat: Kataloggrößen regelbasiert kombinieren (#35)
</commit_message>
<xml_diff>
--- a/doku/SEMBLA_Handbuch.docx
+++ b/doku/SEMBLA_Handbuch.docx
@@ -2842,7 +2842,7 @@
         <w:spacing w:after="120"/>
       </w:pPr>
       <w:r>
-        <w:t xml:space="preserve">Der Bauteilkatalog ist eine eigene Ressource im Format SEMBLA-Bauteilkatalog v1 und wird ausschließlich in Modul 0 gepflegt. Welche Produkte eine konkrete Wand verwendet, wählen die fachlich zuständigen Module direkt aus dem vollständigen Katalog: Modul 1 für Wand, Vorspannung, Anschluss und Fugen, Modul 2 für Latten, Beplankung und Verbinder. Im Projekt werden nur Quelle und ausgewählte Produkt-IDs je Verwendungsrolle referenziert; Produktmaße und Preise werden nicht in das Wandelement eingebettet. Modul 4 liest die Katalogpreise nur und pflegt sie nicht. Fehlende oder mehrdeutige Referenzen werden sichtbar gewarnt und nie durch einen Ersatzwert überdeckt ([P-13], [P-14]).</w:t>
+        <w:t xml:space="preserve">Der Bauteilkatalog ist eine eigene Ressource im Format SEMBLA-Bauteilkatalog v1 und wird ausschließlich in Modul 0 gepflegt. Welche Produkte eine konkrete Wand verwendet, wählen die fachlich zuständigen Module direkt aus dem vollständigen Katalog: Modul 1 für Wand, Vorspannung, Anschluss und Fugen, Modul 2 für Latten, Beplankung und Verbinder. Im Projekt werden nur Quelle und ausgewählte Produkt-IDs je Verwendungsrolle referenziert; Produktmaße und Preise werden nicht in das Wandelement eingebettet. Modul 4 liest die Katalogpreise nur und pflegt sie nicht. Fehlende oder mehrdeutige Referenzen werden sichtbar gewarnt und nie durch einen Ersatzwert überdeckt ([P-13], [P-14]). Ein gewähltes Produkt ist zugleich die alleinige Quelle seiner Maße ([Z-1]); mehrere gewählte Standardgrößen werden nach [Z-2] deterministisch kombiniert.</w:t>
       </w:r>
     </w:p>
     <w:p>
@@ -3982,7 +3982,7 @@
         <w:spacing w:after="120"/>
       </w:pPr>
       <w:r>
-        <w:t xml:space="preserve">Jeder Kern und jede Oberfläche ist durch automatisierte Tests abgesichert: Logik-Tests (tests/module/test-*.mjs), Smoke-Tests der HTML-Module unter DOM-Mock (tests/module/smoke_*.mjs), Core-Parität (tests/core/, Python + JS gegen goldene Fixtures) und BOM-Drift-Schutz (test-shared.mjs). npm run test:all fährt alles. Vor jedem Push müssen die betroffenen Tests grün sein. Fachliche Regressionstests sollen die verletzte oder ergänzte Regel-ID benennen.</w:t>
+        <w:t xml:space="preserve">Jeder Kern und jede Oberfläche ist durch automatisierte Tests abgesichert: Logik-Tests (tests/module/test-*.mjs), Smoke-Tests der HTML-Module unter DOM-Mock (tests/module/smoke_*.mjs), Core-Parität (tests/core/, Python + JS gegen goldene Fixtures) BOM-Drift-Schutz (test-shared.mjs) und die Zuschnitt-Regressionen der Kombinationsregeln (tests/module/test-zuschnitt.mjs, npm run test:zuschnitt – enthält den Leitfall 170 cm aus 100/50). npm run test:all fährt alles. Vor jedem Push müssen die betroffenen Tests grün sein. Fachliche Regressionstests sollen die verletzte oder ergänzte Regel-ID benennen.</w:t>
       </w:r>
     </w:p>
     <w:p>
@@ -8225,46 +8225,10 @@
           <w:b/>
           <w:bCs/>
         </w:rPr>
-        <w:t xml:space="preserve">Produkte für diese Wand ([P-13]):</w:t>
-      </w:r>
-      <w:r>
-        <w:t xml:space="preserve"> Aus dem vollständigen aktiven Bauteilkatalog werden die Produkte je Verwendungsrolle gewählt – gruppiert nach Steinen, Vorspannung, Anschluss (einschließlich getrennter Boden- und Kopfbleche nach [A-1]) und Fugen. Mehrere Produkte je Rolle sind erlaubt; der Auswahlstatus (zugeordnet, mehrdeutig, ohne Auswahl) steht direkt an der Rolle. Gespeichert werden nur Produkt-IDs und die Herkunftsnotiz des Katalogs unter eingaben.planung.produkte – das Wandelement bleibt frei von Produktdaten.</w:t>
-      </w:r>
-    </w:p>
-    <w:p>
-      <w:pPr>
-        <w:pStyle w:val="Heading1"/>
-      </w:pPr>
-      <w:r>
-        <w:t xml:space="preserve">8 · Modul 2 · Horizontaler Wandaufbau</w:t>
-      </w:r>
-    </w:p>
-    <w:p>
-      <w:pPr>
-        <w:spacing w:after="120"/>
-      </w:pPr>
-      <w:r>
-        <w:t xml:space="preserve">Zweck: Verbinder- und Lattenplanung in einem Schritt. Die Panelfugen bestimmen die Verbinderachsen; daraus werden die Latten abgeleitet.</w:t>
-      </w:r>
-    </w:p>
-    <w:p>
-      <w:pPr>
-        <w:pBdr>
-          <w:left w:val="single" w:color="E0B400" w:sz="18" w:space="6"/>
-        </w:pBdr>
-        <w:shd w:fill="FFF8E6" w:val="clear"/>
-        <w:spacing w:after="120" w:before="80"/>
-      </w:pPr>
-      <w:r>
-        <w:t xml:space="preserve">Im MVP ist die Wärmedämmung aus diesem Modul entfernt (Entscheidung Polycare). Die Latten-Logik bleibt unverändert; der Dichtstreifen aus den Stoßfugen (Schallschutz, Kap. 2.6) ist keine Wärmedämmung und bleibt erhalten.</w:t>
-      </w:r>
-    </w:p>
-    <w:p>
-      <w:pPr>
-        <w:pStyle w:val="Heading2"/>
-      </w:pPr>
-      <w:r>
-        <w:t xml:space="preserve">Verbinderachsen aus Panelfugen</w:t>
+        <w:t xml:space="preserve">Produkte für diese Wand ([P-13], [P-17]):</w:t>
+      </w:r>
+      <w:r>
+        <w:t xml:space="preserve"> Aus dem vollständigen aktiven Bauteilkatalog werden die Produkte je Verwendungsrolle gewählt – je Rolle eine kompakte Zeile mit Mehrfachauswahl-Dropdown (Steine, Vorspannung, Anschluss einschließlich getrennter Boden- und Kopfbleche nach [A-1], Fugen). Mehrere Produkte je Rolle sind erlaubt; der Auswahlstatus (zugeordnet, kombiniert, mehrdeutig, ohne Auswahl) steht direkt an der Rolle. Gespeichert werden nur Produkt-IDs und die Herkunftsnotiz des Katalogs unter eingaben.planung.produkte – das Wandelement bleibt frei von Produktdaten.</w:t>
       </w:r>
     </w:p>
     <w:p>
@@ -8281,10 +8245,46 @@
           <w:b/>
           <w:bCs/>
         </w:rPr>
-        <w:t xml:space="preserve">Panelmaß</w:t>
-      </w:r>
-      <w:r>
-        <w:t xml:space="preserve"> (Standard 62,5 × 150 cm, änderbar) legt die Verbinderachsen fest: vertikale Achsen an den Panel-Längsfugen, horizontale an den Panel-Höhenfugen – plus Zwischenachsen, wenn der Max-Abstand überschritten wird.</w:t>
+        <w:t xml:space="preserve">Gewindestangenlänge kommt aus dem Katalog ([Z-1]):</w:t>
+      </w:r>
+      <w:r>
+        <w:t xml:space="preserve"> Sobald ein Gewindestangenprodukt gewählt ist, liefert dessen Standardlänge die Vorspann-Geometrie; das frühere freie Längenfeld ist gesperrt und wird nicht mehr gelesen. Mehrere gewählte Standardlängen werden nach [Z-2] kombiniert (größte zuerst, mit kleineren auffüllen, Restmaß als Sonderzuschnitt); ein Restmaß unter 200 mm wird nach [Z-5] sichtbar als Konflikt gemeldet. Ohne Auswahl bleibt der gekennzeichnete Altwert als Fallback wirksam.</w:t>
+      </w:r>
+    </w:p>
+    <w:p>
+      <w:pPr>
+        <w:pStyle w:val="Heading1"/>
+      </w:pPr>
+      <w:r>
+        <w:t xml:space="preserve">8 · Modul 2 · Horizontaler Wandaufbau</w:t>
+      </w:r>
+    </w:p>
+    <w:p>
+      <w:pPr>
+        <w:spacing w:after="120"/>
+      </w:pPr>
+      <w:r>
+        <w:t xml:space="preserve">Zweck: Verbinder- und Lattenplanung in einem Schritt. Die Panelfugen bestimmen die Verbinderachsen; daraus werden die Latten abgeleitet.</w:t>
+      </w:r>
+    </w:p>
+    <w:p>
+      <w:pPr>
+        <w:pBdr>
+          <w:left w:val="single" w:color="E0B400" w:sz="18" w:space="6"/>
+        </w:pBdr>
+        <w:shd w:fill="FFF8E6" w:val="clear"/>
+        <w:spacing w:after="120" w:before="80"/>
+      </w:pPr>
+      <w:r>
+        <w:t xml:space="preserve">Im MVP ist die Wärmedämmung aus diesem Modul entfernt (Entscheidung Polycare). Die Latten-Logik bleibt unverändert; der Dichtstreifen aus den Stoßfugen (Schallschutz, Kap. 2.6) ist keine Wärmedämmung und bleibt erhalten.</w:t>
+      </w:r>
+    </w:p>
+    <w:p>
+      <w:pPr>
+        <w:pStyle w:val="Heading2"/>
+      </w:pPr>
+      <w:r>
+        <w:t xml:space="preserve">Verbinderachsen aus Panelfugen</w:t>
       </w:r>
     </w:p>
     <w:p>
@@ -8297,7 +8297,14 @@
         <w:spacing w:after="60"/>
       </w:pPr>
       <w:r>
-        <w:t xml:space="preserve">Zusätzlich an Wandkanten; keine Verbinder innerhalb von Öffnungen. An linken/rechten Öffnungskanten wird der bestehende Randabstand eingehalten: Achsen werden auf eine sichere Nut von der Öffnung weg verschoben, dedupliziert und bei unlösbaren Abstandskonflikten sichtbar gewarnt. Oberkanten von Öffnungen sind keine Sperrzone.</w:t>
+        <w:rPr>
+          <w:b/>
+          <w:bCs/>
+        </w:rPr>
+        <w:t xml:space="preserve">Panelmaß</w:t>
+      </w:r>
+      <w:r>
+        <w:t xml:space="preserve"> (Standard 62,5 × 150 cm, änderbar) legt die Verbinderachsen fest: vertikale Achsen an den Panel-Längsfugen, horizontale an den Panel-Höhenfugen – plus Zwischenachsen, wenn der Max-Abstand überschritten wird.</w:t>
       </w:r>
     </w:p>
     <w:p>
@@ -8310,14 +8317,7 @@
         <w:spacing w:after="60"/>
       </w:pPr>
       <w:r>
-        <w:rPr>
-          <w:b/>
-          <w:bCs/>
-        </w:rPr>
-        <w:t xml:space="preserve">Beplankungsfeld:</w:t>
-      </w:r>
-      <w:r>
-        <w:t xml:space="preserve"> häufig wird nur ein Teil der Wand beplankt – ein rechteckiges Feld begrenzt Verbinder und Latten. Ein sichtbarer Bearbeitungsmodus zeigt Rasterpunkte, Hover und Vorschau; erst „Übernehmen &amp; berechnen” speichert das Feld und stößt die Berechnung an. Standard = ganze Wand.</w:t>
+        <w:t xml:space="preserve">Zusätzlich an Wandkanten; keine Verbinder innerhalb von Öffnungen. An linken/rechten Öffnungskanten wird der bestehende Randabstand eingehalten: Achsen werden auf eine sichere Nut von der Öffnung weg verschoben, dedupliziert und bei unlösbaren Abstandskonflikten sichtbar gewarnt. Oberkanten von Öffnungen sind keine Sperrzone.</w:t>
       </w:r>
     </w:p>
     <w:p>
@@ -8334,10 +8334,10 @@
           <w:b/>
           <w:bCs/>
         </w:rPr>
-        <w:t xml:space="preserve">Nutprüfung je Lage ([U-11]):</w:t>
-      </w:r>
-      <w:r>
-        <w:t xml:space="preserve"> Aus jeder Achse entsteht ein Verbinder nur in den Lagen, in denen ein tatsächlich vorhandener Stein die Nut strikt innen führt. Stein-Außenkanten (auch an Staffelungs-/Treppenkanten), Stoßfugen und steinfreie Positionen bleiben leer; entfallene Positionen und Achsen ohne Verbinder werden in der Bildunterschrift gewarnt statt durch Ersatzpunkte ersetzt. Fehlt die Lagengeometrie im Wandelement, entstehen keine Verbinder (sicherer Leerfall mit Warnung).</w:t>
+        <w:t xml:space="preserve">Beplankungsfeld:</w:t>
+      </w:r>
+      <w:r>
+        <w:t xml:space="preserve"> häufig wird nur ein Teil der Wand beplankt – ein rechteckiges Feld begrenzt Verbinder und Latten. Ein sichtbarer Bearbeitungsmodus zeigt Rasterpunkte, Hover und Vorschau; erst „Übernehmen &amp; berechnen” speichert das Feld und stößt die Berechnung an. Standard = ganze Wand.</w:t>
       </w:r>
     </w:p>
     <w:p>
@@ -8354,70 +8354,10 @@
           <w:b/>
           <w:bCs/>
         </w:rPr>
-        <w:t xml:space="preserve">Endverbinder je Lattensegment ([U-12]):</w:t>
-      </w:r>
-      <w:r>
-        <w:t xml:space="preserve"> Zusätzlich zum Panelraster erhält jedes reale Lattensegment an seinem unteren und oberen Ende je einen Verbinder – maßgeblich ist die erste bzw. letzte im Segment nach [U-11] zulässige Lage. Segmentgrenzen sind Öffnungen, Feldgrenzen und Wandkontur, </w:t>
-      </w:r>
-      <w:r>
-        <w:rPr>
-          <w:b/>
-          <w:bCs/>
-        </w:rPr>
-        <w:t xml:space="preserve">nicht</w:t>
-      </w:r>
-      <w:r>
-        <w:t xml:space="preserve"> Wandfuß/Wandkrone: über einer Tür beginnt die Latte an der ersten befestigbaren Lage über der Tür-Oberkante. Diese Punkte sind additiv (bestehende Rasterpunkte bleiben) und stehen unter [U-11]; ein Segment ohne zulässige Lage wird nicht beplankt und gewarnt statt mit einem Ersatzpunkt versehen.</w:t>
-      </w:r>
-    </w:p>
-    <w:p>
-      <w:pPr>
-        <w:pStyle w:val="Heading2"/>
-      </w:pPr>
-      <w:r>
-        <w:t xml:space="preserve">Nachweis je Verbinder</w:t>
-      </w:r>
-    </w:p>
-    <w:p>
-      <w:pPr>
-        <w:pBdr>
-          <w:left w:val="single" w:color="1F6FEB" w:sz="18" w:space="6"/>
-        </w:pBdr>
-        <w:shd w:fill="F4F7FB" w:val="clear"/>
-        <w:spacing w:after="120" w:before="80"/>
-      </w:pPr>
-      <w:r>
-        <w:rPr>
-          <w:rFonts w:ascii="Consolas" w:cs="Consolas" w:eastAsia="Consolas" w:hAnsi="Consolas"/>
-          <w:color w:val="0B3A73"/>
-          <w:sz w:val="20"/>
-          <w:szCs w:val="20"/>
-        </w:rPr>
-        <w:t xml:space="preserve">R_d    = R_k / gamma_M          [kN]   (zul. Zuglast je Verbinder)</w:t>
-      </w:r>
-      <w:r>
-        <w:br/>
-      </w:r>
-      <w:r>
-        <w:rPr>
-          <w:rFonts w:ascii="Consolas" w:cs="Consolas" w:eastAsia="Consolas" w:hAnsi="Consolas"/>
-          <w:color w:val="0B3A73"/>
-          <w:sz w:val="20"/>
-          <w:szCs w:val="20"/>
-        </w:rPr>
-        <w:t xml:space="preserve">coeff  = gamma_Q · w_k          [kN/m²]</w:t>
-      </w:r>
-      <w:r>
-        <w:br/>
-      </w:r>
-      <w:r>
-        <w:rPr>
-          <w:rFonts w:ascii="Consolas" w:cs="Consolas" w:eastAsia="Consolas" w:hAnsi="Consolas"/>
-          <w:color w:val="0B3A73"/>
-          <w:sz w:val="20"/>
-          <w:szCs w:val="20"/>
-        </w:rPr>
-        <w:t xml:space="preserve">A_t    = Feldfläche / Anzahl    A_t / A_tmax ≤ 100 %  (A_tmax = R_d / coeff)</w:t>
+        <w:t xml:space="preserve">Nutprüfung je Lage ([U-11]):</w:t>
+      </w:r>
+      <w:r>
+        <w:t xml:space="preserve"> Aus jeder Achse entsteht ein Verbinder nur in den Lagen, in denen ein tatsächlich vorhandener Stein die Nut strikt innen führt. Stein-Außenkanten (auch an Staffelungs-/Treppenkanten), Stoßfugen und steinfreie Positionen bleiben leer; entfallene Positionen und Achsen ohne Verbinder werden in der Bildunterschrift gewarnt statt durch Ersatzpunkte ersetzt. Fehlt die Lagengeometrie im Wandelement, entstehen keine Verbinder (sicherer Leerfall mit Warnung).</w:t>
       </w:r>
     </w:p>
     <w:p>
@@ -8430,7 +8370,24 @@
         <w:spacing w:after="60"/>
       </w:pPr>
       <w:r>
-        <w:t xml:space="preserve">Verbinder-Katalog: FA-1 (R_k 0,50), FA-2 schwer (0,80), IA-1 leicht (0,25), Universal (0,50); je gamma_M = 2,0.</w:t>
+        <w:rPr>
+          <w:b/>
+          <w:bCs/>
+        </w:rPr>
+        <w:t xml:space="preserve">Endverbinder je Lattensegment ([U-12]):</w:t>
+      </w:r>
+      <w:r>
+        <w:t xml:space="preserve"> Zusätzlich zum Panelraster erhält jedes reale Lattensegment an seinem unteren und oberen Ende je einen Verbinder – maßgeblich ist die erste bzw. letzte im Segment nach [U-11] zulässige Lage. Segmentgrenzen sind Öffnungen, Feldgrenzen und Wandkontur, </w:t>
+      </w:r>
+      <w:r>
+        <w:rPr>
+          <w:b/>
+          <w:bCs/>
+        </w:rPr>
+        <w:t xml:space="preserve">nicht</w:t>
+      </w:r>
+      <w:r>
+        <w:t xml:space="preserve"> Wandfuß/Wandkrone: über einer Tür beginnt die Latte an der ersten befestigbaren Lage über der Tür-Oberkante. Diese Punkte sind additiv (bestehende Rasterpunkte bleiben) und stehen unter [U-11]; ein Segment ohne zulässige Lage wird nicht beplankt und gewarnt statt mit einem Ersatzpunkt versehen.</w:t>
       </w:r>
     </w:p>
     <w:p>
@@ -8438,7 +8395,49 @@
         <w:pStyle w:val="Heading2"/>
       </w:pPr>
       <w:r>
-        <w:t xml:space="preserve">Latten</w:t>
+        <w:t xml:space="preserve">Nachweis je Verbinder</w:t>
+      </w:r>
+    </w:p>
+    <w:p>
+      <w:pPr>
+        <w:pBdr>
+          <w:left w:val="single" w:color="1F6FEB" w:sz="18" w:space="6"/>
+        </w:pBdr>
+        <w:shd w:fill="F4F7FB" w:val="clear"/>
+        <w:spacing w:after="120" w:before="80"/>
+      </w:pPr>
+      <w:r>
+        <w:rPr>
+          <w:rFonts w:ascii="Consolas" w:cs="Consolas" w:eastAsia="Consolas" w:hAnsi="Consolas"/>
+          <w:color w:val="0B3A73"/>
+          <w:sz w:val="20"/>
+          <w:szCs w:val="20"/>
+        </w:rPr>
+        <w:t xml:space="preserve">R_d    = R_k / gamma_M          [kN]   (zul. Zuglast je Verbinder)</w:t>
+      </w:r>
+      <w:r>
+        <w:br/>
+      </w:r>
+      <w:r>
+        <w:rPr>
+          <w:rFonts w:ascii="Consolas" w:cs="Consolas" w:eastAsia="Consolas" w:hAnsi="Consolas"/>
+          <w:color w:val="0B3A73"/>
+          <w:sz w:val="20"/>
+          <w:szCs w:val="20"/>
+        </w:rPr>
+        <w:t xml:space="preserve">coeff  = gamma_Q · w_k          [kN/m²]</w:t>
+      </w:r>
+      <w:r>
+        <w:br/>
+      </w:r>
+      <w:r>
+        <w:rPr>
+          <w:rFonts w:ascii="Consolas" w:cs="Consolas" w:eastAsia="Consolas" w:hAnsi="Consolas"/>
+          <w:color w:val="0B3A73"/>
+          <w:sz w:val="20"/>
+          <w:szCs w:val="20"/>
+        </w:rPr>
+        <w:t xml:space="preserve">A_t    = Feldfläche / Anzahl    A_t / A_tmax ≤ 100 %  (A_tmax = R_d / coeff)</w:t>
       </w:r>
     </w:p>
     <w:p>
@@ -8451,7 +8450,15 @@
         <w:spacing w:after="60"/>
       </w:pPr>
       <w:r>
-        <w:t xml:space="preserve">Latten verlaufen vertikal auf den Verbinderachsen; an Öffnungen und am Feldrand abgeschnitten. Sie enden an der obersten nach [U-11] befestigbaren Lage – über eine Staffelungskante hinaus wird nicht weitergeplant.</w:t>
+        <w:t xml:space="preserve">Verbinder-Katalog: FA-1 (R_k 0,50), FA-2 schwer (0,80), IA-1 leicht (0,25), Universal (0,50); je gamma_M = 2,0.</w:t>
+      </w:r>
+    </w:p>
+    <w:p>
+      <w:pPr>
+        <w:pStyle w:val="Heading2"/>
+      </w:pPr>
+      <w:r>
+        <w:t xml:space="preserve">Latten</w:t>
       </w:r>
     </w:p>
     <w:p>
@@ -8464,7 +8471,7 @@
         <w:spacing w:after="60"/>
       </w:pPr>
       <w:r>
-        <w:t xml:space="preserve">Stöße liegen zwischen zwei Verbindern (mittig); Wandhöhe &gt; Lattenlänge → 1D-Zuschnitt mit Reststück-Wiederverwendung. [U-12] wirkt auf der Segmentebene; die Befestigung der einzelnen Zuschnittstücke innerhalb eines Segments regelt weiterhin diese Stoßregel ([U-12.1]).</w:t>
+        <w:t xml:space="preserve">Latten verlaufen vertikal auf den Verbinderachsen; an Öffnungen und am Feldrand abgeschnitten. Sie enden an der obersten nach [U-11] befestigbaren Lage – über eine Staffelungskante hinaus wird nicht weitergeplant.</w:t>
       </w:r>
     </w:p>
     <w:p>
@@ -8477,7 +8484,7 @@
         <w:spacing w:after="60"/>
       </w:pPr>
       <w:r>
-        <w:t xml:space="preserve">Eingaben werden in eingaben.aufbau gespeichert. Die Berechnung ist kanonisch in sembla-aufbau.js; Exportdokumente werden zentral in Modul 0 erzeugt. Modul 2 schreibt das Wandelement nicht zurück.</w:t>
+        <w:t xml:space="preserve">Stöße liegen zwischen zwei Verbindern (mittig); Wandhöhe &gt; Lattenlänge → 1D-Zuschnitt mit Reststück-Wiederverwendung. [U-12] wirkt auf der Segmentebene; die Befestigung der einzelnen Zuschnittstücke innerhalb eines Segments regelt weiterhin diese Stoßregel ([U-12.1]).</w:t>
       </w:r>
     </w:p>
     <w:p>
@@ -8490,71 +8497,7 @@
         <w:spacing w:after="60"/>
       </w:pPr>
       <w:r>
-        <w:rPr>
-          <w:b/>
-          <w:bCs/>
-        </w:rPr>
-        <w:t xml:space="preserve">Produkte für diesen Aufbau ([P-13]):</w:t>
-      </w:r>
-      <w:r>
-        <w:t xml:space="preserve"> Aus dem vollständigen aktiven Bauteilkatalog werden Lattenstangen, Beplankungsplatten und das ausführende Verbinderprodukt gewählt (mehrere Standardformate je Punkt erlaubt) und als Produkt-IDs unter eingaben.aufbau.produkte gespeichert. Der Verbindertyp selbst bleibt unveränderlich aus Modul 1 ([U-9]); da Katalog v1 kein Typfeld führt, wird die fehlende maschinelle Typprüfung an der Auswahl benannt. Die Beplankungsauswahl steht der Zuschnittplanung programmgesteuert zur Verfügung, erzeugt aber vorerst keine Plattenmenge und keine Kostenzeile – das bleibt der Zuschnitt- und Baustellenstückliste vorbehalten.</w:t>
-      </w:r>
-    </w:p>
-    <w:p>
-      <w:pPr>
-        <w:pStyle w:val="Heading1"/>
-      </w:pPr>
-      <w:r>
-        <w:t xml:space="preserve">9 · Modul 3 · Statik (Werkzeug)</w:t>
-      </w:r>
-    </w:p>
-    <w:p>
-      <w:pPr>
-        <w:spacing w:after="140"/>
-      </w:pPr>
-      <w:r>
-        <w:rPr>
-          <w:color w:val="33414F"/>
-          <w:sz w:val="24"/>
-          <w:szCs w:val="24"/>
-        </w:rPr>
-        <w:t xml:space="preserve">Die Oberfläche zum Schermer-Nachweis aus Kapitel 5. Alle Formeln und die Beispielrechnung stehen dort; dieses Kapitel beschreibt Bedienung, Ein-/Ausgaben und die Wandelement-Anbindung.</w:t>
-      </w:r>
-    </w:p>
-    <w:p>
-      <w:pPr>
-        <w:spacing w:after="120"/>
-      </w:pPr>
-      <w:r>
-        <w:t xml:space="preserve">Eingaben (editierbar wie die Bibliothek der Arbeitsmappe): Material, Gewindestange, Lasten, Vorspannung, Prüfwerte §6.2, Spannsystem-Bauteile und Deckenwinkel-Abstand. Geometrie, Öffnungszahl und Wandtyp kommen ausschließlich read-only aus dem aktiven Wandelement; ohne aktives Element wird kein fiktiver Nachweis gerechnet.</w:t>
-      </w:r>
-    </w:p>
-    <w:p>
-      <w:pPr>
-        <w:spacing w:after="120"/>
-      </w:pPr>
-      <w:r>
-        <w:t xml:space="preserve">Ausgaben: </w:t>
-      </w:r>
-      <w:r>
-        <w:rPr>
-          <w:b/>
-          <w:bCs/>
-        </w:rPr>
-        <w:t xml:space="preserve">Kompaktnachweis Wand</w:t>
-      </w:r>
-      <w:r>
-        <w:t xml:space="preserve"> (Biegung, Schub, Druckrand, Boden, Deckenwinkel) und </w:t>
-      </w:r>
-      <w:r>
-        <w:rPr>
-          <w:b/>
-          <w:bCs/>
-        </w:rPr>
-        <w:t xml:space="preserve">Kompaktnachweis Spannsystem</w:t>
-      </w:r>
-      <w:r>
-        <w:t xml:space="preserve"> (Stange EC3 + Fließen, Spannschraube, Schraube unten Sechskant/Senk, Kopf-/Fußplatte, Steinpressung, Mutter). Jede Karte zeigt E_d, R_d, Auslastung η und Status; oben die Gesamtausnutzung η_max,gesamt = MAX(Wand, Spannsystem).</w:t>
+        <w:t xml:space="preserve">Eingaben werden in eingaben.aufbau gespeichert. Die Berechnung ist kanonisch in sembla-aufbau.js; Exportdokumente werden zentral in Modul 0 erzeugt. Modul 2 schreibt das Wandelement nicht zurück.</w:t>
       </w:r>
     </w:p>
     <w:p>
@@ -8571,10 +8514,67 @@
           <w:b/>
           <w:bCs/>
         </w:rPr>
-        <w:t xml:space="preserve">Wandelement-Anbindung:</w:t>
-      </w:r>
-      <w:r>
-        <w:t xml:space="preserve"> Geometrie, Öffnungszahl und Wandtyp werden ausschließlich aus dem aktiven Wandelement übernommen. Echte Statik-Kennwerte werden unter eingaben.statik gespeichert; das Modul schreibt das Wandelement nicht zurück. Der zentrale Nachweis-Export nutzt dasselbe DOM-freie Parameter-Mapping.</w:t>
+        <w:t xml:space="preserve">Produkte für diesen Aufbau ([P-13], [P-17]):</w:t>
+      </w:r>
+      <w:r>
+        <w:t xml:space="preserve"> Aus dem vollständigen aktiven Bauteilkatalog werden Lattenstangen, Beplankungsplatten und das ausführende Verbinderprodukt gewählt – im selben kompakten Dropdown-Muster wie in Modul 1, mehrere Standardformate je Punkt erlaubt – und als Produkt-IDs unter eingaben.aufbau.produkte gespeichert. Querschnitt und Standardlänge der Latten stammen dann ausschließlich aus dem gewählten Produkt ([Z-1]); die früheren freien Felder sind gesperrt und unwirksam. Die Latten-Bilanz weist Einbaustücke, Standard- und Sonderzuschnitte sowie die Ausgangsprodukte aus ([Z-4]) – keine bin-gepackte Bestellmenge und keine Reststück-Wiederverwendung mehr. Der Verbindertyp selbst bleibt unveränderlich aus Modul 1 ([U-9]); da Katalog v1 kein Typfeld führt, wird die fehlende maschinelle Typprüfung an der Auswahl benannt. Die Beplankungsauswahl steht der Zuschnittplanung programmgesteuert zur Verfügung, erzeugt aber vorerst keine Plattenmenge und keine Kostenzeile – das bleibt der Zuschnitt- und Baustellenstückliste vorbehalten.</w:t>
+      </w:r>
+    </w:p>
+    <w:p>
+      <w:pPr>
+        <w:pStyle w:val="Heading1"/>
+      </w:pPr>
+      <w:r>
+        <w:t xml:space="preserve">9 · Modul 3 · Statik (Werkzeug)</w:t>
+      </w:r>
+    </w:p>
+    <w:p>
+      <w:pPr>
+        <w:spacing w:after="140"/>
+      </w:pPr>
+      <w:r>
+        <w:rPr>
+          <w:color w:val="33414F"/>
+          <w:sz w:val="24"/>
+          <w:szCs w:val="24"/>
+        </w:rPr>
+        <w:t xml:space="preserve">Die Oberfläche zum Schermer-Nachweis aus Kapitel 5. Alle Formeln und die Beispielrechnung stehen dort; dieses Kapitel beschreibt Bedienung, Ein-/Ausgaben und die Wandelement-Anbindung.</w:t>
+      </w:r>
+    </w:p>
+    <w:p>
+      <w:pPr>
+        <w:spacing w:after="120"/>
+      </w:pPr>
+      <w:r>
+        <w:t xml:space="preserve">Eingaben (editierbar wie die Bibliothek der Arbeitsmappe): Material, Gewindestange, Lasten, Vorspannung, Prüfwerte §6.2, Spannsystem-Bauteile und Deckenwinkel-Abstand. Geometrie, Öffnungszahl und Wandtyp kommen ausschließlich read-only aus dem aktiven Wandelement; ohne aktives Element wird kein fiktiver Nachweis gerechnet.</w:t>
+      </w:r>
+    </w:p>
+    <w:p>
+      <w:pPr>
+        <w:spacing w:after="120"/>
+      </w:pPr>
+      <w:r>
+        <w:t xml:space="preserve">Ausgaben: </w:t>
+      </w:r>
+      <w:r>
+        <w:rPr>
+          <w:b/>
+          <w:bCs/>
+        </w:rPr>
+        <w:t xml:space="preserve">Kompaktnachweis Wand</w:t>
+      </w:r>
+      <w:r>
+        <w:t xml:space="preserve"> (Biegung, Schub, Druckrand, Boden, Deckenwinkel) und </w:t>
+      </w:r>
+      <w:r>
+        <w:rPr>
+          <w:b/>
+          <w:bCs/>
+        </w:rPr>
+        <w:t xml:space="preserve">Kompaktnachweis Spannsystem</w:t>
+      </w:r>
+      <w:r>
+        <w:t xml:space="preserve"> (Stange EC3 + Fließen, Spannschraube, Schraube unten Sechskant/Senk, Kopf-/Fußplatte, Steinpressung, Mutter). Jede Karte zeigt E_d, R_d, Auslastung η und Status; oben die Gesamtausnutzung η_max,gesamt = MAX(Wand, Spannsystem).</w:t>
       </w:r>
     </w:p>
     <w:p>
@@ -8591,124 +8591,10 @@
           <w:b/>
           <w:bCs/>
         </w:rPr>
-        <w:t xml:space="preserve">Interpolations-Absicherung:</w:t>
-      </w:r>
-      <w:r>
-        <w:t xml:space="preserve"> Biege-Prüfwerte werden bei Überschreitung des Prüfbereichs gekappt und gewarnt (Kap. 5.5).</w:t>
-      </w:r>
-    </w:p>
-    <w:p>
-      <w:pPr>
-        <w:pStyle w:val="Heading2"/>
-      </w:pPr>
-      <w:r>
-        <w:t xml:space="preserve">9.1 Transport / Hebezustand (Zusatz, nicht Gutachten)</w:t>
-      </w:r>
-    </w:p>
-    <w:p>
-      <w:pPr>
-        <w:spacing w:after="120"/>
-      </w:pPr>
-      <w:r>
-        <w:t xml:space="preserve">Separater Spot-Check für das Anschlagblech beim Heben (vorübergehende Bemessungssituation, eigenes Faktorenregime γ_G·dyn). Eigengewicht als Streckenlast n_Ed = γ_w · t · h.</w:t>
-      </w:r>
-    </w:p>
-    <w:p>
-      <w:pPr>
-        <w:pBdr>
-          <w:left w:val="single" w:color="1F6FEB" w:sz="18" w:space="6"/>
-        </w:pBdr>
-        <w:shd w:fill="F4F7FB" w:val="clear"/>
-        <w:spacing w:after="120" w:before="80"/>
-      </w:pPr>
-      <w:r>
-        <w:rPr>
-          <w:rFonts w:ascii="Consolas" w:cs="Consolas" w:eastAsia="Consolas" w:hAnsi="Consolas"/>
-          <w:color w:val="0B3A73"/>
-          <w:sz w:val="20"/>
-          <w:szCs w:val="20"/>
-        </w:rPr>
-        <w:t xml:space="preserve">G_Ek = n_Ed · L / n_Anker      G_Ed = γ_G · dyn · G_Ek   [kN]</w:t>
-      </w:r>
-      <w:r>
-        <w:br/>
-      </w:r>
-      <w:r>
-        <w:rPr>
-          <w:rFonts w:ascii="Consolas" w:cs="Consolas" w:eastAsia="Consolas" w:hAnsi="Consolas"/>
-          <w:color w:val="0B3A73"/>
-          <w:sz w:val="20"/>
-          <w:szCs w:val="20"/>
-        </w:rPr>
-        <w:t xml:space="preserve">erf. Tragfähigkeit Anschlagmittel = G_Ed·1000 / 9,81   [kg]</w:t>
-      </w:r>
-      <w:r>
-        <w:br/>
-      </w:r>
-      <w:r>
-        <w:rPr>
-          <w:rFonts w:ascii="Consolas" w:cs="Consolas" w:eastAsia="Consolas" w:hAnsi="Consolas"/>
-          <w:color w:val="0B3A73"/>
-          <w:sz w:val="20"/>
-          <w:szCs w:val="20"/>
-        </w:rPr>
-        <w:t xml:space="preserve">M_Ed = G_Ed · hebelBlech / 4   W = b·t²/6   σ = M_Ed·1e6 / W  →  σ ≤ f_y</w:t>
-      </w:r>
-    </w:p>
-    <w:p>
-      <w:pPr>
-        <w:pBdr>
-          <w:left w:val="single" w:color="C9461C" w:sz="18" w:space="6"/>
-        </w:pBdr>
-        <w:shd w:fill="FBE9E2" w:val="clear"/>
-        <w:spacing w:after="120" w:before="80"/>
-      </w:pPr>
-      <w:r>
-        <w:t xml:space="preserve">Der Hebe-Nachweis prüft nur das Stahlblech, nicht die Mauerwerksbiegung zwischen den Anschlagpunkten und nicht den Ankerauszug aus dem Mauerwerk — diese sind gesondert zu führen.</w:t>
-      </w:r>
-    </w:p>
-    <w:p>
-      <w:pPr>
-        <w:pStyle w:val="Heading1"/>
-      </w:pPr>
-      <w:r>
-        <w:t xml:space="preserve">10 · Modul 4 · Stückliste &amp; Kosten</w:t>
-      </w:r>
-    </w:p>
-    <w:p>
-      <w:pPr>
-        <w:spacing w:after="120"/>
-      </w:pPr>
-      <w:r>
-        <w:t xml:space="preserve">Zweck: Material-Auszug und Kosten für genau das aktive Wandelement. Kanonische Mengen stammen aus dem Wandelement/BOM und dem unter eingaben.aufbau gespeicherten Aufbau. Eine Mehrfachwand-Mengenlogik gibt es im MVP nicht.</w:t>
-      </w:r>
-    </w:p>
-    <w:p>
-      <w:pPr>
-        <w:spacing w:after="120"/>
-      </w:pPr>
-      <w:r>
-        <w:t xml:space="preserve">Preise sind hier </w:t>
-      </w:r>
-      <w:r>
-        <w:rPr>
-          <w:b/>
-          <w:bCs/>
-        </w:rPr>
-        <w:t xml:space="preserve">nicht editierbar</w:t>
-      </w:r>
-      <w:r>
-        <w:t xml:space="preserve">. Sie werden zu jeder Position frisch aus dem aktiven Bauteilkatalog aufgelöst – über die in Modul 1 bzw. Modul 2 gewählten Produkte je Verwendungsrolle ([P-13], [P-14]). Editierbar bleiben nur Projektname und Währung. Jede Position zeigt Produkt und Preisbasis oder – bei fehlender, mehrdeutiger, kategoriefremder, einheitenfremder oder maßfremder Zuordnung – den Grund im Klartext und </w:t>
-      </w:r>
-      <w:r>
-        <w:rPr>
-          <w:b/>
-          <w:bCs/>
-        </w:rPr>
-        <w:t xml:space="preserve">keinen</w:t>
-      </w:r>
-      <w:r>
-        <w:t xml:space="preserve"> Preis. Die Summe nennt in diesem Fall ausdrücklich, wie viele von wie vielen Positionen bepreist sind. Boden- und Kopfblech erscheinen als getrennte Positionen ([A-1]); die Dichtstreifen-Gesamtlänge in Metern ist nachrichtlich und wird nicht bepreist ([A-6]). Vorläufige, fachlich unbestätigte Katalogwerte werden je Position gekennzeichnet ([P-12]). Die frühere, im Modul gepflegte Preisliste (eingaben.kosten.preise) bleibt in Altprojekten erhalten, wird aber nicht mehr gelesen und nicht mehr geschrieben.</w:t>
+        <w:t xml:space="preserve">Wandelement-Anbindung:</w:t>
+      </w:r>
+      <w:r>
+        <w:t xml:space="preserve"> Geometrie, Öffnungszahl und Wandtyp werden ausschließlich aus dem aktiven Wandelement übernommen. Echte Statik-Kennwerte werden unter eingaben.statik gespeichert; das Modul schreibt das Wandelement nicht zurück. Der zentrale Nachweis-Export nutzt dasselbe DOM-freie Parameter-Mapping.</w:t>
       </w:r>
     </w:p>
     <w:p>
@@ -8725,10 +8611,164 @@
           <w:b/>
           <w:bCs/>
         </w:rPr>
+        <w:t xml:space="preserve">Interpolations-Absicherung:</w:t>
+      </w:r>
+      <w:r>
+        <w:t xml:space="preserve"> Biege-Prüfwerte werden bei Überschreitung des Prüfbereichs gekappt und gewarnt (Kap. 5.5).</w:t>
+      </w:r>
+    </w:p>
+    <w:p>
+      <w:pPr>
+        <w:pStyle w:val="Heading2"/>
+      </w:pPr>
+      <w:r>
+        <w:t xml:space="preserve">9.1 Transport / Hebezustand (Zusatz, nicht Gutachten)</w:t>
+      </w:r>
+    </w:p>
+    <w:p>
+      <w:pPr>
+        <w:spacing w:after="120"/>
+      </w:pPr>
+      <w:r>
+        <w:t xml:space="preserve">Separater Spot-Check für das Anschlagblech beim Heben (vorübergehende Bemessungssituation, eigenes Faktorenregime γ_G·dyn). Eigengewicht als Streckenlast n_Ed = γ_w · t · h.</w:t>
+      </w:r>
+    </w:p>
+    <w:p>
+      <w:pPr>
+        <w:pBdr>
+          <w:left w:val="single" w:color="1F6FEB" w:sz="18" w:space="6"/>
+        </w:pBdr>
+        <w:shd w:fill="F4F7FB" w:val="clear"/>
+        <w:spacing w:after="120" w:before="80"/>
+      </w:pPr>
+      <w:r>
+        <w:rPr>
+          <w:rFonts w:ascii="Consolas" w:cs="Consolas" w:eastAsia="Consolas" w:hAnsi="Consolas"/>
+          <w:color w:val="0B3A73"/>
+          <w:sz w:val="20"/>
+          <w:szCs w:val="20"/>
+        </w:rPr>
+        <w:t xml:space="preserve">G_Ek = n_Ed · L / n_Anker      G_Ed = γ_G · dyn · G_Ek   [kN]</w:t>
+      </w:r>
+      <w:r>
+        <w:br/>
+      </w:r>
+      <w:r>
+        <w:rPr>
+          <w:rFonts w:ascii="Consolas" w:cs="Consolas" w:eastAsia="Consolas" w:hAnsi="Consolas"/>
+          <w:color w:val="0B3A73"/>
+          <w:sz w:val="20"/>
+          <w:szCs w:val="20"/>
+        </w:rPr>
+        <w:t xml:space="preserve">erf. Tragfähigkeit Anschlagmittel = G_Ed·1000 / 9,81   [kg]</w:t>
+      </w:r>
+      <w:r>
+        <w:br/>
+      </w:r>
+      <w:r>
+        <w:rPr>
+          <w:rFonts w:ascii="Consolas" w:cs="Consolas" w:eastAsia="Consolas" w:hAnsi="Consolas"/>
+          <w:color w:val="0B3A73"/>
+          <w:sz w:val="20"/>
+          <w:szCs w:val="20"/>
+        </w:rPr>
+        <w:t xml:space="preserve">M_Ed = G_Ed · hebelBlech / 4   W = b·t²/6   σ = M_Ed·1e6 / W  →  σ ≤ f_y</w:t>
+      </w:r>
+    </w:p>
+    <w:p>
+      <w:pPr>
+        <w:pBdr>
+          <w:left w:val="single" w:color="C9461C" w:sz="18" w:space="6"/>
+        </w:pBdr>
+        <w:shd w:fill="FBE9E2" w:val="clear"/>
+        <w:spacing w:after="120" w:before="80"/>
+      </w:pPr>
+      <w:r>
+        <w:t xml:space="preserve">Der Hebe-Nachweis prüft nur das Stahlblech, nicht die Mauerwerksbiegung zwischen den Anschlagpunkten und nicht den Ankerauszug aus dem Mauerwerk — diese sind gesondert zu führen.</w:t>
+      </w:r>
+    </w:p>
+    <w:p>
+      <w:pPr>
+        <w:pStyle w:val="Heading1"/>
+      </w:pPr>
+      <w:r>
+        <w:t xml:space="preserve">10 · Modul 4 · Stückliste &amp; Kosten</w:t>
+      </w:r>
+    </w:p>
+    <w:p>
+      <w:pPr>
+        <w:spacing w:after="120"/>
+      </w:pPr>
+      <w:r>
+        <w:t xml:space="preserve">Zweck: Material-Auszug und Kosten für genau das aktive Wandelement. Kanonische Mengen stammen aus dem Wandelement/BOM und dem unter eingaben.aufbau gespeicherten Aufbau. Eine Mehrfachwand-Mengenlogik gibt es im MVP nicht.</w:t>
+      </w:r>
+    </w:p>
+    <w:p>
+      <w:pPr>
+        <w:spacing w:after="120"/>
+      </w:pPr>
+      <w:r>
+        <w:t xml:space="preserve">Preise sind hier </w:t>
+      </w:r>
+      <w:r>
+        <w:rPr>
+          <w:b/>
+          <w:bCs/>
+        </w:rPr>
+        <w:t xml:space="preserve">nicht editierbar</w:t>
+      </w:r>
+      <w:r>
+        <w:t xml:space="preserve">. Sie werden zu jeder Position frisch aus dem aktiven Bauteilkatalog aufgelöst – über die in Modul 1 bzw. Modul 2 gewählten Produkte je Verwendungsrolle ([P-13], [P-14]). Editierbar bleiben nur Projektname und Währung. Jede Position zeigt Produkt und Preisbasis oder – bei fehlender, mehrdeutiger, kategoriefremder, einheitenfremder oder maßfremder Zuordnung – den Grund im Klartext und </w:t>
+      </w:r>
+      <w:r>
+        <w:rPr>
+          <w:b/>
+          <w:bCs/>
+        </w:rPr>
+        <w:t xml:space="preserve">keinen</w:t>
+      </w:r>
+      <w:r>
+        <w:t xml:space="preserve"> Preis. Die Summe nennt in diesem Fall ausdrücklich, wie viele von wie vielen Positionen bepreist sind. Boden- und Kopfblech erscheinen als getrennte Positionen ([A-1]); die Dichtstreifen-Gesamtlänge in Metern ist nachrichtlich und wird nicht bepreist ([A-6]). Vorläufige, fachlich unbestätigte Katalogwerte werden je Position gekennzeichnet ([P-12]). Die frühere, im Modul gepflegte Preisliste (eingaben.kosten.preise) bleibt in Altprojekten erhalten, wird aber nicht mehr gelesen und nicht mehr geschrieben.</w:t>
+      </w:r>
+    </w:p>
+    <w:p>
+      <w:pPr>
+        <w:pStyle w:val="ListParagraph"/>
+        <w:numPr>
+          <w:ilvl w:val="0"/>
+          <w:numId w:val="2"/>
+        </w:numPr>
+        <w:spacing w:after="60"/>
+      </w:pPr>
+      <w:r>
+        <w:rPr>
+          <w:b/>
+          <w:bCs/>
+        </w:rPr>
+        <w:t xml:space="preserve">Positionen je Standardgröße ([Z-2]/[Z-4]):</w:t>
+      </w:r>
+      <w:r>
+        <w:t xml:space="preserve"> Werden mehrere Standardlängen kombiniert, entsteht je verwendeter Standardlänge und je Sonderzuschnitt-Ausgangsprodukt eine eigene Position mit eigenem maßgebendem Maß. Damit bleibt die Zuordnung nach [P-14] eindeutig und bepreisbar, obwohl mehrere Größen gleichzeitig eingebaut sind; die Einbaumenge ändert sich dadurch nicht – die Summe aller Stangenpositionen bleibt die Gesamtzahl des Rechenkerns. Ein Sonderzuschnitt wird über sein Ausgangsprodukt bepreist und nennt Fertigmaß und Herkunft in der Bezeichnung. Die vollständige Einbauteil-Kennzeichnung mit IDs bleibt der Baustellenstückliste vorbehalten.</w:t>
+      </w:r>
+    </w:p>
+    <w:p>
+      <w:pPr>
+        <w:pStyle w:val="ListParagraph"/>
+        <w:numPr>
+          <w:ilvl w:val="0"/>
+          <w:numId w:val="2"/>
+        </w:numPr>
+        <w:spacing w:after="60"/>
+      </w:pPr>
+      <w:r>
+        <w:rPr>
+          <w:b/>
+          <w:bCs/>
+        </w:rPr>
         <w:t xml:space="preserve">Export:</w:t>
       </w:r>
       <w:r>
-        <w:t xml:space="preserve"> Stücklisten-/Zuschnittdateien werden ausschließlich über den zentralen ZIP-Export in Modul 0 erzeugt – mit derselben Preisauflösung wie die Anzeige, damit CSV und Bildschirm nie auseinanderlaufen.</w:t>
+        <w:t xml:space="preserve"> Stücklisten-/Zuschnittdateien werden ausschließlich über den zentralen ZIP-Export in Modul 0 erzeugt – mit derselben Preisauflösung wie die Anzeige, damit CSV und Bildschirm nie auseinanderlaufen. Die Latten-Zuschnittliste nennt je Einbaustück Fertigmaß, Ausgangsprodukt und Art (Standard/Sonderzuschnitt).</w:t>
       </w:r>
     </w:p>
     <w:p>
@@ -10150,7 +10190,7 @@
         <w:spacing w:after="120" w:before="80"/>
       </w:pPr>
       <w:r>
-        <w:t xml:space="preserve">Hierarchie bei Konflikten: (1) Sicherheit/Baubarkeit und explizite Muss-Regeln, (2) fachliche Abdeckungs- und Anschlussregeln, (3) ausdrücklich gewählte Projektparameter, (4) Optimierung/gleichmäßige Verteilung, (5) Darstellung/Komfort. Nicht gemeinsam erfüllbare Muss-Regeln erzeugen einen sichtbaren Konflikt statt eines stillen Fallbacks.</w:t>
+        <w:t xml:space="preserve">Hierarchie bei Konflikten: (1) Sicherheit/Baubarkeit und explizite Muss-Regeln – dazu gehören das Mindest-Fertigmaß [Z-5] und die Befestigungsregeln [U-8]/[U-11]/[U-12], (2) fachliche Abdeckungs- und Anschlussregeln, (3) ausdrücklich gewählte Projektparameter und die Maßquelle [Z-1], (4) Optimierung/gleichmäßige Verteilung – dazu die Größenpräferenz der Kombination [Z-2], (5) Darstellung/Komfort. Nicht gemeinsam erfüllbare Muss-Regeln erzeugen einen sichtbaren Konflikt statt eines stillen Fallbacks.</w:t>
       </w:r>
     </w:p>
     <w:p>
@@ -10546,7 +10586,27 @@
         <w:t xml:space="preserve">[V-10]</w:t>
       </w:r>
       <w:r>
-        <w:t xml:space="preserve"> Gewindestangen = ceil(h / rod), Verbindungsmuttern = Stangen − 1; ROD-Standard 1100 mm (überschreibbar).</w:t>
+        <w:t xml:space="preserve"> Die Gewindestangen eines Segments entstehen aus der </w:t>
+      </w:r>
+      <w:r>
+        <w:rPr>
+          <w:b/>
+          <w:bCs/>
+        </w:rPr>
+        <w:t xml:space="preserve">Kombination der ausgewählten Standardlängen</w:t>
+      </w:r>
+      <w:r>
+        <w:t xml:space="preserve"> nach </w:t>
+      </w:r>
+      <w:r>
+        <w:rPr>
+          <w:b/>
+          <w:bCs/>
+        </w:rPr>
+        <w:t xml:space="preserve">[Z-2]</w:t>
+      </w:r>
+      <w:r>
+        <w:t xml:space="preserve">; Verbindungsmuttern = Stücke − 1. Ist nur eine Standardlänge im Satz (oder keine Produktauswahl vorhanden), gilt unverändert Stücke = ceil(h / rod) mit ROD-Standard 1100 mm – der einelementige Satz liefert bit-genau das bisherige Ergebnis.</w:t>
       </w:r>
     </w:p>
     <w:p>
@@ -11002,7 +11062,37 @@
         <w:t xml:space="preserve">[U-8]</w:t>
       </w:r>
       <w:r>
-        <w:t xml:space="preserve"> Latten vertikal auf den Achsen, an Öffnungen/Feldrand geschnitten; Stöße mittig zwischen zwei Verbindern; 1D-Zuschnitt mit Reststück-Nutzung. Eine Latte endet an der obersten Lage, die nach [U-11] befestigbar ist – sie wird nicht über die tragende Geometrie hinaus fortgesetzt (keine Latte „in der Luft“ über einer Staffelungskante).</w:t>
+        <w:t xml:space="preserve"> Latten vertikal auf den Achsen, an Öffnungen/Feldrand geschnitten; Stöße mittig zwischen zwei Verbindern. Die Stückgrenzen folgen damit der </w:t>
+      </w:r>
+      <w:r>
+        <w:rPr>
+          <w:b/>
+          <w:bCs/>
+        </w:rPr>
+        <w:t xml:space="preserve">Geometrie</w:t>
+      </w:r>
+      <w:r>
+        <w:t xml:space="preserve">, nicht einer Handelslänge; die ausgewählten Standardlängen wirken als Obergrenze und als Ausgangsprodukt (</w:t>
+      </w:r>
+      <w:r>
+        <w:rPr>
+          <w:b/>
+          <w:bCs/>
+        </w:rPr>
+        <w:t xml:space="preserve">[Z-4]</w:t>
+      </w:r>
+      <w:r>
+        <w:t xml:space="preserve">). Eine </w:t>
+      </w:r>
+      <w:r>
+        <w:rPr>
+          <w:b/>
+          <w:bCs/>
+        </w:rPr>
+        <w:t xml:space="preserve">Reststück-Wiederverwendung findet nicht statt</w:t>
+      </w:r>
+      <w:r>
+        <w:t xml:space="preserve"> (früher Teil dieser Regel, mit der Zuschnittentscheidung zu #19 aufgehoben): je Fertigteil genau ein Ausgangsprodukt. Eine Latte endet an der obersten Lage, die nach [U-11] befestigbar ist – sie wird nicht über die tragende Geometrie hinaus fortgesetzt (keine Latte „in der Luft“ über einer Staffelungskante).</w:t>
       </w:r>
     </w:p>
     <w:p>
@@ -12255,6 +12345,681 @@
       </w:pPr>
       <w:r>
         <w:t xml:space="preserve">Herkunft [P-16]: Issue #34 (Folge aus dem Live-Feedback zu #21). Die erste Katalogfassung führte eine einzige generische Eingabezeile unmittelbar über der Produktliste: Beschriftungen waren kategorieunabhängig, für Stein, Verbinder und Verbrauchsmaterial erschienen alle vier Maßfelder, und das Duplizieren schrieb die Kopie sofort in den Katalog, sodass ein anschließendes Abbrechen sie stehen ließ. Es fehlte eine Regel für die kategoriegerechte Maske und für die Reinheit des Bearbeitungsdialogs.</w:t>
+      </w:r>
+    </w:p>
+    <w:p>
+      <w:pPr>
+        <w:pStyle w:val="ListParagraph"/>
+        <w:numPr>
+          <w:ilvl w:val="0"/>
+          <w:numId w:val="2"/>
+        </w:numPr>
+        <w:spacing w:after="60"/>
+      </w:pPr>
+      <w:r>
+        <w:rPr>
+          <w:b/>
+          <w:bCs/>
+        </w:rPr>
+        <w:t xml:space="preserve">[P-17]</w:t>
+      </w:r>
+      <w:r>
+        <w:t xml:space="preserve"> </w:t>
+      </w:r>
+      <w:r>
+        <w:rPr>
+          <w:b/>
+          <w:bCs/>
+        </w:rPr>
+        <w:t xml:space="preserve">Kompakte Rollenauswahl.</w:t>
+      </w:r>
+      <w:r>
+        <w:t xml:space="preserve"> Die wandbezogene Produktauswahl nach </w:t>
+      </w:r>
+      <w:r>
+        <w:rPr>
+          <w:b/>
+          <w:bCs/>
+        </w:rPr>
+        <w:t xml:space="preserve">[P-13]</w:t>
+      </w:r>
+      <w:r>
+        <w:t xml:space="preserve"> zeigt je </w:t>
+      </w:r>
+      <w:r>
+        <w:rPr>
+          <w:b/>
+          <w:bCs/>
+        </w:rPr>
+        <w:t xml:space="preserve">Verwendungsrolle genau eine kompakte Zeile</w:t>
+      </w:r>
+      <w:r>
+        <w:t xml:space="preserve"> mit einem </w:t>
+      </w:r>
+      <w:r>
+        <w:rPr>
+          <w:b/>
+          <w:bCs/>
+        </w:rPr>
+        <w:t xml:space="preserve">Mehrfachauswahl-Dropdown</w:t>
+      </w:r>
+      <w:r>
+        <w:t xml:space="preserve">. Übergeordnete Kategorieblöcke, die nur Verwendungszeilen gruppieren und Bezeichnungen wiederholen, entfallen in der Oberfläche; die Gruppen/Kategorien bleiben intern für Filterung und Datenmodell bestehen. Die </w:t>
+      </w:r>
+      <w:r>
+        <w:rPr>
+          <w:b/>
+          <w:bCs/>
+        </w:rPr>
+        <w:t xml:space="preserve">Zeilenüberschrift benennt die Verwendungsrolle</w:t>
+      </w:r>
+      <w:r>
+        <w:t xml:space="preserve"> (i3-Stein, Gewindestange, Bodenblech, Lattenstange …), </w:t>
+      </w:r>
+      <w:r>
+        <w:rPr>
+          <w:b/>
+          <w:bCs/>
+        </w:rPr>
+        <w:t xml:space="preserve">jede Option das konkrete Katalogprodukt mit unterscheidenden Merkmalen</w:t>
+      </w:r>
+      <w:r>
+        <w:t xml:space="preserve"> (Maße/Gewinde, Preisbasis, Kennung); Rollen- und Optionsbeschriftung dürfen </w:t>
+      </w:r>
+      <w:r>
+        <w:rPr>
+          <w:b/>
+          <w:bCs/>
+        </w:rPr>
+        <w:t xml:space="preserve">nicht denselben generischen Text wiederholen</w:t>
+      </w:r>
+      <w:r>
+        <w:t xml:space="preserve">. Im geöffneten Dropdown erscheinen </w:t>
+      </w:r>
+      <w:r>
+        <w:rPr>
+          <w:b/>
+          <w:bCs/>
+        </w:rPr>
+        <w:t xml:space="preserve">ausschließlich katalogseitig zur Rolle passende Produkte</w:t>
+      </w:r>
+      <w:r>
+        <w:t xml:space="preserve">; geschlossen zeigt das Steuerelement eine kurze Zusammenfassung (keine Auswahl / ein Produkt mit Namen / n Produkte). Öffnen, Auswählen, Abwählen und Schließen sind </w:t>
+      </w:r>
+      <w:r>
+        <w:rPr>
+          <w:b/>
+          <w:bCs/>
+        </w:rPr>
+        <w:t xml:space="preserve">per Tastatur bedienbar</w:t>
+      </w:r>
+      <w:r>
+        <w:t xml:space="preserve">; Modul 1 und Modul 2 verwenden dasselbe Interaktionsmuster. Rollen-Ownership und gespeicherte Produkt-IDs bleiben unverändert. Priorität: Bedienregel (Hierarchiestufe 5) – sie ändert keine Mengen, keine Preise und keinen Nachweis.</w:t>
+      </w:r>
+    </w:p>
+    <w:p>
+      <w:pPr>
+        <w:pBdr>
+          <w:left w:val="single" w:color="E0B400" w:sz="18" w:space="6"/>
+        </w:pBdr>
+        <w:shd w:fill="FFF8E6" w:val="clear"/>
+        <w:spacing w:after="120" w:before="80"/>
+      </w:pPr>
+      <w:r>
+        <w:t xml:space="preserve">Herkunft [P-17]: Issue #35 (Live-Feedback). Die erste Fassung breitete alle Produkt-Checkboxen dauerhaft unter wiederholten Kategorieüberschriften aus; bei Steinen trug die Gruppe „Steine i3 – 37,5 cm“ zugleich eine praktisch gleichlautende Auswahloption, sodass Rolle und Produkt nicht unterscheidbar waren.</w:t>
+      </w:r>
+    </w:p>
+    <w:p>
+      <w:pPr>
+        <w:pStyle w:val="Heading2"/>
+      </w:pPr>
+      <w:r>
+        <w:t xml:space="preserve">15.7 Zuschnitt &amp; Kombination von Standardgrößen  [Z]</w:t>
+      </w:r>
+    </w:p>
+    <w:p>
+      <w:pPr>
+        <w:spacing w:after="140"/>
+      </w:pPr>
+      <w:r>
+        <w:rPr>
+          <w:color w:val="33414F"/>
+          <w:sz w:val="24"/>
+          <w:szCs w:val="24"/>
+        </w:rPr>
+        <w:t xml:space="preserve">Grundlage ist die verbindliche Festlegung aus dem Live-Feedback zu #35 in Verbindung mit den bereits bestätigten Zuschnittentscheidungen zu #19: Die ausgewählten Katalogprodukte sind kein „eines von mehreren“, sondern ein Vorratssatz an Standardgrößen, die tatsächlich kombiniert werden. Leitfall: eine benötigte Strecke von 170 cm wird bei gewählten Standardgrößen 100 cm und 50 cm zu 100 + 50 + 20 cm aufgeteilt, wobei die 20 cm ein gekennzeichneter Sonderzuschnitt sind.</w:t>
+      </w:r>
+    </w:p>
+    <w:p>
+      <w:pPr>
+        <w:pStyle w:val="ListParagraph"/>
+        <w:numPr>
+          <w:ilvl w:val="0"/>
+          <w:numId w:val="2"/>
+        </w:numPr>
+        <w:spacing w:after="60"/>
+      </w:pPr>
+      <w:r>
+        <w:rPr>
+          <w:b/>
+          <w:bCs/>
+        </w:rPr>
+        <w:t xml:space="preserve">[Z-1 · MUSS]</w:t>
+      </w:r>
+      <w:r>
+        <w:t xml:space="preserve"> </w:t>
+      </w:r>
+      <w:r>
+        <w:rPr>
+          <w:b/>
+          <w:bCs/>
+        </w:rPr>
+        <w:t xml:space="preserve">Katalog ist alleinige Maßquelle.</w:t>
+      </w:r>
+      <w:r>
+        <w:t xml:space="preserve"> Ist für eine Verwendungsrolle ein Katalogprodukt gewählt, liefert </w:t>
+      </w:r>
+      <w:r>
+        <w:rPr>
+          <w:b/>
+          <w:bCs/>
+        </w:rPr>
+        <w:t xml:space="preserve">ausschließlich</w:t>
+      </w:r>
+      <w:r>
+        <w:t xml:space="preserve"> dieses Produkt seine Produktspezifikation: bei Gewindestangen die Standardlänge, bei Latten Querschnitt (Breite/Dicke) und Standardlänge. Modul 1 und Modul 2 dürfen daneben </w:t>
+      </w:r>
+      <w:r>
+        <w:rPr>
+          <w:b/>
+          <w:bCs/>
+        </w:rPr>
+        <w:t xml:space="preserve">keine zweite wirksame</w:t>
+      </w:r>
+      <w:r>
+        <w:t xml:space="preserve"> manuelle Produktlänge oder -breite führen: die betreffenden Eingabefelder sind dann </w:t>
+      </w:r>
+      <w:r>
+        <w:rPr>
+          <w:b/>
+          <w:bCs/>
+        </w:rPr>
+        <w:t xml:space="preserve">nicht editierbar</w:t>
+      </w:r>
+      <w:r>
+        <w:t xml:space="preserve"> und werden von der Berechnung </w:t>
+      </w:r>
+      <w:r>
+        <w:rPr>
+          <w:b/>
+          <w:bCs/>
+        </w:rPr>
+        <w:t xml:space="preserve">nicht gelesen</w:t>
+      </w:r>
+      <w:r>
+        <w:t xml:space="preserve"> – auch eine Manipulation des Feldwerts (DOM) bleibt wirkungslos. Ohne Produktauswahl gilt der </w:t>
+      </w:r>
+      <w:r>
+        <w:rPr>
+          <w:b/>
+          <w:bCs/>
+        </w:rPr>
+        <w:t xml:space="preserve">klar gekennzeichnete, rückwärtskompatible Fallback</w:t>
+      </w:r>
+      <w:r>
+        <w:t xml:space="preserve"> aus dem Altwert. Fehlende oder widersprüchliche Angaben (z. B. zwei Lattenprodukte mit unterschiedlicher Querschnittsbreite) werden </w:t>
+      </w:r>
+      <w:r>
+        <w:rPr>
+          <w:b/>
+          <w:bCs/>
+        </w:rPr>
+        <w:t xml:space="preserve">sichtbar gemeldet</w:t>
+      </w:r>
+      <w:r>
+        <w:t xml:space="preserve"> statt durch einen Default ersetzt (</w:t>
+      </w:r>
+      <w:r>
+        <w:rPr>
+          <w:b/>
+          <w:bCs/>
+        </w:rPr>
+        <w:t xml:space="preserve">[P-6]</w:t>
+      </w:r>
+      <w:r>
+        <w:t xml:space="preserve">/</w:t>
+      </w:r>
+      <w:r>
+        <w:rPr>
+          <w:b/>
+          <w:bCs/>
+        </w:rPr>
+        <w:t xml:space="preserve">[P-9]</w:t>
+      </w:r>
+      <w:r>
+        <w:t xml:space="preserve">). Der Längensatz reist als Planungsparameter (prestress.rod_lengths_mm) im Wandelement mit; Preise, Produkt-IDs und Bezeichnungen bleiben davon weiterhin ausgeschlossen (</w:t>
+      </w:r>
+      <w:r>
+        <w:rPr>
+          <w:b/>
+          <w:bCs/>
+        </w:rPr>
+        <w:t xml:space="preserve">[P-13]</w:t>
+      </w:r>
+      <w:r>
+        <w:t xml:space="preserve">).</w:t>
+      </w:r>
+    </w:p>
+    <w:p>
+      <w:pPr>
+        <w:pStyle w:val="ListParagraph"/>
+        <w:numPr>
+          <w:ilvl w:val="0"/>
+          <w:numId w:val="2"/>
+        </w:numPr>
+        <w:spacing w:after="60"/>
+      </w:pPr>
+      <w:r>
+        <w:rPr>
+          <w:b/>
+          <w:bCs/>
+        </w:rPr>
+        <w:t xml:space="preserve">[Z-2 · MUSS]</w:t>
+      </w:r>
+      <w:r>
+        <w:t xml:space="preserve"> </w:t>
+      </w:r>
+      <w:r>
+        <w:rPr>
+          <w:b/>
+          <w:bCs/>
+        </w:rPr>
+        <w:t xml:space="preserve">Deterministische Kombination.</w:t>
+      </w:r>
+      <w:r>
+        <w:t xml:space="preserve"> Der Bedarf wird gedeckt, indem die </w:t>
+      </w:r>
+      <w:r>
+        <w:rPr>
+          <w:b/>
+          <w:bCs/>
+        </w:rPr>
+        <w:t xml:space="preserve">größte geeignete</w:t>
+      </w:r>
+      <w:r>
+        <w:t xml:space="preserve"> ausgewählte Standardgröße zuerst eingesetzt und mit </w:t>
+      </w:r>
+      <w:r>
+        <w:rPr>
+          <w:b/>
+          <w:bCs/>
+        </w:rPr>
+        <w:t xml:space="preserve">kleineren</w:t>
+      </w:r>
+      <w:r>
+        <w:t xml:space="preserve"> ausgewählten Größen aufgefüllt wird; das </w:t>
+      </w:r>
+      <w:r>
+        <w:rPr>
+          <w:b/>
+          <w:bCs/>
+        </w:rPr>
+        <w:t xml:space="preserve">verbleibende Fertigmaß</w:t>
+      </w:r>
+      <w:r>
+        <w:t xml:space="preserve"> ist ein </w:t>
+      </w:r>
+      <w:r>
+        <w:rPr>
+          <w:b/>
+          <w:bCs/>
+        </w:rPr>
+        <w:t xml:space="preserve">sichtbar gekennzeichneter Sonderzuschnitt</w:t>
+      </w:r>
+      <w:r>
+        <w:t xml:space="preserve"> aus dem </w:t>
+      </w:r>
+      <w:r>
+        <w:rPr>
+          <w:b/>
+          <w:bCs/>
+        </w:rPr>
+        <w:t xml:space="preserve">kleinsten geeigneten</w:t>
+      </w:r>
+      <w:r>
+        <w:t xml:space="preserve"> ausgewählten Ausgangsprodukt. Es gibt </w:t>
+      </w:r>
+      <w:r>
+        <w:rPr>
+          <w:b/>
+          <w:bCs/>
+        </w:rPr>
+        <w:t xml:space="preserve">keine Sägefuge/Schnittverlust</w:t>
+      </w:r>
+      <w:r>
+        <w:t xml:space="preserve">, </w:t>
+      </w:r>
+      <w:r>
+        <w:rPr>
+          <w:b/>
+          <w:bCs/>
+        </w:rPr>
+        <w:t xml:space="preserve">keine Reststück-Wiederverwendung</w:t>
+      </w:r>
+      <w:r>
+        <w:t xml:space="preserve"> und </w:t>
+      </w:r>
+      <w:r>
+        <w:rPr>
+          <w:b/>
+          <w:bCs/>
+        </w:rPr>
+        <w:t xml:space="preserve">keine Einkaufs-/Verschnittoptimierung</w:t>
+      </w:r>
+      <w:r>
+        <w:t xml:space="preserve">. Tie-Breaks sind deterministisch: Größen werden dedupliziert und absteigend geordnet, die Eingabereihenfolge ist ohne Wirkung; gleiche Eingaben liefern dieselbe Zuordnung. Der geometrische Bedarf wird dabei </w:t>
+      </w:r>
+      <w:r>
+        <w:rPr>
+          <w:b/>
+          <w:bCs/>
+        </w:rPr>
+        <w:t xml:space="preserve">nie verändert</w:t>
+      </w:r>
+      <w:r>
+        <w:t xml:space="preserve"> (</w:t>
+      </w:r>
+      <w:r>
+        <w:rPr>
+          <w:b/>
+          <w:bCs/>
+        </w:rPr>
+        <w:t xml:space="preserve">[P-14]</w:t>
+      </w:r>
+      <w:r>
+        <w:t xml:space="preserve">).</w:t>
+      </w:r>
+    </w:p>
+    <w:p>
+      <w:pPr>
+        <w:pStyle w:val="ListParagraph"/>
+        <w:numPr>
+          <w:ilvl w:val="0"/>
+          <w:numId w:val="2"/>
+        </w:numPr>
+        <w:spacing w:after="60"/>
+      </w:pPr>
+      <w:r>
+        <w:rPr>
+          <w:b/>
+          <w:bCs/>
+        </w:rPr>
+        <w:t xml:space="preserve">[Z-3]</w:t>
+      </w:r>
+      <w:r>
+        <w:t xml:space="preserve"> </w:t>
+      </w:r>
+      <w:r>
+        <w:rPr>
+          <w:b/>
+          <w:bCs/>
+        </w:rPr>
+        <w:t xml:space="preserve">Gewindestangen.</w:t>
+      </w:r>
+      <w:r>
+        <w:t xml:space="preserve"> Die Stücke eines Vorspannsegments sind </w:t>
+      </w:r>
+      <w:r>
+        <w:rPr>
+          <w:b/>
+          <w:bCs/>
+        </w:rPr>
+        <w:t xml:space="preserve">echte Standardlängen</w:t>
+      </w:r>
+      <w:r>
+        <w:t xml:space="preserve"> plus höchstens </w:t>
+      </w:r>
+      <w:r>
+        <w:rPr>
+          <w:b/>
+          <w:bCs/>
+        </w:rPr>
+        <w:t xml:space="preserve">ein</w:t>
+      </w:r>
+      <w:r>
+        <w:t xml:space="preserve"> Sonderzuschnitt; ein Stoß ist eine Kopplung. Die so entstehende Stückliste je Segment ist die </w:t>
+      </w:r>
+      <w:r>
+        <w:rPr>
+          <w:b/>
+          <w:bCs/>
+        </w:rPr>
+        <w:t xml:space="preserve">kanonische Ableitung</w:t>
+      </w:r>
+      <w:r>
+        <w:t xml:space="preserve">: Stückzahl, Kopplungsanzahl, Kopplungshöhen der Montageunterlage und die Mengen der Stückliste lesen ausschließlich sie. Eine zweite Rechnung aus einer pauschalen Stangenlänge ist unzulässig (</w:t>
+      </w:r>
+      <w:r>
+        <w:rPr>
+          <w:b/>
+          <w:bCs/>
+        </w:rPr>
+        <w:t xml:space="preserve">[P-6]</w:t>
+      </w:r>
+      <w:r>
+        <w:t xml:space="preserve">); die Kopplungshöhen sind die Kumulativsummen der Stücke und daher nicht mehr zwingend gleichabständig.</w:t>
+      </w:r>
+    </w:p>
+    <w:p>
+      <w:pPr>
+        <w:pStyle w:val="ListParagraph"/>
+        <w:numPr>
+          <w:ilvl w:val="0"/>
+          <w:numId w:val="2"/>
+        </w:numPr>
+        <w:spacing w:after="60"/>
+      </w:pPr>
+      <w:r>
+        <w:rPr>
+          <w:b/>
+          <w:bCs/>
+        </w:rPr>
+        <w:t xml:space="preserve">[Z-4]</w:t>
+      </w:r>
+      <w:r>
+        <w:t xml:space="preserve"> </w:t>
+      </w:r>
+      <w:r>
+        <w:rPr>
+          <w:b/>
+          <w:bCs/>
+        </w:rPr>
+        <w:t xml:space="preserve">Latten und Platten.</w:t>
+      </w:r>
+      <w:r>
+        <w:t xml:space="preserve"> Bei Latten bestimmen die </w:t>
+      </w:r>
+      <w:r>
+        <w:rPr>
+          <w:b/>
+          <w:bCs/>
+        </w:rPr>
+        <w:t xml:space="preserve">Muss-Regeln der Befestigung</w:t>
+      </w:r>
+      <w:r>
+        <w:t xml:space="preserve"> das Fertigmaß: Stückgrenzen folgen [U-8]/[U-12] (Stoß mittig zwischen zwei Verbindern) und haben </w:t>
+      </w:r>
+      <w:r>
+        <w:rPr>
+          <w:b/>
+          <w:bCs/>
+        </w:rPr>
+        <w:t xml:space="preserve">Vorrang</w:t>
+      </w:r>
+      <w:r>
+        <w:t xml:space="preserve"> vor der Größenpräferenz aus [Z-2]. Die ausgewählten Standardlängen wirken deshalb als </w:t>
+      </w:r>
+      <w:r>
+        <w:rPr>
+          <w:b/>
+          <w:bCs/>
+        </w:rPr>
+        <w:t xml:space="preserve">Obergrenze</w:t>
+      </w:r>
+      <w:r>
+        <w:t xml:space="preserve"> der Stückbildung und als </w:t>
+      </w:r>
+      <w:r>
+        <w:rPr>
+          <w:b/>
+          <w:bCs/>
+        </w:rPr>
+        <w:t xml:space="preserve">Ausgangsprodukt</w:t>
+      </w:r>
+      <w:r>
+        <w:t xml:space="preserve"> je Stück (kleinste geeignete Größe); ein Stück, dessen Fertigmaß keiner Standardlänge entspricht, ist ein gekennzeichneter Sonderzuschnitt. Für </w:t>
+      </w:r>
+      <w:r>
+        <w:rPr>
+          <w:b/>
+          <w:bCs/>
+        </w:rPr>
+        <w:t xml:space="preserve">Platten</w:t>
+      </w:r>
+      <w:r>
+        <w:t xml:space="preserve"> wird die Auswahl nach [Z-1] als Datenquelle gespeichert und ist programmgesteuert lesbar; die </w:t>
+      </w:r>
+      <w:r>
+        <w:rPr>
+          <w:b/>
+          <w:bCs/>
+        </w:rPr>
+        <w:t xml:space="preserve">2D-Belegungs-/Zuschnittableitung bleibt #19</w:t>
+      </w:r>
+      <w:r>
+        <w:t xml:space="preserve"> – hier entsteht keine Plattenmenge und keine Kostenzeile.</w:t>
+      </w:r>
+    </w:p>
+    <w:p>
+      <w:pPr>
+        <w:pStyle w:val="ListParagraph"/>
+        <w:numPr>
+          <w:ilvl w:val="0"/>
+          <w:numId w:val="2"/>
+        </w:numPr>
+        <w:spacing w:after="60"/>
+      </w:pPr>
+      <w:r>
+        <w:rPr>
+          <w:b/>
+          <w:bCs/>
+        </w:rPr>
+        <w:t xml:space="preserve">[Z-5 · MUSS]</w:t>
+      </w:r>
+      <w:r>
+        <w:t xml:space="preserve"> </w:t>
+      </w:r>
+      <w:r>
+        <w:rPr>
+          <w:b/>
+          <w:bCs/>
+        </w:rPr>
+        <w:t xml:space="preserve">Mindest-Fertigmaß.</w:t>
+      </w:r>
+      <w:r>
+        <w:t xml:space="preserve"> Ein Zuschnitt unter </w:t>
+      </w:r>
+      <w:r>
+        <w:rPr>
+          <w:b/>
+          <w:bCs/>
+        </w:rPr>
+        <w:t xml:space="preserve">200 mm</w:t>
+      </w:r>
+      <w:r>
+        <w:t xml:space="preserve"> ist nicht einbaubar. Diese Baubarkeitsregel steht </w:t>
+      </w:r>
+      <w:r>
+        <w:rPr>
+          <w:b/>
+          <w:bCs/>
+        </w:rPr>
+        <w:t xml:space="preserve">über</w:t>
+      </w:r>
+      <w:r>
+        <w:t xml:space="preserve"> der Größenpräferenz aus [Z-2]: eine Standardgröße wird nur gewählt, wenn der danach verbleibende Rest 0 ist, mindestens das Mindest-Fertigmaß erreicht oder mit einer weiteren ausgewählten Größe auffüllbar ist. Lässt der Vorratssatz </w:t>
+      </w:r>
+      <w:r>
+        <w:rPr>
+          <w:b/>
+          <w:bCs/>
+        </w:rPr>
+        <w:t xml:space="preserve">keine</w:t>
+      </w:r>
+      <w:r>
+        <w:t xml:space="preserve"> solche Wahl zu (typisch: nur eine einzige Standardlänge), bleibt die Größenpräferenz erhalten und der Konflikt wird </w:t>
+      </w:r>
+      <w:r>
+        <w:rPr>
+          <w:b/>
+          <w:bCs/>
+        </w:rPr>
+        <w:t xml:space="preserve">sichtbar gemeldet</w:t>
+      </w:r>
+      <w:r>
+        <w:t xml:space="preserve"> (validation.zuschnitt_konflikte, Warnung in Modul 1/2) – es entsteht </w:t>
+      </w:r>
+      <w:r>
+        <w:rPr>
+          <w:b/>
+          <w:bCs/>
+        </w:rPr>
+        <w:t xml:space="preserve">niemals still</w:t>
+      </w:r>
+      <w:r>
+        <w:t xml:space="preserve"> ein nicht einbaubares Kurzstück und </w:t>
+      </w:r>
+      <w:r>
+        <w:rPr>
+          <w:b/>
+          <w:bCs/>
+        </w:rPr>
+        <w:t xml:space="preserve">keine erfundene Länge</w:t>
+      </w:r>
+      <w:r>
+        <w:t xml:space="preserve">. Der Konflikt ist </w:t>
+      </w:r>
+      <w:r>
+        <w:rPr>
+          <w:b/>
+          <w:bCs/>
+        </w:rPr>
+        <w:t xml:space="preserve">kein</w:t>
+      </w:r>
+      <w:r>
+        <w:t xml:space="preserve"> Baubarkeitsausschluss: Mengen und Geometrie bleiben unverändert, die Meldung benennt das betroffene Fertigmaß und den Weg (weitere Standardgröße wählen).</w:t>
+      </w:r>
+    </w:p>
+    <w:p>
+      <w:pPr>
+        <w:pBdr>
+          <w:left w:val="single" w:color="E0B400" w:sz="18" w:space="6"/>
+        </w:pBdr>
+        <w:shd w:fill="FFF8E6" w:val="clear"/>
+        <w:spacing w:after="120" w:before="80"/>
+      </w:pPr>
+      <w:r>
+        <w:t xml:space="preserve">Herkunft [Z-1]…[Z-5]: Issue #35 mit den bestätigten Zuschnittentscheidungen aus #19. Zuvor steuerten freie Eingabefelder (rodCm bzw. latten.stange_cm) die Stoß-/Kopplungsgeometrie parallel zum Katalog, und die Stückliste kannte nur EINE Standardlänge je Rolle – mehrere gewählte Größen erschienen dadurch als „mehrdeutig“ und blieben unbepreist. Es fehlten Regeln für die Maßquelle, für die Kombination und für das Mindest-Fertigmaß. Folge: Positionen entstehen jetzt je verwendeter Standardgröße bzw. je Ausgangsprodukt, damit die Preisauflösung nach </w:t>
+      </w:r>
+      <w:r>
+        <w:rPr>
+          <w:b/>
+          <w:bCs/>
+        </w:rPr>
+        <w:t xml:space="preserve">[P-14]</w:t>
+      </w:r>
+      <w:r>
+        <w:t xml:space="preserve"> wieder eindeutig ist; die vollständige Einbauteil-/ID-Kennzeichnung bleibt #22, die 2D-Plattenplanung #19.</w:t>
       </w:r>
     </w:p>
     <w:sectPr>

</xml_diff>

<commit_message>
Zeichnungsmodul und zentralen Export ergänzen
</commit_message>
<xml_diff>
--- a/doku/SEMBLA_Handbuch.docx
+++ b/doku/SEMBLA_Handbuch.docx
@@ -121,7 +121,7 @@
         <w:spacing w:after="120"/>
       </w:pPr>
       <w:r>
-        <w:t xml:space="preserve">Sieben Module (0–6) greifen auf ein gemeinsames Datenmodell zu (das „Wandelement”). Modul 0 legt ein Element mit Wandtyp an; Modul 1 erzeugt daraus die geprüfte Wandgeometrie. Alle weiteren Module lesen das Wandelement. So bleibt die Planung über alle Gewerke konsistent.</w:t>
+        <w:t xml:space="preserve">Acht Module (0–7) greifen auf ein gemeinsames Datenmodell zu (das „Wandelement”). Modul 0 legt ein Element mit Wandtyp an; Modul 1 erzeugt daraus die geprüfte Wandgeometrie. Alle weiteren Module lesen das Wandelement. So bleibt die Planung über alle Gewerke konsistent.</w:t>
       </w:r>
     </w:p>
     <w:p>
@@ -137,7 +137,7 @@
         <w:spacing w:after="120"/>
       </w:pPr>
       <w:r>
-        <w:t xml:space="preserve">Dieses Handbuch richtet sich an (a) Statiker, die die Berechnungsansätze prüfen wollen (Kap. 5 + 9), und (b) das interne Entwicklungsteam, das die Suite ohne Programmier-Hintergrund weiterentwickelt (Kap. 4 + 13). Kapitel 15 ist die verbindliche fachliche Grundlage: Planung, Fehlerkorrekturen und Weiterentwicklung müssen auf ausdrücklich benannten Regeln beruhen.</w:t>
+        <w:t xml:space="preserve">Dieses Handbuch richtet sich an (a) Statiker, die die Berechnungsansätze prüfen wollen (Kap. 5 + 9), und (b) das interne Entwicklungsteam, das die Suite ohne Programmier-Hintergrund weiterentwickelt (Kap. 4 + 14). Kapitel 16 ist die verbindliche fachliche Grundlage: Planung, Fehlerkorrekturen und Weiterentwicklung müssen auf ausdrücklich benannten Regeln beruhen.</w:t>
       </w:r>
     </w:p>
     <w:p>
@@ -1586,7 +1586,7 @@
         <w:spacing w:after="120" w:before="80"/>
       </w:pPr>
       <w:r>
-        <w:t xml:space="preserve">Neu bestätigte Zielregeln: Jeder Stein muss von mindestens einer Spannachse gehalten werden; in der untersten Steinreihe sollen automatisch gesetzte Achsen möglichst mittig in i3-Steinen liegen. Diese Muss-/Optimierungsregeln gehen der bloßen Abstandsverteilung vor. Die vollständige Implementierung und Regressionstests sind noch als offener Entwicklungsstand gekennzeichnet (Kap. 15.2).</w:t>
+        <w:t xml:space="preserve">Neu bestätigte Zielregeln: Jeder Stein muss von mindestens einer Spannachse gehalten werden; in der untersten Steinreihe sollen automatisch gesetzte Achsen möglichst mittig in i3-Steinen liegen. Diese Muss-/Optimierungsregeln gehen der bloßen Abstandsverteilung vor. Die vollständige Implementierung und Regressionstests sind noch als offener Entwicklungsstand gekennzeichnet (Kap. 16.2).</w:t>
       </w:r>
     </w:p>
     <w:p>
@@ -3533,7 +3533,7 @@
                 <w:sz w:val="20"/>
                 <w:szCs w:val="20"/>
               </w:rPr>
-              <w:t xml:space="preserve">Zentraler Export</w:t>
+              <w:t xml:space="preserve">Technische Zeichnung</w:t>
             </w:r>
           </w:p>
         </w:tc>
@@ -3562,7 +3562,7 @@
                 <w:sz w:val="20"/>
                 <w:szCs w:val="20"/>
               </w:rPr>
-              <w:t xml:space="preserve">docs/shared/sembla-export.js · zip.js</w:t>
+              <w:t xml:space="preserve">docs/shared/sembla-zeichnung.js</w:t>
             </w:r>
           </w:p>
         </w:tc>
@@ -3591,7 +3591,7 @@
                 <w:sz w:val="20"/>
                 <w:szCs w:val="20"/>
               </w:rPr>
-              <w:t xml:space="preserve">Projekt und ausgewählte Dokumente als ZIP; Nachweis aus dem vollen Schermer-Modell.</w:t>
+              <w:t xml:space="preserve">maßstabsgetreue Wandabwicklung, Bemaßung, Blatt und Schriftfeld (A3/A4); gemeinsame Quelle für Modul 7 und Export ([D-6]).</w:t>
             </w:r>
           </w:p>
         </w:tc>
@@ -3622,7 +3622,7 @@
                 <w:sz w:val="20"/>
                 <w:szCs w:val="20"/>
               </w:rPr>
-              <w:t xml:space="preserve">Bauteilkatalog</w:t>
+              <w:t xml:space="preserve">Zentraler Export</w:t>
             </w:r>
           </w:p>
         </w:tc>
@@ -3651,7 +3651,7 @@
                 <w:sz w:val="20"/>
                 <w:szCs w:val="20"/>
               </w:rPr>
-              <w:t xml:space="preserve">docs/shared/sembla-katalog.js</w:t>
+              <w:t xml:space="preserve">docs/shared/sembla-export.js · zip.js</w:t>
             </w:r>
           </w:p>
         </w:tc>
@@ -3680,7 +3680,7 @@
                 <w:sz w:val="20"/>
                 <w:szCs w:val="20"/>
               </w:rPr>
-              <w:t xml:space="preserve">separate, versionierte Produktressource mit Validierung und Referenzprüfung.</w:t>
+              <w:t xml:space="preserve">Projekt und ausgewählte Dokumente als ZIP; Nachweis aus dem vollen Schermer-Modell.</w:t>
             </w:r>
           </w:p>
         </w:tc>
@@ -3711,7 +3711,7 @@
                 <w:sz w:val="20"/>
                 <w:szCs w:val="20"/>
               </w:rPr>
-              <w:t xml:space="preserve">IFC-Export</w:t>
+              <w:t xml:space="preserve">Bauteilkatalog</w:t>
             </w:r>
           </w:p>
         </w:tc>
@@ -3740,7 +3740,7 @@
                 <w:sz w:val="20"/>
                 <w:szCs w:val="20"/>
               </w:rPr>
-              <w:t xml:space="preserve">docs/shared/sembla-ifc.js</w:t>
+              <w:t xml:space="preserve">docs/shared/sembla-katalog.js</w:t>
             </w:r>
           </w:p>
         </w:tc>
@@ -3769,7 +3769,7 @@
                 <w:sz w:val="20"/>
                 <w:szCs w:val="20"/>
               </w:rPr>
-              <w:t xml:space="preserve">Wandelement → IFC4 (Wand + Öffnungen + Steine, optional echte Steingeometrie als FacetedBrep).</w:t>
+              <w:t xml:space="preserve">separate, versionierte Produktressource mit Validierung und Referenzprüfung.</w:t>
             </w:r>
           </w:p>
         </w:tc>
@@ -3800,7 +3800,7 @@
                 <w:sz w:val="20"/>
                 <w:szCs w:val="20"/>
               </w:rPr>
-              <w:t xml:space="preserve">Zustand &amp; Kopfleiste</w:t>
+              <w:t xml:space="preserve">IFC-Export</w:t>
             </w:r>
           </w:p>
         </w:tc>
@@ -3829,7 +3829,7 @@
                 <w:sz w:val="20"/>
                 <w:szCs w:val="20"/>
               </w:rPr>
-              <w:t xml:space="preserve">docs/shared/storage.js · navbar.js</w:t>
+              <w:t xml:space="preserve">docs/shared/sembla-ifc.js</w:t>
             </w:r>
           </w:p>
         </w:tc>
@@ -3858,7 +3858,7 @@
                 <w:sz w:val="20"/>
                 <w:szCs w:val="20"/>
               </w:rPr>
-              <w:t xml:space="preserve">localStorage-Schicht (Elemente, Eingaben, Migrationen, Katalog, aktiv-Zeiger, OBJ) + gemeinsame Navigation.</w:t>
+              <w:t xml:space="preserve">Wandelement → IFC4 (Wand + Öffnungen + Steine, optional echte Steingeometrie als FacetedBrep).</w:t>
             </w:r>
           </w:p>
         </w:tc>
@@ -3889,6 +3889,95 @@
                 <w:sz w:val="20"/>
                 <w:szCs w:val="20"/>
               </w:rPr>
+              <w:t xml:space="preserve">Zustand &amp; Kopfleiste</w:t>
+            </w:r>
+          </w:p>
+        </w:tc>
+        <w:tc>
+          <w:tcPr>
+            <w:tcW w:type="dxa" w:w="3400"/>
+            <w:tcBorders>
+              <w:top w:val="single" w:color="CCCCCC" w:sz="1"/>
+              <w:left w:val="single" w:color="CCCCCC" w:sz="1"/>
+              <w:bottom w:val="single" w:color="CCCCCC" w:sz="1"/>
+              <w:right w:val="single" w:color="CCCCCC" w:sz="1"/>
+            </w:tcBorders>
+            <w:tcMar>
+              <w:top w:type="dxa" w:w="60"/>
+              <w:left w:type="dxa" w:w="110"/>
+              <w:bottom w:type="dxa" w:w="60"/>
+              <w:right w:type="dxa" w:w="110"/>
+            </w:tcMar>
+          </w:tcPr>
+          <w:p>
+            <w:r>
+              <w:rPr>
+                <w:b w:val="false"/>
+                <w:bCs w:val="false"/>
+                <w:color w:val="1C2430"/>
+                <w:sz w:val="20"/>
+                <w:szCs w:val="20"/>
+              </w:rPr>
+              <w:t xml:space="preserve">docs/shared/storage.js · navbar.js</w:t>
+            </w:r>
+          </w:p>
+        </w:tc>
+        <w:tc>
+          <w:tcPr>
+            <w:tcW w:type="dxa" w:w="3860"/>
+            <w:tcBorders>
+              <w:top w:val="single" w:color="CCCCCC" w:sz="1"/>
+              <w:left w:val="single" w:color="CCCCCC" w:sz="1"/>
+              <w:bottom w:val="single" w:color="CCCCCC" w:sz="1"/>
+              <w:right w:val="single" w:color="CCCCCC" w:sz="1"/>
+            </w:tcBorders>
+            <w:tcMar>
+              <w:top w:type="dxa" w:w="60"/>
+              <w:left w:type="dxa" w:w="110"/>
+              <w:bottom w:type="dxa" w:w="60"/>
+              <w:right w:type="dxa" w:w="110"/>
+            </w:tcMar>
+          </w:tcPr>
+          <w:p>
+            <w:r>
+              <w:rPr>
+                <w:b w:val="false"/>
+                <w:bCs w:val="false"/>
+                <w:color w:val="1C2430"/>
+                <w:sz w:val="20"/>
+                <w:szCs w:val="20"/>
+              </w:rPr>
+              <w:t xml:space="preserve">localStorage-Schicht (Elemente, Eingaben, Migrationen, Katalog, aktiv-Zeiger, OBJ) + gemeinsame Navigation.</w:t>
+            </w:r>
+          </w:p>
+        </w:tc>
+      </w:tr>
+      <w:tr>
+        <w:tc>
+          <w:tcPr>
+            <w:tcW w:type="dxa" w:w="2100"/>
+            <w:tcBorders>
+              <w:top w:val="single" w:color="CCCCCC" w:sz="1"/>
+              <w:left w:val="single" w:color="CCCCCC" w:sz="1"/>
+              <w:bottom w:val="single" w:color="CCCCCC" w:sz="1"/>
+              <w:right w:val="single" w:color="CCCCCC" w:sz="1"/>
+            </w:tcBorders>
+            <w:tcMar>
+              <w:top w:type="dxa" w:w="60"/>
+              <w:left w:type="dxa" w:w="110"/>
+              <w:bottom w:type="dxa" w:w="60"/>
+              <w:right w:type="dxa" w:w="110"/>
+            </w:tcMar>
+          </w:tcPr>
+          <w:p>
+            <w:r>
+              <w:rPr>
+                <w:b w:val="false"/>
+                <w:bCs w:val="false"/>
+                <w:color w:val="1C2430"/>
+                <w:sz w:val="20"/>
+                <w:szCs w:val="20"/>
+              </w:rPr>
               <w:t xml:space="preserve">Bauteilgeometrie</w:t>
             </w:r>
           </w:p>
@@ -3982,7 +4071,7 @@
         <w:spacing w:after="120"/>
       </w:pPr>
       <w:r>
-        <w:t xml:space="preserve">Jeder Kern und jede Oberfläche ist durch automatisierte Tests abgesichert: Logik-Tests (tests/module/test-*.mjs), Smoke-Tests der HTML-Module unter DOM-Mock (tests/module/smoke_*.mjs), Core-Parität (tests/core/, Python + JS gegen goldene Fixtures) BOM-Drift-Schutz (test-shared.mjs) und die Zuschnitt-Regressionen der Kombinationsregeln (tests/module/test-zuschnitt.mjs, npm run test:zuschnitt – enthält den Leitfall 170 cm aus 100/50). npm run test:all fährt alles. Vor jedem Push müssen die betroffenen Tests grün sein. Fachliche Regressionstests sollen die verletzte oder ergänzte Regel-ID benennen.</w:t>
+        <w:t xml:space="preserve">Jeder Kern und jede Oberfläche ist durch automatisierte Tests abgesichert: Logik-Tests (tests/module/test-*.mjs), Smoke-Tests der HTML-Module unter DOM-Mock (tests/module/smoke_*.mjs), Core-Parität (tests/core/, Python + JS gegen goldene Fixtures) BOM-Drift-Schutz (test-shared.mjs) und die Zuschnitt-Regressionen der Kombinationsregeln (tests/module/test-zuschnitt.mjs, npm run test:zuschnitt – enthält den Leitfall 170 cm aus 100/50). Je Modul gibt es ein eigenes Skript, npm run test:modul0 bis npm run test:modul7; npm run test:all fährt alles. Vor jedem Push müssen die betroffenen Tests grün sein. Fachliche Regressionstests sollen die verletzte oder ergänzte Regel-ID benennen.</w:t>
       </w:r>
     </w:p>
     <w:p>
@@ -8030,7 +8119,7 @@
         <w:spacing w:after="120"/>
       </w:pPr>
       <w:r>
-        <w:t xml:space="preserve">Einstieg der Suite (index.html): Wandelement mit Name und Wandtyp anlegen, Projekt-Kopfdaten pflegen, aktive Elemente wählen/umbenennen/löschen sowie den zentralen Projektimport/-export ausführen. Der Häkchen-Dialog erzeugt die Projektdatei und ausgewählte Unterlagen als ZIP.</w:t>
+        <w:t xml:space="preserve">Einstieg der Suite (index.html): Wandelement mit Name und Wandtyp anlegen, Projekt-Kopfdaten pflegen, aktive Elemente wählen/umbenennen/löschen sowie den zentralen Projektimport/-export ausführen. Der Häkchen-Dialog erzeugt die Projektdatei und ausgewählte Unterlagen als ZIP: Stückliste und Zuschnittliste als CSV, Montageanleitung und statischen Nachweis als druckbares HTML, die technische Zeichnung als maßstabsgetreues SVG mit druckbarem Blatt ([D-6], [D-7]) und das 3D-Modell als IFC4. Die Fachmodule haben deshalb keine eigenen Datei-Schaltflächen.</w:t>
       </w:r>
     </w:p>
     <w:p>
@@ -8877,7 +8966,7 @@
         <w:pStyle w:val="Heading1"/>
       </w:pPr>
       <w:r>
-        <w:t xml:space="preserve">13 · Weiterentwicklung (für Nicht-Programmierer)</w:t>
+        <w:t xml:space="preserve">13 · Modul 7 · Technische Zeichnung</w:t>
       </w:r>
     </w:p>
     <w:p>
@@ -8885,7 +8974,67 @@
         <w:spacing w:after="120"/>
       </w:pPr>
       <w:r>
-        <w:t xml:space="preserve">Die häufigsten Anpassungen lassen sich an klar benannten Stellen vornehmen. Fachliche Änderungen beginnen jedoch immer im Regelwerk (Kap. 15): betroffene Regel-ID benennen, Regel ergänzen/ändern, Priorität festlegen, anschließend Implementierung und Regressionstest anpassen. Bei jedem Bug lautet die erste Frage: Welche Regel fehlt, ist unklar oder wurde falsch umgesetzt? Es gibt keinen App-Build-Schritt; docs/ ist nach dem Push sofort live. Das Handbuch selbst wird mit npm run handbuch erzeugt.</w:t>
+        <w:t xml:space="preserve">Zweck: die maßstabsgetreue technische Zeichnung der Wand (Wandabwicklung) als Planblatt – Verlege- und Vorspannplan in einer Ansicht, mit Bemaßung, Blatttabellen, Legende und Schriftfeld, druckbar als A3 oder A4 quer ([D-1]). Reiner Konsument: Modul 7 liest das aktive Wandelement und die Projekt-Kopfdaten aus Modul 0 und schreibt das Wandelement nie. Ohne aktives Wandelement verweist es auf Modul 0; ein Demo-Wandelement als Ersatz gibt es nicht.</w:t>
+      </w:r>
+    </w:p>
+    <w:p>
+      <w:pPr>
+        <w:spacing w:after="120"/>
+      </w:pPr>
+      <w:r>
+        <w:t xml:space="preserve">Gezeichnet wird ausschließlich aus dem Wandelement: Steine nach Typ (i3/i2) mit optionaler Beschriftung, Öffnungen mit ihrer Art, die gestufte Wandkontur, Bodenblech und – bei oberem Blechanschluss – Kopfblech sowie je Spannachse die realen Stangenstücke mit Kopplungen, Verankerung und eigens gekennzeichneter Sonderlänge ([D-4]). Die Stückliste im Blatt kommt aus dem gemeinsamen Stücklisten-Baustein, die Stangenstöße aus derselben Ableitung wie die Montageanleitung – es gibt kein zweites Mengen- oder Stückmodell ([Z-3]).</w:t>
+      </w:r>
+    </w:p>
+    <w:p>
+      <w:pPr>
+        <w:spacing w:after="120"/>
+      </w:pPr>
+      <w:r>
+        <w:t xml:space="preserve">Der Maßstab wird aus der Normreihe gewählt: der größte Maßstab, bei dem die Wand einschließlich Bemaßungsrand in das nutzbare Zeichenfeld des Blattformats passt. Das SVG trägt seine Papiermaße in Millimetern, der Druck ist damit tatsächlich 1:x; der wirksame Maßstab steht in der Zeichnungsüberschrift und im Schriftfeld ([D-2]). Bemaßt werden Gesamtlänge und -höhe in Metern sowie Öffnungs-, Brüstungs- und Staffelungsmaße in Zentimetern ([D-3]).</w:t>
+      </w:r>
+    </w:p>
+    <w:p>
+      <w:pPr>
+        <w:spacing w:after="120"/>
+      </w:pPr>
+      <w:r>
+        <w:t xml:space="preserve">Die vier Vorspann-Zielregeln stehen als Planungshinweise auf dem Blatt und sind ausdrücklich als „nicht automatisch geprüft“ gekennzeichnet – die Suite prüft sie nicht, deshalb darf das Blatt sie nicht als erfüllte Eigenschaft der Wand ausgeben ([D-5]). Ebenso ist der statische Nachweis nicht Bestandteil der Zeichnung: das Schriftfeld verweist auf die separate Prüfung, ein Nachweisergebnis erscheint nicht, und die Zeichnung greift auf kein Nachweis- oder Auslegungsmodell zu ([D-8]).</w:t>
+      </w:r>
+    </w:p>
+    <w:p>
+      <w:pPr>
+        <w:spacing w:after="120"/>
+      </w:pPr>
+      <w:r>
+        <w:t xml:space="preserve">Einstellbar sind allein Darstellungsoptionen: Blattformat A3/A4, Bemaßung ein/aus, Steintypen-Beschriftung ein/aus, Planinhalt und Vorabzug-Wasserzeichen. Sie werden als eingaben.zeichnung im Projekt geführt und wirken dadurch auch im zentralen Export; Geometrie- oder Statikwerte stehen dort nicht ([D-7]). Dateien gibt es ausschließlich über den Häkchen-Dialog in Modul 0 – die maßstabsgetreue SVG-Datei und das druckbare HTML-Blatt; Modul 7 selbst lädt nichts herunter und braucht keine externe Bibliothek ([D-6]).</w:t>
+      </w:r>
+    </w:p>
+    <w:p>
+      <w:pPr>
+        <w:pBdr>
+          <w:left w:val="single" w:color="E0B400" w:sz="18" w:space="6"/>
+        </w:pBdr>
+        <w:shd w:fill="FFF8E6" w:val="clear"/>
+        <w:spacing w:after="120" w:before="80"/>
+      </w:pPr>
+      <w:r>
+        <w:t xml:space="preserve">Vorschau in Modul 7 und die Dateien des zentralen Exports entstehen aus derselben DOM-freien Ableitung (docs/shared/sembla-zeichnung.js). Das gedruckte Blatt ist genau die Vorschau – es gibt keine zweite Zeichen- oder Blattlogik ([D-6]).</w:t>
+      </w:r>
+    </w:p>
+    <w:p>
+      <w:pPr>
+        <w:pStyle w:val="Heading1"/>
+      </w:pPr>
+      <w:r>
+        <w:t xml:space="preserve">14 · Weiterentwicklung (für Nicht-Programmierer)</w:t>
+      </w:r>
+    </w:p>
+    <w:p>
+      <w:pPr>
+        <w:spacing w:after="120"/>
+      </w:pPr>
+      <w:r>
+        <w:t xml:space="preserve">Die häufigsten Anpassungen lassen sich an klar benannten Stellen vornehmen. Fachliche Änderungen beginnen jedoch immer im Regelwerk (Kap. 16): betroffene Regel-ID benennen, Regel ergänzen/ändern, Priorität festlegen, anschließend Implementierung und Regressionstest anpassen. Bei jedem Bug lautet die erste Frage: Welche Regel fehlt, ist unklar oder wurde falsch umgesetzt? Es gibt keinen App-Build-Schritt; docs/ ist nach dem Push sofort live. Das Handbuch selbst wird mit npm run handbuch erzeugt.</w:t>
       </w:r>
     </w:p>
     <w:tbl>
@@ -9407,7 +9556,7 @@
         <w:pStyle w:val="Heading1"/>
       </w:pPr>
       <w:r>
-        <w:t xml:space="preserve">14 · Glossar &amp; Quellen</w:t>
+        <w:t xml:space="preserve">15 · Glossar &amp; Quellen</w:t>
       </w:r>
     </w:p>
     <w:tbl>
@@ -10165,7 +10314,7 @@
         <w:pStyle w:val="Heading1"/>
       </w:pPr>
       <w:r>
-        <w:t xml:space="preserve">15 · Regelwerk – alle Systemregeln hierarchisch</w:t>
+        <w:t xml:space="preserve">16 · Regelwerk – alle Systemregeln hierarchisch</w:t>
       </w:r>
     </w:p>
     <w:p>
@@ -10198,7 +10347,7 @@
         <w:pStyle w:val="Heading2"/>
       </w:pPr>
       <w:r>
-        <w:t xml:space="preserve">15.1 Geometrie &amp; Verband  [G]</w:t>
+        <w:t xml:space="preserve">16.1 Geometrie &amp; Verband  [G]</w:t>
       </w:r>
     </w:p>
     <w:p>
@@ -10386,7 +10535,7 @@
         <w:pStyle w:val="Heading2"/>
       </w:pPr>
       <w:r>
-        <w:t xml:space="preserve">15.2 Kammern, Nuten &amp; Vorspannstränge  [V]</w:t>
+        <w:t xml:space="preserve">16.2 Kammern, Nuten &amp; Vorspannstränge  [V]</w:t>
       </w:r>
     </w:p>
     <w:p>
@@ -10614,7 +10763,7 @@
         <w:pStyle w:val="Heading2"/>
       </w:pPr>
       <w:r>
-        <w:t xml:space="preserve">15.3 Anschlüsse &amp; Vorspann-Regime  [A]</w:t>
+        <w:t xml:space="preserve">16.3 Anschlüsse &amp; Vorspann-Regime  [A]</w:t>
       </w:r>
     </w:p>
     <w:p>
@@ -10892,7 +11041,7 @@
         <w:pStyle w:val="Heading2"/>
       </w:pPr>
       <w:r>
-        <w:t xml:space="preserve">15.4 Horizontaler Wandaufbau – Verbinder &amp; UK (Modul 2)  [U]</w:t>
+        <w:t xml:space="preserve">16.4 Horizontaler Wandaufbau – Verbinder &amp; UK (Modul 2)  [U]</w:t>
       </w:r>
     </w:p>
     <w:p>
@@ -11414,7 +11563,7 @@
         <w:pStyle w:val="Heading2"/>
       </w:pPr>
       <w:r>
-        <w:t xml:space="preserve">15.5 Statik (Gutachten Schermer)  [S]</w:t>
+        <w:t xml:space="preserve">16.5 Statik (Gutachten Schermer)  [S]</w:t>
       </w:r>
     </w:p>
     <w:p>
@@ -11622,7 +11771,7 @@
         <w:pStyle w:val="Heading2"/>
       </w:pPr>
       <w:r>
-        <w:t xml:space="preserve">15.6 Prozess &amp; Datenmodell  [P]</w:t>
+        <w:t xml:space="preserve">16.6 Prozess &amp; Datenmodell  [P]</w:t>
       </w:r>
     </w:p>
     <w:p>
@@ -12474,7 +12623,7 @@
         <w:pStyle w:val="Heading2"/>
       </w:pPr>
       <w:r>
-        <w:t xml:space="preserve">15.7 Zuschnitt &amp; Kombination von Standardgrößen  [Z]</w:t>
+        <w:t xml:space="preserve">16.7 Zuschnitt &amp; Kombination von Standardgrößen  [Z]</w:t>
       </w:r>
     </w:p>
     <w:p>
@@ -13020,6 +13169,719 @@
       </w:r>
       <w:r>
         <w:t xml:space="preserve"> wieder eindeutig ist; die vollständige Einbauteil-/ID-Kennzeichnung bleibt #22, die 2D-Plattenplanung #19.</w:t>
+      </w:r>
+    </w:p>
+    <w:p>
+      <w:pPr>
+        <w:pStyle w:val="Heading2"/>
+      </w:pPr>
+      <w:r>
+        <w:t xml:space="preserve">16.8 Technische Zeichnung &amp; Planausgabe (Modul 7)  [D]</w:t>
+      </w:r>
+    </w:p>
+    <w:p>
+      <w:pPr>
+        <w:spacing w:after="140"/>
+      </w:pPr>
+      <w:r>
+        <w:rPr>
+          <w:color w:val="33414F"/>
+          <w:sz w:val="24"/>
+          <w:szCs w:val="24"/>
+        </w:rPr>
+        <w:t xml:space="preserve">Grundlage ist Issue #36: Das frühere Legacy-Werkzeug „Fertigungszeichnung“ (Wandabwicklung als A3-Ausführungsplan) wird als Modul 7 in die Suite zurückgeholt. Fachlich unverändert bleiben Planinhalt und Darstellung; neu ist die Einbindung in die Architektur der Suite – eine Datenquelle (das aktive Wandelement), eine Zeichenableitung für Vorschau und Export, Dateien ausschließlich über den zentralen Export in Modul 0. Die Zeichnung ist eine Darstellung des berechneten Zustands; sie prüft nichts und weist nichts nach.</w:t>
+      </w:r>
+    </w:p>
+    <w:p>
+      <w:pPr>
+        <w:pStyle w:val="ListParagraph"/>
+        <w:numPr>
+          <w:ilvl w:val="0"/>
+          <w:numId w:val="2"/>
+        </w:numPr>
+        <w:spacing w:after="60"/>
+      </w:pPr>
+      <w:r>
+        <w:rPr>
+          <w:b/>
+          <w:bCs/>
+        </w:rPr>
+        <w:t xml:space="preserve">[D-1 · MUSS]</w:t>
+      </w:r>
+      <w:r>
+        <w:t xml:space="preserve"> </w:t>
+      </w:r>
+      <w:r>
+        <w:rPr>
+          <w:b/>
+          <w:bCs/>
+        </w:rPr>
+        <w:t xml:space="preserve">Eine Datenquelle.</w:t>
+      </w:r>
+      <w:r>
+        <w:t xml:space="preserve"> Die Zeichnung entsteht </w:t>
+      </w:r>
+      <w:r>
+        <w:rPr>
+          <w:b/>
+          <w:bCs/>
+        </w:rPr>
+        <w:t xml:space="preserve">ausschließlich</w:t>
+      </w:r>
+      <w:r>
+        <w:t xml:space="preserve"> aus dem aktiven Wandelement (Single Source of Truth) und – für die Kopfdaten des Schriftfelds – aus eingaben.projekt. Modul 7 ist </w:t>
+      </w:r>
+      <w:r>
+        <w:rPr>
+          <w:b/>
+          <w:bCs/>
+        </w:rPr>
+        <w:t xml:space="preserve">reiner Leser</w:t>
+      </w:r>
+      <w:r>
+        <w:t xml:space="preserve">: es schreibt das Wandelement </w:t>
+      </w:r>
+      <w:r>
+        <w:rPr>
+          <w:b/>
+          <w:bCs/>
+        </w:rPr>
+        <w:t xml:space="preserve">nie</w:t>
+      </w:r>
+      <w:r>
+        <w:t xml:space="preserve">, führt </w:t>
+      </w:r>
+      <w:r>
+        <w:rPr>
+          <w:b/>
+          <w:bCs/>
+        </w:rPr>
+        <w:t xml:space="preserve">keine</w:t>
+      </w:r>
+      <w:r>
+        <w:t xml:space="preserve"> eigene Geometrie und </w:t>
+      </w:r>
+      <w:r>
+        <w:rPr>
+          <w:b/>
+          <w:bCs/>
+        </w:rPr>
+        <w:t xml:space="preserve">keinen</w:t>
+      </w:r>
+      <w:r>
+        <w:t xml:space="preserve"> eigenen Mengensatz und legt </w:t>
+      </w:r>
+      <w:r>
+        <w:rPr>
+          <w:b/>
+          <w:bCs/>
+        </w:rPr>
+        <w:t xml:space="preserve">kein</w:t>
+      </w:r>
+      <w:r>
+        <w:t xml:space="preserve"> Wandelement an. Mengen im Blatt kommen aus dem Stücklisten-Baustein, Stangenstöße aus derselben Ableitung wie die Montageunterlage (</w:t>
+      </w:r>
+      <w:r>
+        <w:rPr>
+          <w:b/>
+          <w:bCs/>
+        </w:rPr>
+        <w:t xml:space="preserve">[Z-3]</w:t>
+      </w:r>
+      <w:r>
+        <w:t xml:space="preserve">). Liegt kein aktives Wandelement vor, wird auf Modul 0 verwiesen; ein Demo-/Platzhalter-Wandelement als produktiver Ersatz ist </w:t>
+      </w:r>
+      <w:r>
+        <w:rPr>
+          <w:b/>
+          <w:bCs/>
+        </w:rPr>
+        <w:t xml:space="preserve">unzulässig</w:t>
+      </w:r>
+      <w:r>
+        <w:t xml:space="preserve"> (</w:t>
+      </w:r>
+      <w:r>
+        <w:rPr>
+          <w:b/>
+          <w:bCs/>
+        </w:rPr>
+        <w:t xml:space="preserve">[P-6]</w:t>
+      </w:r>
+      <w:r>
+        <w:t xml:space="preserve">).</w:t>
+      </w:r>
+    </w:p>
+    <w:p>
+      <w:pPr>
+        <w:pStyle w:val="ListParagraph"/>
+        <w:numPr>
+          <w:ilvl w:val="0"/>
+          <w:numId w:val="2"/>
+        </w:numPr>
+        <w:spacing w:after="60"/>
+      </w:pPr>
+      <w:r>
+        <w:rPr>
+          <w:b/>
+          <w:bCs/>
+        </w:rPr>
+        <w:t xml:space="preserve">[D-2 · MUSS]</w:t>
+      </w:r>
+      <w:r>
+        <w:t xml:space="preserve"> </w:t>
+      </w:r>
+      <w:r>
+        <w:rPr>
+          <w:b/>
+          <w:bCs/>
+        </w:rPr>
+        <w:t xml:space="preserve">Maßstabstreue.</w:t>
+      </w:r>
+      <w:r>
+        <w:t xml:space="preserve"> Die Zeichnung wird in einem </w:t>
+      </w:r>
+      <w:r>
+        <w:rPr>
+          <w:b/>
+          <w:bCs/>
+        </w:rPr>
+        <w:t xml:space="preserve">Norm-Maßstab</w:t>
+      </w:r>
+      <w:r>
+        <w:t xml:space="preserve"> 1:x aus der Reihe 5, 10, 15, 20, 25, 30, 40, 50, 75, 100, 150, 200 ausgegeben. Gewählt wird der </w:t>
+      </w:r>
+      <w:r>
+        <w:rPr>
+          <w:b/>
+          <w:bCs/>
+        </w:rPr>
+        <w:t xml:space="preserve">größte</w:t>
+      </w:r>
+      <w:r>
+        <w:t xml:space="preserve"> Maßstab, bei dem die Wand </w:t>
+      </w:r>
+      <w:r>
+        <w:rPr>
+          <w:b/>
+          <w:bCs/>
+        </w:rPr>
+        <w:t xml:space="preserve">einschließlich Bemaßungsrand</w:t>
+      </w:r>
+      <w:r>
+        <w:t xml:space="preserve"> in das nutzbare Zeichenfeld des Blattformats passt; passt sie in keinen, gilt der gröbste der Reihe. Das erzeugte SVG trägt seine Papiermaße in </w:t>
+      </w:r>
+      <w:r>
+        <w:rPr>
+          <w:b/>
+          <w:bCs/>
+        </w:rPr>
+        <w:t xml:space="preserve">mm</w:t>
+      </w:r>
+      <w:r>
+        <w:t xml:space="preserve">, sodass der Druck tatsächlich 1:x ist. Der wirksame Maßstab ist </w:t>
+      </w:r>
+      <w:r>
+        <w:rPr>
+          <w:b/>
+          <w:bCs/>
+        </w:rPr>
+        <w:t xml:space="preserve">im Blatt und im Schriftfeld anzuschreiben</w:t>
+      </w:r>
+      <w:r>
+        <w:t xml:space="preserve">. Ein Blatt, dessen Zeichnung im Druck nachskaliert werden müsste, ist unzulässig.</w:t>
+      </w:r>
+    </w:p>
+    <w:p>
+      <w:pPr>
+        <w:pStyle w:val="ListParagraph"/>
+        <w:numPr>
+          <w:ilvl w:val="0"/>
+          <w:numId w:val="2"/>
+        </w:numPr>
+        <w:spacing w:after="60"/>
+      </w:pPr>
+      <w:r>
+        <w:rPr>
+          <w:b/>
+          <w:bCs/>
+        </w:rPr>
+        <w:t xml:space="preserve">[D-3]</w:t>
+      </w:r>
+      <w:r>
+        <w:t xml:space="preserve"> </w:t>
+      </w:r>
+      <w:r>
+        <w:rPr>
+          <w:b/>
+          <w:bCs/>
+        </w:rPr>
+        <w:t xml:space="preserve">Bemaßung.</w:t>
+      </w:r>
+      <w:r>
+        <w:t xml:space="preserve"> Bemaßt werden </w:t>
+      </w:r>
+      <w:r>
+        <w:rPr>
+          <w:b/>
+          <w:bCs/>
+        </w:rPr>
+        <w:t xml:space="preserve">Gesamtlänge und Gesamthöhe in m</w:t>
+      </w:r>
+      <w:r>
+        <w:t xml:space="preserve"> sowie </w:t>
+      </w:r>
+      <w:r>
+        <w:rPr>
+          <w:b/>
+          <w:bCs/>
+        </w:rPr>
+        <w:t xml:space="preserve">Öffnungsbreite, Öffnungshöhe und Brüstungshöhe</w:t>
+      </w:r>
+      <w:r>
+        <w:t xml:space="preserve"> und die </w:t>
+      </w:r>
+      <w:r>
+        <w:rPr>
+          <w:b/>
+          <w:bCs/>
+        </w:rPr>
+        <w:t xml:space="preserve">Staffelungsmaße (Länge und Höhe je Stufe) in cm</w:t>
+      </w:r>
+      <w:r>
+        <w:t xml:space="preserve">. Maße werden aus dem Wandelement abgeleitet und nie gerundet dargestellt, wenn dadurch ein anderes Maß entstünde. Die Bemaßung ist abschaltbar (Darstellungsoption), ihre Ableitung dabei unverändert.</w:t>
+      </w:r>
+    </w:p>
+    <w:p>
+      <w:pPr>
+        <w:pStyle w:val="ListParagraph"/>
+        <w:numPr>
+          <w:ilvl w:val="0"/>
+          <w:numId w:val="2"/>
+        </w:numPr>
+        <w:spacing w:after="60"/>
+      </w:pPr>
+      <w:r>
+        <w:rPr>
+          <w:b/>
+          <w:bCs/>
+        </w:rPr>
+        <w:t xml:space="preserve">[D-4]</w:t>
+      </w:r>
+      <w:r>
+        <w:t xml:space="preserve"> </w:t>
+      </w:r>
+      <w:r>
+        <w:rPr>
+          <w:b/>
+          <w:bCs/>
+        </w:rPr>
+        <w:t xml:space="preserve">Darstellungsschlüssel.</w:t>
+      </w:r>
+      <w:r>
+        <w:t xml:space="preserve"> Das Blatt zeigt Verlege- </w:t>
+      </w:r>
+      <w:r>
+        <w:rPr>
+          <w:b/>
+          <w:bCs/>
+        </w:rPr>
+        <w:t xml:space="preserve">und</w:t>
+      </w:r>
+      <w:r>
+        <w:t xml:space="preserve"> Vorspannplan in einer Ansicht: Steine nach Typ (i3/i2) unterscheidbar und optional beschriftet, Öffnungen mit ihrer Art benannt, die </w:t>
+      </w:r>
+      <w:r>
+        <w:rPr>
+          <w:b/>
+          <w:bCs/>
+        </w:rPr>
+        <w:t xml:space="preserve">gestufte Wandkontur</w:t>
+      </w:r>
+      <w:r>
+        <w:t xml:space="preserve">, Bodenblech und – bei oberem Blechanschluss – Kopfblech, sowie je Spannachse die </w:t>
+      </w:r>
+      <w:r>
+        <w:rPr>
+          <w:b/>
+          <w:bCs/>
+        </w:rPr>
+        <w:t xml:space="preserve">realen Stangenstücke</w:t>
+      </w:r>
+      <w:r>
+        <w:t xml:space="preserve"> mit Kopplungen, Verankerung (Bodenblech/Spannplatte/Kopfblech) und </w:t>
+      </w:r>
+      <w:r>
+        <w:rPr>
+          <w:b/>
+          <w:bCs/>
+        </w:rPr>
+        <w:t xml:space="preserve">eigens gekennzeichneter Sonderlänge</w:t>
+      </w:r>
+      <w:r>
+        <w:t xml:space="preserve"> (</w:t>
+      </w:r>
+      <w:r>
+        <w:rPr>
+          <w:b/>
+          <w:bCs/>
+        </w:rPr>
+        <w:t xml:space="preserve">[Z-2]</w:t>
+      </w:r>
+      <w:r>
+        <w:t xml:space="preserve">/</w:t>
+      </w:r>
+      <w:r>
+        <w:rPr>
+          <w:b/>
+          <w:bCs/>
+        </w:rPr>
+        <w:t xml:space="preserve">[Z-3]</w:t>
+      </w:r>
+      <w:r>
+        <w:t xml:space="preserve">). Steinreihen sind durchgehend von unten nummeriert. Der Schlüssel ist im Blatt als </w:t>
+      </w:r>
+      <w:r>
+        <w:rPr>
+          <w:b/>
+          <w:bCs/>
+        </w:rPr>
+        <w:t xml:space="preserve">Legende</w:t>
+      </w:r>
+      <w:r>
+        <w:t xml:space="preserve"> zu erklären. Es wird </w:t>
+      </w:r>
+      <w:r>
+        <w:rPr>
+          <w:b/>
+          <w:bCs/>
+        </w:rPr>
+        <w:t xml:space="preserve">nie</w:t>
+      </w:r>
+      <w:r>
+        <w:t xml:space="preserve"> aus einer pauschalen Stangenlänge oder einem Repräsentanten-Strang gezeichnet.</w:t>
+      </w:r>
+    </w:p>
+    <w:p>
+      <w:pPr>
+        <w:pStyle w:val="ListParagraph"/>
+        <w:numPr>
+          <w:ilvl w:val="0"/>
+          <w:numId w:val="2"/>
+        </w:numPr>
+        <w:spacing w:after="60"/>
+      </w:pPr>
+      <w:r>
+        <w:rPr>
+          <w:b/>
+          <w:bCs/>
+        </w:rPr>
+        <w:t xml:space="preserve">[D-5 · MUSS]</w:t>
+      </w:r>
+      <w:r>
+        <w:t xml:space="preserve"> </w:t>
+      </w:r>
+      <w:r>
+        <w:rPr>
+          <w:b/>
+          <w:bCs/>
+        </w:rPr>
+        <w:t xml:space="preserve">Zielregeln nur als Hinweis.</w:t>
+      </w:r>
+      <w:r>
+        <w:t xml:space="preserve"> Die vier Vorspann-Zielregeln (jeder Stein von mindestens einer Spannachse gehalten; automatische Achsen möglichst mittig im i3-Stein der untersten Reihe; bei Öffnungen über 750 mm beidseitig zwei Achsen; jedes Blech von mindestens zwei Achsen gehalten) dürfen auf dem Blatt </w:t>
+      </w:r>
+      <w:r>
+        <w:rPr>
+          <w:b/>
+          <w:bCs/>
+        </w:rPr>
+        <w:t xml:space="preserve">ausschließlich als Planungshinweis/Zielregel mit ausdrücklichem Vermerk „nicht automatisch geprüft“</w:t>
+      </w:r>
+      <w:r>
+        <w:t xml:space="preserve"> erscheinen. Eine Darstellung als erfüllte, geprüfte oder eingehaltene Eigenschaft der gezeichneten Wand ist </w:t>
+      </w:r>
+      <w:r>
+        <w:rPr>
+          <w:b/>
+          <w:bCs/>
+        </w:rPr>
+        <w:t xml:space="preserve">unzulässig</w:t>
+      </w:r>
+      <w:r>
+        <w:t xml:space="preserve">, solange die Suite diese Regeln nicht prüft. Priorität: Muss-Regel der Aussagewahrheit – sie steht über jeder Darstellungs- und Komfortregel.</w:t>
+      </w:r>
+    </w:p>
+    <w:p>
+      <w:pPr>
+        <w:pStyle w:val="ListParagraph"/>
+        <w:numPr>
+          <w:ilvl w:val="0"/>
+          <w:numId w:val="2"/>
+        </w:numPr>
+        <w:spacing w:after="60"/>
+      </w:pPr>
+      <w:r>
+        <w:rPr>
+          <w:b/>
+          <w:bCs/>
+        </w:rPr>
+        <w:t xml:space="preserve">[D-6 · MUSS]</w:t>
+      </w:r>
+      <w:r>
+        <w:t xml:space="preserve"> </w:t>
+      </w:r>
+      <w:r>
+        <w:rPr>
+          <w:b/>
+          <w:bCs/>
+        </w:rPr>
+        <w:t xml:space="preserve">Eine Zeichenableitung.</w:t>
+      </w:r>
+      <w:r>
+        <w:t xml:space="preserve"> Blatt, Zeichnung, Blatt-CSS und Druckformat liegen </w:t>
+      </w:r>
+      <w:r>
+        <w:rPr>
+          <w:b/>
+          <w:bCs/>
+        </w:rPr>
+        <w:t xml:space="preserve">einmal</w:t>
+      </w:r>
+      <w:r>
+        <w:t xml:space="preserve"> in einem DOM-freien Baustein. Die Vorschau in Modul 7 und die Dateien des zentralen Exports werden </w:t>
+      </w:r>
+      <w:r>
+        <w:rPr>
+          <w:b/>
+          <w:bCs/>
+        </w:rPr>
+        <w:t xml:space="preserve">aus derselben Funktion</w:t>
+      </w:r>
+      <w:r>
+        <w:t xml:space="preserve"> erzeugt und sind deckungsgleich; eine zweite Zeichen- oder Blattlogik (auch nicht für PDF) ist </w:t>
+      </w:r>
+      <w:r>
+        <w:rPr>
+          <w:b/>
+          <w:bCs/>
+        </w:rPr>
+        <w:t xml:space="preserve">unzulässig</w:t>
+      </w:r>
+      <w:r>
+        <w:t xml:space="preserve"> (</w:t>
+      </w:r>
+      <w:r>
+        <w:rPr>
+          <w:b/>
+          <w:bCs/>
+        </w:rPr>
+        <w:t xml:space="preserve">[P-6]</w:t>
+      </w:r>
+      <w:r>
+        <w:t xml:space="preserve">). Ausgabeformate sind das </w:t>
+      </w:r>
+      <w:r>
+        <w:rPr>
+          <w:b/>
+          <w:bCs/>
+        </w:rPr>
+        <w:t xml:space="preserve">maßstabsgetreue SVG</w:t>
+      </w:r>
+      <w:r>
+        <w:t xml:space="preserve"> und das </w:t>
+      </w:r>
+      <w:r>
+        <w:rPr>
+          <w:b/>
+          <w:bCs/>
+        </w:rPr>
+        <w:t xml:space="preserve">druckbare HTML-Blatt</w:t>
+      </w:r>
+      <w:r>
+        <w:t xml:space="preserve"> (A3/A4 quer, „Als PDF speichern“); es wird </w:t>
+      </w:r>
+      <w:r>
+        <w:rPr>
+          <w:b/>
+          <w:bCs/>
+        </w:rPr>
+        <w:t xml:space="preserve">keine</w:t>
+      </w:r>
+      <w:r>
+        <w:t xml:space="preserve"> Fremdbibliothek und </w:t>
+      </w:r>
+      <w:r>
+        <w:rPr>
+          <w:b/>
+          <w:bCs/>
+        </w:rPr>
+        <w:t xml:space="preserve">kein</w:t>
+      </w:r>
+      <w:r>
+        <w:t xml:space="preserve"> CDN im Betrieb geladen.</w:t>
+      </w:r>
+    </w:p>
+    <w:p>
+      <w:pPr>
+        <w:pStyle w:val="ListParagraph"/>
+        <w:numPr>
+          <w:ilvl w:val="0"/>
+          <w:numId w:val="2"/>
+        </w:numPr>
+        <w:spacing w:after="60"/>
+      </w:pPr>
+      <w:r>
+        <w:rPr>
+          <w:b/>
+          <w:bCs/>
+        </w:rPr>
+        <w:t xml:space="preserve">[D-7]</w:t>
+      </w:r>
+      <w:r>
+        <w:t xml:space="preserve"> </w:t>
+      </w:r>
+      <w:r>
+        <w:rPr>
+          <w:b/>
+          <w:bCs/>
+        </w:rPr>
+        <w:t xml:space="preserve">Dateien nur zentral, Optionen nur lokal.</w:t>
+      </w:r>
+      <w:r>
+        <w:t xml:space="preserve"> Zeichnungsdateien entstehen </w:t>
+      </w:r>
+      <w:r>
+        <w:rPr>
+          <w:b/>
+          <w:bCs/>
+        </w:rPr>
+        <w:t xml:space="preserve">ausschließlich</w:t>
+      </w:r>
+      <w:r>
+        <w:t xml:space="preserve"> über den Häkchen-Dialog des zentralen Exports in Modul 0; Modul 7 hat </w:t>
+      </w:r>
+      <w:r>
+        <w:rPr>
+          <w:b/>
+          <w:bCs/>
+        </w:rPr>
+        <w:t xml:space="preserve">keinen eigenen Datei-Download und keinen Datei-Upload</w:t>
+      </w:r>
+      <w:r>
+        <w:t xml:space="preserve">. Modul 7 schreibt allein seinen Eingaben-Abschnitt eingaben.zeichnung, und dieser enthält </w:t>
+      </w:r>
+      <w:r>
+        <w:rPr>
+          <w:b/>
+          <w:bCs/>
+        </w:rPr>
+        <w:t xml:space="preserve">nur Darstellungsoptionen</w:t>
+      </w:r>
+      <w:r>
+        <w:t xml:space="preserve"> (Blattformat, Bemaßung, Steintypen-Beschriftung, Planinhalt, Vorabzug). Geometrie-, Statik-, Produkt- oder Preiswerte dürfen dort </w:t>
+      </w:r>
+      <w:r>
+        <w:rPr>
+          <w:b/>
+          <w:bCs/>
+        </w:rPr>
+        <w:t xml:space="preserve">nicht</w:t>
+      </w:r>
+      <w:r>
+        <w:t xml:space="preserve"> gedoppelt werden. Fehlt der Abschnitt (Altprojekt), gelten die Standardoptionen; das ist </w:t>
+      </w:r>
+      <w:r>
+        <w:rPr>
+          <w:b/>
+          <w:bCs/>
+        </w:rPr>
+        <w:t xml:space="preserve">kein</w:t>
+      </w:r>
+      <w:r>
+        <w:t xml:space="preserve"> Schema- oder Projektformatwechsel.</w:t>
+      </w:r>
+    </w:p>
+    <w:p>
+      <w:pPr>
+        <w:pStyle w:val="ListParagraph"/>
+        <w:numPr>
+          <w:ilvl w:val="0"/>
+          <w:numId w:val="2"/>
+        </w:numPr>
+        <w:spacing w:after="60"/>
+      </w:pPr>
+      <w:r>
+        <w:rPr>
+          <w:b/>
+          <w:bCs/>
+        </w:rPr>
+        <w:t xml:space="preserve">[D-8 · MUSS]</w:t>
+      </w:r>
+      <w:r>
+        <w:t xml:space="preserve"> </w:t>
+      </w:r>
+      <w:r>
+        <w:rPr>
+          <w:b/>
+          <w:bCs/>
+        </w:rPr>
+        <w:t xml:space="preserve">Kein Nachweis auf der Zeichnung.</w:t>
+      </w:r>
+      <w:r>
+        <w:t xml:space="preserve"> Das Schriftfeld führt Projekt, Bauherrenschaft, Planverfasser, Phase, Planinhalt, Wand mit Maßen, Plannummer, Index, Maßstab und Bearbeiter. Für die Standsicherheit weist es aus, dass der Nachweis </w:t>
+      </w:r>
+      <w:r>
+        <w:rPr>
+          <w:b/>
+          <w:bCs/>
+        </w:rPr>
+        <w:t xml:space="preserve">nicht Bestandteil dieser Zeichnung ist und separat zu prüfen</w:t>
+      </w:r>
+      <w:r>
+        <w:t xml:space="preserve"> ist. Ein Nachweisergebnis (bestanden/Auslastung) darf auf dem Blatt </w:t>
+      </w:r>
+      <w:r>
+        <w:rPr>
+          <w:b/>
+          <w:bCs/>
+        </w:rPr>
+        <w:t xml:space="preserve">nicht</w:t>
+      </w:r>
+      <w:r>
+        <w:t xml:space="preserve"> erscheinen, und die Zeichnung greift </w:t>
+      </w:r>
+      <w:r>
+        <w:rPr>
+          <w:b/>
+          <w:bCs/>
+        </w:rPr>
+        <w:t xml:space="preserve">nicht</w:t>
+      </w:r>
+      <w:r>
+        <w:t xml:space="preserve"> auf ein Nachweis- oder Auslegungsmodell zu – der geprüfte Nachweis ist allein Sache von Modul 3 und seines eigenen Dokuments (</w:t>
+      </w:r>
+      <w:r>
+        <w:rPr>
+          <w:b/>
+          <w:bCs/>
+        </w:rPr>
+        <w:t xml:space="preserve">[S-1]</w:t>
+      </w:r>
+      <w:r>
+        <w:t xml:space="preserve">).</w:t>
+      </w:r>
+    </w:p>
+    <w:p>
+      <w:pPr>
+        <w:pBdr>
+          <w:left w:val="single" w:color="E0B400" w:sz="18" w:space="6"/>
+        </w:pBdr>
+        <w:shd w:fill="FFF8E6" w:val="clear"/>
+        <w:spacing w:after="120" w:before="80"/>
+      </w:pPr>
+      <w:r>
+        <w:t xml:space="preserve">Herkunft [D-1]…[D-8]: Issue #36. Das Legacy-Werkzeug lud sein Wandelement über einen eigenen Datei-Dialog, hielt eine zweite Stücklistenlogik, baute das PDF über eine CDN-Bibliothek in einer zweiten Zeichenlogik nach, rechnete den Maßstab ohne den Bemaßungsrand (das Blatt lief über und wurde im Druck nachskaliert), druckte die vier Spannregeln ohne Vorbehalt als Blattinhalt und zeigte im Schriftfeld einen Nachweisstatus aus einem Feld des Wandelements. Es fehlten Regeln für Datenquelle, Maßstabstreue, geteilte Zeichenableitung, Aussagewahrheit der Zielregeln und Abgrenzung zum statischen Nachweis.</w:t>
       </w:r>
     </w:p>
     <w:sectPr>

</xml_diff>

<commit_message>
feat(modul5): Stückarten der Gewindestangen farblich unterscheiden ([D-4], #49)
Zentraler Farbschlüssel (STUECK_FARBE/LABEL) in sembla-montage.js;
Modul 5 zeichnet stückweise in drei Farben mit Legende;
Modul 7 bekommt stange_rest und Rest-Legende;
Modul 1 (wandplanung.html) nutzt denselben Schlüssel;
Alt-Bundles ohne stuecke bleiben einfarbig ohne Rateschluss;
[D-4] als gemeinsame Darstellungsregel für Modul 1/5/7 formuliert;
Tests erweitert, Handbuch neu gebaut.
</commit_message>
<xml_diff>
--- a/doku/SEMBLA_Handbuch.docx
+++ b/doku/SEMBLA_Handbuch.docx
@@ -13923,7 +13923,7 @@
           <w:sz w:val="24"/>
           <w:szCs w:val="24"/>
         </w:rPr>
-        <w:t xml:space="preserve">Grundlage ist Issue #36: Das frühere Legacy-Werkzeug „Fertigungszeichnung“ (Wandabwicklung als A3-Ausführungsplan) wird als Modul 7 in die Suite zurückgeholt. Fachlich unverändert bleiben Planinhalt und Darstellung; neu ist die Einbindung in die Architektur der Suite – eine Datenquelle (das aktive Wandelement), eine Zeichenableitung für Vorschau und Export, Dateien ausschließlich über den zentralen Export in Modul 0. Die Zeichnung ist eine Darstellung des berechneten Zustands; sie prüft nichts und weist nichts nach.</w:t>
+        <w:t xml:space="preserve">Grundlage ist Issue #36: Das frühere Legacy-Werkzeug „Fertigungszeichnung“ (Wandabwicklung als A3-Ausführungsplan) wird als Modul 7 in die Suite zurückgeholt. Fachlich unverändert bleiben Planinhalt und Darstellung; neu ist die Einbindung in die Architektur der Suite – eine Datenquelle (das aktive Wandelement), eine Zeichenableitung für Vorschau und Export, Dateien ausschließlich über den zentralen Export in Modul 0. Die Zeichnung ist eine Darstellung des berechneten Zustands; sie prüft nichts und weist nichts nach. Eine Regel dieses Kapitels reicht bewusst über Modul 7 hinaus: der Darstellungsschlüssel des Zuschnitts **[D-4]** gilt gemeinsam für die Wandansicht in Modul 1, die Baugruppenbilder in Modul 5 und das Zeichnungsblatt in Modul 7.</w:t>
       </w:r>
     </w:p>
     <w:p>
@@ -14200,7 +14200,7 @@
           <w:b/>
           <w:bCs/>
         </w:rPr>
-        <w:t xml:space="preserve">[D-4]</w:t>
+        <w:t xml:space="preserve">[D-4 · MUSS]</w:t>
       </w:r>
       <w:r>
         <w:t xml:space="preserve"> </w:t>
@@ -14210,10 +14210,230 @@
           <w:b/>
           <w:bCs/>
         </w:rPr>
-        <w:t xml:space="preserve">Darstellungsschlüssel.</w:t>
-      </w:r>
-      <w:r>
-        <w:t xml:space="preserve"> Das Blatt zeigt Verlege- </w:t>
+        <w:t xml:space="preserve">Ein gemeinsamer Darstellungsschlüssel für alle Ansichten des Zuschnitts.</w:t>
+      </w:r>
+      <w:r>
+        <w:t xml:space="preserve"> Der Darstellungsschlüssel gilt </w:t>
+      </w:r>
+      <w:r>
+        <w:rPr>
+          <w:b/>
+          <w:bCs/>
+        </w:rPr>
+        <w:t xml:space="preserve">modulübergreifend</w:t>
+      </w:r>
+      <w:r>
+        <w:t xml:space="preserve"> für jede Ausgabe, die Vorspannstränge zeigt: die </w:t>
+      </w:r>
+      <w:r>
+        <w:rPr>
+          <w:b/>
+          <w:bCs/>
+        </w:rPr>
+        <w:t xml:space="preserve">Wandansicht in Modul 1</w:t>
+      </w:r>
+      <w:r>
+        <w:t xml:space="preserve">, die </w:t>
+      </w:r>
+      <w:r>
+        <w:rPr>
+          <w:b/>
+          <w:bCs/>
+        </w:rPr>
+        <w:t xml:space="preserve">Baugruppenbilder in Modul 5</w:t>
+      </w:r>
+      <w:r>
+        <w:t xml:space="preserve"> und die </w:t>
+      </w:r>
+      <w:r>
+        <w:rPr>
+          <w:b/>
+          <w:bCs/>
+        </w:rPr>
+        <w:t xml:space="preserve">technische Zeichnung in Modul 7</w:t>
+      </w:r>
+      <w:r>
+        <w:t xml:space="preserve">. Gezeichnet werden überall die </w:t>
+      </w:r>
+      <w:r>
+        <w:rPr>
+          <w:b/>
+          <w:bCs/>
+        </w:rPr>
+        <w:t xml:space="preserve">realen Stangenstücke</w:t>
+      </w:r>
+      <w:r>
+        <w:t xml:space="preserve"> aus segment.stuecke mit ihren Kopplungen und ihrer Verankerung (Bodenblech/Spannplatte/Kopfblech) – </w:t>
+      </w:r>
+      <w:r>
+        <w:rPr>
+          <w:b/>
+          <w:bCs/>
+        </w:rPr>
+        <w:t xml:space="preserve">nie</w:t>
+      </w:r>
+      <w:r>
+        <w:t xml:space="preserve"> eine pauschale Stangenlänge, </w:t>
+      </w:r>
+      <w:r>
+        <w:rPr>
+          <w:b/>
+          <w:bCs/>
+        </w:rPr>
+        <w:t xml:space="preserve">nie</w:t>
+      </w:r>
+      <w:r>
+        <w:t xml:space="preserve"> ein Repräsentanten-Strang und </w:t>
+      </w:r>
+      <w:r>
+        <w:rPr>
+          <w:b/>
+          <w:bCs/>
+        </w:rPr>
+        <w:t xml:space="preserve">nie</w:t>
+      </w:r>
+      <w:r>
+        <w:t xml:space="preserve"> ein Strich je Strang. Die drei </w:t>
+      </w:r>
+      <w:r>
+        <w:rPr>
+          <w:b/>
+          <w:bCs/>
+        </w:rPr>
+        <w:t xml:space="preserve">Stückarten</w:t>
+      </w:r>
+      <w:r>
+        <w:t xml:space="preserve"> Standardlänge (</w:t>
+      </w:r>
+      <w:r>
+        <w:rPr>
+          <w:b/>
+          <w:bCs/>
+        </w:rPr>
+        <w:t xml:space="preserve">[Z-2]</w:t>
+      </w:r>
+      <w:r>
+        <w:t xml:space="preserve">), Sonderzuschnitt (</w:t>
+      </w:r>
+      <w:r>
+        <w:rPr>
+          <w:b/>
+          <w:bCs/>
+        </w:rPr>
+        <w:t xml:space="preserve">[Z-2]</w:t>
+      </w:r>
+      <w:r>
+        <w:t xml:space="preserve">/</w:t>
+      </w:r>
+      <w:r>
+        <w:rPr>
+          <w:b/>
+          <w:bCs/>
+        </w:rPr>
+        <w:t xml:space="preserve">[Z-3]</w:t>
+      </w:r>
+      <w:r>
+        <w:t xml:space="preserve">) und Reststück am oberen Abschluss (</w:t>
+      </w:r>
+      <w:r>
+        <w:rPr>
+          <w:b/>
+          <w:bCs/>
+        </w:rPr>
+        <w:t xml:space="preserve">[Z-6]</w:t>
+      </w:r>
+      <w:r>
+        <w:t xml:space="preserve">) sind in </w:t>
+      </w:r>
+      <w:r>
+        <w:rPr>
+          <w:b/>
+          <w:bCs/>
+        </w:rPr>
+        <w:t xml:space="preserve">jeder</w:t>
+      </w:r>
+      <w:r>
+        <w:t xml:space="preserve"> dieser Ansichten voneinander unterscheidbar dargestellt und tragen dort </w:t>
+      </w:r>
+      <w:r>
+        <w:rPr>
+          <w:b/>
+          <w:bCs/>
+        </w:rPr>
+        <w:t xml:space="preserve">dieselbe Farbe und denselben Klartext</w:t>
+      </w:r>
+      <w:r>
+        <w:t xml:space="preserve">; die dafür maßgeblichen Farb- und Textwerte sowie die Zuordnung Stück→Art liegen </w:t>
+      </w:r>
+      <w:r>
+        <w:rPr>
+          <w:b/>
+          <w:bCs/>
+        </w:rPr>
+        <w:t xml:space="preserve">genau einmal</w:t>
+      </w:r>
+      <w:r>
+        <w:t xml:space="preserve"> in einem gemeinsamen, DOM-freien Baustein und werden von allen drei Modulen importiert. Ein modul-eigener zweiter Farb- oder Textschlüssel ist </w:t>
+      </w:r>
+      <w:r>
+        <w:rPr>
+          <w:b/>
+          <w:bCs/>
+        </w:rPr>
+        <w:t xml:space="preserve">unzulässig</w:t>
+      </w:r>
+      <w:r>
+        <w:t xml:space="preserve"> (</w:t>
+      </w:r>
+      <w:r>
+        <w:rPr>
+          <w:b/>
+          <w:bCs/>
+        </w:rPr>
+        <w:t xml:space="preserve">[P-6]</w:t>
+      </w:r>
+      <w:r>
+        <w:t xml:space="preserve">), ebenso eine Farbe, die zugleich ein </w:t>
+      </w:r>
+      <w:r>
+        <w:rPr>
+          <w:b/>
+          <w:bCs/>
+        </w:rPr>
+        <w:t xml:space="preserve">Bauteil</w:t>
+      </w:r>
+      <w:r>
+        <w:t xml:space="preserve"> (Spannplatte, Blech, Mutter) und eine Stückart bezeichnet – Bauteil und Zuschnitt dürfen nicht verwechselbar sein. Eine unbekannte oder fehlende Stückart gilt als Standardlänge; eine Farbe wird </w:t>
+      </w:r>
+      <w:r>
+        <w:rPr>
+          <w:b/>
+          <w:bCs/>
+        </w:rPr>
+        <w:t xml:space="preserve">nicht erfunden</w:t>
+      </w:r>
+      <w:r>
+        <w:t xml:space="preserve">. Jede Ansicht, die stückweise zeichnet, erklärt den Schlüssel als </w:t>
+      </w:r>
+      <w:r>
+        <w:rPr>
+          <w:b/>
+          <w:bCs/>
+        </w:rPr>
+        <w:t xml:space="preserve">Legende</w:t>
+      </w:r>
+      <w:r>
+        <w:t xml:space="preserve"> mit denselben Texten und in derselben Reihenfolge (Standardlänge, Sonderzuschnitt, Reststück); zeichnet sie – etwa bei einem Altstand ohne stuecke – nicht stückweise, entfällt die Legende ersatzlos statt eine leere oder unbelegte Legende zu zeigen. Darüber hinaus zeigt das </w:t>
+      </w:r>
+      <w:r>
+        <w:rPr>
+          <w:b/>
+          <w:bCs/>
+        </w:rPr>
+        <w:t xml:space="preserve">Blatt in Modul 7</w:t>
+      </w:r>
+      <w:r>
+        <w:t xml:space="preserve"> Verlege- </w:t>
       </w:r>
       <w:r>
         <w:rPr>
@@ -14233,87 +14453,7 @@
         <w:t xml:space="preserve">gestufte Wandkontur</w:t>
       </w:r>
       <w:r>
-        <w:t xml:space="preserve">, Bodenblech und – bei oberem Blechanschluss – Kopfblech, sowie je Spannachse die </w:t>
-      </w:r>
-      <w:r>
-        <w:rPr>
-          <w:b/>
-          <w:bCs/>
-        </w:rPr>
-        <w:t xml:space="preserve">realen Stangenstücke</w:t>
-      </w:r>
-      <w:r>
-        <w:t xml:space="preserve"> mit Kopplungen, Verankerung (Bodenblech/Spannplatte/Kopfblech) und </w:t>
-      </w:r>
-      <w:r>
-        <w:rPr>
-          <w:b/>
-          <w:bCs/>
-        </w:rPr>
-        <w:t xml:space="preserve">eigens gekennzeichneter Sonderlänge</w:t>
-      </w:r>
-      <w:r>
-        <w:t xml:space="preserve"> (</w:t>
-      </w:r>
-      <w:r>
-        <w:rPr>
-          <w:b/>
-          <w:bCs/>
-        </w:rPr>
-        <w:t xml:space="preserve">[Z-2]</w:t>
-      </w:r>
-      <w:r>
-        <w:t xml:space="preserve">/</w:t>
-      </w:r>
-      <w:r>
-        <w:rPr>
-          <w:b/>
-          <w:bCs/>
-        </w:rPr>
-        <w:t xml:space="preserve">[Z-3]</w:t>
-      </w:r>
-      <w:r>
-        <w:t xml:space="preserve">). </w:t>
-      </w:r>
-      <w:r>
-        <w:rPr>
-          <w:b/>
-          <w:bCs/>
-        </w:rPr>
-        <w:t xml:space="preserve">Alle drei Stückarten sind optisch unterscheidbar</w:t>
-      </w:r>
-      <w:r>
-        <w:t xml:space="preserve">: Standardlänge, Sonderzuschnitt und das </w:t>
-      </w:r>
-      <w:r>
-        <w:rPr>
-          <w:b/>
-          <w:bCs/>
-        </w:rPr>
-        <w:t xml:space="preserve">Reststück am oberen Wandabschluss</w:t>
-      </w:r>
-      <w:r>
-        <w:t xml:space="preserve"> (</w:t>
-      </w:r>
-      <w:r>
-        <w:rPr>
-          <w:b/>
-          <w:bCs/>
-        </w:rPr>
-        <w:t xml:space="preserve">[Z-6]</w:t>
-      </w:r>
-      <w:r>
-        <w:t xml:space="preserve">) tragen je eine eigene Farbe mit eigenem Legendeneintrag – sonst wäre auf dem Blatt nicht erkennbar, dass an der Wandoberkante ein eigenes Bauteil sitzt. Die Vorspann-Kennzahlen weisen das Reststück </w:t>
-      </w:r>
-      <w:r>
-        <w:rPr>
-          <w:b/>
-          <w:bCs/>
-        </w:rPr>
-        <w:t xml:space="preserve">getrennt</w:t>
-      </w:r>
-      <w:r>
-        <w:t xml:space="preserve"> von den Sonderlängen aus; ist keines gewählt, bleibt die Zeile leer statt eine Standardlänge zu unterstellen. Steinreihen sind durchgehend von unten nummeriert. Der Schlüssel ist im Blatt als </w:t>
+        <w:t xml:space="preserve">, Bodenblech und – bei oberem Blechanschluss – Kopfblech; Steinreihen sind durchgehend von unten nummeriert. Der Schlüssel ist im Blatt als </w:t>
       </w:r>
       <w:r>
         <w:rPr>
@@ -14334,6 +14474,18 @@
       </w:r>
       <w:r>
         <w:t xml:space="preserve"> aus einer pauschalen Stangenlänge oder einem Repräsentanten-Strang gezeichnet.</w:t>
+      </w:r>
+    </w:p>
+    <w:p>
+      <w:pPr>
+        <w:pBdr>
+          <w:left w:val="single" w:color="E0B400" w:sz="18" w:space="6"/>
+        </w:pBdr>
+        <w:shd w:fill="FFF8E6" w:val="clear"/>
+        <w:spacing w:after="120" w:before="80"/>
+      </w:pPr>
+      <w:r>
+        <w:t xml:space="preserve">Herkunft [D-4]: ursprünglich Issue #36 als Darstellungsschlüssel allein des Zeichnungsblatts formuliert; auf Modul 1 und Modul 5 erweitert mit Issue #49 (Bearbeitung 2026-08-06). Zuvor führte jedes Modul seine Stangenfarben selbst: Modul 5 zeichnete den ganzen Strang in einer Farbe (der Zuschnitt war im Baugruppenbild also gar nicht ablesbar), Modul 1 und Modul 7 verwendeten für denselben Sonderzuschnitt verschiedene Farbwerte, und die Sonderzuschnittsfarbe war in Modul 1/5 gleichzeitig die Farbe der Spannplatte. Es fehlte die Regel, dass Stückarten EINE gemeinsame Quelle für Farbe und Klartext haben und dass Bauteil- und Zuschnittfarben getrennt bleiben.</w:t>
       </w:r>
     </w:p>
     <w:p>

</xml_diff>

<commit_message>
feat: Geschosslayout bemaßen und fixieren (#26)
</commit_message>
<xml_diff>
--- a/doku/SEMBLA_Handbuch.docx
+++ b/doku/SEMBLA_Handbuch.docx
@@ -17853,37 +17853,47 @@
         <w:t xml:space="preserve">[L-9]</w:t>
       </w:r>
       <w:r>
-        <w:t xml:space="preserve">). </w:t>
-      </w:r>
-      <w:r>
-        <w:rPr>
-          <w:b/>
-          <w:bCs/>
-        </w:rPr>
-        <w:t xml:space="preserve">Noch nicht bedienbar</w:t>
-      </w:r>
-      <w:r>
-        <w:t xml:space="preserve"> und damit ausdrücklich nur im Kern vorhanden sind das </w:t>
-      </w:r>
-      <w:r>
-        <w:rPr>
-          <w:b/>
-          <w:bCs/>
-        </w:rPr>
-        <w:t xml:space="preserve">Setzen von Bemaßungen</w:t>
-      </w:r>
-      <w:r>
-        <w:t xml:space="preserve"> und das </w:t>
-      </w:r>
-      <w:r>
-        <w:rPr>
-          <w:b/>
-          <w:bCs/>
-        </w:rPr>
-        <w:t xml:space="preserve">Fixieren</w:t>
-      </w:r>
-      <w:r>
-        <w:t xml:space="preserve"> – und mit ihnen alles, was erst daran sichtbar wird: </w:t>
+        <w:t xml:space="preserve">). Mit Etappe C4b (2026-08-08) sind </w:t>
+      </w:r>
+      <w:r>
+        <w:rPr>
+          <w:b/>
+          <w:bCs/>
+        </w:rPr>
+        <w:t xml:space="preserve">[K-1]</w:t>
+      </w:r>
+      <w:r>
+        <w:t xml:space="preserve"> bis </w:t>
+      </w:r>
+      <w:r>
+        <w:rPr>
+          <w:b/>
+          <w:bCs/>
+        </w:rPr>
+        <w:t xml:space="preserve">[K-13]</w:t>
+      </w:r>
+      <w:r>
+        <w:t xml:space="preserve"> vollständig bedienbar und regressionsgetestet: Bemaßen mit achsgebundenen Bezügen (</w:t>
+      </w:r>
+      <w:r>
+        <w:rPr>
+          <w:b/>
+          <w:bCs/>
+        </w:rPr>
+        <w:t xml:space="preserve">[K-1]</w:t>
+      </w:r>
+      <w:r>
+        <w:t xml:space="preserve">, </w:t>
+      </w:r>
+      <w:r>
+        <w:rPr>
+          <w:b/>
+          <w:bCs/>
+        </w:rPr>
+        <w:t xml:space="preserve">[K-2]</w:t>
+      </w:r>
+      <w:r>
+        <w:t xml:space="preserve">), treibende Maße mit Wert (</w:t>
       </w:r>
       <w:r>
         <w:rPr>
@@ -17893,6 +17903,76 @@
         <w:t xml:space="preserve">[K-3]</w:t>
       </w:r>
       <w:r>
+        <w:t xml:space="preserve">), Fixieren gegen den Geschossursprung je Achse einzeln (</w:t>
+      </w:r>
+      <w:r>
+        <w:rPr>
+          <w:b/>
+          <w:bCs/>
+        </w:rPr>
+        <w:t xml:space="preserve">[K-4]</w:t>
+      </w:r>
+      <w:r>
+        <w:t xml:space="preserve">), sichtbare Widersprüche mit benannter Differenz (</w:t>
+      </w:r>
+      <w:r>
+        <w:rPr>
+          <w:b/>
+          <w:bCs/>
+        </w:rPr>
+        <w:t xml:space="preserve">[K-6]</w:t>
+      </w:r>
+      <w:r>
+        <w:t xml:space="preserve">), gemeldete Redundanz (</w:t>
+      </w:r>
+      <w:r>
+        <w:rPr>
+          <w:b/>
+          <w:bCs/>
+        </w:rPr>
+        <w:t xml:space="preserve">[K-7]</w:t>
+      </w:r>
+      <w:r>
+        <w:t xml:space="preserve">), das Längenmaß samt Abweisung krummer Werte (</w:t>
+      </w:r>
+      <w:r>
+        <w:rPr>
+          <w:b/>
+          <w:bCs/>
+        </w:rPr>
+        <w:t xml:space="preserve">[K-11]</w:t>
+      </w:r>
+      <w:r>
+        <w:t xml:space="preserve">) und die ganzzahlige Millimetereingabe (</w:t>
+      </w:r>
+      <w:r>
+        <w:rPr>
+          <w:b/>
+          <w:bCs/>
+        </w:rPr>
+        <w:t xml:space="preserve">[K-12]</w:t>
+      </w:r>
+      <w:r>
+        <w:t xml:space="preserve">). Ein Rückgängig/Wiederholen umfasst genau die Daten dieses Kapitels – Lagen und Bemaßungen (</w:t>
+      </w:r>
+      <w:r>
+        <w:rPr>
+          <w:b/>
+          <w:bCs/>
+        </w:rPr>
+        <w:t xml:space="preserve">[K-10]</w:t>
+      </w:r>
+      <w:r>
+        <w:t xml:space="preserve">) – und ausdrücklich weder Planbild noch Maßstab oder Versatz (</w:t>
+      </w:r>
+      <w:r>
+        <w:rPr>
+          <w:b/>
+          <w:bCs/>
+        </w:rPr>
+        <w:t xml:space="preserve">[L-8]</w:t>
+      </w:r>
+      <w:r>
         <w:t xml:space="preserve">, </w:t>
       </w:r>
       <w:r>
@@ -17900,50 +17980,10 @@
           <w:b/>
           <w:bCs/>
         </w:rPr>
-        <w:t xml:space="preserve">[K-6]</w:t>
-      </w:r>
-      <w:r>
-        <w:t xml:space="preserve">, </w:t>
-      </w:r>
-      <w:r>
-        <w:rPr>
-          <w:b/>
-          <w:bCs/>
-        </w:rPr>
-        <w:t xml:space="preserve">[K-7]</w:t>
-      </w:r>
-      <w:r>
-        <w:t xml:space="preserve">, </w:t>
-      </w:r>
-      <w:r>
-        <w:rPr>
-          <w:b/>
-          <w:bCs/>
-        </w:rPr>
-        <w:t xml:space="preserve">[K-11]</w:t>
-      </w:r>
-      <w:r>
-        <w:t xml:space="preserve"> und die Einheitenregel </w:t>
-      </w:r>
-      <w:r>
-        <w:rPr>
-          <w:b/>
-          <w:bCs/>
-        </w:rPr>
-        <w:t xml:space="preserve">[K-12]</w:t>
-      </w:r>
-      <w:r>
-        <w:t xml:space="preserve"> der Eingabe. Sie kommen mit Etappe C4b; bis dahin ist jede Wand nach </w:t>
-      </w:r>
-      <w:r>
-        <w:rPr>
-          <w:b/>
-          <w:bCs/>
-        </w:rPr>
-        <w:t xml:space="preserve">[K-4]</w:t>
-      </w:r>
-      <w:r>
-        <w:t xml:space="preserve"> in beiden Achsen frei, sofern nicht ein von Hand eingetragenes Maß vorliegt.</w:t>
+        <w:t xml:space="preserve">[L-9]</w:t>
+      </w:r>
+      <w:r>
+        <w:t xml:space="preserve">). Offen sind allein die Bedienzugaben der Etappen C4c (Bauteilliste, Referenzgeschoss) und C5 (Mappen-ZIP), die keine Regel dieses Kapitels berühren.</w:t>
       </w:r>
     </w:p>
     <w:sectPr>

</xml_diff>

<commit_message>
Fix gestaffelte Kopfbleche in Modul 6 (#24)
</commit_message>
<xml_diff>
--- a/doku/SEMBLA_Handbuch.docx
+++ b/doku/SEMBLA_Handbuch.docx
@@ -1729,6 +1729,39 @@
         <w:spacing w:after="60"/>
       </w:pPr>
       <w:r>
+        <w:t xml:space="preserve">Bei </w:t>
+      </w:r>
+      <w:r>
+        <w:rPr>
+          <w:b/>
+          <w:bCs/>
+        </w:rPr>
+        <w:t xml:space="preserve">gestaffelten Wänden</w:t>
+      </w:r>
+      <w:r>
+        <w:t xml:space="preserve"> liegt das Kopfblech nicht durchgehend auf der Maximalhöhe, sondern in </w:t>
+      </w:r>
+      <w:r>
+        <w:rPr>
+          <w:b/>
+          <w:bCs/>
+        </w:rPr>
+        <w:t xml:space="preserve">horizontalen Abschnitten auf der jeweils tatsächlich gebauten lokalen Oberkante</w:t>
+      </w:r>
+      <w:r>
+        <w:t xml:space="preserve">; seine Gesamtlänge ist die Summe der lokalen Oberkantenlängen (top_plate.laenge_mm), siehe [A-1].</w:t>
+      </w:r>
+    </w:p>
+    <w:p>
+      <w:pPr>
+        <w:pStyle w:val="ListParagraph"/>
+        <w:numPr>
+          <w:ilvl w:val="0"/>
+          <w:numId w:val="2"/>
+        </w:numPr>
+        <w:spacing w:after="60"/>
+      </w:pPr>
+      <w:r>
         <w:rPr>
           <w:b/>
           <w:bCs/>
@@ -10983,7 +11016,157 @@
         <w:t xml:space="preserve">getrennt bepreisbare Positionen</w:t>
       </w:r>
       <w:r>
-        <w:t xml:space="preserve">. Die Trennung wird in der gemeinsamen Ausgabeschicht aus den real vorhandenen Platten des Wandelements abgeleitet; die Summe beider Positionen bleibt gleich der Gesamtmodulzahl des Rechenkerns (keine Doppelzählung, kein Core-Eingriff).</w:t>
+        <w:t xml:space="preserve">. Die Trennung wird in der gemeinsamen Ausgabeschicht aus den real vorhandenen Platten des Wandelements abgeleitet; die Summe beider Positionen bleibt gleich der Gesamtmodulzahl des Rechenkerns (keine Doppelzählung, kein Core-Eingriff). </w:t>
+      </w:r>
+      <w:r>
+        <w:rPr>
+          <w:b/>
+          <w:bCs/>
+        </w:rPr>
+        <w:t xml:space="preserve">Lage und Ausdehnung der Bleche sind fachlich festgelegt:</w:t>
+      </w:r>
+      <w:r>
+        <w:t xml:space="preserve"> das </w:t>
+      </w:r>
+      <w:r>
+        <w:rPr>
+          <w:b/>
+          <w:bCs/>
+        </w:rPr>
+        <w:t xml:space="preserve">Bodenblech</w:t>
+      </w:r>
+      <w:r>
+        <w:t xml:space="preserve"> liegt über die </w:t>
+      </w:r>
+      <w:r>
+        <w:rPr>
+          <w:b/>
+          <w:bCs/>
+        </w:rPr>
+        <w:t xml:space="preserve">volle Wandlänge</w:t>
+      </w:r>
+      <w:r>
+        <w:t xml:space="preserve"> unter der Wand; das </w:t>
+      </w:r>
+      <w:r>
+        <w:rPr>
+          <w:b/>
+          <w:bCs/>
+        </w:rPr>
+        <w:t xml:space="preserve">Kopfblech</w:t>
+      </w:r>
+      <w:r>
+        <w:t xml:space="preserve"> liegt in </w:t>
+      </w:r>
+      <w:r>
+        <w:rPr>
+          <w:b/>
+          <w:bCs/>
+        </w:rPr>
+        <w:t xml:space="preserve">horizontalen Abschnitten auf der jeweils tatsächlich gebauten lokalen Oberkante</w:t>
+      </w:r>
+      <w:r>
+        <w:t xml:space="preserve"> – je maximaler Abschnitt gleicher lokaler Höhe ein Blech, </w:t>
+      </w:r>
+      <w:r>
+        <w:rPr>
+          <w:b/>
+          <w:bCs/>
+        </w:rPr>
+        <w:t xml:space="preserve">lückenlos</w:t>
+      </w:r>
+      <w:r>
+        <w:t xml:space="preserve"> aneinander und </w:t>
+      </w:r>
+      <w:r>
+        <w:rPr>
+          <w:b/>
+          <w:bCs/>
+        </w:rPr>
+        <w:t xml:space="preserve">ohne schwebendes oder überragendes</w:t>
+      </w:r>
+      <w:r>
+        <w:t xml:space="preserve"> Stück. Rasterspalten </w:t>
+      </w:r>
+      <w:r>
+        <w:rPr>
+          <w:b/>
+          <w:bCs/>
+        </w:rPr>
+        <w:t xml:space="preserve">ohne</w:t>
+      </w:r>
+      <w:r>
+        <w:t xml:space="preserve"> Wand (lokale Oberkante 0) erhalten </w:t>
+      </w:r>
+      <w:r>
+        <w:rPr>
+          <w:b/>
+          <w:bCs/>
+        </w:rPr>
+        <w:t xml:space="preserve">kein</w:t>
+      </w:r>
+      <w:r>
+        <w:t xml:space="preserve"> Blech; dort entsteht eine </w:t>
+      </w:r>
+      <w:r>
+        <w:rPr>
+          <w:b/>
+          <w:bCs/>
+        </w:rPr>
+        <w:t xml:space="preserve">echte Lücke</w:t>
+      </w:r>
+      <w:r>
+        <w:t xml:space="preserve"> statt eines schwebenden Abschnitts. Die </w:t>
+      </w:r>
+      <w:r>
+        <w:rPr>
+          <w:b/>
+          <w:bCs/>
+        </w:rPr>
+        <w:t xml:space="preserve">Summe</w:t>
+      </w:r>
+      <w:r>
+        <w:t xml:space="preserve"> der Abschnittslängen ist </w:t>
+      </w:r>
+      <w:r>
+        <w:rPr>
+          <w:b/>
+          <w:bCs/>
+        </w:rPr>
+        <w:t xml:space="preserve">gleich</w:t>
+      </w:r>
+      <w:r>
+        <w:t xml:space="preserve"> top_plate.laenge_mm (im Rechenkern die Zahl belegter Rasterspalten × 125 mm), sodass Mengen und Darstellung dieselbe Kontur benutzen. Die </w:t>
+      </w:r>
+      <w:r>
+        <w:rPr>
+          <w:b/>
+          <w:bCs/>
+        </w:rPr>
+        <w:t xml:space="preserve">Art</w:t>
+      </w:r>
+      <w:r>
+        <w:t xml:space="preserve"> des oberen Anschlusses ändert die Kontur </w:t>
+      </w:r>
+      <w:r>
+        <w:rPr>
+          <w:b/>
+          <w:bCs/>
+        </w:rPr>
+        <w:t xml:space="preserve">nicht</w:t>
+      </w:r>
+      <w:r>
+        <w:t xml:space="preserve">; bei prestress.top_connection = spannplatte entsteht </w:t>
+      </w:r>
+      <w:r>
+        <w:rPr>
+          <w:b/>
+          <w:bCs/>
+        </w:rPr>
+        <w:t xml:space="preserve">gar kein</w:t>
+      </w:r>
+      <w:r>
+        <w:t xml:space="preserve"> Kopfblech (top_plate = null).</w:t>
       </w:r>
     </w:p>
     <w:p>
@@ -14353,7 +14536,97 @@
         <w:t xml:space="preserve">technische Zeichnung in Modul 7</w:t>
       </w:r>
       <w:r>
-        <w:t xml:space="preserve">. Gezeichnet werden überall die </w:t>
+        <w:t xml:space="preserve">. Ebenso gilt: </w:t>
+      </w:r>
+      <w:r>
+        <w:rPr>
+          <w:b/>
+          <w:bCs/>
+        </w:rPr>
+        <w:t xml:space="preserve">jede</w:t>
+      </w:r>
+      <w:r>
+        <w:t xml:space="preserve"> Ansicht, die die </w:t>
+      </w:r>
+      <w:r>
+        <w:rPr>
+          <w:b/>
+          <w:bCs/>
+        </w:rPr>
+        <w:t xml:space="preserve">Wandkontur</w:t>
+      </w:r>
+      <w:r>
+        <w:t xml:space="preserve"> oder die </w:t>
+      </w:r>
+      <w:r>
+        <w:rPr>
+          <w:b/>
+          <w:bCs/>
+        </w:rPr>
+        <w:t xml:space="preserve">Anschlussbleche</w:t>
+      </w:r>
+      <w:r>
+        <w:t xml:space="preserve"> zeigt – </w:t>
+      </w:r>
+      <w:r>
+        <w:rPr>
+          <w:b/>
+          <w:bCs/>
+        </w:rPr>
+        <w:t xml:space="preserve">einschließlich der 3D-Vorschau in Modul 6</w:t>
+      </w:r>
+      <w:r>
+        <w:t xml:space="preserve"> –, leitet die lokale Oberkante aus der </w:t>
+      </w:r>
+      <w:r>
+        <w:rPr>
+          <w:b/>
+          <w:bCs/>
+        </w:rPr>
+        <w:t xml:space="preserve">gemeinsamen, DOM-freien Konturableitung</w:t>
+      </w:r>
+      <w:r>
+        <w:t xml:space="preserve"> ab (topLagen / oberkantenAbschnitte in sembla-montage.js) und hält damit </w:t>
+      </w:r>
+      <w:r>
+        <w:rPr>
+          <w:b/>
+          <w:bCs/>
+        </w:rPr>
+        <w:t xml:space="preserve">[A-1]</w:t>
+      </w:r>
+      <w:r>
+        <w:t xml:space="preserve"> ein; eine </w:t>
+      </w:r>
+      <w:r>
+        <w:rPr>
+          <w:b/>
+          <w:bCs/>
+        </w:rPr>
+        <w:t xml:space="preserve">modul-eigene zweite</w:t>
+      </w:r>
+      <w:r>
+        <w:t xml:space="preserve"> Kontur- oder Blechrechnung ist </w:t>
+      </w:r>
+      <w:r>
+        <w:rPr>
+          <w:b/>
+          <w:bCs/>
+        </w:rPr>
+        <w:t xml:space="preserve">unzulässig</w:t>
+      </w:r>
+      <w:r>
+        <w:t xml:space="preserve"> (</w:t>
+      </w:r>
+      <w:r>
+        <w:rPr>
+          <w:b/>
+          <w:bCs/>
+        </w:rPr>
+        <w:t xml:space="preserve">[P-6]</w:t>
+      </w:r>
+      <w:r>
+        <w:t xml:space="preserve">), auch dann, wenn sie zufällig dasselbe Ergebnis liefern würde. Gezeichnet werden überall die </w:t>
       </w:r>
       <w:r>
         <w:rPr>

</xml_diff>

<commit_message>
feat(modul0): Bauteilliste und Referenzgeschoss (C4c, #26)
</commit_message>
<xml_diff>
--- a/doku/SEMBLA_Handbuch.docx
+++ b/doku/SEMBLA_Handbuch.docx
@@ -18256,7 +18256,37 @@
         <w:t xml:space="preserve">[L-9]</w:t>
       </w:r>
       <w:r>
-        <w:t xml:space="preserve">). Offen sind allein die Bedienzugaben der Etappen C4c (Bauteilliste, Referenzgeschoss) und C5 (Mappen-ZIP), die keine Regel dieses Kapitels berühren.</w:t>
+        <w:t xml:space="preserve">). Mit Etappe C4c (2026-08-08) kamen die Bedienzugaben hinzu – eine schwebende Bauteilliste mit Kurzbeschreibung und beidseitig synchroner Auswahl, das unmittelbar darunterliegende Geschoss als blasse, nicht anklickbare Umrisse mit einstellbarer Deckkraft sowie zwei Bedienkorrekturen (Doppelklick auf die dargestellte Maßzahl öffnet denselben Maßeditor; die Beschriftungen der Zeichenfläche sind nicht mehr als Text markierbar). Auch das berührt keine Regel dieses Kapitels: die Umrisse des Referenzgeschosses gehen in keine Auswahl, keine Kollisionsprüfung (</w:t>
+      </w:r>
+      <w:r>
+        <w:rPr>
+          <w:b/>
+          <w:bCs/>
+        </w:rPr>
+        <w:t xml:space="preserve">[K-13]</w:t>
+      </w:r>
+      <w:r>
+        <w:t xml:space="preserve">) und keine Bemaßung ein, ihre Sichtbarkeit wird nicht gespeichert (</w:t>
+      </w:r>
+      <w:r>
+        <w:rPr>
+          <w:b/>
+          <w:bCs/>
+        </w:rPr>
+        <w:t xml:space="preserve">[K-10]</w:t>
+      </w:r>
+      <w:r>
+        <w:t xml:space="preserve">), und der Doppelklick benutzt ausschließlich den vorhandenen Bearbeitungsweg, ohne die Bedeutung eines Maßes zu ändern (</w:t>
+      </w:r>
+      <w:r>
+        <w:rPr>
+          <w:b/>
+          <w:bCs/>
+        </w:rPr>
+        <w:t xml:space="preserve">[K-3]</w:t>
+      </w:r>
+      <w:r>
+        <w:t xml:space="preserve">). Offen ist allein die Etappe C5 (Mappen-ZIP), die ebenfalls keine Regel dieses Kapitels berührt.</w:t>
       </w:r>
     </w:p>
     <w:sectPr>

</xml_diff>

<commit_message>
feat(modul0): vollständiges Projektarchiv C5 (#26)
</commit_message>
<xml_diff>
--- a/doku/SEMBLA_Handbuch.docx
+++ b/doku/SEMBLA_Handbuch.docx
@@ -16762,6 +16762,126 @@
       </w:r>
       <w:r>
         <w:t xml:space="preserve"> gesetzte Katalog, und fehlt auch der, gibt es keinen. *Umgesetzt mit Etappe C3.1, regressionsgetestet.*</w:t>
+      </w:r>
+    </w:p>
+    <w:p>
+      <w:pPr>
+        <w:pStyle w:val="ListParagraph"/>
+        <w:numPr>
+          <w:ilvl w:val="0"/>
+          <w:numId w:val="2"/>
+        </w:numPr>
+        <w:spacing w:after="60"/>
+      </w:pPr>
+      <w:r>
+        <w:rPr>
+          <w:b/>
+          <w:bCs/>
+        </w:rPr>
+        <w:t xml:space="preserve">[L-13 · MUSS]</w:t>
+      </w:r>
+      <w:r>
+        <w:t xml:space="preserve"> </w:t>
+      </w:r>
+      <w:r>
+        <w:rPr>
+          <w:b/>
+          <w:bCs/>
+        </w:rPr>
+        <w:t xml:space="preserve">Ein vollständiges Projektarchiv wird vor dem Schreiben vollständig geprüft und atomar importiert.</w:t>
+      </w:r>
+      <w:r>
+        <w:t xml:space="preserve"> Ein Archiv enthält </w:t>
+      </w:r>
+      <w:r>
+        <w:rPr>
+          <w:b/>
+          <w:bCs/>
+        </w:rPr>
+        <w:t xml:space="preserve">genau eine</w:t>
+      </w:r>
+      <w:r>
+        <w:t xml:space="preserve"> Projektmappe (`projekt.json`), jede referenzierte vorhandene Wand als unveränderte </w:t>
+      </w:r>
+      <w:r>
+        <w:rPr>
+          <w:b/>
+          <w:bCs/>
+        </w:rPr>
+        <w:t xml:space="preserve">SEMBLA-Projekt-v2-Datei</w:t>
+      </w:r>
+      <w:r>
+        <w:t xml:space="preserve"> und jedes vorhandene referenzierte Planbild aus der IndexedDB; der </w:t>
+      </w:r>
+      <w:r>
+        <w:rPr>
+          <w:b/>
+          <w:bCs/>
+        </w:rPr>
+        <w:t xml:space="preserve">Bauteilkatalog selbst bleibt ausgeschlossen</w:t>
+      </w:r>
+      <w:r>
+        <w:t xml:space="preserve"> (</w:t>
+      </w:r>
+      <w:r>
+        <w:rPr>
+          <w:b/>
+          <w:bCs/>
+        </w:rPr>
+        <w:t xml:space="preserve">[L-12]</w:t>
+      </w:r>
+      <w:r>
+        <w:t xml:space="preserve">), nur seine Kennung reist mit. Die Zuordnung einer Wanddatei steht ausschließlich und ausdrücklich in `wand.datei`; Dateiname und Kennung werden </w:t>
+      </w:r>
+      <w:r>
+        <w:rPr>
+          <w:b/>
+          <w:bCs/>
+        </w:rPr>
+        <w:t xml:space="preserve">nie heuristisch</w:t>
+      </w:r>
+      <w:r>
+        <w:t xml:space="preserve"> verknüpft, und der Transportpfad wird nach dem Import nicht als zweite Identität gespeichert (</w:t>
+      </w:r>
+      <w:r>
+        <w:rPr>
+          <w:b/>
+          <w:bCs/>
+        </w:rPr>
+        <w:t xml:space="preserve">[L-4]</w:t>
+      </w:r>
+      <w:r>
+        <w:t xml:space="preserve">). Vor jeder Bestätigung werden Format- und Versionsachsen, Bildtyp und Bildbytes, genau eine Mappendatei, sichere normalisierte relative Pfade (keine absoluten Pfade, Laufwerksangaben oder Traversal), doppelte, fehlende und überzählige Dateien sowie beim ZIP CRC und Kompressionsmethode geprüft; lesbar sind STORE und Deflate. Der Prüfbericht erscheint </w:t>
+      </w:r>
+      <w:r>
+        <w:rPr>
+          <w:b/>
+          <w:bCs/>
+        </w:rPr>
+        <w:t xml:space="preserve">vor jedem Schreibzugriff</w:t>
+      </w:r>
+      <w:r>
+        <w:t xml:space="preserve"> und bleibt bis „Importieren“ nur im Seitenspeicher. Vorhandene Projekt- oder Wandkennungen werden ausschließlich nach </w:t>
+      </w:r>
+      <w:r>
+        <w:rPr>
+          <w:b/>
+          <w:bCs/>
+        </w:rPr>
+        <w:t xml:space="preserve">ausdrücklicher Überschreibbestätigung</w:t>
+      </w:r>
+      <w:r>
+        <w:t xml:space="preserve"> ersetzt; scheitert irgendein Schreiben in localStorage oder IndexedDB, werden beide Speicher vollständig auf ihren vorherigen Stand zurückgesetzt. Ein Ordnerimport folgt demselben Prüf- und Schreibweg wie das ZIP. Der getrennte Mappen-JSON-Weg bleibt klar als </w:t>
+      </w:r>
+      <w:r>
+        <w:rPr>
+          <w:b/>
+          <w:bCs/>
+        </w:rPr>
+        <w:t xml:space="preserve">„nur Struktur (JSON)“</w:t>
+      </w:r>
+      <w:r>
+        <w:t xml:space="preserve"> bezeichnet, Einzelwand- und Katalogwege bleiben unverändert. *Umgesetzt mit Etappe C5 (Bearbeitung 2026-08-08), ohne Schema- oder Formatversionsbump, regressionsgetestet.*</w:t>
       </w:r>
     </w:p>
     <w:p>

</xml_diff>

<commit_message>
feat: streamline floor plan wall workflow (#50)
</commit_message>
<xml_diff>
--- a/doku/SEMBLA_Handbuch.docx
+++ b/doku/SEMBLA_Handbuch.docx
@@ -15808,7 +15808,7 @@
           <w:b/>
           <w:bCs/>
         </w:rPr>
-        <w:t xml:space="preserve">Geschosshöhe ist Vorgabe, nicht Wahrheit.</w:t>
+        <w:t xml:space="preserve">Standard-Wandhöhe ist Vorgabe, nicht Wahrheit.</w:t>
       </w:r>
       <w:r>
         <w:t xml:space="preserve"> Ein Geschoss trägt eine </w:t>
@@ -15818,7 +15818,7 @@
           <w:b/>
           <w:bCs/>
         </w:rPr>
-        <w:t xml:space="preserve">Geschosshöhe</w:t>
+        <w:t xml:space="preserve">Standard-Wandhöhe</w:t>
       </w:r>
       <w:r>
         <w:t xml:space="preserve">, die beim </w:t>
@@ -15861,7 +15861,17 @@
         <w:t xml:space="preserve">nie</w:t>
       </w:r>
       <w:r>
-        <w:t xml:space="preserve"> nachträglich auf bestehende Wände angewandt. Erfüllt die Geschosshöhe das Lagenraster COURSE = 200 mm (</w:t>
+        <w:t xml:space="preserve"> nachträglich auf bestehende Wände angewandt: eine spätere Änderung des Standardwerts lässt jede vorhandene Wandhöhe unverändert, und eine Nachführung wäre ein Eingriff in fremdes Eigentum (</w:t>
+      </w:r>
+      <w:r>
+        <w:rPr>
+          <w:b/>
+          <w:bCs/>
+        </w:rPr>
+        <w:t xml:space="preserve">[P-1]</w:t>
+      </w:r>
+      <w:r>
+        <w:t xml:space="preserve">). Erfüllt der Wert das Lagenraster COURSE = 200 mm (</w:t>
       </w:r>
       <w:r>
         <w:rPr>
@@ -15871,7 +15881,7 @@
         <w:t xml:space="preserve">[G-2]</w:t>
       </w:r>
       <w:r>
-        <w:t xml:space="preserve">) nicht, wird sie </w:t>
+        <w:t xml:space="preserve">) nicht, wird er </w:t>
       </w:r>
       <w:r>
         <w:rPr>
@@ -15881,7 +15891,27 @@
         <w:t xml:space="preserve">nicht still gerundet</w:t>
       </w:r>
       <w:r>
-        <w:t xml:space="preserve">: die Abweichung wird beim Anlegen benannt und die Wandhöhe ausdrücklich gewählt.</w:t>
+        <w:t xml:space="preserve">: die Abweichung wird beim Anlegen benannt und die Wandhöhe ausdrücklich gewählt. Der Wert ist </w:t>
+      </w:r>
+      <w:r>
+        <w:rPr>
+          <w:b/>
+          <w:bCs/>
+        </w:rPr>
+        <w:t xml:space="preserve">keine</w:t>
+      </w:r>
+      <w:r>
+        <w:t xml:space="preserve"> Geschoss- oder Deckenhöhe und begründet keine solche Logik; er heißt in der </w:t>
+      </w:r>
+      <w:r>
+        <w:rPr>
+          <w:b/>
+          <w:bCs/>
+        </w:rPr>
+        <w:t xml:space="preserve">Oberfläche</w:t>
+      </w:r>
+      <w:r>
+        <w:t xml:space="preserve"> durchgängig „Standard-Wandhöhe“, während das Datenfeld unverändert `geschoss.hoehe_mm` bleibt – die Umbenennung ist eine Benennungs-, keine Formatänderung. *Fassung ab Issue #50 (Bearbeitung 2026-08-09); zuvor hieß derselbe Wert in der Oberfläche „Geschosshöhe“, was eine Bauteilhöhe des Geschosses nahelegte, die es nicht gibt.*</w:t>
       </w:r>
     </w:p>
     <w:p>
@@ -18406,7 +18436,57 @@
         <w:t xml:space="preserve">[K-3]</w:t>
       </w:r>
       <w:r>
-        <w:t xml:space="preserve">). Offen ist allein die Etappe C5 (Mappen-ZIP), die ebenfalls keine Regel dieses Kapitels berührt.</w:t>
+        <w:t xml:space="preserve">). Offen ist allein die Etappe C5 (Mappen-ZIP), die ebenfalls keine Regel dieses Kapitels berührt. Mit Issue #50, Paket 1 (Bearbeitung 2026-08-09) kam eine reine Bedienbereinigung hinzu: der linke Abschnitt „Neue Wand“ des Layout-Editors ist entfallen, weil er neben dem grafischen Werkzeug „Wand zeichnen“ einen zweiten, formularartigen Anlegeweg vortäuschte; seine tatsächlich benötigten Angaben – Zeichenziel, Standard-Wandhöhe (</w:t>
+      </w:r>
+      <w:r>
+        <w:rPr>
+          <w:b/>
+          <w:bCs/>
+        </w:rPr>
+        <w:t xml:space="preserve">[L-5]</w:t>
+      </w:r>
+      <w:r>
+        <w:t xml:space="preserve">) und Wandtyp – gehören jetzt sichtbar zum Werkzeug, der Rasterfang zur Ansicht. Die schwebende Bauteilliste trägt zusätzlich je Wand einen Knopf „Planen“, der dieselbe Funktion aufruft wie der vorhandene Knopf der aktiven Wand: er setzt genau diese Wand aktiv (</w:t>
+      </w:r>
+      <w:r>
+        <w:rPr>
+          <w:b/>
+          <w:bCs/>
+        </w:rPr>
+        <w:t xml:space="preserve">[L-10]</w:t>
+      </w:r>
+      <w:r>
+        <w:t xml:space="preserve">) und öffnet Modul 1. Ein verwaister Eintrag erhält </w:t>
+      </w:r>
+      <w:r>
+        <w:rPr>
+          <w:b/>
+          <w:bCs/>
+        </w:rPr>
+        <w:t xml:space="preserve">keinen</w:t>
+      </w:r>
+      <w:r>
+        <w:t xml:space="preserve"> solchen Knopf, statt einen Weg vorzutäuschen, den es nicht gibt (</w:t>
+      </w:r>
+      <w:r>
+        <w:rPr>
+          <w:b/>
+          <w:bCs/>
+        </w:rPr>
+        <w:t xml:space="preserve">[L-4]</w:t>
+      </w:r>
+      <w:r>
+        <w:t xml:space="preserve">). Auch das ändert keine Regel dieses Kapitels: die Liste bleibt Anzeige und Auswahl und schreibt nichts (</w:t>
+      </w:r>
+      <w:r>
+        <w:rPr>
+          <w:b/>
+          <w:bCs/>
+        </w:rPr>
+        <w:t xml:space="preserve">[K-10]</w:t>
+      </w:r>
+      <w:r>
+        <w:t xml:space="preserve">), Löser, Bemaßungen und Kollisionsprüfung bleiben unberührt, und es gibt keinen Schema- oder Formatversionsbump.</w:t>
       </w:r>
     </w:p>
     <w:sectPr>

</xml_diff>

<commit_message>
feat: edit dimensions inline in floor plan (#51)
</commit_message>
<xml_diff>
--- a/doku/SEMBLA_Handbuch.docx
+++ b/doku/SEMBLA_Handbuch.docx
@@ -18486,7 +18486,87 @@
         <w:t xml:space="preserve">[K-10]</w:t>
       </w:r>
       <w:r>
-        <w:t xml:space="preserve">), Löser, Bemaßungen und Kollisionsprüfung bleiben unberührt, und es gibt keinen Schema- oder Formatversionsbump.</w:t>
+        <w:t xml:space="preserve">), Löser, Bemaßungen und Kollisionsprüfung bleiben unberührt, und es gibt keinen Schema- oder Formatversionsbump. Mit Issue #51, Paket 2 (Bearbeitung 2026-08-10) wurde die Bemaßung unmittelbar in der Zeichnung bedienbar: der Doppelklick auf die Maßzahl öffnet das Eingabefeld nicht mehr nur in der Seitenleiste, sondern an Ort und Stelle – Enter übernimmt, Escape verwirft, ein Fokusverlust übernimmt einen gültigen Wert, ein ungültiger ändert nichts und wird begründet gemeldet, statt gerundet oder still verworfen zu werden (</w:t>
+      </w:r>
+      <w:r>
+        <w:rPr>
+          <w:b/>
+          <w:bCs/>
+        </w:rPr>
+        <w:t xml:space="preserve">[K-12]</w:t>
+      </w:r>
+      <w:r>
+        <w:t xml:space="preserve">, </w:t>
+      </w:r>
+      <w:r>
+        <w:rPr>
+          <w:b/>
+          <w:bCs/>
+        </w:rPr>
+        <w:t xml:space="preserve">[P-9]</w:t>
+      </w:r>
+      <w:r>
+        <w:t xml:space="preserve">). Geschrieben wird ausschließlich über den vorhandenen Weg, sodass die Bedeutung eines Maßes unverändert bleibt (</w:t>
+      </w:r>
+      <w:r>
+        <w:rPr>
+          <w:b/>
+          <w:bCs/>
+        </w:rPr>
+        <w:t xml:space="preserve">[K-3]</w:t>
+      </w:r>
+      <w:r>
+        <w:t xml:space="preserve">) und Längenmaß (</w:t>
+      </w:r>
+      <w:r>
+        <w:rPr>
+          <w:b/>
+          <w:bCs/>
+        </w:rPr>
+        <w:t xml:space="preserve">[K-11]</w:t>
+      </w:r>
+      <w:r>
+        <w:t xml:space="preserve">), Widerspruch (</w:t>
+      </w:r>
+      <w:r>
+        <w:rPr>
+          <w:b/>
+          <w:bCs/>
+        </w:rPr>
+        <w:t xml:space="preserve">[K-6]</w:t>
+      </w:r>
+      <w:r>
+        <w:t xml:space="preserve">), Redundanz (</w:t>
+      </w:r>
+      <w:r>
+        <w:rPr>
+          <w:b/>
+          <w:bCs/>
+        </w:rPr>
+        <w:t xml:space="preserve">[K-7]</w:t>
+      </w:r>
+      <w:r>
+        <w:t xml:space="preserve">) und Rückgängig (</w:t>
+      </w:r>
+      <w:r>
+        <w:rPr>
+          <w:b/>
+          <w:bCs/>
+        </w:rPr>
+        <w:t xml:space="preserve">[K-10]</w:t>
+      </w:r>
+      <w:r>
+        <w:t xml:space="preserve">) unverändert greifen. Zusätzlich lässt sich die dargestellte Maßzahl verschieben: das optionale Feld text_mm der Bemaßung ist ausschließlich ihre Beschriftungsposition, verschiebt weder Maßlinie noch Bezugspunkt, ändert keinen Maßwert und geht nicht in den Löser ein (</w:t>
+      </w:r>
+      <w:r>
+        <w:rPr>
+          <w:b/>
+          <w:bCs/>
+        </w:rPr>
+        <w:t xml:space="preserve">[K-5]</w:t>
+      </w:r>
+      <w:r>
+        <w:t xml:space="preserve">); fehlt es, gilt unverändert die automatisch berechnete Stelle. Auch das begründet keine neue Regel und keinen Schema- oder Formatversionsbump – das Feld war im Datenmodell bereits vorgesehen und im Bestand nie gesetzt.</w:t>
       </w:r>
     </w:p>
     <w:sectPr>

</xml_diff>

<commit_message>
fix: make floor plan dimensions CAD-like (#51)
</commit_message>
<xml_diff>
--- a/doku/SEMBLA_Handbuch.docx
+++ b/doku/SEMBLA_Handbuch.docx
@@ -16949,6 +16949,25 @@
     </w:p>
     <w:p>
       <w:pPr>
+        <w:pBdr>
+          <w:left w:val="single" w:color="E0B400" w:sz="18" w:space="6"/>
+        </w:pBdr>
+        <w:shd w:fill="FFF8E6" w:val="clear"/>
+        <w:spacing w:after="120" w:before="80"/>
+      </w:pPr>
+      <w:r>
+        <w:rPr>
+          <w:b/>
+          <w:bCs/>
+        </w:rPr>
+        <w:t xml:space="preserve">Bedienung der Bemaßungen (Issue #51):</w:t>
+      </w:r>
+      <w:r>
+        <w:t xml:space="preserve"> Mit dem D-Werkzeug werden erster und zweiter Bezug direkt im Plan gewählt. Nach dem zweiten Bezug steht die vollständige vorläufige Bemaßung mit einem Inline-Feld an der Maßzahl; der exakte Istabstand ist vorausgewählt. Enter setzt über den einzigen treibenden Maßwertweg, Escape verwirft Feld und Entwurf gemeinsam. Ein nicht ganzzahliger 0,5-mm-Istabstand wird nach [K-12] nicht gerundet, sondern bleibt rot, bis er überschrieben wird. Doppelklick auf Maßzahl oder Maßlinie öffnet dieselbe Eingabe unabhängig vom aktiven Werkzeug. Ein normaler Zug an Zahl oder Linie verschiebt die vollständige Maßdarstellung quer zur Messrichtung: Maßlinie und Zahl wandern gemeinsam, Hilfslinien bleiben an den Referenzen. Dafür wird nur das optionale skalare `linie_mm` gespeichert; ein vorhandenes `text_mm` bleibt als relativer Labelversatz erhalten. Maßwert, Wandgeometrie, Referenzen und Löser ändern sich nicht. Delete/Backspace löschen ein ausgewähltes Maß, aber nie während einer Texteingabe und nie eine Wand. Anlegen, Ändern, Verschieben und Löschen sind jeweils genau ein Undo-/Redo-Schritt. Der frühere linke Maßeditor ist vollständig entfernt; Fixieren bleibt ein Ein-Klick-Werkzeug.</w:t>
+      </w:r>
+    </w:p>
+    <w:p>
+      <w:pPr>
         <w:pStyle w:val="ListParagraph"/>
         <w:numPr>
           <w:ilvl w:val="0"/>
@@ -18486,7 +18505,17 @@
         <w:t xml:space="preserve">[K-10]</w:t>
       </w:r>
       <w:r>
-        <w:t xml:space="preserve">), Löser, Bemaßungen und Kollisionsprüfung bleiben unberührt, und es gibt keinen Schema- oder Formatversionsbump. Mit Issue #51, Paket 2 (Bearbeitung 2026-08-10) wurde die Bemaßung unmittelbar in der Zeichnung bedienbar: der Doppelklick auf die Maßzahl öffnet das Eingabefeld nicht mehr nur in der Seitenleiste, sondern an Ort und Stelle – Enter übernimmt, Escape verwirft, ein Fokusverlust übernimmt einen gültigen Wert, ein ungültiger ändert nichts und wird begründet gemeldet, statt gerundet oder still verworfen zu werden (</w:t>
+        <w:t xml:space="preserve">), Löser, Bemaßungen und Kollisionsprüfung bleiben unberührt, und es gibt keinen Schema- oder Formatversionsbump. Mit Issue #51, Paket 2 (Bearbeitung 2026-08-10) wurde der gesamte Bemaßungsworkflow in die Zeichnung verlegt: Nach erstem und zweitem Bezug ist der ungespeicherte Entwurf sichtbar; nach dem zweiten Bezug öffnet das Inline-Feld mit dem exakten Istabstand. Enter schreibt ausschließlich über den vorhandenen treibenden Weg (</w:t>
+      </w:r>
+      <w:r>
+        <w:rPr>
+          <w:b/>
+          <w:bCs/>
+        </w:rPr>
+        <w:t xml:space="preserve">[K-3]</w:t>
+      </w:r>
+      <w:r>
+        <w:t xml:space="preserve">), Escape verwirft Feld und Entwurf gemeinsam. Ein nicht ganzzahliger 0,5-mm-Istabstand wird nicht gerundet, sondern bleibt wegen </w:t>
       </w:r>
       <w:r>
         <w:rPr>
@@ -18496,7 +18525,7 @@
         <w:t xml:space="preserve">[K-12]</w:t>
       </w:r>
       <w:r>
-        <w:t xml:space="preserve">, </w:t>
+        <w:t xml:space="preserve"> ungültig und rot, bis er überschrieben wird (</w:t>
       </w:r>
       <w:r>
         <w:rPr>
@@ -18506,17 +18535,27 @@
         <w:t xml:space="preserve">[P-9]</w:t>
       </w:r>
       <w:r>
-        <w:t xml:space="preserve">). Geschrieben wird ausschließlich über den vorhandenen Weg, sodass die Bedeutung eines Maßes unverändert bleibt (</w:t>
-      </w:r>
-      <w:r>
-        <w:rPr>
-          <w:b/>
-          <w:bCs/>
-        </w:rPr>
-        <w:t xml:space="preserve">[K-3]</w:t>
-      </w:r>
-      <w:r>
-        <w:t xml:space="preserve">) und Längenmaß (</w:t>
+        <w:t xml:space="preserve">). Der linke Maßeditor ist vollständig entfernt. Doppelklick auf Maßzahl oder Maßlinie öffnet dieselbe Eingabe in jedem Werkzeug, ohne vorher eine fremde Werkzeugaktion auszulösen. Ein Zug an Zahl oder Linie verschiebt die vollständige Maßdarstellung quer zur Messrichtung: Maßlinie und Zahl wandern gemeinsam, Hilfslinien bleiben an den Referenzen. Gespeichert wird ausschließlich das optionale skalare Feld `linie_mm`; vorhandenes `text_mm` bleibt als relativer Labelversatz unverändert. Wert, Wandgeometrie, Referenzen und Löser bleiben bit-genau (</w:t>
+      </w:r>
+      <w:r>
+        <w:rPr>
+          <w:b/>
+          <w:bCs/>
+        </w:rPr>
+        <w:t xml:space="preserve">[K-5]</w:t>
+      </w:r>
+      <w:r>
+        <w:t xml:space="preserve">). Delete/Backspace löschen nur ein ausgewähltes Maß und nie eine Wand oder während einer Texteingabe. Anlegen, Ändern, Verschieben und Löschen sind jeweils ein Rückgängig-Schritt (</w:t>
+      </w:r>
+      <w:r>
+        <w:rPr>
+          <w:b/>
+          <w:bCs/>
+        </w:rPr>
+        <w:t xml:space="preserve">[K-10]</w:t>
+      </w:r>
+      <w:r>
+        <w:t xml:space="preserve">). Längenmaß (</w:t>
       </w:r>
       <w:r>
         <w:rPr>
@@ -18546,27 +18585,7 @@
         <w:t xml:space="preserve">[K-7]</w:t>
       </w:r>
       <w:r>
-        <w:t xml:space="preserve">) und Rückgängig (</w:t>
-      </w:r>
-      <w:r>
-        <w:rPr>
-          <w:b/>
-          <w:bCs/>
-        </w:rPr>
-        <w:t xml:space="preserve">[K-10]</w:t>
-      </w:r>
-      <w:r>
-        <w:t xml:space="preserve">) unverändert greifen. Zusätzlich lässt sich die dargestellte Maßzahl verschieben: das optionale Feld text_mm der Bemaßung ist ausschließlich ihre Beschriftungsposition, verschiebt weder Maßlinie noch Bezugspunkt, ändert keinen Maßwert und geht nicht in den Löser ein (</w:t>
-      </w:r>
-      <w:r>
-        <w:rPr>
-          <w:b/>
-          <w:bCs/>
-        </w:rPr>
-        <w:t xml:space="preserve">[K-5]</w:t>
-      </w:r>
-      <w:r>
-        <w:t xml:space="preserve">); fehlt es, gilt unverändert die automatisch berechnete Stelle. Auch das begründet keine neue Regel und keinen Schema- oder Formatversionsbump – das Feld war im Datenmodell bereits vorgesehen und im Bestand nie gesetzt.</w:t>
+        <w:t xml:space="preserve">), Fixieren und alle Formatversionen bleiben unverändert.</w:t>
       </w:r>
     </w:p>
     <w:sectPr>

</xml_diff>

<commit_message>
feat: Kalibrierung direkt im Geschossplan (#52)
</commit_message>
<xml_diff>
--- a/doku/SEMBLA_Handbuch.docx
+++ b/doku/SEMBLA_Handbuch.docx
@@ -16381,7 +16381,97 @@
         <w:t xml:space="preserve">[P-9]</w:t>
       </w:r>
       <w:r>
-        <w:t xml:space="preserve">). Ein Planwechsel, eine Neukalibrierung oder ein Versatz ändert </w:t>
+        <w:t xml:space="preserve">). Davon zu unterscheiden ist der </w:t>
+      </w:r>
+      <w:r>
+        <w:rPr>
+          <w:b/>
+          <w:bCs/>
+        </w:rPr>
+        <w:t xml:space="preserve">vorläufige Anzeigefaktor</w:t>
+      </w:r>
+      <w:r>
+        <w:t xml:space="preserve"> (Issue #52): damit ein noch nicht kalibrierter Plan überhaupt sichtbar ist und sich eine Kalibrierlinie in ihn hineinklicken lässt, wird er mit dem festen, deterministischen Faktor </w:t>
+      </w:r>
+      <w:r>
+        <w:rPr>
+          <w:b/>
+          <w:bCs/>
+        </w:rPr>
+        <w:t xml:space="preserve">1 Bildpixel = 1 mm</w:t>
+      </w:r>
+      <w:r>
+        <w:t xml:space="preserve"> unter die Zeichnung gelegt. Dieser Faktor ist </w:t>
+      </w:r>
+      <w:r>
+        <w:rPr>
+          <w:b/>
+          <w:bCs/>
+        </w:rPr>
+        <w:t xml:space="preserve">kein Maßstab</w:t>
+      </w:r>
+      <w:r>
+        <w:t xml:space="preserve">: er wird </w:t>
+      </w:r>
+      <w:r>
+        <w:rPr>
+          <w:b/>
+          <w:bCs/>
+        </w:rPr>
+        <w:t xml:space="preserve">nie gespeichert</w:t>
+      </w:r>
+      <w:r>
+        <w:t xml:space="preserve">, geht in </w:t>
+      </w:r>
+      <w:r>
+        <w:rPr>
+          <w:b/>
+          <w:bCs/>
+        </w:rPr>
+        <w:t xml:space="preserve">keine</w:t>
+      </w:r>
+      <w:r>
+        <w:t xml:space="preserve"> Wandlage, </w:t>
+      </w:r>
+      <w:r>
+        <w:rPr>
+          <w:b/>
+          <w:bCs/>
+        </w:rPr>
+        <w:t xml:space="preserve">keine</w:t>
+      </w:r>
+      <w:r>
+        <w:t xml:space="preserve"> Länge und </w:t>
+      </w:r>
+      <w:r>
+        <w:rPr>
+          <w:b/>
+          <w:bCs/>
+        </w:rPr>
+        <w:t xml:space="preserve">keine</w:t>
+      </w:r>
+      <w:r>
+        <w:t xml:space="preserve"> Bemaßung ein, das 125-mm-Raster bleibt so lange </w:t>
+      </w:r>
+      <w:r>
+        <w:rPr>
+          <w:b/>
+          <w:bCs/>
+        </w:rPr>
+        <w:t xml:space="preserve">ausgeblendet</w:t>
+      </w:r>
+      <w:r>
+        <w:t xml:space="preserve">, und der Zustand „nicht kalibriert“ wird in der Oberfläche </w:t>
+      </w:r>
+      <w:r>
+        <w:rPr>
+          <w:b/>
+          <w:bCs/>
+        </w:rPr>
+        <w:t xml:space="preserve">benannt</w:t>
+      </w:r>
+      <w:r>
+        <w:t xml:space="preserve">. Ein Maßstab entsteht ausschließlich durch die beiden ausdrücklichen Wege – Kalibrierlinie oder Zahleneingabe. Ein Planwechsel, eine Neukalibrierung oder ein Versatz ändert </w:t>
       </w:r>
       <w:r>
         <w:rPr>
@@ -16968,6 +17058,55 @@
     </w:p>
     <w:p>
       <w:pPr>
+        <w:pBdr>
+          <w:left w:val="single" w:color="E0B400" w:sz="18" w:space="6"/>
+        </w:pBdr>
+        <w:shd w:fill="FFF8E6" w:val="clear"/>
+        <w:spacing w:after="120" w:before="80"/>
+      </w:pPr>
+      <w:r>
+        <w:rPr>
+          <w:b/>
+          <w:bCs/>
+        </w:rPr>
+        <w:t xml:space="preserve">Bedienung von Maßstab und Rasterfang (Issue #52):</w:t>
+      </w:r>
+      <w:r>
+        <w:t xml:space="preserve"> Der Maßstab eines Geschossplans wird </w:t>
+      </w:r>
+      <w:r>
+        <w:rPr>
+          <w:b/>
+          <w:bCs/>
+        </w:rPr>
+        <w:t xml:space="preserve">auf der Zeichenfläche</w:t>
+      </w:r>
+      <w:r>
+        <w:t xml:space="preserve"> festgelegt, nicht in einem eigenen Fenster. Gestartet wird der Modus im linken Panel mit „Maßstab aus Plan übernehmen“; dort stehen auch die reale Länge, „Übernehmen“, „Punkte verwerfen“ und „Abbrechen“. Angeklickt werden zwei Punkte im Plan, der zweite orthogonal gezwungen, dargestellt als gestrichelte Messhilfe mit Kreuzmarkern. Zoom, Mausrad, Verschieben und „Alles zeigen“ bleiben während der Punktwahl nutzbar, weil die Punkte sofort als Bildpunkte geführt werden. Ein noch nicht kalibrierter Plan liegt dafür mit dem vorläufigen Anzeigefaktor aus [L-9] als Hintergrund unter der Zeichnung, ohne 125-mm-Raster und sichtbar als „nicht kalibriert“ benannt. Nach der Übernahme wird der Blick einmal auf den vollständigen Inhalt gesetzt. Abbrechen und Escape schreiben nichts. Das Verschieben des Plans bleibt bis zur Kalibrierung gesperrt; die Zahleneingabe „mm je Bildpixel“ bleibt der gleichwertige zweite Weg. Der </w:t>
+      </w:r>
+      <w:r>
+        <w:rPr>
+          <w:b/>
+          <w:bCs/>
+        </w:rPr>
+        <w:t xml:space="preserve">Rasterfang</w:t>
+      </w:r>
+      <w:r>
+        <w:t xml:space="preserve"> ist ein einziger allgemeiner Schalter unter „Ansicht“, gilt für alle Wände beim Zeichnen, Verschieben und Größenziehen, startet </w:t>
+      </w:r>
+      <w:r>
+        <w:rPr>
+          <w:b/>
+          <w:bCs/>
+        </w:rPr>
+        <w:t xml:space="preserve">aus</w:t>
+      </w:r>
+      <w:r>
+        <w:t xml:space="preserve"> und wird nicht gespeichert; die Wandlänge bleibt davon unberührt im 125-mm-Raster.</w:t>
+      </w:r>
+    </w:p>
+    <w:p>
+      <w:pPr>
         <w:pStyle w:val="ListParagraph"/>
         <w:numPr>
           <w:ilvl w:val="0"/>
@@ -18585,7 +18724,107 @@
         <w:t xml:space="preserve">[K-7]</w:t>
       </w:r>
       <w:r>
-        <w:t xml:space="preserve">), Fixieren und alle Formatversionen bleiben unverändert.</w:t>
+        <w:t xml:space="preserve">), Fixieren und alle Formatversionen bleiben unverändert. Mit Issue #52 (Bearbeitung 2026-08-10) folgten zwei weitere reine Bedienkorrekturen desselben Editors. Erstens entstand der Maßstab bis dahin in einem modalen Kalibriereditor mit eigener Bildpixelansicht, festem Zoom, ohne Mausrad und ohne Verschieben – an einem realen Grundriss war damit kein Anschlag sauber zu treffen, und jeder Ablesefehler ging unmittelbar in den Maßstab ein. Kalibriert wird jetzt </w:t>
+      </w:r>
+      <w:r>
+        <w:rPr>
+          <w:b/>
+          <w:bCs/>
+        </w:rPr>
+        <w:t xml:space="preserve">auf der Zeichenfläche selbst</w:t>
+      </w:r>
+      <w:r>
+        <w:t xml:space="preserve">, mit deren Zoom, Mausrad, Verschieben und „Alles zeigen“; gestartet wird der Modus im linken Panel („Maßstab aus Plan übernehmen“), die reale Länge und Übernehmen/Abbrechen bleiben dort. Die beiden gesetzten Punkte werden sofort in </w:t>
+      </w:r>
+      <w:r>
+        <w:rPr>
+          <w:b/>
+          <w:bCs/>
+        </w:rPr>
+        <w:t xml:space="preserve">Bildpunkte</w:t>
+      </w:r>
+      <w:r>
+        <w:t xml:space="preserve"> umgerechnet, das Ergebnis ist deshalb vom Blick unabhängig; der zweite Punkt bleibt orthogonal gezwungen, gezeichnet wird weiter die gestrichelte Messhilfe mit Kreuzmarkern. Damit das möglich ist, liegt ein unkalibrierter Plan mit dem vorläufigen Anzeigefaktor aus </w:t>
+      </w:r>
+      <w:r>
+        <w:rPr>
+          <w:b/>
+          <w:bCs/>
+        </w:rPr>
+        <w:t xml:space="preserve">[L-9]</w:t>
+      </w:r>
+      <w:r>
+        <w:t xml:space="preserve"> als Hintergrund unter der Zeichnung – ohne 125-mm-Raster und sichtbar als „nicht kalibriert“ benannt. Geschrieben wird ausschließlich `mm_je_pixel` über denselben Weg wie die gleichwertige Zahleneingabe; Abbrechen und Escape schreiben nichts, Wandlagen (</w:t>
+      </w:r>
+      <w:r>
+        <w:rPr>
+          <w:b/>
+          <w:bCs/>
+        </w:rPr>
+        <w:t xml:space="preserve">[L-1]</w:t>
+      </w:r>
+      <w:r>
+        <w:t xml:space="preserve">) und Rückgängig (</w:t>
+      </w:r>
+      <w:r>
+        <w:rPr>
+          <w:b/>
+          <w:bCs/>
+        </w:rPr>
+        <w:t xml:space="preserve">[K-10]</w:t>
+      </w:r>
+      <w:r>
+        <w:t xml:space="preserve">) bleiben unberührt, und das Verschieben des Plans bleibt bis zur Kalibrierung gesperrt. Zweitens ist der </w:t>
+      </w:r>
+      <w:r>
+        <w:rPr>
+          <w:b/>
+          <w:bCs/>
+        </w:rPr>
+        <w:t xml:space="preserve">Rasterfang</w:t>
+      </w:r>
+      <w:r>
+        <w:t xml:space="preserve"> ein einziger allgemeiner Schalter für alle Wände und alle drei Wandoperationen – Zeichnen, Verschieben, Größenziehen – und startet </w:t>
+      </w:r>
+      <w:r>
+        <w:rPr>
+          <w:b/>
+          <w:bCs/>
+        </w:rPr>
+        <w:t xml:space="preserve">aus</w:t>
+      </w:r>
+      <w:r>
+        <w:t xml:space="preserve">; er wird nicht gespeichert. Ausgeschaltet rasten Positionen weiterhin auf halbe Millimeter (</w:t>
+      </w:r>
+      <w:r>
+        <w:rPr>
+          <w:b/>
+          <w:bCs/>
+        </w:rPr>
+        <w:t xml:space="preserve">[L-1]</w:t>
+      </w:r>
+      <w:r>
+        <w:t xml:space="preserve">) und Maßwerte bleiben ganzzahlig (</w:t>
+      </w:r>
+      <w:r>
+        <w:rPr>
+          <w:b/>
+          <w:bCs/>
+        </w:rPr>
+        <w:t xml:space="preserve">[K-12]</w:t>
+      </w:r>
+      <w:r>
+        <w:t xml:space="preserve">), die </w:t>
+      </w:r>
+      <w:r>
+        <w:rPr>
+          <w:b/>
+          <w:bCs/>
+        </w:rPr>
+        <w:t xml:space="preserve">Länge</w:t>
+      </w:r>
+      <w:r>
+        <w:t xml:space="preserve"> bleibt unverändert an das 125-mm-Raster gebunden – sie ist keine Ansichtsoption. Auch #52 ändert keine Regel dieses Kapitels und bringt keinen Schema- oder Formatversionsbump.</w:t>
       </w:r>
     </w:p>
     <w:sectPr>

</xml_diff>

<commit_message>
feat(modul0): kompakte CAD-Oberfläche im Geschossplan (#53)
</commit_message>
<xml_diff>
--- a/doku/SEMBLA_Handbuch.docx
+++ b/doku/SEMBLA_Handbuch.docx
@@ -18564,7 +18564,7 @@
         <w:t xml:space="preserve">[L-9]</w:t>
       </w:r>
       <w:r>
-        <w:t xml:space="preserve">). Mit Etappe C4c (2026-08-08) kamen die Bedienzugaben hinzu – eine schwebende Bauteilliste mit Kurzbeschreibung und beidseitig synchroner Auswahl, das unmittelbar darunterliegende Geschoss als blasse, nicht anklickbare Umrisse mit einstellbarer Deckkraft sowie zwei Bedienkorrekturen (Doppelklick auf die dargestellte Maßzahl öffnet denselben Maßeditor; die Beschriftungen der Zeichenfläche sind nicht mehr als Text markierbar). Auch das berührt keine Regel dieses Kapitels: die Umrisse des Referenzgeschosses gehen in keine Auswahl, keine Kollisionsprüfung (</w:t>
+        <w:t xml:space="preserve">). Mit Etappe C4c (2026-08-08) kamen die Bedienzugaben hinzu – eine schwebende Bauteilliste mit Kurzbeschreibung und beidseitig synchroner Auswahl, das unmittelbar darunterliegende Geschoss als blasse, nicht anklickbare Umrisse mit einstellbarer Deckkraft sowie zwei Bedienkorrekturen (Doppelklick auf die dargestellte Maßzahl öffnet denselben Maßeditor; die Beschriftungen der Zeichenfläche sind nicht mehr als Text markierbar). Auch das berührt keine Regel dieses Kapitels: die Umrisse des Referenzgeschosses gingen in keine Auswahl, keine Kollisionsprüfung (</w:t>
       </w:r>
       <w:r>
         <w:rPr>
@@ -18574,7 +18574,7 @@
         <w:t xml:space="preserve">[K-13]</w:t>
       </w:r>
       <w:r>
-        <w:t xml:space="preserve">) und keine Bemaßung ein, ihre Sichtbarkeit wird nicht gespeichert (</w:t>
+        <w:t xml:space="preserve">) und keine Bemaßung ein, ihre Sichtbarkeit wurde nicht gespeichert (</w:t>
       </w:r>
       <w:r>
         <w:rPr>
@@ -18594,7 +18594,7 @@
         <w:t xml:space="preserve">[K-3]</w:t>
       </w:r>
       <w:r>
-        <w:t xml:space="preserve">). Offen ist allein die Etappe C5 (Mappen-ZIP), die ebenfalls keine Regel dieses Kapitels berührt. Mit Issue #50, Paket 1 (Bearbeitung 2026-08-09) kam eine reine Bedienbereinigung hinzu: der linke Abschnitt „Neue Wand“ des Layout-Editors ist entfallen, weil er neben dem grafischen Werkzeug „Wand zeichnen“ einen zweiten, formularartigen Anlegeweg vortäuschte; seine tatsächlich benötigten Angaben – Zeichenziel, Standard-Wandhöhe (</w:t>
+        <w:t xml:space="preserve">). Das Referenzgeschoss ist mit Issue #53 wieder ersatzlos entfallen (s. u.). Offen ist allein die Etappe C5 (Mappen-ZIP), die ebenfalls keine Regel dieses Kapitels berührt. Mit Issue #50, Paket 1 (Bearbeitung 2026-08-09) kam eine reine Bedienbereinigung hinzu: der linke Abschnitt „Neue Wand“ des Layout-Editors ist entfallen, weil er neben dem grafischen Werkzeug „Wand zeichnen“ einen zweiten, formularartigen Anlegeweg vortäuschte; seine tatsächlich benötigten Angaben – Zeichenziel, Standard-Wandhöhe (</w:t>
       </w:r>
       <w:r>
         <w:rPr>
@@ -18734,7 +18734,7 @@
         <w:t xml:space="preserve">auf der Zeichenfläche selbst</w:t>
       </w:r>
       <w:r>
-        <w:t xml:space="preserve">, mit deren Zoom, Mausrad, Verschieben und „Alles zeigen“; gestartet wird der Modus im linken Panel („Maßstab aus Plan übernehmen“), die reale Länge und Übernehmen/Abbrechen bleiben dort. Die beiden gesetzten Punkte werden sofort in </w:t>
+        <w:t xml:space="preserve">, mit deren Zoom, Mausrad, Verschieben und „Alles zeigen“; gestartet wird der Modus mit „Maßstab aus Plan übernehmen“, die reale Länge und Übernehmen/Abbrechen bleiben in der zugehörigen Bedienfläche (seit Issue #53 die Planverwaltung des Editors). Die beiden gesetzten Punkte werden sofort in </w:t>
       </w:r>
       <w:r>
         <w:rPr>
@@ -18824,7 +18824,57 @@
         <w:t xml:space="preserve">Länge</w:t>
       </w:r>
       <w:r>
-        <w:t xml:space="preserve"> bleibt unverändert an das 125-mm-Raster gebunden – sie ist keine Ansichtsoption. Auch #52 ändert keine Regel dieses Kapitels und bringt keinen Schema- oder Formatversionsbump.</w:t>
+        <w:t xml:space="preserve"> bleibt unverändert an das 125-mm-Raster gebunden – sie ist keine Ansichtsoption. Auch #52 ändert keine Regel dieses Kapitels und bringt keinen Schema- oder Formatversionsbump. Mit Issue #53, Paket 3 (Bearbeitung 2026-08-10) wurde schließlich die Bedienoberfläche desselben Editors umgebaut, ohne eine einzige Regel dieses Kapitels zu berühren. Das linke Panel ist ersatzlos entfallen; die Zeichenfläche nimmt die volle Breite, darüber schweben eine obere Werkzeugleiste (Auswählen, Wand zeichnen, Bemaßen, Fixieren, dazu Rückgängig/Wiederholen und Drehen), eine untere Ansichtsleiste (Zoom, Rasterfang, Raster und Bemaßungen als reine Anzeigeschalter, Zugang zur Planverwaltung), die bestehende Wandliste rechts und die Planverwaltung als Blatt von unten. Der Geschossplan wird seither ausschließlich dort verwaltet – hochladen, ersetzen, entfernen, kalibrieren, Maßstab, Versatz und Plan verschieben liegen an einer Stelle, und es gibt damit genau einen Uploadweg; Modul 0 zeigt nur noch an, ob ein Plan hinterlegt ist. Während der Kalibrierpunktwahl verkleinert sich das Blatt auf Status und Abbruch, damit die Bühne vollständig bedienbar bleibt. Die beiden neuen Anzeigeschalter für Raster und Bemaßungen ändern weder Datenmodell noch Geometrie noch Löserergebnis (</w:t>
+      </w:r>
+      <w:r>
+        <w:rPr>
+          <w:b/>
+          <w:bCs/>
+        </w:rPr>
+        <w:t xml:space="preserve">[K-5]</w:t>
+      </w:r>
+      <w:r>
+        <w:t xml:space="preserve">) und werden nicht gespeichert (</w:t>
+      </w:r>
+      <w:r>
+        <w:rPr>
+          <w:b/>
+          <w:bCs/>
+        </w:rPr>
+        <w:t xml:space="preserve">[K-10]</w:t>
+      </w:r>
+      <w:r>
+        <w:t xml:space="preserve">); ein ausgeblendetes Maß bleibt vollständig wirksam, ist aber auch nicht anklickbar, und in den Werkzeugen Bemaßen und Fixieren werden Maße sichtbar gehalten. Das Referenzgeschoss ist samt Schaltern und zweitem Löserlauf entfernt. Neu ist eine einzige fachliche Verschärfung der Bedienung: eine Wand wird nicht mehr gedreht, sobald eine Bemaßung unmittelbar an ihr hängt – gleich ob gewöhnliches Maß, Fixierung (</w:t>
+      </w:r>
+      <w:r>
+        <w:rPr>
+          <w:b/>
+          <w:bCs/>
+        </w:rPr>
+        <w:t xml:space="preserve">[K-4]</w:t>
+      </w:r>
+      <w:r>
+        <w:t xml:space="preserve">) oder Längenmaß (</w:t>
+      </w:r>
+      <w:r>
+        <w:rPr>
+          <w:b/>
+          <w:bCs/>
+        </w:rPr>
+        <w:t xml:space="preserve">[K-11]</w:t>
+      </w:r>
+      <w:r>
+        <w:t xml:space="preserve">) –, weil Drehen die Achsen der Wand tauscht und den Bezug des Maßes hintergehen würde; die bisherige Sperre für mittelbar bestimmte Wände (</w:t>
+      </w:r>
+      <w:r>
+        <w:rPr>
+          <w:b/>
+          <w:bCs/>
+        </w:rPr>
+        <w:t xml:space="preserve">[K-9]</w:t>
+      </w:r>
+      <w:r>
+        <w:t xml:space="preserve">) bleibt daneben bestehen und wird getrennt begründet. Weder Löser noch Bemaßungsmathematik, Fixiersemantik, Formatversionen oder Schemastand ändern sich dadurch.</w:t>
       </w:r>
     </w:p>
     <w:sectPr>

</xml_diff>

<commit_message>
feat(modul9): Lageplan-Vorschau und Geschossexport (#54)
</commit_message>
<xml_diff>
--- a/doku/SEMBLA_Handbuch.docx
+++ b/doku/SEMBLA_Handbuch.docx
@@ -18875,6 +18875,878 @@
       </w:r>
       <w:r>
         <w:t xml:space="preserve">) bleibt daneben bestehen und wird getrennt begründet. Weder Löser noch Bemaßungsmathematik, Fixiersemantik, Formatversionen oder Schemastand ändern sich dadurch.</w:t>
+      </w:r>
+    </w:p>
+    <w:p>
+      <w:pPr>
+        <w:pStyle w:val="Heading2"/>
+      </w:pPr>
+      <w:r>
+        <w:t xml:space="preserve">16.11 Lageplan des Geschosses (Modul 9)  [N]</w:t>
+      </w:r>
+    </w:p>
+    <w:p>
+      <w:pPr>
+        <w:spacing w:after="140"/>
+      </w:pPr>
+      <w:r>
+        <w:rPr>
+          <w:color w:val="33414F"/>
+          <w:sz w:val="24"/>
+          <w:szCs w:val="24"/>
+        </w:rPr>
+        <w:t xml:space="preserve">Grundlage ist Issue #54 (Bearbeitung 2026-08-10). Der im Geschossplaner erzeugte Wandgrundriss wird als eigene, prüf- und druckbare Projektunterlage ausgegeben: eine technische 2D-Draufsicht des Geschosses mit Wandkennzeichnung, den vorhandenen treibenden Bemaßungen, Maßstab, Legende, Wandtabelle, Vollständigkeitsvermerk und Schriftfeld. Die Richtungsentscheidung lautet ausdrücklich: eigenes Modul, keine zweite Bearbeitungsansicht. Damit steht dieses Kapitel neben – nicht über – Kapitel 16.9 (Projektstruktur, [L]) und 16.10 (Layout-Editor, [K]): [N] regelt allein die AUSGABE und darf die dortigen Regeln weder ändern noch umgehen. Bei Konflikt gilt die Rangfolge Sicherheit/Baubarkeit, dann [L]/[K] als Datenhoheit, dann [N] als Darstellung; eine Darstellungsregel setzt sich niemals gegen eine Datenregel durch.</w:t>
+      </w:r>
+    </w:p>
+    <w:p>
+      <w:pPr>
+        <w:pStyle w:val="ListParagraph"/>
+        <w:numPr>
+          <w:ilvl w:val="0"/>
+          <w:numId w:val="2"/>
+        </w:numPr>
+        <w:spacing w:after="60"/>
+      </w:pPr>
+      <w:r>
+        <w:rPr>
+          <w:b/>
+          <w:bCs/>
+        </w:rPr>
+        <w:t xml:space="preserve">[N-1 · MUSS]</w:t>
+      </w:r>
+      <w:r>
+        <w:t xml:space="preserve"> </w:t>
+      </w:r>
+      <w:r>
+        <w:rPr>
+          <w:b/>
+          <w:bCs/>
+        </w:rPr>
+        <w:t xml:space="preserve">Eigenes Modul, eine Bearbeitung.</w:t>
+      </w:r>
+      <w:r>
+        <w:t xml:space="preserve"> Der Lageplan ist eine eigene Seite mit eigenem Navigationseintrag (Modul 9). Der </w:t>
+      </w:r>
+      <w:r>
+        <w:rPr>
+          <w:b/>
+          <w:bCs/>
+        </w:rPr>
+        <w:t xml:space="preserve">Geschossplaner bleibt der einzige Ort</w:t>
+      </w:r>
+      <w:r>
+        <w:t xml:space="preserve">, an dem Wände, Lagen und Bemaßungen entstehen oder sich ändern; das Ausgabemodul führt </w:t>
+      </w:r>
+      <w:r>
+        <w:rPr>
+          <w:b/>
+          <w:bCs/>
+        </w:rPr>
+        <w:t xml:space="preserve">kein</w:t>
+      </w:r>
+      <w:r>
+        <w:t xml:space="preserve"> Zeichen-, Auswahl- oder Bearbeitungswerkzeug, keinen Schreibweg und keine zweite Verortungsmöglichkeit. Die Modulnummern bleiben an die GitHub-Issues gebunden und werden </w:t>
+      </w:r>
+      <w:r>
+        <w:rPr>
+          <w:b/>
+          <w:bCs/>
+        </w:rPr>
+        <w:t xml:space="preserve">nie umnummeriert</w:t>
+      </w:r>
+      <w:r>
+        <w:t xml:space="preserve">; die Reihe wächst additiv.</w:t>
+      </w:r>
+    </w:p>
+    <w:p>
+      <w:pPr>
+        <w:pStyle w:val="ListParagraph"/>
+        <w:numPr>
+          <w:ilvl w:val="0"/>
+          <w:numId w:val="2"/>
+        </w:numPr>
+        <w:spacing w:after="60"/>
+      </w:pPr>
+      <w:r>
+        <w:rPr>
+          <w:b/>
+          <w:bCs/>
+        </w:rPr>
+        <w:t xml:space="preserve">[N-2 · MUSS]</w:t>
+      </w:r>
+      <w:r>
+        <w:t xml:space="preserve"> </w:t>
+      </w:r>
+      <w:r>
+        <w:rPr>
+          <w:b/>
+          <w:bCs/>
+        </w:rPr>
+        <w:t xml:space="preserve">Der Blattbezug ist ausdrücklich und maßgeblich.</w:t>
+      </w:r>
+      <w:r>
+        <w:t xml:space="preserve"> Projekt und Geschoss sind im Modul </w:t>
+      </w:r>
+      <w:r>
+        <w:rPr>
+          <w:b/>
+          <w:bCs/>
+        </w:rPr>
+        <w:t xml:space="preserve">eindeutig wählbar</w:t>
+      </w:r>
+      <w:r>
+        <w:t xml:space="preserve">; Vorschau </w:t>
+      </w:r>
+      <w:r>
+        <w:rPr>
+          <w:b/>
+          <w:bCs/>
+        </w:rPr>
+        <w:t xml:space="preserve">und</w:t>
+      </w:r>
+      <w:r>
+        <w:t xml:space="preserve"> Export folgen genau dieser Auswahl, und sie steht sichtbar am Blatt. Vorbelegt wird aus dem aktiven Pfad, doch die Auswahl setzt </w:t>
+      </w:r>
+      <w:r>
+        <w:rPr>
+          <w:b/>
+          <w:bCs/>
+        </w:rPr>
+        <w:t xml:space="preserve">keinen</w:t>
+      </w:r>
+      <w:r>
+        <w:t xml:space="preserve"> aktiven Zeiger (</w:t>
+      </w:r>
+      <w:r>
+        <w:rPr>
+          <w:b/>
+          <w:bCs/>
+        </w:rPr>
+        <w:t xml:space="preserve">[L-10]</w:t>
+      </w:r>
+      <w:r>
+        <w:t xml:space="preserve">): ein fremdes Geschoss lässt sich ausgeben, ohne den Arbeitskontext zu verschieben. Umgekehrt wird ein selbst gewählter Blattbezug nicht still von einem Zeigerwechsel in einem anderen Modul überschrieben.</w:t>
+      </w:r>
+    </w:p>
+    <w:p>
+      <w:pPr>
+        <w:pStyle w:val="ListParagraph"/>
+        <w:numPr>
+          <w:ilvl w:val="0"/>
+          <w:numId w:val="2"/>
+        </w:numPr>
+        <w:spacing w:after="60"/>
+      </w:pPr>
+      <w:r>
+        <w:rPr>
+          <w:b/>
+          <w:bCs/>
+        </w:rPr>
+        <w:t xml:space="preserve">[N-3 · MUSS]</w:t>
+      </w:r>
+      <w:r>
+        <w:t xml:space="preserve"> </w:t>
+      </w:r>
+      <w:r>
+        <w:rPr>
+          <w:b/>
+          <w:bCs/>
+        </w:rPr>
+        <w:t xml:space="preserve">Frische Ableitung, keine zweite Lagehaltung.</w:t>
+      </w:r>
+      <w:r>
+        <w:t xml:space="preserve"> Jede Ausgabe entsteht neu aus der gewählten Projektmappe, dem gewählten Geschoss und dem kanonischen Löserergebnis (</w:t>
+      </w:r>
+      <w:r>
+        <w:rPr>
+          <w:b/>
+          <w:bCs/>
+        </w:rPr>
+        <w:t xml:space="preserve">[K-5]</w:t>
+      </w:r>
+      <w:r>
+        <w:t xml:space="preserve">). Es gibt </w:t>
+      </w:r>
+      <w:r>
+        <w:rPr>
+          <w:b/>
+          <w:bCs/>
+        </w:rPr>
+        <w:t xml:space="preserve">keine</w:t>
+      </w:r>
+      <w:r>
+        <w:t xml:space="preserve"> Schattenwerte aus der Anzeige, </w:t>
+      </w:r>
+      <w:r>
+        <w:rPr>
+          <w:b/>
+          <w:bCs/>
+        </w:rPr>
+        <w:t xml:space="preserve">keinen</w:t>
+      </w:r>
+      <w:r>
+        <w:t xml:space="preserve"> Zwischenstand, </w:t>
+      </w:r>
+      <w:r>
+        <w:rPr>
+          <w:b/>
+          <w:bCs/>
+        </w:rPr>
+        <w:t xml:space="preserve">keine</w:t>
+      </w:r>
+      <w:r>
+        <w:t xml:space="preserve"> Kopie von Lage, Länge, Höhe oder Wandtyp und </w:t>
+      </w:r>
+      <w:r>
+        <w:rPr>
+          <w:b/>
+          <w:bCs/>
+        </w:rPr>
+        <w:t xml:space="preserve">keine</w:t>
+      </w:r>
+      <w:r>
+        <w:t xml:space="preserve"> Ableitung aus der Bearbeitungsoberfläche. Höhe und Wandtyp kommen aus dem Wandelement (</w:t>
+      </w:r>
+      <w:r>
+        <w:rPr>
+          <w:b/>
+          <w:bCs/>
+        </w:rPr>
+        <w:t xml:space="preserve">[P-1]</w:t>
+      </w:r>
+      <w:r>
+        <w:t xml:space="preserve">), Struktur, Lage und Maße aus der Mappe (</w:t>
+      </w:r>
+      <w:r>
+        <w:rPr>
+          <w:b/>
+          <w:bCs/>
+        </w:rPr>
+        <w:t xml:space="preserve">[K-10]</w:t>
+      </w:r>
+      <w:r>
+        <w:t xml:space="preserve">).</w:t>
+      </w:r>
+    </w:p>
+    <w:p>
+      <w:pPr>
+        <w:pStyle w:val="ListParagraph"/>
+        <w:numPr>
+          <w:ilvl w:val="0"/>
+          <w:numId w:val="2"/>
+        </w:numPr>
+        <w:spacing w:after="60"/>
+      </w:pPr>
+      <w:r>
+        <w:rPr>
+          <w:b/>
+          <w:bCs/>
+        </w:rPr>
+        <w:t xml:space="preserve">[N-4 · MUSS]</w:t>
+      </w:r>
+      <w:r>
+        <w:t xml:space="preserve"> </w:t>
+      </w:r>
+      <w:r>
+        <w:rPr>
+          <w:b/>
+          <w:bCs/>
+        </w:rPr>
+        <w:t xml:space="preserve">Gelöste Positionen schlagen gespeicherte Rohpositionen.</w:t>
+      </w:r>
+      <w:r>
+        <w:t xml:space="preserve"> Wo Bemaßungen die Lage bestimmen, wird die </w:t>
+      </w:r>
+      <w:r>
+        <w:rPr>
+          <w:b/>
+          <w:bCs/>
+        </w:rPr>
+        <w:t xml:space="preserve">gelöste</w:t>
+      </w:r>
+      <w:r>
+        <w:t xml:space="preserve"> Position gezeichnet; `lage.start_mm` bleibt der letzte gültige gespeicherte Stand und wird </w:t>
+      </w:r>
+      <w:r>
+        <w:rPr>
+          <w:b/>
+          <w:bCs/>
+        </w:rPr>
+        <w:t xml:space="preserve">nie</w:t>
+      </w:r>
+      <w:r>
+        <w:t xml:space="preserve"> zurückgeschrieben. Ein Ausgabelauf verändert grundsätzlich keine Daten.</w:t>
+      </w:r>
+    </w:p>
+    <w:p>
+      <w:pPr>
+        <w:pStyle w:val="ListParagraph"/>
+        <w:numPr>
+          <w:ilvl w:val="0"/>
+          <w:numId w:val="2"/>
+        </w:numPr>
+        <w:spacing w:after="60"/>
+      </w:pPr>
+      <w:r>
+        <w:rPr>
+          <w:b/>
+          <w:bCs/>
+        </w:rPr>
+        <w:t xml:space="preserve">[N-5 · MUSS]</w:t>
+      </w:r>
+      <w:r>
+        <w:t xml:space="preserve"> </w:t>
+      </w:r>
+      <w:r>
+        <w:rPr>
+          <w:b/>
+          <w:bCs/>
+        </w:rPr>
+        <w:t xml:space="preserve">Maße stehen exakt wie im Editor.</w:t>
+      </w:r>
+      <w:r>
+        <w:t xml:space="preserve"> Dargestellt werden </w:t>
+      </w:r>
+      <w:r>
+        <w:rPr>
+          <w:b/>
+          <w:bCs/>
+        </w:rPr>
+        <w:t xml:space="preserve">alle</w:t>
+      </w:r>
+      <w:r>
+        <w:t xml:space="preserve"> vorhandenen treibenden Bemaßungen des Geschosses mit </w:t>
+      </w:r>
+      <w:r>
+        <w:rPr>
+          <w:b/>
+          <w:bCs/>
+        </w:rPr>
+        <w:t xml:space="preserve">identischen Bezügen, identischen Werten</w:t>
+      </w:r>
+      <w:r>
+        <w:t xml:space="preserve"> und den </w:t>
+      </w:r>
+      <w:r>
+        <w:rPr>
+          <w:b/>
+          <w:bCs/>
+        </w:rPr>
+        <w:t xml:space="preserve">gespeicherten Darstellungspositionen</w:t>
+      </w:r>
+      <w:r>
+        <w:t xml:space="preserve"> `linie_mm` (verschiebt die ganze Maßdarstellung quer) und `text_mm` (verschiebt allein die Zahl), samt gleicher, reihenfolgetreuer Staffelung. Es wird </w:t>
+      </w:r>
+      <w:r>
+        <w:rPr>
+          <w:b/>
+          <w:bCs/>
+        </w:rPr>
+        <w:t xml:space="preserve">nichts</w:t>
+      </w:r>
+      <w:r>
+        <w:t xml:space="preserve"> neu angeordnet, verschoben, gerundet, weggelassen oder geraten. Um das technisch zu erzwingen, liegt die Weltgeometrie der Maßdarstellung in </w:t>
+      </w:r>
+      <w:r>
+        <w:rPr>
+          <w:b/>
+          <w:bCs/>
+        </w:rPr>
+        <w:t xml:space="preserve">einem</w:t>
+      </w:r>
+      <w:r>
+        <w:t xml:space="preserve"> gemeinsamen, DOM-freien Baustein, den Editor und Blatt gleichrangig benutzen; eine zweite, nachgebaute Zeichenrechnung ist unzulässig. Die Bearbeitungsoberfläche wird dadurch </w:t>
+      </w:r>
+      <w:r>
+        <w:rPr>
+          <w:b/>
+          <w:bCs/>
+        </w:rPr>
+        <w:t xml:space="preserve">nicht</w:t>
+      </w:r>
+      <w:r>
+        <w:t xml:space="preserve"> zur Ausgabequelle. Die Darstellungsfelder erreichen den Löser nie (</w:t>
+      </w:r>
+      <w:r>
+        <w:rPr>
+          <w:b/>
+          <w:bCs/>
+        </w:rPr>
+        <w:t xml:space="preserve">[K-5]</w:t>
+      </w:r>
+      <w:r>
+        <w:t xml:space="preserve">).</w:t>
+      </w:r>
+    </w:p>
+    <w:p>
+      <w:pPr>
+        <w:pStyle w:val="ListParagraph"/>
+        <w:numPr>
+          <w:ilvl w:val="0"/>
+          <w:numId w:val="2"/>
+        </w:numPr>
+        <w:spacing w:after="60"/>
+      </w:pPr>
+      <w:r>
+        <w:rPr>
+          <w:b/>
+          <w:bCs/>
+        </w:rPr>
+        <w:t xml:space="preserve">[N-6 · MUSS]</w:t>
+      </w:r>
+      <w:r>
+        <w:t xml:space="preserve"> </w:t>
+      </w:r>
+      <w:r>
+        <w:rPr>
+          <w:b/>
+          <w:bCs/>
+        </w:rPr>
+        <w:t xml:space="preserve">Ein Schriftfeld, eine Quelle.</w:t>
+      </w:r>
+      <w:r>
+        <w:t xml:space="preserve"> Die Projekt-Kopfdaten des Schriftfelds kommen ausschließlich aus `mappe.projekt.kopfdaten` (</w:t>
+      </w:r>
+      <w:r>
+        <w:rPr>
+          <w:b/>
+          <w:bCs/>
+        </w:rPr>
+        <w:t xml:space="preserve">[L-11]</w:t>
+      </w:r>
+      <w:r>
+        <w:t xml:space="preserve">), ergänzt um Projekt-, Gebäude- und Geschossbezug aus der Struktur. Der wandbezogene Altbestand `eingaben.projekt` wird </w:t>
+      </w:r>
+      <w:r>
+        <w:rPr>
+          <w:b/>
+          <w:bCs/>
+        </w:rPr>
+        <w:t xml:space="preserve">nicht</w:t>
+      </w:r>
+      <w:r>
+        <w:t xml:space="preserve"> herangezogen und </w:t>
+      </w:r>
+      <w:r>
+        <w:rPr>
+          <w:b/>
+          <w:bCs/>
+        </w:rPr>
+        <w:t xml:space="preserve">nie</w:t>
+      </w:r>
+      <w:r>
+        <w:t xml:space="preserve"> zusammengeführt – ein Lageplan hat keine einzelne Wand, also auch keinen Rückfall. Ein fehlendes Feld bleibt </w:t>
+      </w:r>
+      <w:r>
+        <w:rPr>
+          <w:b/>
+          <w:bCs/>
+        </w:rPr>
+        <w:t xml:space="preserve">leer</w:t>
+      </w:r>
+      <w:r>
+        <w:t xml:space="preserve">, statt gefüllt zu werden.</w:t>
+      </w:r>
+    </w:p>
+    <w:p>
+      <w:pPr>
+        <w:pStyle w:val="ListParagraph"/>
+        <w:numPr>
+          <w:ilvl w:val="0"/>
+          <w:numId w:val="2"/>
+        </w:numPr>
+        <w:spacing w:after="60"/>
+      </w:pPr>
+      <w:r>
+        <w:rPr>
+          <w:b/>
+          <w:bCs/>
+        </w:rPr>
+        <w:t xml:space="preserve">[N-7 · MUSS]</w:t>
+      </w:r>
+      <w:r>
+        <w:t xml:space="preserve"> </w:t>
+      </w:r>
+      <w:r>
+        <w:rPr>
+          <w:b/>
+          <w:bCs/>
+        </w:rPr>
+        <w:t xml:space="preserve">Ein unvollständiger Stand wird nie als vollständig ausgegeben.</w:t>
+      </w:r>
+      <w:r>
+        <w:t xml:space="preserve"> Unverortete Wände, verwaiste Einträge ohne Wandelement (</w:t>
+      </w:r>
+      <w:r>
+        <w:rPr>
+          <w:b/>
+          <w:bCs/>
+        </w:rPr>
+        <w:t xml:space="preserve">[L-4]</w:t>
+      </w:r>
+      <w:r>
+        <w:t xml:space="preserve">), widersprüchliche Bemaßungen samt Differenz in Millimetern (</w:t>
+      </w:r>
+      <w:r>
+        <w:rPr>
+          <w:b/>
+          <w:bCs/>
+        </w:rPr>
+        <w:t xml:space="preserve">[K-6]</w:t>
+      </w:r>
+      <w:r>
+        <w:t xml:space="preserve">), Kollisionen samt Überlappungsmaß (</w:t>
+      </w:r>
+      <w:r>
+        <w:rPr>
+          <w:b/>
+          <w:bCs/>
+        </w:rPr>
+        <w:t xml:space="preserve">[K-13]</w:t>
+      </w:r>
+      <w:r>
+        <w:t xml:space="preserve">), ungültige Maße und Längenabweichungen zwischen gezeichneter Lage und Wandelement (</w:t>
+      </w:r>
+      <w:r>
+        <w:rPr>
+          <w:b/>
+          <w:bCs/>
+        </w:rPr>
+        <w:t xml:space="preserve">[L-3]</w:t>
+      </w:r>
+      <w:r>
+        <w:t xml:space="preserve">) werden </w:t>
+      </w:r>
+      <w:r>
+        <w:rPr>
+          <w:b/>
+          <w:bCs/>
+        </w:rPr>
+        <w:t xml:space="preserve">konkret und namentlich</w:t>
+      </w:r>
+      <w:r>
+        <w:t xml:space="preserve"> auf dem Blatt benannt, und das Blatt trägt einen sichtbaren Vollständigkeitsvermerk. Nichts davon wird stillschweigend korrigiert, weggelassen oder geschätzt. Eine verortete, aber unbemaßte Wand ist dagegen nach </w:t>
+      </w:r>
+      <w:r>
+        <w:rPr>
+          <w:b/>
+          <w:bCs/>
+        </w:rPr>
+        <w:t xml:space="preserve">[K-8]</w:t>
+      </w:r>
+      <w:r>
+        <w:t xml:space="preserve"> „frei“ – der Normalfall vor dem Bemaßen – und bleibt ein </w:t>
+      </w:r>
+      <w:r>
+        <w:rPr>
+          <w:b/>
+          <w:bCs/>
+        </w:rPr>
+        <w:t xml:space="preserve">Hinweis</w:t>
+      </w:r>
+      <w:r>
+        <w:t xml:space="preserve">, kein Mangel.</w:t>
+      </w:r>
+    </w:p>
+    <w:p>
+      <w:pPr>
+        <w:pStyle w:val="ListParagraph"/>
+        <w:numPr>
+          <w:ilvl w:val="0"/>
+          <w:numId w:val="2"/>
+        </w:numPr>
+        <w:spacing w:after="60"/>
+      </w:pPr>
+      <w:r>
+        <w:rPr>
+          <w:b/>
+          <w:bCs/>
+        </w:rPr>
+        <w:t xml:space="preserve">[N-8 · MUSS]</w:t>
+      </w:r>
+      <w:r>
+        <w:t xml:space="preserve"> </w:t>
+      </w:r>
+      <w:r>
+        <w:rPr>
+          <w:b/>
+          <w:bCs/>
+        </w:rPr>
+        <w:t xml:space="preserve">Genau ein Blatt je Geschoss, echter Maßstab, kein Beschneiden.</w:t>
+      </w:r>
+      <w:r>
+        <w:t xml:space="preserve"> Der Maßstab kommt aus der Bauzeichnungsreihe </w:t>
+      </w:r>
+      <w:r>
+        <w:rPr>
+          <w:b/>
+          <w:bCs/>
+        </w:rPr>
+        <w:t xml:space="preserve">1:50, 1:100, 1:200, 1:250, 1:500</w:t>
+      </w:r>
+      <w:r>
+        <w:t xml:space="preserve">; gewählt wird der größte, bei dem das Geschoss samt Bemaßungsrand ins nutzbare Zeichenfeld des Blattformats passt, und er wird angeschrieben. Ein Zwischenwert wird nicht erfunden. Passt ein Geschoss selbst bei 1:500 nicht, bleibt es bei 1:500, die Zeichnung bleibt </w:t>
+      </w:r>
+      <w:r>
+        <w:rPr>
+          <w:b/>
+          <w:bCs/>
+        </w:rPr>
+        <w:t xml:space="preserve">vollständig</w:t>
+      </w:r>
+      <w:r>
+        <w:t xml:space="preserve">, und das Blatt sagt sichtbar, dass es zu groß und der Ausdruck insoweit nicht maßstabsgetreu ist: </w:t>
+      </w:r>
+      <w:r>
+        <w:rPr>
+          <w:b/>
+          <w:bCs/>
+        </w:rPr>
+        <w:t xml:space="preserve">beschnitten oder auf mehrere Blätter gekachelt wird nicht</w:t>
+      </w:r>
+      <w:r>
+        <w:t xml:space="preserve">.</w:t>
+      </w:r>
+    </w:p>
+    <w:p>
+      <w:pPr>
+        <w:pBdr>
+          <w:left w:val="single" w:color="E0B400" w:sz="18" w:space="6"/>
+        </w:pBdr>
+        <w:shd w:fill="FFF8E6" w:val="clear"/>
+        <w:spacing w:after="120" w:before="80"/>
+      </w:pPr>
+      <w:r>
+        <w:rPr>
+          <w:b/>
+          <w:bCs/>
+        </w:rPr>
+        <w:t xml:space="preserve">Ausgabe und Umfang (Issue #54, Umsetzungsstand 2026-08-10).</w:t>
+      </w:r>
+      <w:r>
+        <w:t xml:space="preserve"> Vorschau und Export laufen durch </w:t>
+      </w:r>
+      <w:r>
+        <w:rPr>
+          <w:b/>
+          <w:bCs/>
+        </w:rPr>
+        <w:t xml:space="preserve">dieselbe</w:t>
+      </w:r>
+      <w:r>
+        <w:t xml:space="preserve"> DOM-freie Zeichenableitung – der Export ist nur deren Verpackung – und liefern ein selbsttragendes, druckbares HTML-Blatt sowie eine eigenständige, maßstabsgetreue SVG-Datei; ein PDF entsteht über den Browserdruck („Als PDF speichern“). Die </w:t>
+      </w:r>
+      <w:r>
+        <w:rPr>
+          <w:b/>
+          <w:bCs/>
+        </w:rPr>
+        <w:t xml:space="preserve">Export-Schaltfläche liegt allein in Modul 9</w:t>
+      </w:r>
+      <w:r>
+        <w:t xml:space="preserve">; der zentrale Export in Modul 0 bleibt im ersten Umfang ausdrücklich unbeteiligt und unverändert. Wandkennungen stimmen mit allen anderen Ausgaben überein, weil dieselbe stabile Kennung der Mappe und des Wandspeichers verwendet wird (</w:t>
+      </w:r>
+      <w:r>
+        <w:rPr>
+          <w:b/>
+          <w:bCs/>
+        </w:rPr>
+        <w:t xml:space="preserve">[L-4]</w:t>
+      </w:r>
+      <w:r>
+        <w:t xml:space="preserve">). Nicht Bestandteil dieses Umfangs sind: Bearbeitung von Wänden, Bemaßungen oder Planbildern, ein Weg über den zentralen Modul-0-Export, IFC/BIM, Planerkennung, Einkaufs-, Bestell- oder Verschnittplanung sowie </w:t>
+      </w:r>
+      <w:r>
+        <w:rPr>
+          <w:b/>
+          <w:bCs/>
+        </w:rPr>
+        <w:t xml:space="preserve">jede neue Datenstruktur</w:t>
+      </w:r>
+      <w:r>
+        <w:t xml:space="preserve"> – die Darstellungsoptionen des Moduls sind bewusst flüchtig, es gibt keinen neuen Speicherbereich und keinen Schema- oder Formatversionsbump. Das </w:t>
+      </w:r>
+      <w:r>
+        <w:rPr>
+          <w:b/>
+          <w:bCs/>
+        </w:rPr>
+        <w:t xml:space="preserve">Planbild</w:t>
+      </w:r>
+      <w:r>
+        <w:t xml:space="preserve"> des Geschosses erscheint nicht im Blatt: es ist Hintergrund der Verortung und keine Datenquelle (</w:t>
+      </w:r>
+      <w:r>
+        <w:rPr>
+          <w:b/>
+          <w:bCs/>
+        </w:rPr>
+        <w:t xml:space="preserve">[L-9]</w:t>
+      </w:r>
+      <w:r>
+        <w:t xml:space="preserve">), und ein unkalibriertes Rasterbild hätte in einer maßstäblichen Unterlage nichts zu suchen. Umgesetzt und regressionsgetestet mit Issue #54 (Logiktests der gemeinsamen Maßdarstellung und des Blattes, Smoke-Test über den echten Modul- und Exportpfad einschließlich der exportierten Bytes).</w:t>
+      </w:r>
+    </w:p>
+    <w:p>
+      <w:pPr>
+        <w:pBdr>
+          <w:left w:val="single" w:color="E0B400" w:sz="18" w:space="6"/>
+        </w:pBdr>
+        <w:shd w:fill="FFF8E6" w:val="clear"/>
+        <w:spacing w:after="120" w:before="80"/>
+      </w:pPr>
+      <w:r>
+        <w:t xml:space="preserve">Verhältnis zu Kapitel 16.10: Mit Issue #54 ist die Weltgeometrie der Maßdarstellung aus der Bedienoberfläche des Layout-Editors in einen gemeinsamen, DOM-freien Baustein gezogen worden, den Editor und Lageplan gleichrangig benutzen (</w:t>
+      </w:r>
+      <w:r>
+        <w:rPr>
+          <w:b/>
+          <w:bCs/>
+        </w:rPr>
+        <w:t xml:space="preserve">[N-5]</w:t>
+      </w:r>
+      <w:r>
+        <w:t xml:space="preserve">). Fachlich ändert das dort </w:t>
+      </w:r>
+      <w:r>
+        <w:rPr>
+          <w:b/>
+          <w:bCs/>
+        </w:rPr>
+        <w:t xml:space="preserve">nichts</w:t>
+      </w:r>
+      <w:r>
+        <w:t xml:space="preserve">: Bezüge (</w:t>
+      </w:r>
+      <w:r>
+        <w:rPr>
+          <w:b/>
+          <w:bCs/>
+        </w:rPr>
+        <w:t xml:space="preserve">[K-1]</w:t>
+      </w:r>
+      <w:r>
+        <w:t xml:space="preserve">, </w:t>
+      </w:r>
+      <w:r>
+        <w:rPr>
+          <w:b/>
+          <w:bCs/>
+        </w:rPr>
+        <w:t xml:space="preserve">[K-2]</w:t>
+      </w:r>
+      <w:r>
+        <w:t xml:space="preserve">), treibende Maße (</w:t>
+      </w:r>
+      <w:r>
+        <w:rPr>
+          <w:b/>
+          <w:bCs/>
+        </w:rPr>
+        <w:t xml:space="preserve">[K-3]</w:t>
+      </w:r>
+      <w:r>
+        <w:t xml:space="preserve">), Fixieren (</w:t>
+      </w:r>
+      <w:r>
+        <w:rPr>
+          <w:b/>
+          <w:bCs/>
+        </w:rPr>
+        <w:t xml:space="preserve">[K-4]</w:t>
+      </w:r>
+      <w:r>
+        <w:t xml:space="preserve">), Determinismus (</w:t>
+      </w:r>
+      <w:r>
+        <w:rPr>
+          <w:b/>
+          <w:bCs/>
+        </w:rPr>
+        <w:t xml:space="preserve">[K-5]</w:t>
+      </w:r>
+      <w:r>
+        <w:t xml:space="preserve">), Widerspruch (</w:t>
+      </w:r>
+      <w:r>
+        <w:rPr>
+          <w:b/>
+          <w:bCs/>
+        </w:rPr>
+        <w:t xml:space="preserve">[K-6]</w:t>
+      </w:r>
+      <w:r>
+        <w:t xml:space="preserve">), Redundanz (</w:t>
+      </w:r>
+      <w:r>
+        <w:rPr>
+          <w:b/>
+          <w:bCs/>
+        </w:rPr>
+        <w:t xml:space="preserve">[K-7]</w:t>
+      </w:r>
+      <w:r>
+        <w:t xml:space="preserve">), Zustandsfarben (</w:t>
+      </w:r>
+      <w:r>
+        <w:rPr>
+          <w:b/>
+          <w:bCs/>
+        </w:rPr>
+        <w:t xml:space="preserve">[K-8]</w:t>
+      </w:r>
+      <w:r>
+        <w:t xml:space="preserve">), Ziehen (</w:t>
+      </w:r>
+      <w:r>
+        <w:rPr>
+          <w:b/>
+          <w:bCs/>
+        </w:rPr>
+        <w:t xml:space="preserve">[K-9]</w:t>
+      </w:r>
+      <w:r>
+        <w:t xml:space="preserve">), Datenhoheit im Geschoss (</w:t>
+      </w:r>
+      <w:r>
+        <w:rPr>
+          <w:b/>
+          <w:bCs/>
+        </w:rPr>
+        <w:t xml:space="preserve">[K-10]</w:t>
+      </w:r>
+      <w:r>
+        <w:t xml:space="preserve">), Längenmaß (</w:t>
+      </w:r>
+      <w:r>
+        <w:rPr>
+          <w:b/>
+          <w:bCs/>
+        </w:rPr>
+        <w:t xml:space="preserve">[K-11]</w:t>
+      </w:r>
+      <w:r>
+        <w:t xml:space="preserve">), Millimetereingabe (</w:t>
+      </w:r>
+      <w:r>
+        <w:rPr>
+          <w:b/>
+          <w:bCs/>
+        </w:rPr>
+        <w:t xml:space="preserve">[K-12]</w:t>
+      </w:r>
+      <w:r>
+        <w:t xml:space="preserve">) und Kollisionsmeldung (</w:t>
+      </w:r>
+      <w:r>
+        <w:rPr>
+          <w:b/>
+          <w:bCs/>
+        </w:rPr>
+        <w:t xml:space="preserve">[K-13]</w:t>
+      </w:r>
+      <w:r>
+        <w:t xml:space="preserve">) gelten unverändert, ebenso Löser, Fixiersemantik und alle Formatversionen. Der Editor bleibt der einzige Ort der Bearbeitung; er liefert der Ausgabe nichts zu, sondern ruft denselben Baustein auf.</w:t>
       </w:r>
     </w:p>
     <w:sectPr>

</xml_diff>

<commit_message>
fix(modul7): Reststücke in Zeichnung korrekt darstellen (#15)
</commit_message>
<xml_diff>
--- a/doku/SEMBLA_Handbuch.docx
+++ b/doku/SEMBLA_Handbuch.docx
@@ -9095,7 +9095,7 @@
         <w:spacing w:after="120"/>
       </w:pPr>
       <w:r>
-        <w:t xml:space="preserve">Gezeichnet wird ausschließlich aus dem Wandelement: Steine nach Typ (i3/i2) mit optionaler Beschriftung, Öffnungen mit ihrer Art, die gestufte Wandkontur, Bodenblech und – bei oberem Blechanschluss – Kopfblech sowie je Spannachse die realen Stangenstücke mit Kopplungen, Verankerung sowie eigens gekennzeichneter Sonderlänge und eigens gekennzeichnetem Reststück des oberen Abschlusses ([D-4]/[Z-6]). Die Stückliste im Blatt kommt aus dem gemeinsamen Stücklisten-Baustein, die Stangenstöße aus derselben Ableitung wie die Montageanleitung – es gibt kein zweites Mengen- oder Stückmodell ([Z-3]).</w:t>
+        <w:t xml:space="preserve">Gezeichnet wird ausschließlich aus dem Wandelement: Steine nach Typ (i3/i2) mit optionaler Beschriftung, Öffnungen mit ihrer Art, die gestufte Wandkontur, Bodenblech und – bei oberem Blechanschluss – Kopfblech sowie je Spannachse die realen Stangenstücke mit Kopplungen, Verankerung sowie eigens gekennzeichneter Sonderlänge und eigens gekennzeichnetem Reststück des oberen Abschlusses ([D-4]/[Z-6]). Die Stückliste im Blatt kommt aus dem gemeinsamen Stücklisten-Baustein, die Stangenstücke und ihre Stöße aus derselben Ableitung wie Wandansicht und Montageanleitung – es gibt kein zweites Mengen- oder Stückmodell ([Z-3]). Zuschnittkonflikte des Rechenkerns ([Z-5]/[Z-6]) stehen als eigener Mangelblock auf dem Blatt.</w:t>
       </w:r>
     </w:p>
     <w:p>
@@ -14111,7 +14111,97 @@
         <w:t xml:space="preserve">kein</w:t>
       </w:r>
       <w:r>
-        <w:t xml:space="preserve"> Baubarkeitsausschluss: Mengen und Geometrie bleiben unverändert. In der Stückliste ist das Reststück eine </w:t>
+        <w:t xml:space="preserve"> Baubarkeitsausschluss: Mengen und Geometrie bleiben unverändert. Gemeldet wird er in </w:t>
+      </w:r>
+      <w:r>
+        <w:rPr>
+          <w:b/>
+          <w:bCs/>
+        </w:rPr>
+        <w:t xml:space="preserve">jeder</w:t>
+      </w:r>
+      <w:r>
+        <w:t xml:space="preserve"> Ausgabe, die den Zuschnitt zeigt oder bemengt – Wandansicht, Baugruppenbilder, Zeichnungsblatt und zentraler Export –, und nicht nur im erzeugenden Modul; ein </w:t>
+      </w:r>
+      <w:r>
+        <w:rPr>
+          <w:b/>
+          <w:bCs/>
+        </w:rPr>
+        <w:t xml:space="preserve">stilles „–“</w:t>
+      </w:r>
+      <w:r>
+        <w:t xml:space="preserve"> ist unzulässig, weil es sich wie „nicht erforderlich“ liest. Bleibt die Zerlegung eines Segments dabei </w:t>
+      </w:r>
+      <w:r>
+        <w:rPr>
+          <w:b/>
+          <w:bCs/>
+        </w:rPr>
+        <w:t xml:space="preserve">unbestimmt</w:t>
+      </w:r>
+      <w:r>
+        <w:t xml:space="preserve"> (leere Stückliste des Segments), so hat dieses Segment </w:t>
+      </w:r>
+      <w:r>
+        <w:rPr>
+          <w:b/>
+          <w:bCs/>
+        </w:rPr>
+        <w:t xml:space="preserve">keine</w:t>
+      </w:r>
+      <w:r>
+        <w:t xml:space="preserve"> Stange, </w:t>
+      </w:r>
+      <w:r>
+        <w:rPr>
+          <w:b/>
+          <w:bCs/>
+        </w:rPr>
+        <w:t xml:space="preserve">keine</w:t>
+      </w:r>
+      <w:r>
+        <w:t xml:space="preserve"> Kopplung und </w:t>
+      </w:r>
+      <w:r>
+        <w:rPr>
+          <w:b/>
+          <w:bCs/>
+        </w:rPr>
+        <w:t xml:space="preserve">keinen</w:t>
+      </w:r>
+      <w:r>
+        <w:t xml:space="preserve"> Verschnitt: Zählungen dürfen nicht ins Negative laufen, und in der Stückliste entsteht </w:t>
+      </w:r>
+      <w:r>
+        <w:rPr>
+          <w:b/>
+          <w:bCs/>
+        </w:rPr>
+        <w:t xml:space="preserve">keine</w:t>
+      </w:r>
+      <w:r>
+        <w:t xml:space="preserve"> ersatzweise Position aus einem anderen Feld (</w:t>
+      </w:r>
+      <w:r>
+        <w:rPr>
+          <w:b/>
+          <w:bCs/>
+        </w:rPr>
+        <w:t xml:space="preserve">[P-6]</w:t>
+      </w:r>
+      <w:r>
+        <w:t xml:space="preserve">/</w:t>
+      </w:r>
+      <w:r>
+        <w:rPr>
+          <w:b/>
+          <w:bCs/>
+        </w:rPr>
+        <w:t xml:space="preserve">[P-9]</w:t>
+      </w:r>
+      <w:r>
+        <w:t xml:space="preserve">). In der Stückliste ist das Reststück eine </w:t>
       </w:r>
       <w:r>
         <w:rPr>
@@ -14786,7 +14876,87 @@
         <w:t xml:space="preserve">nicht erfunden</w:t>
       </w:r>
       <w:r>
-        <w:t xml:space="preserve">. Jede Ansicht, die stückweise zeichnet, erklärt den Schlüssel als </w:t>
+        <w:t xml:space="preserve">. Jedes Stück wird mit seiner </w:t>
+      </w:r>
+      <w:r>
+        <w:rPr>
+          <w:b/>
+          <w:bCs/>
+        </w:rPr>
+        <w:t xml:space="preserve">realen Materiallänge</w:t>
+      </w:r>
+      <w:r>
+        <w:t xml:space="preserve"> dargestellt: das Reststück des oberen Abschlusses reicht deshalb um den </w:t>
+      </w:r>
+      <w:r>
+        <w:rPr>
+          <w:b/>
+          <w:bCs/>
+        </w:rPr>
+        <w:t xml:space="preserve">Überstand [Z-6] über die Wandoberkante hinaus</w:t>
+      </w:r>
+      <w:r>
+        <w:t xml:space="preserve"> und wird </w:t>
+      </w:r>
+      <w:r>
+        <w:rPr>
+          <w:b/>
+          <w:bCs/>
+        </w:rPr>
+        <w:t xml:space="preserve">nicht</w:t>
+      </w:r>
+      <w:r>
+        <w:t xml:space="preserve"> auf die Oberkante gekappt – der Überstand ist eingebautes Material, und ein gekapptes Stück wäre je nach gewählter Länge zu kurz oder überhaupt nicht mehr sichtbar. Die Kopplungshöhen der Montageunterlage (Segmentende) und die </w:t>
+      </w:r>
+      <w:r>
+        <w:rPr>
+          <w:b/>
+          <w:bCs/>
+        </w:rPr>
+        <w:t xml:space="preserve">Zeichengeometrie</w:t>
+      </w:r>
+      <w:r>
+        <w:t xml:space="preserve"> der Stücke (Materialoberkante) sind daher </w:t>
+      </w:r>
+      <w:r>
+        <w:rPr>
+          <w:b/>
+          <w:bCs/>
+        </w:rPr>
+        <w:t xml:space="preserve">getrennte Ableitungen desselben</w:t>
+      </w:r>
+      <w:r>
+        <w:t xml:space="preserve"> Stücksatzes und liegen beide </w:t>
+      </w:r>
+      <w:r>
+        <w:rPr>
+          <w:b/>
+          <w:bCs/>
+        </w:rPr>
+        <w:t xml:space="preserve">genau einmal</w:t>
+      </w:r>
+      <w:r>
+        <w:t xml:space="preserve"> im gemeinsamen Baustein. Ist die Zerlegung eines Segments nicht bestimmt (gemeldeter Konflikt nach [Z-6]), wird für dieses Segment </w:t>
+      </w:r>
+      <w:r>
+        <w:rPr>
+          <w:b/>
+          <w:bCs/>
+        </w:rPr>
+        <w:t xml:space="preserve">nichts</w:t>
+      </w:r>
+      <w:r>
+        <w:t xml:space="preserve"> gezeichnet – </w:t>
+      </w:r>
+      <w:r>
+        <w:rPr>
+          <w:b/>
+          <w:bCs/>
+        </w:rPr>
+        <w:t xml:space="preserve">keine</w:t>
+      </w:r>
+      <w:r>
+        <w:t xml:space="preserve"> Ersatzstange –, und das Blatt benennt den Konflikt, statt einen unvollständigen Zuschnitt als vollständig auszugeben. Jede Ansicht, die stückweise zeichnet, erklärt den Schlüssel als </w:t>
       </w:r>
       <w:r>
         <w:rPr>

</xml_diff>

<commit_message>
feat(modul4): Baustellenstückliste mit Einbauteil-IDs (#22)
</commit_message>
<xml_diff>
--- a/doku/SEMBLA_Handbuch.docx
+++ b/doku/SEMBLA_Handbuch.docx
@@ -8894,7 +8894,7 @@
         <w:pStyle w:val="Heading1"/>
       </w:pPr>
       <w:r>
-        <w:t xml:space="preserve">10 · Modul 4 · Stückliste &amp; Kosten</w:t>
+        <w:t xml:space="preserve">10 · Modul 4 · Baustellenstückliste (Einbauteile)</w:t>
       </w:r>
     </w:p>
     <w:p>
@@ -8902,35 +8902,27 @@
         <w:spacing w:after="120"/>
       </w:pPr>
       <w:r>
-        <w:t xml:space="preserve">Zweck: Material-Auszug und Kosten für genau das aktive Wandelement. Kanonische Mengen stammen aus dem Wandelement/BOM und dem unter eingaben.aufbau gespeicherten Aufbau. Eine Mehrfachwand-Mengenlogik gibt es im MVP nicht.</w:t>
-      </w:r>
-    </w:p>
-    <w:p>
-      <w:pPr>
-        <w:spacing w:after="120"/>
-      </w:pPr>
-      <w:r>
-        <w:t xml:space="preserve">Preise sind hier </w:t>
-      </w:r>
-      <w:r>
-        <w:rPr>
-          <w:b/>
-          <w:bCs/>
-        </w:rPr>
-        <w:t xml:space="preserve">nicht editierbar</w:t>
-      </w:r>
-      <w:r>
-        <w:t xml:space="preserve">. Sie werden zu jeder Position frisch aus dem aktiven Bauteilkatalog aufgelöst – über die in Modul 1 bzw. Modul 2 gewählten Produkte je Verwendungsrolle ([P-13], [P-14]). Editierbar bleiben nur Projektname und Währung. Jede Position zeigt Produkt und Preisbasis oder – bei fehlender, mehrdeutiger, kategoriefremder, einheitenfremder oder maßfremder Zuordnung – den Grund im Klartext und </w:t>
-      </w:r>
-      <w:r>
-        <w:rPr>
-          <w:b/>
-          <w:bCs/>
-        </w:rPr>
-        <w:t xml:space="preserve">keinen</w:t>
-      </w:r>
-      <w:r>
-        <w:t xml:space="preserve"> Preis. Die Summe nennt in diesem Fall ausdrücklich, wie viele von wie vielen Positionen bepreist sind. Boden- und Kopfblech erscheinen als getrennte Positionen ([A-1]); die Dichtstreifen-Gesamtlänge in Metern ist nachrichtlich und wird nicht bepreist ([A-6]). Vorläufige, fachlich unbestätigte Katalogwerte werden je Position gekennzeichnet ([P-12]). Die frühere, im Modul gepflegte Preisliste (eingaben.kosten.preise) bleibt in Altprojekten erhalten, wird aber nicht mehr gelesen und nicht mehr geschrieben.</w:t>
+        <w:t xml:space="preserve">Zweck: die </w:t>
+      </w:r>
+      <w:r>
+        <w:rPr>
+          <w:b/>
+          <w:bCs/>
+        </w:rPr>
+        <w:t xml:space="preserve">real einzubauenden Teile</w:t>
+      </w:r>
+      <w:r>
+        <w:t xml:space="preserve"> genau des aktiven Wandelements in ihren </w:t>
+      </w:r>
+      <w:r>
+        <w:rPr>
+          <w:b/>
+          <w:bCs/>
+        </w:rPr>
+        <w:t xml:space="preserve">Fertigmaßen</w:t>
+      </w:r>
+      <w:r>
+        <w:t xml:space="preserve"> – eine Baustellen- und Vorfertigungsunterlage, keine Einkaufs- oder Bestellliste ([P-19]). Kanonische Mengen stammen ausschließlich aus dem Wandelement/BOM und werden bei jeder Ausgabe neu gerechnet. Eine Mehrfachwand- oder Projektmengenlogik gibt es hier nicht; die Gesamtstückliste über mehrere Wände ist eine eigene Ausgabe.</w:t>
       </w:r>
     </w:p>
     <w:p>
@@ -8947,10 +8939,30 @@
           <w:b/>
           <w:bCs/>
         </w:rPr>
-        <w:t xml:space="preserve">Positionen je Standardgröße ([Z-2]/[Z-4]):</w:t>
-      </w:r>
-      <w:r>
-        <w:t xml:space="preserve"> Werden mehrere Standardlängen kombiniert, entsteht je verwendeter Standardlänge und je Sonderzuschnitt-Ausgangsprodukt eine eigene Position mit eigenem maßgebendem Maß. Damit bleibt die Zuordnung nach [P-14] eindeutig und bepreisbar, obwohl mehrere Größen gleichzeitig eingebaut sind; die Einbaumenge ändert sich dadurch nicht – die Summe aller Stangenpositionen bleibt die Gesamtzahl des Rechenkerns. Ein Sonderzuschnitt wird über sein Ausgangsprodukt bepreist und nennt Fertigmaß und Herkunft in der Bezeichnung. Die vollständige Einbauteil-Kennzeichnung mit IDs bleibt der Baustellenstückliste vorbehalten.</w:t>
+        <w:t xml:space="preserve">Einbauteil-Kennzeichnung der Gewindestangenstücke ([P-19]):</w:t>
+      </w:r>
+      <w:r>
+        <w:t xml:space="preserve"> Jedes Stück trägt eine deterministische Einbauteil-ID nach dem Schema GS-k&lt;Spannachse&gt;.&lt;Segment von unten&gt;.&lt;Stück von unten&gt;, dazu Kategorie, Art (Standardteil / Sonderzuschnitt / Reststück), Fertigmaß und die Wandreferenz. Gleichartige Fertigteile stehen als </w:t>
+      </w:r>
+      <w:r>
+        <w:rPr>
+          <w:b/>
+          <w:bCs/>
+        </w:rPr>
+        <w:t xml:space="preserve">eine</w:t>
+      </w:r>
+      <w:r>
+        <w:t xml:space="preserve"> Zeile mit ihrer Menge; die Einzel-IDs bleiben in derselben Zeile vollständig aufgeführt und sind mit derselben Kennung im Zeichnungsblatt (Modul 7) wiederzufinden. Für Steine, Muttern, Bleche und Dichtstreifen wird </w:t>
+      </w:r>
+      <w:r>
+        <w:rPr>
+          <w:b/>
+          <w:bCs/>
+        </w:rPr>
+        <w:t xml:space="preserve">keine</w:t>
+      </w:r>
+      <w:r>
+        <w:t xml:space="preserve"> Einzel-ID erfunden – der Rechenkern kennt dort keine Einzelteil-Identität ([P-9]).</w:t>
       </w:r>
     </w:p>
     <w:p>
@@ -8967,10 +8979,128 @@
           <w:b/>
           <w:bCs/>
         </w:rPr>
+        <w:t xml:space="preserve">Keine Beplankungspositionen ([Z-4], [P-19]):</w:t>
+      </w:r>
+      <w:r>
+        <w:t xml:space="preserve"> Latten, Platten und die Modul-2-Verbinderrolle erscheinen in </w:t>
+      </w:r>
+      <w:r>
+        <w:rPr>
+          <w:b/>
+          <w:bCs/>
+        </w:rPr>
+        <w:t xml:space="preserve">keiner</w:t>
+      </w:r>
+      <w:r>
+        <w:t xml:space="preserve"> Stücklistenausgabe – nicht in der Anzeige und nicht in CSV oder HTML des zentralen Exports –, solange die Beplankung nicht neu aufgesetzt ist. Die </w:t>
+      </w:r>
+      <w:r>
+        <w:rPr>
+          <w:b/>
+          <w:bCs/>
+        </w:rPr>
+        <w:t xml:space="preserve">Gewindestangen-Kopplung</w:t>
+      </w:r>
+      <w:r>
+        <w:t xml:space="preserve"> ist davon unberührt: sie ist ein Vorspann-Einbauteil und kein Modul-2-Verbinder. Die eigenständige Latten-Zuschnittliste bleibt als Ausgabe von Modul 2 erhalten; sie ist keine Stückliste.</w:t>
+      </w:r>
+    </w:p>
+    <w:p>
+      <w:pPr>
+        <w:spacing w:after="120"/>
+      </w:pPr>
+      <w:r>
+        <w:t xml:space="preserve">Preise sind hier </w:t>
+      </w:r>
+      <w:r>
+        <w:rPr>
+          <w:b/>
+          <w:bCs/>
+        </w:rPr>
+        <w:t xml:space="preserve">nicht editierbar</w:t>
+      </w:r>
+      <w:r>
+        <w:t xml:space="preserve">, und die Baustellenstückliste führt </w:t>
+      </w:r>
+      <w:r>
+        <w:rPr>
+          <w:b/>
+          <w:bCs/>
+        </w:rPr>
+        <w:t xml:space="preserve">keine</w:t>
+      </w:r>
+      <w:r>
+        <w:t xml:space="preserve"> eigene Preisfunktion ein. Ein Einzelpreis wird – soweit für die verbleibenden Positionen vorhanden – zu jeder Position frisch aus dem aktiven Bauteilkatalog aufgelöst, über die in Modul 1 gewählten Produkte je Verwendungsrolle ([P-13], [P-14]). Editierbar bleiben nur Projektname und Währung. Jede Position zeigt Produkt und Preisbasis oder – bei fehlender, mehrdeutiger, kategoriefremder, einheitenfremder oder maßfremder Zuordnung – den Grund im Klartext und </w:t>
+      </w:r>
+      <w:r>
+        <w:rPr>
+          <w:b/>
+          <w:bCs/>
+        </w:rPr>
+        <w:t xml:space="preserve">keinen</w:t>
+      </w:r>
+      <w:r>
+        <w:t xml:space="preserve"> Preis. Die Summe nennt in diesem Fall ausdrücklich, wie viele von wie vielen Positionen bepreist sind. Boden- und Kopfblech erscheinen als getrennte Positionen ([A-1]); die Dichtstreifen-Gesamtlänge in Metern ist nachrichtlich und wird nicht bepreist ([A-6]). Vorläufige, fachlich unbestätigte Katalogwerte werden je Position gekennzeichnet ([P-12]). Die frühere, im Modul gepflegte Preisliste (eingaben.kosten.preise) bleibt in Altprojekten erhalten, wird aber nicht mehr gelesen und nicht mehr geschrieben.</w:t>
+      </w:r>
+    </w:p>
+    <w:p>
+      <w:pPr>
+        <w:pStyle w:val="ListParagraph"/>
+        <w:numPr>
+          <w:ilvl w:val="0"/>
+          <w:numId w:val="2"/>
+        </w:numPr>
+        <w:spacing w:after="60"/>
+      </w:pPr>
+      <w:r>
+        <w:rPr>
+          <w:b/>
+          <w:bCs/>
+        </w:rPr>
+        <w:t xml:space="preserve">Positionen je Standardgröße ([Z-2]/[Z-4]):</w:t>
+      </w:r>
+      <w:r>
+        <w:t xml:space="preserve"> Werden mehrere Standardlängen kombiniert, entsteht je verwendeter Standardlänge und je Sonderzuschnitt-Fertigmaß eine eigene Position mit eigenem maßgebendem Maß. Damit bleibt die Zuordnung nach [P-14] eindeutig und bepreisbar, obwohl mehrere Größen gleichzeitig eingebaut sind; die Einbaumenge ändert sich dadurch nicht – die Summe aller Stangenpositionen bleibt die Gesamtzahl des Rechenkerns. Ein Sonderzuschnitt nennt nur sein Fertigmaß und wird nicht bepreist ([P-18]); die zugehörigen Einbauteil-IDs stehen in derselben Zeile ([P-19]).</w:t>
+      </w:r>
+    </w:p>
+    <w:p>
+      <w:pPr>
+        <w:pStyle w:val="ListParagraph"/>
+        <w:numPr>
+          <w:ilvl w:val="0"/>
+          <w:numId w:val="2"/>
+        </w:numPr>
+        <w:spacing w:after="60"/>
+      </w:pPr>
+      <w:r>
+        <w:rPr>
+          <w:b/>
+          <w:bCs/>
+        </w:rPr>
         <w:t xml:space="preserve">Export:</w:t>
       </w:r>
       <w:r>
-        <w:t xml:space="preserve"> Stücklisten-/Zuschnittdateien werden ausschließlich über den zentralen ZIP-Export in Modul 0 erzeugt – mit derselben Preisauflösung wie die Anzeige, damit CSV und Bildschirm nie auseinanderlaufen. Die Latten-Zuschnittliste nennt je Einbaustück Fertigmaß, Ausgangsprodukt und Art (Standard/Sonderzuschnitt).</w:t>
+        <w:t xml:space="preserve"> Die Stücklistendateien werden ausschließlich über den zentralen ZIP-Export in Modul 0 erzeugt – mit derselben Ableitung und Preisauflösung wie die Anzeige, damit CSV und Bildschirm nie auseinanderlaufen. Es entstehen zwei Dateien aus </w:t>
+      </w:r>
+      <w:r>
+        <w:rPr>
+          <w:b/>
+          <w:bCs/>
+        </w:rPr>
+        <w:t xml:space="preserve">einer</w:t>
+      </w:r>
+      <w:r>
+        <w:t xml:space="preserve"> Ableitung: die aggregierte Baustellenstückliste und die Einzelteilliste der Gewindestangen mit ID, Art, Fertigmaß, Wandreferenz und Einbauort. Beide schreiben die Art mit </w:t>
+      </w:r>
+      <w:r>
+        <w:rPr>
+          <w:b/>
+          <w:bCs/>
+        </w:rPr>
+        <w:t xml:space="preserve">Symbol und Klartext</w:t>
+      </w:r>
+      <w:r>
+        <w:t xml:space="preserve">, weil eine Datei keine Farbe hat. Die Latten-Zuschnittliste ist eine getrennte Ausgabe von Modul 2 und Teil keiner Stückliste.</w:t>
       </w:r>
     </w:p>
     <w:p>
@@ -13335,27 +13465,6 @@
     </w:p>
     <w:p>
       <w:pPr>
-        <w:pStyle w:val="Heading2"/>
-      </w:pPr>
-      <w:r>
-        <w:t xml:space="preserve">16.7 Zuschnitt &amp; Kombination von Standardgrößen  [Z]</w:t>
-      </w:r>
-    </w:p>
-    <w:p>
-      <w:pPr>
-        <w:spacing w:after="140"/>
-      </w:pPr>
-      <w:r>
-        <w:rPr>
-          <w:color w:val="33414F"/>
-          <w:sz w:val="24"/>
-          <w:szCs w:val="24"/>
-        </w:rPr>
-        <w:t xml:space="preserve">Grundlage ist die verbindliche Festlegung aus dem Live-Feedback zu #35 in Verbindung mit den bereits bestätigten Zuschnittentscheidungen zu #19: Die ausgewählten Katalogprodukte sind kein „eines von mehreren“, sondern ein Vorratssatz an Standardgrößen, die tatsächlich kombiniert werden. Leitfall: eine benötigte Strecke von 170 cm wird bei gewählten Standardgrößen 100 cm und 50 cm zu 100 + 50 + 20 cm aufgeteilt, wobei die 20 cm ein gekennzeichneter Sonderzuschnitt sind.</w:t>
-      </w:r>
-    </w:p>
-    <w:p>
-      <w:pPr>
         <w:pStyle w:val="ListParagraph"/>
         <w:numPr>
           <w:ilvl w:val="0"/>
@@ -13368,7 +13477,7 @@
           <w:b/>
           <w:bCs/>
         </w:rPr>
-        <w:t xml:space="preserve">[Z-1 · MUSS]</w:t>
+        <w:t xml:space="preserve">[P-19 · MUSS]</w:t>
       </w:r>
       <w:r>
         <w:t xml:space="preserve"> </w:t>
@@ -13378,70 +13487,150 @@
           <w:b/>
           <w:bCs/>
         </w:rPr>
-        <w:t xml:space="preserve">Katalog ist alleinige Maßquelle.</w:t>
-      </w:r>
-      <w:r>
-        <w:t xml:space="preserve"> Ist für eine Verwendungsrolle ein Katalogprodukt gewählt, liefert </w:t>
-      </w:r>
-      <w:r>
-        <w:rPr>
-          <w:b/>
-          <w:bCs/>
-        </w:rPr>
-        <w:t xml:space="preserve">ausschließlich</w:t>
-      </w:r>
-      <w:r>
-        <w:t xml:space="preserve"> dieses Produkt seine Produktspezifikation: bei Gewindestangen die Standardlänge, bei Latten Querschnitt (Breite/Dicke) und Standardlänge. Modul 1 und Modul 2 dürfen daneben </w:t>
-      </w:r>
-      <w:r>
-        <w:rPr>
-          <w:b/>
-          <w:bCs/>
-        </w:rPr>
-        <w:t xml:space="preserve">keine zweite wirksame</w:t>
-      </w:r>
-      <w:r>
-        <w:t xml:space="preserve"> manuelle Produktlänge oder -breite führen: die betreffenden Eingabefelder sind dann </w:t>
-      </w:r>
-      <w:r>
-        <w:rPr>
-          <w:b/>
-          <w:bCs/>
-        </w:rPr>
-        <w:t xml:space="preserve">nicht editierbar</w:t>
-      </w:r>
-      <w:r>
-        <w:t xml:space="preserve"> und werden von der Berechnung </w:t>
-      </w:r>
-      <w:r>
-        <w:rPr>
-          <w:b/>
-          <w:bCs/>
-        </w:rPr>
-        <w:t xml:space="preserve">nicht gelesen</w:t>
-      </w:r>
-      <w:r>
-        <w:t xml:space="preserve"> – auch eine Manipulation des Feldwerts (DOM) bleibt wirkungslos. Ohne Produktauswahl gilt der </w:t>
-      </w:r>
-      <w:r>
-        <w:rPr>
-          <w:b/>
-          <w:bCs/>
-        </w:rPr>
-        <w:t xml:space="preserve">klar gekennzeichnete, rückwärtskompatible Fallback</w:t>
-      </w:r>
-      <w:r>
-        <w:t xml:space="preserve"> aus dem Altwert. Fehlende oder widersprüchliche Angaben (z. B. zwei Lattenprodukte mit unterschiedlicher Querschnittsbreite) werden </w:t>
-      </w:r>
-      <w:r>
-        <w:rPr>
-          <w:b/>
-          <w:bCs/>
-        </w:rPr>
-        <w:t xml:space="preserve">sichtbar gemeldet</w:t>
-      </w:r>
-      <w:r>
-        <w:t xml:space="preserve"> statt durch einen Default ersetzt (</w:t>
+        <w:t xml:space="preserve">Baustellenstückliste und Einbauteil-Identität.</w:t>
+      </w:r>
+      <w:r>
+        <w:t xml:space="preserve"> Die Stückliste einer Wand ist die </w:t>
+      </w:r>
+      <w:r>
+        <w:rPr>
+          <w:b/>
+          <w:bCs/>
+        </w:rPr>
+        <w:t xml:space="preserve">Baustellen- und Vorfertigungsunterlage</w:t>
+      </w:r>
+      <w:r>
+        <w:t xml:space="preserve">: sie nennt die </w:t>
+      </w:r>
+      <w:r>
+        <w:rPr>
+          <w:b/>
+          <w:bCs/>
+        </w:rPr>
+        <w:t xml:space="preserve">real einzubauenden Teile</w:t>
+      </w:r>
+      <w:r>
+        <w:t xml:space="preserve"> in ihren </w:t>
+      </w:r>
+      <w:r>
+        <w:rPr>
+          <w:b/>
+          <w:bCs/>
+        </w:rPr>
+        <w:t xml:space="preserve">Fertigmaßen</w:t>
+      </w:r>
+      <w:r>
+        <w:t xml:space="preserve"> und trägt diesen Zweck auch in ihrer Benennung – in der Oberfläche wie in jeder Datei. Jede ausgegebene Position </w:t>
+      </w:r>
+      <w:r>
+        <w:rPr>
+          <w:b/>
+          <w:bCs/>
+        </w:rPr>
+        <w:t xml:space="preserve">muss</w:t>
+      </w:r>
+      <w:r>
+        <w:t xml:space="preserve"> ein reales Einbauteil oder eine real gleichartige Gruppe solcher Teile sein; eine Position, die kein Bauteil bezeichnet, ist unzulässig. </w:t>
+      </w:r>
+      <w:r>
+        <w:rPr>
+          <w:b/>
+          <w:bCs/>
+        </w:rPr>
+        <w:t xml:space="preserve">Kanonisch ableitbare Gewindestangenstücke</w:t>
+      </w:r>
+      <w:r>
+        <w:t xml:space="preserve"> führen zusätzlich eine </w:t>
+      </w:r>
+      <w:r>
+        <w:rPr>
+          <w:b/>
+          <w:bCs/>
+        </w:rPr>
+        <w:t xml:space="preserve">Einbauteil-Identität</w:t>
+      </w:r>
+      <w:r>
+        <w:t xml:space="preserve">: eine </w:t>
+      </w:r>
+      <w:r>
+        <w:rPr>
+          <w:b/>
+          <w:bCs/>
+        </w:rPr>
+        <w:t xml:space="preserve">eindeutige, deterministische ID</w:t>
+      </w:r>
+      <w:r>
+        <w:t xml:space="preserve">, Kategorie, </w:t>
+      </w:r>
+      <w:r>
+        <w:rPr>
+          <w:b/>
+          <w:bCs/>
+        </w:rPr>
+        <w:t xml:space="preserve">Art</w:t>
+      </w:r>
+      <w:r>
+        <w:t xml:space="preserve"> (Standardteil, Sonderzuschnitt oder Reststück nach </w:t>
+      </w:r>
+      <w:r>
+        <w:rPr>
+          <w:b/>
+          <w:bCs/>
+        </w:rPr>
+        <w:t xml:space="preserve">[Z-6]</w:t>
+      </w:r>
+      <w:r>
+        <w:t xml:space="preserve">), </w:t>
+      </w:r>
+      <w:r>
+        <w:rPr>
+          <w:b/>
+          <w:bCs/>
+        </w:rPr>
+        <w:t xml:space="preserve">Fertigmaß</w:t>
+      </w:r>
+      <w:r>
+        <w:t xml:space="preserve"> und die </w:t>
+      </w:r>
+      <w:r>
+        <w:rPr>
+          <w:b/>
+          <w:bCs/>
+        </w:rPr>
+        <w:t xml:space="preserve">Wandreferenz</w:t>
+      </w:r>
+      <w:r>
+        <w:t xml:space="preserve">. Die ID wird </w:t>
+      </w:r>
+      <w:r>
+        <w:rPr>
+          <w:b/>
+          <w:bCs/>
+        </w:rPr>
+        <w:t xml:space="preserve">allein</w:t>
+      </w:r>
+      <w:r>
+        <w:t xml:space="preserve"> aus kanonischen Feldern des Wandelements gebildet – Spannachse, Segment von unten, Stück von unten – und ist damit am gezeichneten Blatt wiederzufinden; sie wird </w:t>
+      </w:r>
+      <w:r>
+        <w:rPr>
+          <w:b/>
+          <w:bCs/>
+        </w:rPr>
+        <w:t xml:space="preserve">nie</w:t>
+      </w:r>
+      <w:r>
+        <w:t xml:space="preserve"> gespeichert, sondern bei </w:t>
+      </w:r>
+      <w:r>
+        <w:rPr>
+          <w:b/>
+          <w:bCs/>
+        </w:rPr>
+        <w:t xml:space="preserve">jeder</w:t>
+      </w:r>
+      <w:r>
+        <w:t xml:space="preserve"> Ausgabe neu abgeleitet (</w:t>
       </w:r>
       <w:r>
         <w:rPr>
@@ -13451,7 +13640,107 @@
         <w:t xml:space="preserve">[P-6]</w:t>
       </w:r>
       <w:r>
-        <w:t xml:space="preserve">/</w:t>
+        <w:t xml:space="preserve">), und es gibt </w:t>
+      </w:r>
+      <w:r>
+        <w:rPr>
+          <w:b/>
+          <w:bCs/>
+        </w:rPr>
+        <w:t xml:space="preserve">genau ein</w:t>
+      </w:r>
+      <w:r>
+        <w:t xml:space="preserve"> Schema für Liste, Datei und Zeichnung (</w:t>
+      </w:r>
+      <w:r>
+        <w:rPr>
+          <w:b/>
+          <w:bCs/>
+        </w:rPr>
+        <w:t xml:space="preserve">[D-6]</w:t>
+      </w:r>
+      <w:r>
+        <w:t xml:space="preserve">). </w:t>
+      </w:r>
+      <w:r>
+        <w:rPr>
+          <w:b/>
+          <w:bCs/>
+        </w:rPr>
+        <w:t xml:space="preserve">Gleichartige Fertigteile werden aggregiert</w:t>
+      </w:r>
+      <w:r>
+        <w:t xml:space="preserve">, aber </w:t>
+      </w:r>
+      <w:r>
+        <w:rPr>
+          <w:b/>
+          <w:bCs/>
+        </w:rPr>
+        <w:t xml:space="preserve">nachvollziehbar</w:t>
+      </w:r>
+      <w:r>
+        <w:t xml:space="preserve">: die Menge einer Zeile ist die Anzahl ihrer Einzelteile, und deren IDs bleiben in derselben Zeile vollständig lesbar, damit jede Zeile bis auf das Einzelteil auflösbar bleibt und </w:t>
+      </w:r>
+      <w:r>
+        <w:rPr>
+          <w:b/>
+          <w:bCs/>
+        </w:rPr>
+        <w:t xml:space="preserve">dieselben</w:t>
+      </w:r>
+      <w:r>
+        <w:t xml:space="preserve"> IDs in technischer Zeichnung und Export erscheinen. Die Art wird </w:t>
+      </w:r>
+      <w:r>
+        <w:rPr>
+          <w:b/>
+          <w:bCs/>
+        </w:rPr>
+        <w:t xml:space="preserve">redundant</w:t>
+      </w:r>
+      <w:r>
+        <w:t xml:space="preserve"> gekennzeichnet – </w:t>
+      </w:r>
+      <w:r>
+        <w:rPr>
+          <w:b/>
+          <w:bCs/>
+        </w:rPr>
+        <w:t xml:space="preserve">Symbol und Klartext</w:t>
+      </w:r>
+      <w:r>
+        <w:t xml:space="preserve">, Farbe nur zusätzlich –, sodass Sonderzuschnitte auch im </w:t>
+      </w:r>
+      <w:r>
+        <w:rPr>
+          <w:b/>
+          <w:bCs/>
+        </w:rPr>
+        <w:t xml:space="preserve">Schwarz-Weiß-Druck</w:t>
+      </w:r>
+      <w:r>
+        <w:t xml:space="preserve"> und in einer Datei ohne Farbe zweifelsfrei erkennbar sind; mindestens ID und Fertiglänge stehen an jedem Sonderzuschnitt. Für Bauteile, für die der Rechenkern </w:t>
+      </w:r>
+      <w:r>
+        <w:rPr>
+          <w:b/>
+          <w:bCs/>
+        </w:rPr>
+        <w:t xml:space="preserve">keine</w:t>
+      </w:r>
+      <w:r>
+        <w:t xml:space="preserve"> Einzelteil-Identität führt (Steine, Muttern, Bleche, Dichtstreifen), wird </w:t>
+      </w:r>
+      <w:r>
+        <w:rPr>
+          <w:b/>
+          <w:bCs/>
+        </w:rPr>
+        <w:t xml:space="preserve">keine</w:t>
+      </w:r>
+      <w:r>
+        <w:t xml:space="preserve"> ID erfunden (</w:t>
       </w:r>
       <w:r>
         <w:rPr>
@@ -13461,17 +13750,70 @@
         <w:t xml:space="preserve">[P-9]</w:t>
       </w:r>
       <w:r>
-        <w:t xml:space="preserve">). Der Längensatz reist als Planungsparameter (prestress.rod_lengths_mm) im Wandelement mit; Preise, Produkt-IDs und Bezeichnungen bleiben davon weiterhin ausgeschlossen (</w:t>
-      </w:r>
-      <w:r>
-        <w:rPr>
-          <w:b/>
-          <w:bCs/>
-        </w:rPr>
-        <w:t xml:space="preserve">[P-13]</w:t>
-      </w:r>
-      <w:r>
-        <w:t xml:space="preserve">).</w:t>
+        <w:t xml:space="preserve">): sie bleiben reale Mengenpositionen mit Wandreferenz. </w:t>
+      </w:r>
+      <w:r>
+        <w:rPr>
+          <w:b/>
+          <w:bCs/>
+        </w:rPr>
+        <w:t xml:space="preserve">Nicht</w:t>
+      </w:r>
+      <w:r>
+        <w:t xml:space="preserve"> Gegenstand der Baustellenstückliste sind Bestellmengen, Handelslängen- und Halbzeugoptimierung, Verschnittrechnung, Lager- und Reststückverwaltung sowie jede Zuschnittplanung (</w:t>
+      </w:r>
+      <w:r>
+        <w:rPr>
+          <w:b/>
+          <w:bCs/>
+        </w:rPr>
+        <w:t xml:space="preserve">[P-18]</w:t>
+      </w:r>
+      <w:r>
+        <w:t xml:space="preserve">) – und ebenso keine Mengen über mehrere Wände hinweg.</w:t>
+      </w:r>
+    </w:p>
+    <w:p>
+      <w:pPr>
+        <w:pBdr>
+          <w:left w:val="single" w:color="E0B400" w:sz="18" w:space="6"/>
+        </w:pBdr>
+        <w:shd w:fill="FFF8E6" w:val="clear"/>
+        <w:spacing w:after="120" w:before="80"/>
+      </w:pPr>
+      <w:r>
+        <w:t xml:space="preserve">Herkunft [P-19]: Issue #22 mit der Scope-Entscheidung von Tibor vom 2026-08-11 (nur Gewindestangenstücke, Beplankung zurückgestellt). Zuvor war Modul 4 eine Mengenliste je Verwendungsrolle mit Kostenschwerpunkt: es gab keine Einbauteil-ID, keine Wandreferenz an der Zeile und keine Kennzeichnung des Sonderzuschnitts außer dem Wort in der Bezeichnung – auf der Baustelle war damit nicht entscheidbar, welches konkrete Stück wohin gehört. Zugleich standen Latten und Verbinder aus dem eingefrorenen Modul 2 in der Liste, obwohl deren Planung zurückgestellt ist. Die Identität wird bewusst </w:t>
+      </w:r>
+      <w:r>
+        <w:rPr>
+          <w:b/>
+          <w:bCs/>
+        </w:rPr>
+        <w:t xml:space="preserve">abgeleitet und nicht gespeichert</w:t>
+      </w:r>
+      <w:r>
+        <w:t xml:space="preserve">: eine gespeicherte ID wäre eine zweite Wahrheit neben dem Wandelement und würde bei jeder Neuberechnung der Wand veralten.</w:t>
+      </w:r>
+    </w:p>
+    <w:p>
+      <w:pPr>
+        <w:pStyle w:val="Heading2"/>
+      </w:pPr>
+      <w:r>
+        <w:t xml:space="preserve">16.7 Zuschnitt &amp; Kombination von Standardgrößen  [Z]</w:t>
+      </w:r>
+    </w:p>
+    <w:p>
+      <w:pPr>
+        <w:spacing w:after="140"/>
+      </w:pPr>
+      <w:r>
+        <w:rPr>
+          <w:color w:val="33414F"/>
+          <w:sz w:val="24"/>
+          <w:szCs w:val="24"/>
+        </w:rPr>
+        <w:t xml:space="preserve">Grundlage ist die verbindliche Festlegung aus dem Live-Feedback zu #35 in Verbindung mit den bereits bestätigten Zuschnittentscheidungen zu #19: Die ausgewählten Katalogprodukte sind kein „eines von mehreren“, sondern ein Vorratssatz an Standardgrößen, die tatsächlich kombiniert werden. Leitfall: eine benötigte Strecke von 170 cm wird bei gewählten Standardgrößen 100 cm und 50 cm zu 100 + 50 + 20 cm aufgeteilt, wobei die 20 cm ein gekennzeichneter Sonderzuschnitt sind.</w:t>
       </w:r>
     </w:p>
     <w:p>
@@ -13488,7 +13830,7 @@
           <w:b/>
           <w:bCs/>
         </w:rPr>
-        <w:t xml:space="preserve">[Z-2 · MUSS]</w:t>
+        <w:t xml:space="preserve">[Z-1 · MUSS]</w:t>
       </w:r>
       <w:r>
         <w:t xml:space="preserve"> </w:t>
@@ -13498,107 +13840,97 @@
           <w:b/>
           <w:bCs/>
         </w:rPr>
-        <w:t xml:space="preserve">Deterministische Kombination.</w:t>
-      </w:r>
-      <w:r>
-        <w:t xml:space="preserve"> Der Bedarf wird gedeckt, indem die </w:t>
-      </w:r>
-      <w:r>
-        <w:rPr>
-          <w:b/>
-          <w:bCs/>
-        </w:rPr>
-        <w:t xml:space="preserve">größte geeignete</w:t>
-      </w:r>
-      <w:r>
-        <w:t xml:space="preserve"> ausgewählte Standardgröße zuerst eingesetzt und mit </w:t>
-      </w:r>
-      <w:r>
-        <w:rPr>
-          <w:b/>
-          <w:bCs/>
-        </w:rPr>
-        <w:t xml:space="preserve">kleineren</w:t>
-      </w:r>
-      <w:r>
-        <w:t xml:space="preserve"> ausgewählten Größen aufgefüllt wird; das </w:t>
-      </w:r>
-      <w:r>
-        <w:rPr>
-          <w:b/>
-          <w:bCs/>
-        </w:rPr>
-        <w:t xml:space="preserve">verbleibende Fertigmaß</w:t>
-      </w:r>
-      <w:r>
-        <w:t xml:space="preserve"> ist ein </w:t>
-      </w:r>
-      <w:r>
-        <w:rPr>
-          <w:b/>
-          <w:bCs/>
-        </w:rPr>
-        <w:t xml:space="preserve">sichtbar gekennzeichneter Sonderzuschnitt</w:t>
-      </w:r>
-      <w:r>
-        <w:t xml:space="preserve"> aus dem </w:t>
-      </w:r>
-      <w:r>
-        <w:rPr>
-          <w:b/>
-          <w:bCs/>
-        </w:rPr>
-        <w:t xml:space="preserve">kleinsten geeigneten</w:t>
-      </w:r>
-      <w:r>
-        <w:t xml:space="preserve"> ausgewählten Ausgangsprodukt. Es gibt </w:t>
-      </w:r>
-      <w:r>
-        <w:rPr>
-          <w:b/>
-          <w:bCs/>
-        </w:rPr>
-        <w:t xml:space="preserve">keine Sägefuge/Schnittverlust</w:t>
-      </w:r>
-      <w:r>
-        <w:t xml:space="preserve">, </w:t>
-      </w:r>
-      <w:r>
-        <w:rPr>
-          <w:b/>
-          <w:bCs/>
-        </w:rPr>
-        <w:t xml:space="preserve">keine Reststück-Wiederverwendung</w:t>
-      </w:r>
-      <w:r>
-        <w:t xml:space="preserve"> und </w:t>
-      </w:r>
-      <w:r>
-        <w:rPr>
-          <w:b/>
-          <w:bCs/>
-        </w:rPr>
-        <w:t xml:space="preserve">keine Einkaufs-/Verschnittoptimierung</w:t>
-      </w:r>
-      <w:r>
-        <w:t xml:space="preserve">. Tie-Breaks sind deterministisch: Größen werden dedupliziert und absteigend geordnet, die Eingabereihenfolge ist ohne Wirkung; gleiche Eingaben liefern dieselbe Zuordnung. Der geometrische Bedarf wird dabei </w:t>
-      </w:r>
-      <w:r>
-        <w:rPr>
-          <w:b/>
-          <w:bCs/>
-        </w:rPr>
-        <w:t xml:space="preserve">nie verändert</w:t>
-      </w:r>
-      <w:r>
-        <w:t xml:space="preserve"> (</w:t>
-      </w:r>
-      <w:r>
-        <w:rPr>
-          <w:b/>
-          <w:bCs/>
-        </w:rPr>
-        <w:t xml:space="preserve">[P-14]</w:t>
+        <w:t xml:space="preserve">Katalog ist alleinige Maßquelle.</w:t>
+      </w:r>
+      <w:r>
+        <w:t xml:space="preserve"> Ist für eine Verwendungsrolle ein Katalogprodukt gewählt, liefert </w:t>
+      </w:r>
+      <w:r>
+        <w:rPr>
+          <w:b/>
+          <w:bCs/>
+        </w:rPr>
+        <w:t xml:space="preserve">ausschließlich</w:t>
+      </w:r>
+      <w:r>
+        <w:t xml:space="preserve"> dieses Produkt seine Produktspezifikation: bei Gewindestangen die Standardlänge, bei Latten Querschnitt (Breite/Dicke) und Standardlänge. Modul 1 und Modul 2 dürfen daneben </w:t>
+      </w:r>
+      <w:r>
+        <w:rPr>
+          <w:b/>
+          <w:bCs/>
+        </w:rPr>
+        <w:t xml:space="preserve">keine zweite wirksame</w:t>
+      </w:r>
+      <w:r>
+        <w:t xml:space="preserve"> manuelle Produktlänge oder -breite führen: die betreffenden Eingabefelder sind dann </w:t>
+      </w:r>
+      <w:r>
+        <w:rPr>
+          <w:b/>
+          <w:bCs/>
+        </w:rPr>
+        <w:t xml:space="preserve">nicht editierbar</w:t>
+      </w:r>
+      <w:r>
+        <w:t xml:space="preserve"> und werden von der Berechnung </w:t>
+      </w:r>
+      <w:r>
+        <w:rPr>
+          <w:b/>
+          <w:bCs/>
+        </w:rPr>
+        <w:t xml:space="preserve">nicht gelesen</w:t>
+      </w:r>
+      <w:r>
+        <w:t xml:space="preserve"> – auch eine Manipulation des Feldwerts (DOM) bleibt wirkungslos. Ohne Produktauswahl gilt der </w:t>
+      </w:r>
+      <w:r>
+        <w:rPr>
+          <w:b/>
+          <w:bCs/>
+        </w:rPr>
+        <w:t xml:space="preserve">klar gekennzeichnete, rückwärtskompatible Fallback</w:t>
+      </w:r>
+      <w:r>
+        <w:t xml:space="preserve"> aus dem Altwert. Fehlende oder widersprüchliche Angaben (z. B. zwei Lattenprodukte mit unterschiedlicher Querschnittsbreite) werden </w:t>
+      </w:r>
+      <w:r>
+        <w:rPr>
+          <w:b/>
+          <w:bCs/>
+        </w:rPr>
+        <w:t xml:space="preserve">sichtbar gemeldet</w:t>
+      </w:r>
+      <w:r>
+        <w:t xml:space="preserve"> statt durch einen Default ersetzt (</w:t>
+      </w:r>
+      <w:r>
+        <w:rPr>
+          <w:b/>
+          <w:bCs/>
+        </w:rPr>
+        <w:t xml:space="preserve">[P-6]</w:t>
+      </w:r>
+      <w:r>
+        <w:t xml:space="preserve">/</w:t>
+      </w:r>
+      <w:r>
+        <w:rPr>
+          <w:b/>
+          <w:bCs/>
+        </w:rPr>
+        <w:t xml:space="preserve">[P-9]</w:t>
+      </w:r>
+      <w:r>
+        <w:t xml:space="preserve">). Der Längensatz reist als Planungsparameter (prestress.rod_lengths_mm) im Wandelement mit; Preise, Produkt-IDs und Bezeichnungen bleiben davon weiterhin ausgeschlossen (</w:t>
+      </w:r>
+      <w:r>
+        <w:rPr>
+          <w:b/>
+          <w:bCs/>
+        </w:rPr>
+        <w:t xml:space="preserve">[P-13]</w:t>
       </w:r>
       <w:r>
         <w:t xml:space="preserve">).</w:t>
@@ -13618,7 +13950,7 @@
           <w:b/>
           <w:bCs/>
         </w:rPr>
-        <w:t xml:space="preserve">[Z-3]</w:t>
+        <w:t xml:space="preserve">[Z-2 · MUSS]</w:t>
       </w:r>
       <w:r>
         <w:t xml:space="preserve"> </w:t>
@@ -13628,50 +13960,110 @@
           <w:b/>
           <w:bCs/>
         </w:rPr>
-        <w:t xml:space="preserve">Gewindestangen.</w:t>
-      </w:r>
-      <w:r>
-        <w:t xml:space="preserve"> Die Stücke eines Vorspannsegments sind </w:t>
-      </w:r>
-      <w:r>
-        <w:rPr>
-          <w:b/>
-          <w:bCs/>
-        </w:rPr>
-        <w:t xml:space="preserve">echte Standardlängen</w:t>
-      </w:r>
-      <w:r>
-        <w:t xml:space="preserve"> plus höchstens </w:t>
-      </w:r>
-      <w:r>
-        <w:rPr>
-          <w:b/>
-          <w:bCs/>
-        </w:rPr>
-        <w:t xml:space="preserve">ein</w:t>
-      </w:r>
-      <w:r>
-        <w:t xml:space="preserve"> Sonderzuschnitt; ein Stoß ist eine Kopplung. Die so entstehende Stückliste je Segment ist die </w:t>
-      </w:r>
-      <w:r>
-        <w:rPr>
-          <w:b/>
-          <w:bCs/>
-        </w:rPr>
-        <w:t xml:space="preserve">kanonische Ableitung</w:t>
-      </w:r>
-      <w:r>
-        <w:t xml:space="preserve">: Stückzahl, Kopplungsanzahl, Kopplungshöhen der Montageunterlage und die Mengen der Stückliste lesen ausschließlich sie. Eine zweite Rechnung aus einer pauschalen Stangenlänge ist unzulässig (</w:t>
-      </w:r>
-      <w:r>
-        <w:rPr>
-          <w:b/>
-          <w:bCs/>
-        </w:rPr>
-        <w:t xml:space="preserve">[P-6]</w:t>
-      </w:r>
-      <w:r>
-        <w:t xml:space="preserve">); die Kopplungshöhen sind die Kumulativsummen der Stücke und daher nicht mehr zwingend gleichabständig.</w:t>
+        <w:t xml:space="preserve">Deterministische Kombination.</w:t>
+      </w:r>
+      <w:r>
+        <w:t xml:space="preserve"> Der Bedarf wird gedeckt, indem die </w:t>
+      </w:r>
+      <w:r>
+        <w:rPr>
+          <w:b/>
+          <w:bCs/>
+        </w:rPr>
+        <w:t xml:space="preserve">größte geeignete</w:t>
+      </w:r>
+      <w:r>
+        <w:t xml:space="preserve"> ausgewählte Standardgröße zuerst eingesetzt und mit </w:t>
+      </w:r>
+      <w:r>
+        <w:rPr>
+          <w:b/>
+          <w:bCs/>
+        </w:rPr>
+        <w:t xml:space="preserve">kleineren</w:t>
+      </w:r>
+      <w:r>
+        <w:t xml:space="preserve"> ausgewählten Größen aufgefüllt wird; das </w:t>
+      </w:r>
+      <w:r>
+        <w:rPr>
+          <w:b/>
+          <w:bCs/>
+        </w:rPr>
+        <w:t xml:space="preserve">verbleibende Fertigmaß</w:t>
+      </w:r>
+      <w:r>
+        <w:t xml:space="preserve"> ist ein </w:t>
+      </w:r>
+      <w:r>
+        <w:rPr>
+          <w:b/>
+          <w:bCs/>
+        </w:rPr>
+        <w:t xml:space="preserve">sichtbar gekennzeichneter Sonderzuschnitt</w:t>
+      </w:r>
+      <w:r>
+        <w:t xml:space="preserve"> aus dem </w:t>
+      </w:r>
+      <w:r>
+        <w:rPr>
+          <w:b/>
+          <w:bCs/>
+        </w:rPr>
+        <w:t xml:space="preserve">kleinsten geeigneten</w:t>
+      </w:r>
+      <w:r>
+        <w:t xml:space="preserve"> ausgewählten Ausgangsprodukt. Es gibt </w:t>
+      </w:r>
+      <w:r>
+        <w:rPr>
+          <w:b/>
+          <w:bCs/>
+        </w:rPr>
+        <w:t xml:space="preserve">keine Sägefuge/Schnittverlust</w:t>
+      </w:r>
+      <w:r>
+        <w:t xml:space="preserve">, </w:t>
+      </w:r>
+      <w:r>
+        <w:rPr>
+          <w:b/>
+          <w:bCs/>
+        </w:rPr>
+        <w:t xml:space="preserve">keine Reststück-Wiederverwendung</w:t>
+      </w:r>
+      <w:r>
+        <w:t xml:space="preserve"> und </w:t>
+      </w:r>
+      <w:r>
+        <w:rPr>
+          <w:b/>
+          <w:bCs/>
+        </w:rPr>
+        <w:t xml:space="preserve">keine Einkaufs-/Verschnittoptimierung</w:t>
+      </w:r>
+      <w:r>
+        <w:t xml:space="preserve">. Tie-Breaks sind deterministisch: Größen werden dedupliziert und absteigend geordnet, die Eingabereihenfolge ist ohne Wirkung; gleiche Eingaben liefern dieselbe Zuordnung. Der geometrische Bedarf wird dabei </w:t>
+      </w:r>
+      <w:r>
+        <w:rPr>
+          <w:b/>
+          <w:bCs/>
+        </w:rPr>
+        <w:t xml:space="preserve">nie verändert</w:t>
+      </w:r>
+      <w:r>
+        <w:t xml:space="preserve"> (</w:t>
+      </w:r>
+      <w:r>
+        <w:rPr>
+          <w:b/>
+          <w:bCs/>
+        </w:rPr>
+        <w:t xml:space="preserve">[P-14]</w:t>
+      </w:r>
+      <w:r>
+        <w:t xml:space="preserve">).</w:t>
       </w:r>
     </w:p>
     <w:p>
@@ -13688,7 +14080,7 @@
           <w:b/>
           <w:bCs/>
         </w:rPr>
-        <w:t xml:space="preserve">[Z-4]</w:t>
+        <w:t xml:space="preserve">[Z-3]</w:t>
       </w:r>
       <w:r>
         <w:t xml:space="preserve"> </w:t>
@@ -13698,70 +14090,50 @@
           <w:b/>
           <w:bCs/>
         </w:rPr>
-        <w:t xml:space="preserve">Latten und Platten.</w:t>
-      </w:r>
-      <w:r>
-        <w:t xml:space="preserve"> Bei Latten bestimmen die </w:t>
-      </w:r>
-      <w:r>
-        <w:rPr>
-          <w:b/>
-          <w:bCs/>
-        </w:rPr>
-        <w:t xml:space="preserve">Muss-Regeln der Befestigung</w:t>
-      </w:r>
-      <w:r>
-        <w:t xml:space="preserve"> das Fertigmaß: Stückgrenzen folgen [U-8]/[U-12] (Stoß mittig zwischen zwei Verbindern) und haben </w:t>
-      </w:r>
-      <w:r>
-        <w:rPr>
-          <w:b/>
-          <w:bCs/>
-        </w:rPr>
-        <w:t xml:space="preserve">Vorrang</w:t>
-      </w:r>
-      <w:r>
-        <w:t xml:space="preserve"> vor der Größenpräferenz aus [Z-2]. Die ausgewählten Standardlängen wirken deshalb als </w:t>
-      </w:r>
-      <w:r>
-        <w:rPr>
-          <w:b/>
-          <w:bCs/>
-        </w:rPr>
-        <w:t xml:space="preserve">Obergrenze</w:t>
-      </w:r>
-      <w:r>
-        <w:t xml:space="preserve"> der Stückbildung und als </w:t>
-      </w:r>
-      <w:r>
-        <w:rPr>
-          <w:b/>
-          <w:bCs/>
-        </w:rPr>
-        <w:t xml:space="preserve">Ausgangsprodukt</w:t>
-      </w:r>
-      <w:r>
-        <w:t xml:space="preserve"> je Stück (kleinste geeignete Größe); ein Stück, dessen Fertigmaß keiner Standardlänge entspricht, ist ein gekennzeichneter Sonderzuschnitt. Für </w:t>
-      </w:r>
-      <w:r>
-        <w:rPr>
-          <w:b/>
-          <w:bCs/>
-        </w:rPr>
-        <w:t xml:space="preserve">Platten</w:t>
-      </w:r>
-      <w:r>
-        <w:t xml:space="preserve"> wird die Auswahl nach [Z-1] als Datenquelle gespeichert und ist programmgesteuert lesbar; die </w:t>
-      </w:r>
-      <w:r>
-        <w:rPr>
-          <w:b/>
-          <w:bCs/>
-        </w:rPr>
-        <w:t xml:space="preserve">2D-Belegungs-/Zuschnittableitung bleibt #19</w:t>
-      </w:r>
-      <w:r>
-        <w:t xml:space="preserve"> – hier entsteht keine Plattenmenge und keine Kostenzeile.</w:t>
+        <w:t xml:space="preserve">Gewindestangen.</w:t>
+      </w:r>
+      <w:r>
+        <w:t xml:space="preserve"> Die Stücke eines Vorspannsegments sind </w:t>
+      </w:r>
+      <w:r>
+        <w:rPr>
+          <w:b/>
+          <w:bCs/>
+        </w:rPr>
+        <w:t xml:space="preserve">echte Standardlängen</w:t>
+      </w:r>
+      <w:r>
+        <w:t xml:space="preserve"> plus höchstens </w:t>
+      </w:r>
+      <w:r>
+        <w:rPr>
+          <w:b/>
+          <w:bCs/>
+        </w:rPr>
+        <w:t xml:space="preserve">ein</w:t>
+      </w:r>
+      <w:r>
+        <w:t xml:space="preserve"> Sonderzuschnitt; ein Stoß ist eine Kopplung. Die so entstehende Stückliste je Segment ist die </w:t>
+      </w:r>
+      <w:r>
+        <w:rPr>
+          <w:b/>
+          <w:bCs/>
+        </w:rPr>
+        <w:t xml:space="preserve">kanonische Ableitung</w:t>
+      </w:r>
+      <w:r>
+        <w:t xml:space="preserve">: Stückzahl, Kopplungsanzahl, Kopplungshöhen der Montageunterlage und die Mengen der Stückliste lesen ausschließlich sie. Eine zweite Rechnung aus einer pauschalen Stangenlänge ist unzulässig (</w:t>
+      </w:r>
+      <w:r>
+        <w:rPr>
+          <w:b/>
+          <w:bCs/>
+        </w:rPr>
+        <w:t xml:space="preserve">[P-6]</w:t>
+      </w:r>
+      <w:r>
+        <w:t xml:space="preserve">); die Kopplungshöhen sind die Kumulativsummen der Stücke und daher nicht mehr zwingend gleichabständig.</w:t>
       </w:r>
     </w:p>
     <w:p>
@@ -13778,7 +14150,7 @@
           <w:b/>
           <w:bCs/>
         </w:rPr>
-        <w:t xml:space="preserve">[Z-5 · MUSS]</w:t>
+        <w:t xml:space="preserve">[Z-4]</w:t>
       </w:r>
       <w:r>
         <w:t xml:space="preserve"> </w:t>
@@ -13788,30 +14160,130 @@
           <w:b/>
           <w:bCs/>
         </w:rPr>
-        <w:t xml:space="preserve">Mindest-Fertigmaß.</w:t>
-      </w:r>
-      <w:r>
-        <w:t xml:space="preserve"> Ein Zuschnitt unter </w:t>
-      </w:r>
-      <w:r>
-        <w:rPr>
-          <w:b/>
-          <w:bCs/>
-        </w:rPr>
-        <w:t xml:space="preserve">200 mm</w:t>
-      </w:r>
-      <w:r>
-        <w:t xml:space="preserve"> ist nicht einbaubar. Diese Baubarkeitsregel steht </w:t>
-      </w:r>
-      <w:r>
-        <w:rPr>
-          <w:b/>
-          <w:bCs/>
-        </w:rPr>
-        <w:t xml:space="preserve">über</w:t>
-      </w:r>
-      <w:r>
-        <w:t xml:space="preserve"> der Größenpräferenz aus [Z-2]: eine Standardgröße wird nur gewählt, wenn der danach verbleibende Rest 0 ist, mindestens das Mindest-Fertigmaß erreicht oder mit einer weiteren ausgewählten Größe auffüllbar ist. Lässt der Vorratssatz </w:t>
+        <w:t xml:space="preserve">Latten und Platten.</w:t>
+      </w:r>
+      <w:r>
+        <w:t xml:space="preserve"> Bei Latten bestimmen die </w:t>
+      </w:r>
+      <w:r>
+        <w:rPr>
+          <w:b/>
+          <w:bCs/>
+        </w:rPr>
+        <w:t xml:space="preserve">Muss-Regeln der Befestigung</w:t>
+      </w:r>
+      <w:r>
+        <w:t xml:space="preserve"> das Fertigmaß: Stückgrenzen folgen [U-8]/[U-12] (Stoß mittig zwischen zwei Verbindern) und haben </w:t>
+      </w:r>
+      <w:r>
+        <w:rPr>
+          <w:b/>
+          <w:bCs/>
+        </w:rPr>
+        <w:t xml:space="preserve">Vorrang</w:t>
+      </w:r>
+      <w:r>
+        <w:t xml:space="preserve"> vor der Größenpräferenz aus [Z-2]. Die ausgewählten Standardlängen wirken deshalb als </w:t>
+      </w:r>
+      <w:r>
+        <w:rPr>
+          <w:b/>
+          <w:bCs/>
+        </w:rPr>
+        <w:t xml:space="preserve">Obergrenze</w:t>
+      </w:r>
+      <w:r>
+        <w:t xml:space="preserve"> der Stückbildung und als </w:t>
+      </w:r>
+      <w:r>
+        <w:rPr>
+          <w:b/>
+          <w:bCs/>
+        </w:rPr>
+        <w:t xml:space="preserve">Ausgangsprodukt</w:t>
+      </w:r>
+      <w:r>
+        <w:t xml:space="preserve"> je Stück (kleinste geeignete Größe); ein Stück, dessen Fertigmaß keiner Standardlänge entspricht, ist ein gekennzeichneter Sonderzuschnitt. Für </w:t>
+      </w:r>
+      <w:r>
+        <w:rPr>
+          <w:b/>
+          <w:bCs/>
+        </w:rPr>
+        <w:t xml:space="preserve">Platten</w:t>
+      </w:r>
+      <w:r>
+        <w:t xml:space="preserve"> wird die Auswahl nach [Z-1] als Datenquelle gespeichert und ist programmgesteuert lesbar; die </w:t>
+      </w:r>
+      <w:r>
+        <w:rPr>
+          <w:b/>
+          <w:bCs/>
+        </w:rPr>
+        <w:t xml:space="preserve">2D-Belegungs-/Zuschnittableitung bleibt #19</w:t>
+      </w:r>
+      <w:r>
+        <w:t xml:space="preserve"> – hier entsteht keine Plattenmenge und keine Kostenzeile. </w:t>
+      </w:r>
+      <w:r>
+        <w:rPr>
+          <w:b/>
+          <w:bCs/>
+        </w:rPr>
+        <w:t xml:space="preserve">Solange die Beplankung zurückgestellt ist</w:t>
+      </w:r>
+      <w:r>
+        <w:t xml:space="preserve"> (Scope-Entscheidung zu #22 vom 2026-08-11), erzeugen </w:t>
+      </w:r>
+      <w:r>
+        <w:rPr>
+          <w:b/>
+          <w:bCs/>
+        </w:rPr>
+        <w:t xml:space="preserve">Latten, Platten und die Modul-2-Verbinderrolle in keiner Stücklistenausgabe eine Position</w:t>
+      </w:r>
+      <w:r>
+        <w:t xml:space="preserve"> – weder in der Anzeige noch in CSV oder HTML des zentralen Exports (</w:t>
+      </w:r>
+      <w:r>
+        <w:rPr>
+          <w:b/>
+          <w:bCs/>
+        </w:rPr>
+        <w:t xml:space="preserve">[P-19]</w:t>
+      </w:r>
+      <w:r>
+        <w:t xml:space="preserve">). Die </w:t>
+      </w:r>
+      <w:r>
+        <w:rPr>
+          <w:b/>
+          <w:bCs/>
+        </w:rPr>
+        <w:t xml:space="preserve">Gewindestangen-Kopplung</w:t>
+      </w:r>
+      <w:r>
+        <w:t xml:space="preserve"> ist davon ausdrücklich </w:t>
+      </w:r>
+      <w:r>
+        <w:rPr>
+          <w:b/>
+          <w:bCs/>
+        </w:rPr>
+        <w:t xml:space="preserve">nicht</w:t>
+      </w:r>
+      <w:r>
+        <w:t xml:space="preserve"> betroffen: sie ist ein Vorspann-Einbauteil und kein Modul-2-Verbinder. Die </w:t>
+      </w:r>
+      <w:r>
+        <w:rPr>
+          <w:b/>
+          <w:bCs/>
+        </w:rPr>
+        <w:t xml:space="preserve">eigenständige Latten-Zuschnittliste</w:t>
+      </w:r>
+      <w:r>
+        <w:t xml:space="preserve"> bleibt als Ausgabe von Modul 2 unverändert erhalten; sie ist </w:t>
       </w:r>
       <w:r>
         <w:rPr>
@@ -13821,47 +14293,7 @@
         <w:t xml:space="preserve">keine</w:t>
       </w:r>
       <w:r>
-        <w:t xml:space="preserve"> solche Wahl zu (typisch: nur eine einzige Standardlänge), bleibt die Größenpräferenz erhalten und der Konflikt wird </w:t>
-      </w:r>
-      <w:r>
-        <w:rPr>
-          <w:b/>
-          <w:bCs/>
-        </w:rPr>
-        <w:t xml:space="preserve">sichtbar gemeldet</w:t>
-      </w:r>
-      <w:r>
-        <w:t xml:space="preserve"> (validation.zuschnitt_konflikte, Warnung in Modul 1/2) – es entsteht </w:t>
-      </w:r>
-      <w:r>
-        <w:rPr>
-          <w:b/>
-          <w:bCs/>
-        </w:rPr>
-        <w:t xml:space="preserve">niemals still</w:t>
-      </w:r>
-      <w:r>
-        <w:t xml:space="preserve"> ein nicht einbaubares Kurzstück und </w:t>
-      </w:r>
-      <w:r>
-        <w:rPr>
-          <w:b/>
-          <w:bCs/>
-        </w:rPr>
-        <w:t xml:space="preserve">keine erfundene Länge</w:t>
-      </w:r>
-      <w:r>
-        <w:t xml:space="preserve">. Der Konflikt ist </w:t>
-      </w:r>
-      <w:r>
-        <w:rPr>
-          <w:b/>
-          <w:bCs/>
-        </w:rPr>
-        <w:t xml:space="preserve">kein</w:t>
-      </w:r>
-      <w:r>
-        <w:t xml:space="preserve"> Baubarkeitsausschluss: Mengen und Geometrie bleiben unverändert, die Meldung benennt das betroffene Fertigmaß und den Weg (weitere Standardgröße wählen).</w:t>
+        <w:t xml:space="preserve"> Stückliste. Das Fertigmaß der Latten wird weiter nach dieser Regel gerechnet – es fehlt nur die Stücklistenzeile, und das Zurücknehmen ist eine Änderung an genau einer Sperrliste im Ausgabepfad.</w:t>
       </w:r>
     </w:p>
     <w:p>
@@ -13878,6 +14310,106 @@
           <w:b/>
           <w:bCs/>
         </w:rPr>
+        <w:t xml:space="preserve">[Z-5 · MUSS]</w:t>
+      </w:r>
+      <w:r>
+        <w:t xml:space="preserve"> </w:t>
+      </w:r>
+      <w:r>
+        <w:rPr>
+          <w:b/>
+          <w:bCs/>
+        </w:rPr>
+        <w:t xml:space="preserve">Mindest-Fertigmaß.</w:t>
+      </w:r>
+      <w:r>
+        <w:t xml:space="preserve"> Ein Zuschnitt unter </w:t>
+      </w:r>
+      <w:r>
+        <w:rPr>
+          <w:b/>
+          <w:bCs/>
+        </w:rPr>
+        <w:t xml:space="preserve">200 mm</w:t>
+      </w:r>
+      <w:r>
+        <w:t xml:space="preserve"> ist nicht einbaubar. Diese Baubarkeitsregel steht </w:t>
+      </w:r>
+      <w:r>
+        <w:rPr>
+          <w:b/>
+          <w:bCs/>
+        </w:rPr>
+        <w:t xml:space="preserve">über</w:t>
+      </w:r>
+      <w:r>
+        <w:t xml:space="preserve"> der Größenpräferenz aus [Z-2]: eine Standardgröße wird nur gewählt, wenn der danach verbleibende Rest 0 ist, mindestens das Mindest-Fertigmaß erreicht oder mit einer weiteren ausgewählten Größe auffüllbar ist. Lässt der Vorratssatz </w:t>
+      </w:r>
+      <w:r>
+        <w:rPr>
+          <w:b/>
+          <w:bCs/>
+        </w:rPr>
+        <w:t xml:space="preserve">keine</w:t>
+      </w:r>
+      <w:r>
+        <w:t xml:space="preserve"> solche Wahl zu (typisch: nur eine einzige Standardlänge), bleibt die Größenpräferenz erhalten und der Konflikt wird </w:t>
+      </w:r>
+      <w:r>
+        <w:rPr>
+          <w:b/>
+          <w:bCs/>
+        </w:rPr>
+        <w:t xml:space="preserve">sichtbar gemeldet</w:t>
+      </w:r>
+      <w:r>
+        <w:t xml:space="preserve"> (validation.zuschnitt_konflikte, Warnung in Modul 1/2) – es entsteht </w:t>
+      </w:r>
+      <w:r>
+        <w:rPr>
+          <w:b/>
+          <w:bCs/>
+        </w:rPr>
+        <w:t xml:space="preserve">niemals still</w:t>
+      </w:r>
+      <w:r>
+        <w:t xml:space="preserve"> ein nicht einbaubares Kurzstück und </w:t>
+      </w:r>
+      <w:r>
+        <w:rPr>
+          <w:b/>
+          <w:bCs/>
+        </w:rPr>
+        <w:t xml:space="preserve">keine erfundene Länge</w:t>
+      </w:r>
+      <w:r>
+        <w:t xml:space="preserve">. Der Konflikt ist </w:t>
+      </w:r>
+      <w:r>
+        <w:rPr>
+          <w:b/>
+          <w:bCs/>
+        </w:rPr>
+        <w:t xml:space="preserve">kein</w:t>
+      </w:r>
+      <w:r>
+        <w:t xml:space="preserve"> Baubarkeitsausschluss: Mengen und Geometrie bleiben unverändert, die Meldung benennt das betroffene Fertigmaß und den Weg (weitere Standardgröße wählen).</w:t>
+      </w:r>
+    </w:p>
+    <w:p>
+      <w:pPr>
+        <w:pStyle w:val="ListParagraph"/>
+        <w:numPr>
+          <w:ilvl w:val="0"/>
+          <w:numId w:val="2"/>
+        </w:numPr>
+        <w:spacing w:after="60"/>
+      </w:pPr>
+      <w:r>
+        <w:rPr>
+          <w:b/>
+          <w:bCs/>
+        </w:rPr>
         <w:t xml:space="preserve">[Z-6 · MUSS]</w:t>
       </w:r>
       <w:r>
@@ -14265,7 +14797,7 @@
         <w:spacing w:after="120" w:before="80"/>
       </w:pPr>
       <w:r>
-        <w:t xml:space="preserve">Herkunft [Z-1]…[Z-5]: Issue #35 mit den bestätigten Zuschnittentscheidungen aus #19. Zuvor steuerten freie Eingabefelder (rodCm bzw. latten.stange_cm) die Stoß-/Kopplungsgeometrie parallel zum Katalog, und die Stückliste kannte nur EINE Standardlänge je Rolle – mehrere gewählte Größen erschienen dadurch als „mehrdeutig“ und blieben unbepreist. Es fehlten Regeln für die Maßquelle, für die Kombination und für das Mindest-Fertigmaß. Folge: Positionen entstehen jetzt je verwendeter Standardgröße bzw. je Ausgangsprodukt, damit die Preisauflösung nach </w:t>
+        <w:t xml:space="preserve">Herkunft [Z-1]…[Z-5]: Issue #35 mit den bestätigten Zuschnittentscheidungen aus #19. Zuvor steuerten freie Eingabefelder (rodCm bzw. latten.stange_cm) die Stoß-/Kopplungsgeometrie parallel zum Katalog, und die Stückliste kannte nur EINE Standardlänge je Rolle – mehrere gewählte Größen erschienen dadurch als „mehrdeutig“ und blieben unbepreist. Es fehlten Regeln für die Maßquelle, für die Kombination und für das Mindest-Fertigmaß. Folge: Positionen entstehen jetzt je verwendeter Standardgröße bzw. je Fertigmaß, damit die Preisauflösung nach </w:t>
       </w:r>
       <w:r>
         <w:rPr>
@@ -14275,7 +14807,17 @@
         <w:t xml:space="preserve">[P-14]</w:t>
       </w:r>
       <w:r>
-        <w:t xml:space="preserve"> wieder eindeutig ist; die vollständige Einbauteil-/ID-Kennzeichnung bleibt #22, die 2D-Plattenplanung #19.</w:t>
+        <w:t xml:space="preserve"> wieder eindeutig ist. Die vollständige Einbauteil-/ID-Kennzeichnung ist mit #22 nachgezogen und steht als </w:t>
+      </w:r>
+      <w:r>
+        <w:rPr>
+          <w:b/>
+          <w:bCs/>
+        </w:rPr>
+        <w:t xml:space="preserve">[P-19]</w:t>
+      </w:r>
+      <w:r>
+        <w:t xml:space="preserve">; die 2D-Plattenplanung bleibt #19.</w:t>
       </w:r>
     </w:p>
     <w:p>

</xml_diff>

<commit_message>
fix: Einbauteil-IDs aus Baustellenblatt entfernen (#62)
</commit_message>
<xml_diff>
--- a/doku/SEMBLA_Handbuch.docx
+++ b/doku/SEMBLA_Handbuch.docx
@@ -8942,7 +8942,7 @@
         <w:t xml:space="preserve">Einbauteil-Kennzeichnung der Gewindestangenstücke ([P-19]):</w:t>
       </w:r>
       <w:r>
-        <w:t xml:space="preserve"> Jedes Stück trägt eine deterministische Einbauteil-ID nach dem Schema GS-k&lt;Spannachse&gt;.&lt;Segment von unten&gt;.&lt;Stück von unten&gt;, dazu Kategorie, Art (Standardteil / Sonderzuschnitt / Reststück), Fertigmaß und die Wandreferenz. Gleichartige Fertigteile stehen als </w:t>
+        <w:t xml:space="preserve"> Jedes Stück trägt eine deterministische Einbauteil-ID nach dem Schema GS-k&lt;Spannachse&gt;.&lt;Segment von unten&gt;.&lt;Stück von unten&gt;, dazu Kategorie, Art (Standardteil / Sonderzuschnitt / Reststück), Fertigmaß und die Wandreferenz. Gleichartige Fertigteile stehen im Baustellenarbeitsblatt als </w:t>
       </w:r>
       <w:r>
         <w:rPr>
@@ -8952,7 +8952,7 @@
         <w:t xml:space="preserve">eine</w:t>
       </w:r>
       <w:r>
-        <w:t xml:space="preserve"> Zeile mit ihrer Menge; die Einzel-IDs bleiben in derselben Zeile vollständig aufgeführt und sind mit derselben Kennung im Zeichnungsblatt (Modul 7) wiederzufinden. Für Steine, Muttern, Bleche und Dichtstreifen wird </w:t>
+        <w:t xml:space="preserve"> Zeile mit ihrer Menge; die lange Folge ihrer Einzel-IDs wird dort bewusst nicht wiederholt. Vollständig und mit derselben Kennung bleiben die IDs in der getrennten Einbauteilliste und im Zeichnungsblatt (Modul 7) wiederzufinden. Für Steine, Muttern, Bleche und Dichtstreifen wird </w:t>
       </w:r>
       <w:r>
         <w:rPr>
@@ -9060,7 +9060,7 @@
         <w:t xml:space="preserve">Positionen je Standardgröße ([Z-2]/[Z-4]):</w:t>
       </w:r>
       <w:r>
-        <w:t xml:space="preserve"> Werden mehrere Standardlängen kombiniert, entsteht je verwendeter Standardlänge und je Sonderzuschnitt-Fertigmaß eine eigene Position mit eigenem maßgebendem Maß. Damit bleibt die Zuordnung nach [P-14] eindeutig und bepreisbar, obwohl mehrere Größen gleichzeitig eingebaut sind; die Einbaumenge ändert sich dadurch nicht – die Summe aller Stangenpositionen bleibt die Gesamtzahl des Rechenkerns. Ein Sonderzuschnitt nennt nur sein Fertigmaß und wird nicht bepreist ([P-18]); die zugehörigen Einbauteil-IDs stehen in derselben Zeile ([P-19]).</w:t>
+        <w:t xml:space="preserve"> Werden mehrere Standardlängen kombiniert, entsteht je verwendeter Standardlänge und je Sonderzuschnitt-Fertigmaß eine eigene Position mit eigenem maßgebendem Maß. Damit bleibt die Zuordnung nach [P-14] eindeutig und bepreisbar, obwohl mehrere Größen gleichzeitig eingebaut sind; die Einbaumenge ändert sich dadurch nicht – die Summe aller Stangenpositionen bleibt die Gesamtzahl des Rechenkerns. Ein Sonderzuschnitt nennt im Arbeitsblatt sein Fertigmaß und wird nicht bepreist ([P-18]); seine Einbauteil-IDs bleiben in der getrennten Einbauteilliste und im Zeichnungsblatt erhalten ([P-19]).</w:t>
       </w:r>
     </w:p>
     <w:p>
@@ -13680,17 +13680,17 @@
         <w:t xml:space="preserve">nachvollziehbar</w:t>
       </w:r>
       <w:r>
-        <w:t xml:space="preserve">: die Menge einer Zeile ist die Anzahl ihrer Einzelteile, und deren IDs bleiben in derselben Zeile vollständig lesbar, damit jede Zeile bis auf das Einzelteil auflösbar bleibt und </w:t>
-      </w:r>
-      <w:r>
-        <w:rPr>
-          <w:b/>
-          <w:bCs/>
-        </w:rPr>
-        <w:t xml:space="preserve">dieselben</w:t>
-      </w:r>
-      <w:r>
-        <w:t xml:space="preserve"> IDs in technischer Zeichnung und Export erscheinen. Die Art wird </w:t>
+        <w:t xml:space="preserve">: die Menge einer Zeile ist die Anzahl ihrer Einzelteile. Das kompakte Baustellenarbeitsblatt wiederholt die langen ID-Folgen bewusst nicht; die vollständige Einzelteilauflösung bleibt in der getrennten Einbauteilliste und in der technischen Zeichnung mit </w:t>
+      </w:r>
+      <w:r>
+        <w:rPr>
+          <w:b/>
+          <w:bCs/>
+        </w:rPr>
+        <w:t xml:space="preserve">denselben</w:t>
+      </w:r>
+      <w:r>
+        <w:t xml:space="preserve"> IDs erhalten. Die Art wird </w:t>
       </w:r>
       <w:r>
         <w:rPr>
@@ -13720,7 +13720,7 @@
         <w:t xml:space="preserve">Schwarz-Weiß-Druck</w:t>
       </w:r>
       <w:r>
-        <w:t xml:space="preserve"> und in einer Datei ohne Farbe zweifelsfrei erkennbar sind; mindestens ID und Fertiglänge stehen an jedem Sonderzuschnitt. Für Bauteile, für die der Rechenkern </w:t>
+        <w:t xml:space="preserve"> und in einer Datei ohne Farbe zweifelsfrei erkennbar sind; mindestens ID und Fertiglänge stehen an jedem Sonderzuschnitt in der getrennten Einbauteilliste und im Zeichnungsblatt. Für Bauteile, für die der Rechenkern </w:t>
       </w:r>
       <w:r>
         <w:rPr>

</xml_diff>

<commit_message>
fix: Maßzahlen einheitlich in Millimetern darstellen (#64)
</commit_message>
<xml_diff>
--- a/doku/SEMBLA_Handbuch.docx
+++ b/doku/SEMBLA_Handbuch.docx
@@ -9233,7 +9233,7 @@
         <w:spacing w:after="120"/>
       </w:pPr>
       <w:r>
-        <w:t xml:space="preserve">Der Maßstab wird aus der Normreihe gewählt: der größte Maßstab, bei dem die Wand einschließlich Bemaßungsrand in das nutzbare Zeichenfeld des Blattformats passt. Das SVG trägt seine Papiermaße in Millimetern, der Druck ist damit tatsächlich 1:x; der wirksame Maßstab steht in der Zeichnungsüberschrift und im Schriftfeld ([D-2]). Bemaßt werden Gesamtlänge und -höhe in Metern sowie Öffnungs-, Brüstungs- und Staffelungsmaße in Zentimetern ([D-3]).</w:t>
+        <w:t xml:space="preserve">Der Maßstab wird aus der Normreihe gewählt: der größte Maßstab, bei dem die Wand einschließlich Bemaßungsrand in das nutzbare Zeichenfeld des Blattformats passt. Das SVG trägt seine Papiermaße in Millimetern, der Druck ist damit tatsächlich 1:x; der wirksame Maßstab steht in der Zeichnungsüberschrift und im Schriftfeld ([D-2]). Bemaßt werden Gesamtlänge und -höhe sowie Öffnungs-, Brüstungs- und Staffelungsmaße; alle Maßzahlen stehen als reine Millimeterwerte ohne angehängte Einheit, die Einheit selbst nennt das Schriftfeld genau einmal ([D-3]).</w:t>
       </w:r>
     </w:p>
     <w:p>
@@ -15075,7 +15075,7 @@
           <w:b/>
           <w:bCs/>
         </w:rPr>
-        <w:t xml:space="preserve">Gesamtlänge und Gesamthöhe in m</w:t>
+        <w:t xml:space="preserve">Gesamtlänge und Gesamthöhe</w:t>
       </w:r>
       <w:r>
         <w:t xml:space="preserve"> sowie </w:t>
@@ -15095,10 +15095,40 @@
           <w:b/>
           <w:bCs/>
         </w:rPr>
-        <w:t xml:space="preserve">Staffelungsmaße (Länge und Höhe je Stufe) in cm</w:t>
-      </w:r>
-      <w:r>
-        <w:t xml:space="preserve">. Maße werden aus dem Wandelement abgeleitet und nie gerundet dargestellt, wenn dadurch ein anderes Maß entstünde. Die Bemaßung ist abschaltbar (Darstellungsoption), ihre Ableitung dabei unverändert.</w:t>
+        <w:t xml:space="preserve">Staffelungsmaße (Länge und Höhe je Stufe)</w:t>
+      </w:r>
+      <w:r>
+        <w:t xml:space="preserve">. Es gibt </w:t>
+      </w:r>
+      <w:r>
+        <w:rPr>
+          <w:b/>
+          <w:bCs/>
+        </w:rPr>
+        <w:t xml:space="preserve">genau eine Einheit: Millimeter</w:t>
+      </w:r>
+      <w:r>
+        <w:t xml:space="preserve">. Jede Maßzahl steht deshalb als </w:t>
+      </w:r>
+      <w:r>
+        <w:rPr>
+          <w:b/>
+          <w:bCs/>
+        </w:rPr>
+        <w:t xml:space="preserve">reiner Millimeterwert ohne angehängte Einheit</w:t>
+      </w:r>
+      <w:r>
+        <w:t xml:space="preserve"> – keine Umrechnung in Zentimeter oder Meter und keine Einheitenwahl; die Einheit nennt das </w:t>
+      </w:r>
+      <w:r>
+        <w:rPr>
+          <w:b/>
+          <w:bCs/>
+        </w:rPr>
+        <w:t xml:space="preserve">Schriftfeld genau einmal</w:t>
+      </w:r>
+      <w:r>
+        <w:t xml:space="preserve"> (Feld „Einheit“ = „mm“). Maße werden aus dem Wandelement abgeleitet und nie gerundet dargestellt, wenn dadurch ein anderes Maß entstünde. Die Bemaßung ist abschaltbar (Darstellungsoption), ihre Ableitung dabei unverändert.</w:t>
       </w:r>
     </w:p>
     <w:p>

</xml_diff>

<commit_message>
Technische Zeichnung auf wesentliche Blattangaben reduzieren (#61)
</commit_message>
<xml_diff>
--- a/doku/SEMBLA_Handbuch.docx
+++ b/doku/SEMBLA_Handbuch.docx
@@ -9241,7 +9241,7 @@
         <w:spacing w:after="120"/>
       </w:pPr>
       <w:r>
-        <w:t xml:space="preserve">Die vier Vorspann-Zielregeln stehen als Planungshinweise auf dem Blatt und sind ausdrücklich als „nicht automatisch geprüft“ gekennzeichnet – die Suite prüft sie nicht, deshalb darf das Blatt sie nicht als erfüllte Eigenschaft der Wand ausgeben ([D-5]). Ebenso ist der statische Nachweis nicht Bestandteil der Zeichnung: das Schriftfeld verweist auf die separate Prüfung, ein Nachweisergebnis erscheint nicht, und die Zeichnung greift auf kein Nachweis- oder Auslegungsmodell zu ([D-8]).</w:t>
+        <w:t xml:space="preserve">Das Blatt ist auf das Ausführungsnötige beschränkt: Wanddarstellung mit Maßen, Baustellenstückliste, die konkreten Einbauteil-IDs der Gewindestangen je Spannachse, kompakte Vorspannkennzahlen, vorhandene Zuschnittkonflikte und der Darstellungsschlüssel als kompakte Legende. Erklärende Regeltexte trägt es nicht – weder eine Liste eingehaltener noch eine Liste ungeprüfter Zielregeln; [D-5] verlangt keine solche Darstellung, sondern nur, dass Geprüftes und Ungeprüftes nie vermischt werden, wo Regeln genannt sind. Der statische Nachweis ist ebenso nicht Bestandteil der Zeichnung: das Blatt führt kein Nachweisfeld, nennt kein Nachweisergebnis und greift auf kein Nachweis- oder Auslegungsmodell zu ([D-8]).</w:t>
       </w:r>
     </w:p>
     <w:p>
@@ -15630,14 +15630,44 @@
         <w:t xml:space="preserve">Nur behaupten, was gerechnet wird.</w:t>
       </w:r>
       <w:r>
-        <w:t xml:space="preserve"> Das Blatt trennt zwei Listen. </w:t>
-      </w:r>
-      <w:r>
-        <w:rPr>
-          <w:b/>
-          <w:bCs/>
-        </w:rPr>
-        <w:t xml:space="preserve">Eingehalten</w:t>
+        <w:t xml:space="preserve"> Die Regel ist eine </w:t>
+      </w:r>
+      <w:r>
+        <w:rPr>
+          <w:b/>
+          <w:bCs/>
+        </w:rPr>
+        <w:t xml:space="preserve">Aussagewahrheitsregel, keine Darstellungspflicht</w:t>
+      </w:r>
+      <w:r>
+        <w:t xml:space="preserve">: Das technische Blatt </w:t>
+      </w:r>
+      <w:r>
+        <w:rPr>
+          <w:b/>
+          <w:bCs/>
+        </w:rPr>
+        <w:t xml:space="preserve">muss</w:t>
+      </w:r>
+      <w:r>
+        <w:t xml:space="preserve"> Fachregeln </w:t>
+      </w:r>
+      <w:r>
+        <w:rPr>
+          <w:b/>
+          <w:bCs/>
+        </w:rPr>
+        <w:t xml:space="preserve">nicht</w:t>
+      </w:r>
+      <w:r>
+        <w:t xml:space="preserve"> auflisten. Wo eine Ausgabe Regeln aber nennt, gilt strikt: </w:t>
+      </w:r>
+      <w:r>
+        <w:rPr>
+          <w:b/>
+          <w:bCs/>
+        </w:rPr>
+        <w:t xml:space="preserve">eingehalten</w:t>
       </w:r>
       <w:r>
         <w:t xml:space="preserve"> dürfen ausschließlich Regeln heißen, die der Rechenkern tatsächlich einhält und die am Wandelement nachweisbar sind – derzeit </w:t>
@@ -15660,7 +15690,7 @@
         <w:t xml:space="preserve">[V-3]</w:t>
       </w:r>
       <w:r>
-        <w:t xml:space="preserve"> (automatische Achsen möglichst mittig im i3-Stein der untersten Reihe). Die </w:t>
+        <w:t xml:space="preserve"> (automatische Achsen möglichst mittig im i3-Stein der untersten Reihe); die </w:t>
       </w:r>
       <w:r>
         <w:rPr>
@@ -15670,17 +15700,27 @@
         <w:t xml:space="preserve">noch nicht gerechneten</w:t>
       </w:r>
       <w:r>
-        <w:t xml:space="preserve"> Zielregeln – bei Öffnungen über 750 mm beidseitig zwei Achsen; jedes Blech von mindestens zwei Achsen gehalten – erscheinen </w:t>
-      </w:r>
-      <w:r>
-        <w:rPr>
-          <w:b/>
-          <w:bCs/>
-        </w:rPr>
-        <w:t xml:space="preserve">ausschließlich als Planungshinweis mit ausdrücklichem Vermerk „nicht automatisch geprüft“</w:t>
-      </w:r>
-      <w:r>
-        <w:t xml:space="preserve">. Eine Darstellung dieser offenen Regeln als erfüllte oder geprüfte Eigenschaft ist </w:t>
+        <w:t xml:space="preserve"> Zielregeln – bei Öffnungen über 750 mm beidseitig zwei Achsen; jedes Blech von mindestens zwei Achsen gehalten – nur mit ausdrücklichem Vermerk </w:t>
+      </w:r>
+      <w:r>
+        <w:rPr>
+          <w:b/>
+          <w:bCs/>
+        </w:rPr>
+        <w:t xml:space="preserve">„nicht automatisch geprüft“</w:t>
+      </w:r>
+      <w:r>
+        <w:t xml:space="preserve">. Geprüftes und Ungeprüftes zu vermischen ist in </w:t>
+      </w:r>
+      <w:r>
+        <w:rPr>
+          <w:b/>
+          <w:bCs/>
+        </w:rPr>
+        <w:t xml:space="preserve">beide</w:t>
+      </w:r>
+      <w:r>
+        <w:t xml:space="preserve"> Richtungen </w:t>
       </w:r>
       <w:r>
         <w:rPr>
@@ -15690,7 +15730,17 @@
         <w:t xml:space="preserve">unzulässig</w:t>
       </w:r>
       <w:r>
-        <w:t xml:space="preserve">; ebenso unzulässig ist es, eine tatsächlich gerechnete Regel weiter als ungeprüfte Zielregel auszuweisen. Priorität: Muss-Regel der Aussagewahrheit – sie steht über jeder Darstellungs- und Komfortregel.</w:t>
+        <w:t xml:space="preserve">: eine offene Zielregel als erfüllt oder geprüft darzustellen ebenso wie eine tatsächlich gerechnete Regel weiter als ungeprüfte Zielregel auszuweisen. Das </w:t>
+      </w:r>
+      <w:r>
+        <w:rPr>
+          <w:b/>
+          <w:bCs/>
+        </w:rPr>
+        <w:t xml:space="preserve">Weglassen</w:t>
+      </w:r>
+      <w:r>
+        <w:t xml:space="preserve"> beider Listen ist dagegen zulässig – es behauptet nichts. Priorität: Muss-Regel der Aussagewahrheit – sie steht über jeder Darstellungs- und Komfortregel, verlangt aber selbst keinen Blattinhalt.</w:t>
       </w:r>
     </w:p>
     <w:p>
@@ -15910,17 +15960,37 @@
         <w:t xml:space="preserve">Kein Nachweis auf der Zeichnung.</w:t>
       </w:r>
       <w:r>
-        <w:t xml:space="preserve"> Das Schriftfeld führt Projekt, Bauherrenschaft, Planverfasser, Phase, Planinhalt, Wand mit Maßen, Plannummer, Index, Maßstab und Bearbeiter. Für die Standsicherheit weist es aus, dass der Nachweis </w:t>
-      </w:r>
-      <w:r>
-        <w:rPr>
-          <w:b/>
-          <w:bCs/>
-        </w:rPr>
-        <w:t xml:space="preserve">nicht Bestandteil dieser Zeichnung ist und separat zu prüfen</w:t>
-      </w:r>
-      <w:r>
-        <w:t xml:space="preserve"> ist. Ein Nachweisergebnis (bestanden/Auslastung) darf auf dem Blatt </w:t>
+        <w:t xml:space="preserve"> Das Schriftfeld führt </w:t>
+      </w:r>
+      <w:r>
+        <w:rPr>
+          <w:b/>
+          <w:bCs/>
+        </w:rPr>
+        <w:t xml:space="preserve">genau</w:t>
+      </w:r>
+      <w:r>
+        <w:t xml:space="preserve"> Projekt, Wand mit ihren Maßen (Länge × Höhe), Planinhalt, Plannummer, Index, Maßstab, Einheit und Bearbeiter; eine </w:t>
+      </w:r>
+      <w:r>
+        <w:rPr>
+          <w:b/>
+          <w:bCs/>
+        </w:rPr>
+        <w:t xml:space="preserve">fehlende optionale</w:t>
+      </w:r>
+      <w:r>
+        <w:t xml:space="preserve"> Angabe erzeugt </w:t>
+      </w:r>
+      <w:r>
+        <w:rPr>
+          <w:b/>
+          <w:bCs/>
+        </w:rPr>
+        <w:t xml:space="preserve">keinen Platzhaltertext</w:t>
+      </w:r>
+      <w:r>
+        <w:t xml:space="preserve"> und keine leere Zeile, statt einen Wert vorzutäuschen. Ein Nachweisergebnis (bestanden/Auslastung) darf auf dem Blatt </w:t>
       </w:r>
       <w:r>
         <w:rPr>
@@ -15950,7 +16020,27 @@
         <w:t xml:space="preserve">[S-1]</w:t>
       </w:r>
       <w:r>
-        <w:t xml:space="preserve">).</w:t>
+        <w:t xml:space="preserve">). Ein </w:t>
+      </w:r>
+      <w:r>
+        <w:rPr>
+          <w:b/>
+          <w:bCs/>
+        </w:rPr>
+        <w:t xml:space="preserve">erklärender Satz</w:t>
+      </w:r>
+      <w:r>
+        <w:t xml:space="preserve"> dazu ist auf dem Blatt </w:t>
+      </w:r>
+      <w:r>
+        <w:rPr>
+          <w:b/>
+          <w:bCs/>
+        </w:rPr>
+        <w:t xml:space="preserve">nicht erforderlich</w:t>
+      </w:r>
+      <w:r>
+        <w:t xml:space="preserve">: dass die Zeichnung nichts nachweist, folgt bereits daraus, dass sie kein Nachweisfeld führt – der frühere Pflichtvermerk „nicht Bestandteil dieser Zeichnung – separat prüfen“ ist entfallen (Issue #61). Die Abgrenzung selbst bleibt unverändert Muss.</w:t>
       </w:r>
     </w:p>
     <w:p>
@@ -15963,6 +16053,18 @@
       </w:pPr>
       <w:r>
         <w:t xml:space="preserve">Herkunft [D-1]…[D-8]: Issue #36. Das Legacy-Werkzeug lud sein Wandelement über einen eigenen Datei-Dialog, hielt eine zweite Stücklistenlogik, baute das PDF über eine CDN-Bibliothek in einer zweiten Zeichenlogik nach, rechnete den Maßstab ohne den Bemaßungsrand (das Blatt lief über und wurde im Druck nachskaliert), druckte die vier Spannregeln ohne Vorbehalt als Blattinhalt und zeigte im Schriftfeld einen Nachweisstatus aus einem Feld des Wandelements. Es fehlten Regeln für Datenquelle, Maßstabstreue, geteilte Zeichenableitung, Aussagewahrheit der Zielregeln und Abgrenzung zum statischen Nachweis.</w:t>
+      </w:r>
+    </w:p>
+    <w:p>
+      <w:pPr>
+        <w:pBdr>
+          <w:left w:val="single" w:color="E0B400" w:sz="18" w:space="6"/>
+        </w:pBdr>
+        <w:shd w:fill="FFF8E6" w:val="clear"/>
+        <w:spacing w:after="120" w:before="80"/>
+      </w:pPr>
+      <w:r>
+        <w:t xml:space="preserve">Bearbeitung [D-5]/[D-8]: Issue #61 (2026-08-12). Beide Regeln forderten Blattinhalt, der auf dem Blatt nichts entscheidet: [D-5] verlangte zwei Regellisten samt erklärender Fußnote, [D-8] neben Projekt und Wand auch Bauherrenschaft, Planverfasser und Planungsphase sowie einen Pflichtsatz zum statischen Nachweis. Das Blatt war dadurch zugesetzt, während die maßstäbliche Wanddarstellung – der eigentliche Zweck – gedrängt stand. Korrigiert ist deshalb ausschließlich die Darstellungspflicht: [D-5] bleibt als Aussagewahrheitsregel unverändert scharf (Geprüftes und Ungeprüftes nie vermischt), verlangt aber keine Liste; [D-8] behält das Verbot von Nachweisergebnis und Nachweismodell und führt nur noch die zwingenden Schriftfeldangaben. Die Vorspann-Zielregeln selbst sind unverändert offen und stehen weiter in diesem Handbuch – sie waren nie ein Rechenergebnis des Kerns.</w:t>
       </w:r>
     </w:p>
     <w:p>

</xml_diff>

<commit_message>
Geschossplan als Hintergrund im Lageplan (#80)
Der im Geschossplaner hinterlegte und kalibrierte Grundriss liegt in Modul 9 als
Hintergrund unter der Zeichnung — platziert allein ueber den gespeicherten
Maszstab und Versatz, read-only aus derselben Bilddatenbank. Die Transparenz ist
eine fluechtige Darstellungsoption (0..100 %, bei 100 % kein Bild); Vorschau,
Druck-HTML und exportiertes SVG zeigen bit-genau dasselbe Bild als Data-URL.
Fehlendes oder unkalibriertes Bild wird benannt und bleibt Hinweis statt Mangel.

Neue Zielregel [N-9] ersetzt das Nicht-Ziel aus #54; [L-9] und [N-1]...[N-8]
bleiben unveraendert. Kein Versionsbump, kein zweiter Uploadweg.

Co-Authored-By: Claude Opus 5 <noreply@anthropic.com>
</commit_message>
<xml_diff>
--- a/doku/SEMBLA_Handbuch.docx
+++ b/doku/SEMBLA_Handbuch.docx
@@ -20392,6 +20392,306 @@
     </w:p>
     <w:p>
       <w:pPr>
+        <w:pStyle w:val="ListParagraph"/>
+        <w:numPr>
+          <w:ilvl w:val="0"/>
+          <w:numId w:val="2"/>
+        </w:numPr>
+        <w:spacing w:after="60"/>
+      </w:pPr>
+      <w:r>
+        <w:rPr>
+          <w:b/>
+          <w:bCs/>
+        </w:rPr>
+        <w:t xml:space="preserve">[N-9 · MUSS]</w:t>
+      </w:r>
+      <w:r>
+        <w:t xml:space="preserve"> </w:t>
+      </w:r>
+      <w:r>
+        <w:rPr>
+          <w:b/>
+          <w:bCs/>
+        </w:rPr>
+        <w:t xml:space="preserve">Der kalibrierte Geschossplan liegt als Hintergrund unter der Zeichnung.</w:t>
+      </w:r>
+      <w:r>
+        <w:t xml:space="preserve"> Ist einem Geschoss ein Plan hinterlegt </w:t>
+      </w:r>
+      <w:r>
+        <w:rPr>
+          <w:b/>
+          <w:bCs/>
+        </w:rPr>
+        <w:t xml:space="preserve">und kalibriert</w:t>
+      </w:r>
+      <w:r>
+        <w:t xml:space="preserve">, erscheint sein Bild im Lageplanblatt als Hintergrund – platziert </w:t>
+      </w:r>
+      <w:r>
+        <w:rPr>
+          <w:b/>
+          <w:bCs/>
+        </w:rPr>
+        <w:t xml:space="preserve">ausschließlich</w:t>
+      </w:r>
+      <w:r>
+        <w:t xml:space="preserve"> über den </w:t>
+      </w:r>
+      <w:r>
+        <w:rPr>
+          <w:b/>
+          <w:bCs/>
+        </w:rPr>
+        <w:t xml:space="preserve">gespeicherten</w:t>
+      </w:r>
+      <w:r>
+        <w:t xml:space="preserve"> Maßstab (`mm_je_pixel`) und den </w:t>
+      </w:r>
+      <w:r>
+        <w:rPr>
+          <w:b/>
+          <w:bCs/>
+        </w:rPr>
+        <w:t xml:space="preserve">gespeicherten</w:t>
+      </w:r>
+      <w:r>
+        <w:t xml:space="preserve"> Versatz der Planansicht (</w:t>
+      </w:r>
+      <w:r>
+        <w:rPr>
+          <w:b/>
+          <w:bCs/>
+        </w:rPr>
+        <w:t xml:space="preserve">[L-9]</w:t>
+      </w:r>
+      <w:r>
+        <w:t xml:space="preserve">). Er bleibt dabei </w:t>
+      </w:r>
+      <w:r>
+        <w:rPr>
+          <w:b/>
+          <w:bCs/>
+        </w:rPr>
+        <w:t xml:space="preserve">Hintergrund und keine Datenquelle</w:t>
+      </w:r>
+      <w:r>
+        <w:t xml:space="preserve">: aus dem Bild wird </w:t>
+      </w:r>
+      <w:r>
+        <w:rPr>
+          <w:b/>
+          <w:bCs/>
+        </w:rPr>
+        <w:t xml:space="preserve">keine</w:t>
+      </w:r>
+      <w:r>
+        <w:t xml:space="preserve"> Wand, </w:t>
+      </w:r>
+      <w:r>
+        <w:rPr>
+          <w:b/>
+          <w:bCs/>
+        </w:rPr>
+        <w:t xml:space="preserve">keine</w:t>
+      </w:r>
+      <w:r>
+        <w:t xml:space="preserve"> Länge und </w:t>
+      </w:r>
+      <w:r>
+        <w:rPr>
+          <w:b/>
+          <w:bCs/>
+        </w:rPr>
+        <w:t xml:space="preserve">kein</w:t>
+      </w:r>
+      <w:r>
+        <w:t xml:space="preserve"> Maßstab abgeleitet, es wird nichts an ihm gemessen, und die Maßstabswahl des Blattes (</w:t>
+      </w:r>
+      <w:r>
+        <w:rPr>
+          <w:b/>
+          <w:bCs/>
+        </w:rPr>
+        <w:t xml:space="preserve">[N-8]</w:t>
+      </w:r>
+      <w:r>
+        <w:t xml:space="preserve">) sowie die gezeichnete Wandgeometrie bleiben von ihm </w:t>
+      </w:r>
+      <w:r>
+        <w:rPr>
+          <w:b/>
+          <w:bCs/>
+        </w:rPr>
+        <w:t xml:space="preserve">unberührt</w:t>
+      </w:r>
+      <w:r>
+        <w:t xml:space="preserve">. Gezeichnet wird der Hintergrund </w:t>
+      </w:r>
+      <w:r>
+        <w:rPr>
+          <w:b/>
+          <w:bCs/>
+        </w:rPr>
+        <w:t xml:space="preserve">zuerst</w:t>
+      </w:r>
+      <w:r>
+        <w:t xml:space="preserve">, also unter allen Wand-, Maß-, Kennzeichnungs- und Schriftfeldangaben; deren Lesbarkeit hat Vorrang. Die </w:t>
+      </w:r>
+      <w:r>
+        <w:rPr>
+          <w:b/>
+          <w:bCs/>
+        </w:rPr>
+        <w:t xml:space="preserve">Transparenz</w:t>
+      </w:r>
+      <w:r>
+        <w:t xml:space="preserve"> ist eine </w:t>
+      </w:r>
+      <w:r>
+        <w:rPr>
+          <w:b/>
+          <w:bCs/>
+        </w:rPr>
+        <w:t xml:space="preserve">flüchtige Darstellungsoption</w:t>
+      </w:r>
+      <w:r>
+        <w:t xml:space="preserve"> in ganzen Prozent von </w:t>
+      </w:r>
+      <w:r>
+        <w:rPr>
+          <w:b/>
+          <w:bCs/>
+        </w:rPr>
+        <w:t xml:space="preserve">0 bis 100</w:t>
+      </w:r>
+      <w:r>
+        <w:t xml:space="preserve"> – sie wird </w:t>
+      </w:r>
+      <w:r>
+        <w:rPr>
+          <w:b/>
+          <w:bCs/>
+        </w:rPr>
+        <w:t xml:space="preserve">nicht gespeichert</w:t>
+      </w:r>
+      <w:r>
+        <w:t xml:space="preserve"> (kein neuer Speicherbereich, keine Formatänderung), und bei 100 % entfällt der Hintergrund vollständig. </w:t>
+      </w:r>
+      <w:r>
+        <w:rPr>
+          <w:b/>
+          <w:bCs/>
+        </w:rPr>
+        <w:t xml:space="preserve">Ohne Kalibrierung gibt es keinen Hintergrund</w:t>
+      </w:r>
+      <w:r>
+        <w:t xml:space="preserve">: der vorläufige Anzeigefaktor des Layout-Editors (1 Bildpunkt = 1 mm) ist eine Bedienhilfe zum Kalibrieren und hat in einer maßstäblichen Unterlage nichts zu suchen – ein Ersatzmaßstab wird </w:t>
+      </w:r>
+      <w:r>
+        <w:rPr>
+          <w:b/>
+          <w:bCs/>
+        </w:rPr>
+        <w:t xml:space="preserve">nicht geschätzt</w:t>
+      </w:r>
+      <w:r>
+        <w:t xml:space="preserve">. Fehlt das Bild in diesem Browser (</w:t>
+      </w:r>
+      <w:r>
+        <w:rPr>
+          <w:b/>
+          <w:bCs/>
+        </w:rPr>
+        <w:t xml:space="preserve">[L-8]</w:t>
+      </w:r>
+      <w:r>
+        <w:t xml:space="preserve">), bleibt das Blatt im Übrigen </w:t>
+      </w:r>
+      <w:r>
+        <w:rPr>
+          <w:b/>
+          <w:bCs/>
+        </w:rPr>
+        <w:t xml:space="preserve">vollständig</w:t>
+      </w:r>
+      <w:r>
+        <w:t xml:space="preserve"> und der Grund wird </w:t>
+      </w:r>
+      <w:r>
+        <w:rPr>
+          <w:b/>
+          <w:bCs/>
+        </w:rPr>
+        <w:t xml:space="preserve">benannt</w:t>
+      </w:r>
+      <w:r>
+        <w:t xml:space="preserve">; beides – fehlendes wie unkalibriertes Bild – ist ein </w:t>
+      </w:r>
+      <w:r>
+        <w:rPr>
+          <w:b/>
+          <w:bCs/>
+        </w:rPr>
+        <w:t xml:space="preserve">Hinweis</w:t>
+      </w:r>
+      <w:r>
+        <w:t xml:space="preserve">, kein Mangel, und ändert den Vollständigkeitsvermerk nach </w:t>
+      </w:r>
+      <w:r>
+        <w:rPr>
+          <w:b/>
+          <w:bCs/>
+        </w:rPr>
+        <w:t xml:space="preserve">[N-7]</w:t>
+      </w:r>
+      <w:r>
+        <w:t xml:space="preserve"> nicht. Modul 9 </w:t>
+      </w:r>
+      <w:r>
+        <w:rPr>
+          <w:b/>
+          <w:bCs/>
+        </w:rPr>
+        <w:t xml:space="preserve">liest</w:t>
+      </w:r>
+      <w:r>
+        <w:t xml:space="preserve"> Bild, Maßstab und Versatz und schreibt davon </w:t>
+      </w:r>
+      <w:r>
+        <w:rPr>
+          <w:b/>
+          <w:bCs/>
+        </w:rPr>
+        <w:t xml:space="preserve">nichts</w:t>
+      </w:r>
+      <w:r>
+        <w:t xml:space="preserve">; es gibt dort </w:t>
+      </w:r>
+      <w:r>
+        <w:rPr>
+          <w:b/>
+          <w:bCs/>
+        </w:rPr>
+        <w:t xml:space="preserve">keinen</w:t>
+      </w:r>
+      <w:r>
+        <w:t xml:space="preserve"> Uploadweg und </w:t>
+      </w:r>
+      <w:r>
+        <w:rPr>
+          <w:b/>
+          <w:bCs/>
+        </w:rPr>
+        <w:t xml:space="preserve">keinen</w:t>
+      </w:r>
+      <w:r>
+        <w:t xml:space="preserve"> zweiten Speicherort – hochgeladen und kalibriert wird allein im Geschossplaner.</w:t>
+      </w:r>
+    </w:p>
+    <w:p>
+      <w:pPr>
         <w:pBdr>
           <w:left w:val="single" w:color="E0B400" w:sz="18" w:space="6"/>
         </w:pBdr>
@@ -20456,7 +20756,57 @@
         <w:t xml:space="preserve">Planbild</w:t>
       </w:r>
       <w:r>
-        <w:t xml:space="preserve"> des Geschosses erscheint nicht im Blatt: es ist Hintergrund der Verortung und keine Datenquelle (</w:t>
+        <w:t xml:space="preserve"> des Geschosses war im ersten Umfang ausdrücklich </w:t>
+      </w:r>
+      <w:r>
+        <w:rPr>
+          <w:b/>
+          <w:bCs/>
+        </w:rPr>
+        <w:t xml:space="preserve">nicht</w:t>
+      </w:r>
+      <w:r>
+        <w:t xml:space="preserve"> Bestandteil des Blattes; mit </w:t>
+      </w:r>
+      <w:r>
+        <w:rPr>
+          <w:b/>
+          <w:bCs/>
+        </w:rPr>
+        <w:t xml:space="preserve">Issue #80 (Bearbeitung 2026-08-14)</w:t>
+      </w:r>
+      <w:r>
+        <w:t xml:space="preserve"> ist dieses Nicht-Ziel durch die Zielregel </w:t>
+      </w:r>
+      <w:r>
+        <w:rPr>
+          <w:b/>
+          <w:bCs/>
+        </w:rPr>
+        <w:t xml:space="preserve">[N-9]</w:t>
+      </w:r>
+      <w:r>
+        <w:t xml:space="preserve"> ersetzt: der </w:t>
+      </w:r>
+      <w:r>
+        <w:rPr>
+          <w:b/>
+          <w:bCs/>
+        </w:rPr>
+        <w:t xml:space="preserve">kalibrierte</w:t>
+      </w:r>
+      <w:r>
+        <w:t xml:space="preserve"> Plan erscheint als Hintergrund, read-only und mit flüchtig einstellbarer Transparenz. Ersetzt ist damit ausschließlich die </w:t>
+      </w:r>
+      <w:r>
+        <w:rPr>
+          <w:b/>
+          <w:bCs/>
+        </w:rPr>
+        <w:t xml:space="preserve">Umfangsaussage</w:t>
+      </w:r>
+      <w:r>
+        <w:t xml:space="preserve"> – </w:t>
       </w:r>
       <w:r>
         <w:rPr>
@@ -20466,7 +20816,27 @@
         <w:t xml:space="preserve">[L-9]</w:t>
       </w:r>
       <w:r>
-        <w:t xml:space="preserve">), und ein unkalibriertes Rasterbild hätte in einer maßstäblichen Unterlage nichts zu suchen. Umgesetzt und regressionsgetestet mit Issue #54 (Logiktests der gemeinsamen Maßdarstellung und des Blattes, Smoke-Test über den echten Modul- und Exportpfad einschließlich der exportierten Bytes).</w:t>
+        <w:t xml:space="preserve"> gilt unverändert (der Plan bleibt Hintergrund und keine Datenquelle), das </w:t>
+      </w:r>
+      <w:r>
+        <w:rPr>
+          <w:b/>
+          <w:bCs/>
+        </w:rPr>
+        <w:t xml:space="preserve">Bearbeiten</w:t>
+      </w:r>
+      <w:r>
+        <w:t xml:space="preserve"> von Planbildern bleibt Nicht-Ziel dieses Moduls, und ein </w:t>
+      </w:r>
+      <w:r>
+        <w:rPr>
+          <w:b/>
+          <w:bCs/>
+        </w:rPr>
+        <w:t xml:space="preserve">unkalibriertes</w:t>
+      </w:r>
+      <w:r>
+        <w:t xml:space="preserve"> Rasterbild hat in einer maßstäblichen Unterlage weiterhin nichts zu suchen (es erscheint deshalb nicht). Umgesetzt und regressionsgetestet mit Issue #54 (Logiktests der gemeinsamen Maßdarstellung und des Blattes, Smoke-Test über den echten Modul- und Exportpfad einschließlich der exportierten Bytes).</w:t>
       </w:r>
     </w:p>
     <w:p>

</xml_diff>

<commit_message>
Brandschutzklassifikation F0/F30 je Wand (#79)
Kanonisches Feld am Wandelement mit den Werten F0 und F30, Standard F0 fuer
Neuanlage und Altbestand (Normalisierung beim Lesen, keine Migration, kein
Schema-Bump). Gewaehlt wird ausschliesslich in Modul 1; der Geschosseditor
fuehrt den Wert bei der Neuberechnung nur mit. Export und Import erhalten ihn
unveraendert. Reine Planungskennzeichnung: kein Nachweis, keine Freigabe,
keine Materialregel; Tiling, Vorspannung, Stueckliste und Statik unveraendert.
</commit_message>
<xml_diff>
--- a/doku/SEMBLA_Handbuch.docx
+++ b/doku/SEMBLA_Handbuch.docx
@@ -2618,6 +2618,67 @@
                 <w:sz w:val="20"/>
                 <w:szCs w:val="20"/>
               </w:rPr>
+              <w:t xml:space="preserve">brandklasse</w:t>
+            </w:r>
+          </w:p>
+        </w:tc>
+        <w:tc>
+          <w:tcPr>
+            <w:tcW w:type="dxa" w:w="5960"/>
+            <w:tcBorders>
+              <w:top w:val="single" w:color="CCCCCC" w:sz="1"/>
+              <w:left w:val="single" w:color="CCCCCC" w:sz="1"/>
+              <w:bottom w:val="single" w:color="CCCCCC" w:sz="1"/>
+              <w:right w:val="single" w:color="CCCCCC" w:sz="1"/>
+            </w:tcBorders>
+            <w:tcMar>
+              <w:top w:type="dxa" w:w="60"/>
+              <w:left w:type="dxa" w:w="110"/>
+              <w:bottom w:type="dxa" w:w="60"/>
+              <w:right w:type="dxa" w:w="110"/>
+            </w:tcMar>
+          </w:tcPr>
+          <w:p>
+            <w:r>
+              <w:rPr>
+                <w:b w:val="false"/>
+                <w:bCs w:val="false"/>
+                <w:color w:val="1C2430"/>
+                <w:sz w:val="20"/>
+                <w:szCs w:val="20"/>
+              </w:rPr>
+              <w:t xml:space="preserve">F0 | F30; Planungskennzeichnung, wird ausschließlich in Modul 1 gewählt; fehlt sie, gilt F0</w:t>
+            </w:r>
+          </w:p>
+        </w:tc>
+      </w:tr>
+      <w:tr>
+        <w:tc>
+          <w:tcPr>
+            <w:tcW w:type="dxa" w:w="3400"/>
+            <w:tcBorders>
+              <w:top w:val="single" w:color="CCCCCC" w:sz="1"/>
+              <w:left w:val="single" w:color="CCCCCC" w:sz="1"/>
+              <w:bottom w:val="single" w:color="CCCCCC" w:sz="1"/>
+              <w:right w:val="single" w:color="CCCCCC" w:sz="1"/>
+            </w:tcBorders>
+            <w:tcMar>
+              <w:top w:type="dxa" w:w="60"/>
+              <w:left w:type="dxa" w:w="110"/>
+              <w:bottom w:type="dxa" w:w="60"/>
+              <w:right w:type="dxa" w:w="110"/>
+            </w:tcMar>
+          </w:tcPr>
+          <w:p>
+            <w:r>
+              <w:rPr>
+                <w:rFonts w:ascii="Consolas" w:cs="Consolas" w:eastAsia="Consolas" w:hAnsi="Consolas"/>
+                <w:b w:val="false"/>
+                <w:bCs w:val="false"/>
+                <w:color w:val="0B3A73"/>
+                <w:sz w:val="20"/>
+                <w:szCs w:val="20"/>
+              </w:rPr>
               <w:t xml:space="preserve">prestress</w:t>
             </w:r>
           </w:p>
@@ -8455,6 +8516,106 @@
           <w:b/>
           <w:bCs/>
         </w:rPr>
+        <w:t xml:space="preserve">Brandschutzklassifikation je Wand (Issue #79):</w:t>
+      </w:r>
+      <w:r>
+        <w:t xml:space="preserve"> Jede Wand trägt die Klassifikation </w:t>
+      </w:r>
+      <w:r>
+        <w:rPr>
+          <w:b/>
+          <w:bCs/>
+        </w:rPr>
+        <w:t xml:space="preserve">F0</w:t>
+      </w:r>
+      <w:r>
+        <w:t xml:space="preserve"> oder </w:t>
+      </w:r>
+      <w:r>
+        <w:rPr>
+          <w:b/>
+          <w:bCs/>
+        </w:rPr>
+        <w:t xml:space="preserve">F30</w:t>
+      </w:r>
+      <w:r>
+        <w:t xml:space="preserve">; gewählt wird sie hier und </w:t>
+      </w:r>
+      <w:r>
+        <w:rPr>
+          <w:b/>
+          <w:bCs/>
+        </w:rPr>
+        <w:t xml:space="preserve">nur</w:t>
+      </w:r>
+      <w:r>
+        <w:t xml:space="preserve"> hier, der Geschosseditor führt sie beim Neuaufbau unverändert mit. Sie ist eine reine </w:t>
+      </w:r>
+      <w:r>
+        <w:rPr>
+          <w:b/>
+          <w:bCs/>
+        </w:rPr>
+        <w:t xml:space="preserve">Planungskennzeichnung</w:t>
+      </w:r>
+      <w:r>
+        <w:t xml:space="preserve">: aus ihr wird </w:t>
+      </w:r>
+      <w:r>
+        <w:rPr>
+          <w:b/>
+          <w:bCs/>
+        </w:rPr>
+        <w:t xml:space="preserve">kein</w:t>
+      </w:r>
+      <w:r>
+        <w:t xml:space="preserve"> Nachweis, </w:t>
+      </w:r>
+      <w:r>
+        <w:rPr>
+          <w:b/>
+          <w:bCs/>
+        </w:rPr>
+        <w:t xml:space="preserve">keine</w:t>
+      </w:r>
+      <w:r>
+        <w:t xml:space="preserve"> Freigabe und </w:t>
+      </w:r>
+      <w:r>
+        <w:rPr>
+          <w:b/>
+          <w:bCs/>
+        </w:rPr>
+        <w:t xml:space="preserve">keine</w:t>
+      </w:r>
+      <w:r>
+        <w:t xml:space="preserve"> Materialregel abgeleitet, und Tiling, Vorspannung, Stückliste und statischer Nachweis rechnen unverändert. Der Standard ist </w:t>
+      </w:r>
+      <w:r>
+        <w:rPr>
+          <w:b/>
+          <w:bCs/>
+        </w:rPr>
+        <w:t xml:space="preserve">F0</w:t>
+      </w:r>
+      <w:r>
+        <w:t xml:space="preserve"> – auch für jede Wand ohne ausdrückliche Angabe; ein bestehender Stand wird nie still auf F30 gesetzt und nie als geprüft dargestellt. Vererbt wird nichts: weder Geschoss noch Projekt geben die Klassifikation vor.</w:t>
+      </w:r>
+    </w:p>
+    <w:p>
+      <w:pPr>
+        <w:pStyle w:val="ListParagraph"/>
+        <w:numPr>
+          <w:ilvl w:val="0"/>
+          <w:numId w:val="2"/>
+        </w:numPr>
+        <w:spacing w:after="60"/>
+      </w:pPr>
+      <w:r>
+        <w:rPr>
+          <w:b/>
+          <w:bCs/>
+        </w:rPr>
         <w:t xml:space="preserve">Reststück am oberen Wandabschluss ([Z-6]):</w:t>
       </w:r>
       <w:r>
@@ -12543,6 +12704,325 @@
       </w:r>
       <w:r>
         <w:t xml:space="preserve"> Wandtyp wird ausschließlich in Modul 0 gewählt; Modul 1 führt ihn unverändert mit, Modul 3 liest ihn einschließlich Geometrie und Öffnungszahl read-only.</w:t>
+      </w:r>
+    </w:p>
+    <w:p>
+      <w:pPr>
+        <w:pBdr>
+          <w:left w:val="single" w:color="E0B400" w:sz="18" w:space="6"/>
+        </w:pBdr>
+        <w:shd w:fill="FFF8E6" w:val="clear"/>
+        <w:spacing w:after="120" w:before="80"/>
+      </w:pPr>
+      <w:r>
+        <w:rPr>
+          <w:b/>
+          <w:bCs/>
+        </w:rPr>
+        <w:t xml:space="preserve">Brandschutzklassifikation als Planungskennzeichnung (Issue #79, 2026-08-14).</w:t>
+      </w:r>
+      <w:r>
+        <w:t xml:space="preserve"> Jede Wand trägt am Wandelement das Feld `brandklasse` mit </w:t>
+      </w:r>
+      <w:r>
+        <w:rPr>
+          <w:b/>
+          <w:bCs/>
+        </w:rPr>
+        <w:t xml:space="preserve">genau</w:t>
+      </w:r>
+      <w:r>
+        <w:t xml:space="preserve"> den Werten </w:t>
+      </w:r>
+      <w:r>
+        <w:rPr>
+          <w:b/>
+          <w:bCs/>
+        </w:rPr>
+        <w:t xml:space="preserve">F0</w:t>
+      </w:r>
+      <w:r>
+        <w:t xml:space="preserve"> und </w:t>
+      </w:r>
+      <w:r>
+        <w:rPr>
+          <w:b/>
+          <w:bCs/>
+        </w:rPr>
+        <w:t xml:space="preserve">F30</w:t>
+      </w:r>
+      <w:r>
+        <w:t xml:space="preserve">. Es begründet </w:t>
+      </w:r>
+      <w:r>
+        <w:rPr>
+          <w:b/>
+          <w:bCs/>
+        </w:rPr>
+        <w:t xml:space="preserve">keine neue Fachregel</w:t>
+      </w:r>
+      <w:r>
+        <w:t xml:space="preserve">: aus der Klassifikation wird </w:t>
+      </w:r>
+      <w:r>
+        <w:rPr>
+          <w:b/>
+          <w:bCs/>
+        </w:rPr>
+        <w:t xml:space="preserve">kein</w:t>
+      </w:r>
+      <w:r>
+        <w:t xml:space="preserve"> Nachweis, </w:t>
+      </w:r>
+      <w:r>
+        <w:rPr>
+          <w:b/>
+          <w:bCs/>
+        </w:rPr>
+        <w:t xml:space="preserve">keine</w:t>
+      </w:r>
+      <w:r>
+        <w:t xml:space="preserve"> Freigabe und </w:t>
+      </w:r>
+      <w:r>
+        <w:rPr>
+          <w:b/>
+          <w:bCs/>
+        </w:rPr>
+        <w:t xml:space="preserve">keine</w:t>
+      </w:r>
+      <w:r>
+        <w:t xml:space="preserve"> Materialregel abgeleitet, und sie verändert </w:t>
+      </w:r>
+      <w:r>
+        <w:rPr>
+          <w:b/>
+          <w:bCs/>
+        </w:rPr>
+        <w:t xml:space="preserve">keine</w:t>
+      </w:r>
+      <w:r>
+        <w:t xml:space="preserve"> Menge, </w:t>
+      </w:r>
+      <w:r>
+        <w:rPr>
+          <w:b/>
+          <w:bCs/>
+        </w:rPr>
+        <w:t xml:space="preserve">keine</w:t>
+      </w:r>
+      <w:r>
+        <w:t xml:space="preserve"> Geometrie und </w:t>
+      </w:r>
+      <w:r>
+        <w:rPr>
+          <w:b/>
+          <w:bCs/>
+        </w:rPr>
+        <w:t xml:space="preserve">kein</w:t>
+      </w:r>
+      <w:r>
+        <w:t xml:space="preserve"> Nachweisergebnis – Tiling, Vorspannung, Stückliste und statischer Nachweis rechnen unverändert. Sie ist deshalb – wie Wandtyp und Abdichtung – bewusst </w:t>
+      </w:r>
+      <w:r>
+        <w:rPr>
+          <w:b/>
+          <w:bCs/>
+        </w:rPr>
+        <w:t xml:space="preserve">nicht</w:t>
+      </w:r>
+      <w:r>
+        <w:t xml:space="preserve"> Teil des Rechenkerns. Gewählt wird sie </w:t>
+      </w:r>
+      <w:r>
+        <w:rPr>
+          <w:b/>
+          <w:bCs/>
+        </w:rPr>
+        <w:t xml:space="preserve">ausschließlich in Modul 1</w:t>
+      </w:r>
+      <w:r>
+        <w:t xml:space="preserve"> (ein Schreibweg, </w:t>
+      </w:r>
+      <w:r>
+        <w:rPr>
+          <w:b/>
+          <w:bCs/>
+        </w:rPr>
+        <w:t xml:space="preserve">[P-1]</w:t>
+      </w:r>
+      <w:r>
+        <w:t xml:space="preserve">); der Geschosseditor </w:t>
+      </w:r>
+      <w:r>
+        <w:rPr>
+          <w:b/>
+          <w:bCs/>
+        </w:rPr>
+        <w:t xml:space="preserve">führt sie beim Neuaufbau unverändert mit</w:t>
+      </w:r>
+      <w:r>
+        <w:t xml:space="preserve">, ohne sie zu wählen. Der Standard ist der zurückhaltende Fall: fehlt das Feld – neu angelegte Wand, Altbestand, importierte Datei ohne das Feld –, gilt beim Lesen </w:t>
+      </w:r>
+      <w:r>
+        <w:rPr>
+          <w:b/>
+          <w:bCs/>
+        </w:rPr>
+        <w:t xml:space="preserve">F0</w:t>
+      </w:r>
+      <w:r>
+        <w:t xml:space="preserve">. Ein Altbestand wird </w:t>
+      </w:r>
+      <w:r>
+        <w:rPr>
+          <w:b/>
+          <w:bCs/>
+        </w:rPr>
+        <w:t xml:space="preserve">nie</w:t>
+      </w:r>
+      <w:r>
+        <w:t xml:space="preserve"> als F30 und </w:t>
+      </w:r>
+      <w:r>
+        <w:rPr>
+          <w:b/>
+          <w:bCs/>
+        </w:rPr>
+        <w:t xml:space="preserve">nie</w:t>
+      </w:r>
+      <w:r>
+        <w:t xml:space="preserve"> als geprüft dargestellt (</w:t>
+      </w:r>
+      <w:r>
+        <w:rPr>
+          <w:b/>
+          <w:bCs/>
+        </w:rPr>
+        <w:t xml:space="preserve">[P-9]</w:t>
+      </w:r>
+      <w:r>
+        <w:t xml:space="preserve">). Normalisiert wird an </w:t>
+      </w:r>
+      <w:r>
+        <w:rPr>
+          <w:b/>
+          <w:bCs/>
+        </w:rPr>
+        <w:t xml:space="preserve">genau einer</w:t>
+      </w:r>
+      <w:r>
+        <w:t xml:space="preserve"> kanonischen Stelle der Speicherschicht und </w:t>
+      </w:r>
+      <w:r>
+        <w:rPr>
+          <w:b/>
+          <w:bCs/>
+        </w:rPr>
+        <w:t xml:space="preserve">nur beim Lesen</w:t>
+      </w:r>
+      <w:r>
+        <w:t xml:space="preserve">: ein gespeichertes Wandelement wird nicht stillschweigend umgeschrieben, und weil es – anders als beim Wandtyp – </w:t>
+      </w:r>
+      <w:r>
+        <w:rPr>
+          <w:b/>
+          <w:bCs/>
+        </w:rPr>
+        <w:t xml:space="preserve">kein</w:t>
+      </w:r>
+      <w:r>
+        <w:t xml:space="preserve"> Alt-Feld gibt, aus dem sich etwas ableiten ließe, entfällt jede Migration. Das Feld liegt </w:t>
+      </w:r>
+      <w:r>
+        <w:rPr>
+          <w:b/>
+          <w:bCs/>
+        </w:rPr>
+        <w:t xml:space="preserve">nicht</w:t>
+      </w:r>
+      <w:r>
+        <w:t xml:space="preserve"> in `eingaben`, </w:t>
+      </w:r>
+      <w:r>
+        <w:rPr>
+          <w:b/>
+          <w:bCs/>
+        </w:rPr>
+        <w:t xml:space="preserve">nicht</w:t>
+      </w:r>
+      <w:r>
+        <w:t xml:space="preserve"> in der Projektmappe und </w:t>
+      </w:r>
+      <w:r>
+        <w:rPr>
+          <w:b/>
+          <w:bCs/>
+        </w:rPr>
+        <w:t xml:space="preserve">nicht</w:t>
+      </w:r>
+      <w:r>
+        <w:t xml:space="preserve"> im Bauteilkatalog; es ist im öffentlichen Projektformat </w:t>
+      </w:r>
+      <w:r>
+        <w:rPr>
+          <w:b/>
+          <w:bCs/>
+        </w:rPr>
+        <w:t xml:space="preserve">optional</w:t>
+      </w:r>
+      <w:r>
+        <w:t xml:space="preserve"> und begründet daher </w:t>
+      </w:r>
+      <w:r>
+        <w:rPr>
+          <w:b/>
+          <w:bCs/>
+        </w:rPr>
+        <w:t xml:space="preserve">keinen</w:t>
+      </w:r>
+      <w:r>
+        <w:t xml:space="preserve"> Versionssprung (</w:t>
+      </w:r>
+      <w:r>
+        <w:rPr>
+          <w:b/>
+          <w:bCs/>
+        </w:rPr>
+        <w:t xml:space="preserve">[P-2]</w:t>
+      </w:r>
+      <w:r>
+        <w:t xml:space="preserve">, </w:t>
+      </w:r>
+      <w:r>
+        <w:rPr>
+          <w:b/>
+          <w:bCs/>
+        </w:rPr>
+        <w:t xml:space="preserve">[P-10]</w:t>
+      </w:r>
+      <w:r>
+        <w:t xml:space="preserve">). Die farbliche und textliche </w:t>
+      </w:r>
+      <w:r>
+        <w:rPr>
+          <w:b/>
+          <w:bCs/>
+        </w:rPr>
+        <w:t xml:space="preserve">Darstellung</w:t>
+      </w:r>
+      <w:r>
+        <w:t xml:space="preserve"> in Geschosseditor, Lageplan (Modul 9) und technischer Zeichnung (Modul 7) ist ausdrücklich </w:t>
+      </w:r>
+      <w:r>
+        <w:rPr>
+          <w:b/>
+          <w:bCs/>
+        </w:rPr>
+        <w:t xml:space="preserve">noch nicht</w:t>
+      </w:r>
+      <w:r>
+        <w:t xml:space="preserve"> Gegenstand dieser Fassung und folgt getrennt.</w:t>
       </w:r>
     </w:p>
     <w:p>

</xml_diff>

<commit_message>
Menge je Stuecklistenposition uebersteuerbar (#81)
Modul 4 kann je Position eine manuelle Menge tragen; die berechnete Menge
bleibt unveraendert daneben sichtbar und wird nie ueberschrieben. Jede
Uebersteuerung ist einzeln aenderbar und rueckseterbar, gebunden an
Stuecklistenschluessel + Fertigmass, gespeichert wandbezogen in
eingaben.kosten.mengen ([P-20], Modul 4 als einziger Schreibweg). Nicht
zuordenbare und unzulaessige Eintraege werden benannt und nie still
entfernt oder umgehaengt; krumme und negative Werte werden abgewiesen.
Core, Engine, sembla-bom.js, Katalog, Preisaufloesung ([P-14]) und der
zentrale Export bleiben unberuehrt; kein Schema- oder Formatversionssprung.

Co-Authored-By: Claude Opus 5 <noreply@anthropic.com>
Claude-Session: https://claude.ai/code/session_01Xw5RGdXXRqx94w6u269iGE
</commit_message>
<xml_diff>
--- a/doku/SEMBLA_Handbuch.docx
+++ b/doku/SEMBLA_Handbuch.docx
@@ -9282,6 +9282,36 @@
         <w:spacing w:after="60"/>
       </w:pPr>
       <w:r>
+        <w:rPr>
+          <w:b/>
+          <w:bCs/>
+        </w:rPr>
+        <w:t xml:space="preserve">Manuelle Menge je Position ([P-20]):</w:t>
+      </w:r>
+      <w:r>
+        <w:t xml:space="preserve"> Zu jeder Zeile lässt sich eine übersteuernde Menge eintragen, wenn auf der Baustelle eine andere Stückzahl gebraucht wird als die Rechnung ergibt. Die berechnete Menge bleibt daneben sichtbar stehen und wird nie überschrieben; die Zeile ist als übersteuert gekennzeichnet, und jede Übersteuerung lässt sich einzeln ändern und einzeln zurücksetzen. Zulässig sind ganze Zahlen ab 0 – ein anderer Wert wird benannt abgewiesen und ändert nichts. Modul 4 ist der </w:t>
+      </w:r>
+      <w:r>
+        <w:rPr>
+          <w:b/>
+          <w:bCs/>
+        </w:rPr>
+        <w:t xml:space="preserve">einzige Schreibweg</w:t>
+      </w:r>
+      <w:r>
+        <w:t xml:space="preserve">; gespeichert wird wandbezogen unter eingaben.kosten, das Wandelement bleibt unberührt. Der Gesamtpreis der Zeile folgt der wirksamen Menge bei unverändertem Einzelpreis ([P-14]). Auf den Gesamtebenen und in den Exportdateien des zentralen ZIP stehen weiterhin die berechneten Mengen – das Blatt sagt das ausdrücklich. Eine gespeicherte Übersteuerung, die zu keiner gerechneten Position mehr passt, wird namentlich gemeldet und weder gelöscht noch umgehängt.</w:t>
+      </w:r>
+    </w:p>
+    <w:p>
+      <w:pPr>
+        <w:pStyle w:val="ListParagraph"/>
+        <w:numPr>
+          <w:ilvl w:val="0"/>
+          <w:numId w:val="2"/>
+        </w:numPr>
+        <w:spacing w:after="60"/>
+      </w:pPr>
+      <w:r>
         <w:t xml:space="preserve">Reiner Konsument: liest das aktive Wandelement, schreibt es nicht zurück. Dieselbe BOM-Quelle nutzt auch die Kurz-Stückliste in der Montage (Modul 5) – konsistent und driftfrei.</w:t>
       </w:r>
     </w:p>
@@ -14311,6 +14341,428 @@
       </w:r>
       <w:r>
         <w:t xml:space="preserve">: eine gespeicherte ID wäre eine zweite Wahrheit neben dem Wandelement und würde bei jeder Neuberechnung der Wand veralten.</w:t>
+      </w:r>
+    </w:p>
+    <w:p>
+      <w:pPr>
+        <w:pStyle w:val="ListParagraph"/>
+        <w:numPr>
+          <w:ilvl w:val="0"/>
+          <w:numId w:val="2"/>
+        </w:numPr>
+        <w:spacing w:after="60"/>
+      </w:pPr>
+      <w:r>
+        <w:rPr>
+          <w:b/>
+          <w:bCs/>
+        </w:rPr>
+        <w:t xml:space="preserve">[P-20]</w:t>
+      </w:r>
+      <w:r>
+        <w:t xml:space="preserve"> </w:t>
+      </w:r>
+      <w:r>
+        <w:rPr>
+          <w:b/>
+          <w:bCs/>
+        </w:rPr>
+        <w:t xml:space="preserve">Übersteuerbare Menge je Stücklistenposition.</w:t>
+      </w:r>
+      <w:r>
+        <w:t xml:space="preserve"> Die </w:t>
+      </w:r>
+      <w:r>
+        <w:rPr>
+          <w:b/>
+          <w:bCs/>
+        </w:rPr>
+        <w:t xml:space="preserve">berechnete</w:t>
+      </w:r>
+      <w:r>
+        <w:t xml:space="preserve"> Menge einer Stücklistenposition bleibt </w:t>
+      </w:r>
+      <w:r>
+        <w:rPr>
+          <w:b/>
+          <w:bCs/>
+        </w:rPr>
+        <w:t xml:space="preserve">ausschließlich abgeleitet</w:t>
+      </w:r>
+      <w:r>
+        <w:t xml:space="preserve"> (</w:t>
+      </w:r>
+      <w:r>
+        <w:rPr>
+          <w:b/>
+          <w:bCs/>
+        </w:rPr>
+        <w:t xml:space="preserve">[P-6]</w:t>
+      </w:r>
+      <w:r>
+        <w:t xml:space="preserve">, </w:t>
+      </w:r>
+      <w:r>
+        <w:rPr>
+          <w:b/>
+          <w:bCs/>
+        </w:rPr>
+        <w:t xml:space="preserve">[P-19]</w:t>
+      </w:r>
+      <w:r>
+        <w:t xml:space="preserve">): sie entsteht aus dem Wandelement über den gemeinsamen Stücklisten-Baustein und wird bei jeder Ausgabe neu gerechnet. Daneben – und ausdrücklich </w:t>
+      </w:r>
+      <w:r>
+        <w:rPr>
+          <w:b/>
+          <w:bCs/>
+        </w:rPr>
+        <w:t xml:space="preserve">nicht an ihrer Stelle</w:t>
+      </w:r>
+      <w:r>
+        <w:t xml:space="preserve"> – darf zu jeder Position eine </w:t>
+      </w:r>
+      <w:r>
+        <w:rPr>
+          <w:b/>
+          <w:bCs/>
+        </w:rPr>
+        <w:t xml:space="preserve">manuelle Menge</w:t>
+      </w:r>
+      <w:r>
+        <w:t xml:space="preserve"> gesetzt werden, wenn auf der Baustelle nachweislich eine andere Stückzahl gebraucht wird (Bruch, Reserve, vorhandenes Material). Dabei gilt: </w:t>
+      </w:r>
+      <w:r>
+        <w:rPr>
+          <w:b/>
+          <w:bCs/>
+        </w:rPr>
+        <w:t xml:space="preserve">beide Werte werden gleichzeitig ausgewiesen</w:t>
+      </w:r>
+      <w:r>
+        <w:t xml:space="preserve"> – der wirksame und der berechnete –, die Übersteuerung ist als solche </w:t>
+      </w:r>
+      <w:r>
+        <w:rPr>
+          <w:b/>
+          <w:bCs/>
+        </w:rPr>
+        <w:t xml:space="preserve">gekennzeichnet</w:t>
+      </w:r>
+      <w:r>
+        <w:t xml:space="preserve">, und die berechnete Menge wird </w:t>
+      </w:r>
+      <w:r>
+        <w:rPr>
+          <w:b/>
+          <w:bCs/>
+        </w:rPr>
+        <w:t xml:space="preserve">nie</w:t>
+      </w:r>
+      <w:r>
+        <w:t xml:space="preserve"> überschrieben, ersetzt oder nachgeführt. Jede Übersteuerung ist </w:t>
+      </w:r>
+      <w:r>
+        <w:rPr>
+          <w:b/>
+          <w:bCs/>
+        </w:rPr>
+        <w:t xml:space="preserve">einzeln änderbar und einzeln rücksetzbar</w:t>
+      </w:r>
+      <w:r>
+        <w:t xml:space="preserve">; nach dem Zurücksetzen gilt wieder die berechnete Menge, ohne Rest. Zulässig ist ausschließlich eine </w:t>
+      </w:r>
+      <w:r>
+        <w:rPr>
+          <w:b/>
+          <w:bCs/>
+        </w:rPr>
+        <w:t xml:space="preserve">ganze Zahl ab 0</w:t>
+      </w:r>
+      <w:r>
+        <w:t xml:space="preserve">; ein nicht ganzzahliger oder negativer Wert wird </w:t>
+      </w:r>
+      <w:r>
+        <w:rPr>
+          <w:b/>
+          <w:bCs/>
+        </w:rPr>
+        <w:t xml:space="preserve">benannt abgewiesen</w:t>
+      </w:r>
+      <w:r>
+        <w:t xml:space="preserve"> und ändert nichts – er wird </w:t>
+      </w:r>
+      <w:r>
+        <w:rPr>
+          <w:b/>
+          <w:bCs/>
+        </w:rPr>
+        <w:t xml:space="preserve">nicht</w:t>
+      </w:r>
+      <w:r>
+        <w:t xml:space="preserve"> gerundet (</w:t>
+      </w:r>
+      <w:r>
+        <w:rPr>
+          <w:b/>
+          <w:bCs/>
+        </w:rPr>
+        <w:t xml:space="preserve">[P-9]</w:t>
+      </w:r>
+      <w:r>
+        <w:t xml:space="preserve">). Gebunden wird die Angabe an die </w:t>
+      </w:r>
+      <w:r>
+        <w:rPr>
+          <w:b/>
+          <w:bCs/>
+        </w:rPr>
+        <w:t xml:space="preserve">stabile Positionskennung aus Stücklistenschlüssel und Fertigmaß</w:t>
+      </w:r>
+      <w:r>
+        <w:t xml:space="preserve">, weil mehrere Positionen denselben Schlüssel tragen und sich nur im Fertigmaß unterscheiden (</w:t>
+      </w:r>
+      <w:r>
+        <w:rPr>
+          <w:b/>
+          <w:bCs/>
+        </w:rPr>
+        <w:t xml:space="preserve">[Z-2]</w:t>
+      </w:r>
+      <w:r>
+        <w:t xml:space="preserve">); Bezeichnung, Produkt und Preis taugen als Kennung nicht, weil sie mit Katalog und Darstellung wandern. Eine gespeicherte Übersteuerung, die in der </w:t>
+      </w:r>
+      <w:r>
+        <w:rPr>
+          <w:b/>
+          <w:bCs/>
+        </w:rPr>
+        <w:t xml:space="preserve">neu gerechneten</w:t>
+      </w:r>
+      <w:r>
+        <w:t xml:space="preserve"> Stückliste zu keiner Position mehr passt, wird </w:t>
+      </w:r>
+      <w:r>
+        <w:rPr>
+          <w:b/>
+          <w:bCs/>
+        </w:rPr>
+        <w:t xml:space="preserve">namentlich gemeldet</w:t>
+      </w:r>
+      <w:r>
+        <w:t xml:space="preserve">, bleibt erhalten und wird </w:t>
+      </w:r>
+      <w:r>
+        <w:rPr>
+          <w:b/>
+          <w:bCs/>
+        </w:rPr>
+        <w:t xml:space="preserve">niemals auf eine andere Position umgehängt</w:t>
+      </w:r>
+      <w:r>
+        <w:t xml:space="preserve"> oder stillschweigend gelöscht; dasselbe gilt für einen unzulässig gespeicherten Wert. Die Angabe ist </w:t>
+      </w:r>
+      <w:r>
+        <w:rPr>
+          <w:b/>
+          <w:bCs/>
+        </w:rPr>
+        <w:t xml:space="preserve">wandbezogen</w:t>
+      </w:r>
+      <w:r>
+        <w:t xml:space="preserve"> und liegt im Eingabenabschnitt der Wand (eingaben.kosten); </w:t>
+      </w:r>
+      <w:r>
+        <w:rPr>
+          <w:b/>
+          <w:bCs/>
+        </w:rPr>
+        <w:t xml:space="preserve">Modul 4 ist ihr einziger Schreibweg</w:t>
+      </w:r>
+      <w:r>
+        <w:t xml:space="preserve">, und Wandelement, Projektmappe und Bauteilkatalog bleiben unberührt (</w:t>
+      </w:r>
+      <w:r>
+        <w:rPr>
+          <w:b/>
+          <w:bCs/>
+        </w:rPr>
+        <w:t xml:space="preserve">[P-1]</w:t>
+      </w:r>
+      <w:r>
+        <w:t xml:space="preserve">, </w:t>
+      </w:r>
+      <w:r>
+        <w:rPr>
+          <w:b/>
+          <w:bCs/>
+        </w:rPr>
+        <w:t xml:space="preserve">[P-10]</w:t>
+      </w:r>
+      <w:r>
+        <w:t xml:space="preserve">, </w:t>
+      </w:r>
+      <w:r>
+        <w:rPr>
+          <w:b/>
+          <w:bCs/>
+        </w:rPr>
+        <w:t xml:space="preserve">[K-10]</w:t>
+      </w:r>
+      <w:r>
+        <w:t xml:space="preserve">). Der </w:t>
+      </w:r>
+      <w:r>
+        <w:rPr>
+          <w:b/>
+          <w:bCs/>
+        </w:rPr>
+        <w:t xml:space="preserve">Gesamtpreis</w:t>
+      </w:r>
+      <w:r>
+        <w:t xml:space="preserve"> einer übersteuerten Zeile folgt der wirksamen Menge bei </w:t>
+      </w:r>
+      <w:r>
+        <w:rPr>
+          <w:b/>
+          <w:bCs/>
+        </w:rPr>
+        <w:t xml:space="preserve">unverändertem</w:t>
+      </w:r>
+      <w:r>
+        <w:t xml:space="preserve"> Einzelpreis; die Preisauflösung selbst bleibt bit-genau die aus </w:t>
+      </w:r>
+      <w:r>
+        <w:rPr>
+          <w:b/>
+          <w:bCs/>
+        </w:rPr>
+        <w:t xml:space="preserve">[P-14]</w:t>
+      </w:r>
+      <w:r>
+        <w:t xml:space="preserve"> – eine Übersteuerung wählt </w:t>
+      </w:r>
+      <w:r>
+        <w:rPr>
+          <w:b/>
+          <w:bCs/>
+        </w:rPr>
+        <w:t xml:space="preserve">kein</w:t>
+      </w:r>
+      <w:r>
+        <w:t xml:space="preserve"> anderes Produkt und erzeugt </w:t>
+      </w:r>
+      <w:r>
+        <w:rPr>
+          <w:b/>
+          <w:bCs/>
+        </w:rPr>
+        <w:t xml:space="preserve">keinen</w:t>
+      </w:r>
+      <w:r>
+        <w:t xml:space="preserve"> Preis. Wo die Übersteuerung </w:t>
+      </w:r>
+      <w:r>
+        <w:rPr>
+          <w:b/>
+          <w:bCs/>
+        </w:rPr>
+        <w:t xml:space="preserve">nicht</w:t>
+      </w:r>
+      <w:r>
+        <w:t xml:space="preserve"> wirkt – auf den Mengenebenen über der Wand und in den Stücklistendateien des zentralen Exports –, wird das am Blatt </w:t>
+      </w:r>
+      <w:r>
+        <w:rPr>
+          <w:b/>
+          <w:bCs/>
+        </w:rPr>
+        <w:t xml:space="preserve">gesagt</w:t>
+      </w:r>
+      <w:r>
+        <w:t xml:space="preserve">, statt es zu unterschlagen. Im öffentlichen Projektformat ist der Abschnitt </w:t>
+      </w:r>
+      <w:r>
+        <w:rPr>
+          <w:b/>
+          <w:bCs/>
+        </w:rPr>
+        <w:t xml:space="preserve">optional</w:t>
+      </w:r>
+      <w:r>
+        <w:t xml:space="preserve">: ein Projekt ohne ihn lädt unverändert und ohne Übersteuerungen, ein Versionssprung entsteht dadurch nicht (</w:t>
+      </w:r>
+      <w:r>
+        <w:rPr>
+          <w:b/>
+          <w:bCs/>
+        </w:rPr>
+        <w:t xml:space="preserve">[P-2]</w:t>
+      </w:r>
+      <w:r>
+        <w:t xml:space="preserve">). Priorität: Mengen- und Ausweisungsregel (Hierarchiestufe 3) – sie ändert </w:t>
+      </w:r>
+      <w:r>
+        <w:rPr>
+          <w:b/>
+          <w:bCs/>
+        </w:rPr>
+        <w:t xml:space="preserve">keine</w:t>
+      </w:r>
+      <w:r>
+        <w:t xml:space="preserve"> Geometrie, </w:t>
+      </w:r>
+      <w:r>
+        <w:rPr>
+          <w:b/>
+          <w:bCs/>
+        </w:rPr>
+        <w:t xml:space="preserve">keinen</w:t>
+      </w:r>
+      <w:r>
+        <w:t xml:space="preserve"> Nachweis und </w:t>
+      </w:r>
+      <w:r>
+        <w:rPr>
+          <w:b/>
+          <w:bCs/>
+        </w:rPr>
+        <w:t xml:space="preserve">keine berechnete</w:t>
+      </w:r>
+      <w:r>
+        <w:t xml:space="preserve"> Menge, sondern ausschließlich die zusätzlich ausgewiesene wirksame Menge.</w:t>
+      </w:r>
+    </w:p>
+    <w:p>
+      <w:pPr>
+        <w:pBdr>
+          <w:left w:val="single" w:color="E0B400" w:sz="18" w:space="6"/>
+        </w:pBdr>
+        <w:shd w:fill="FFF8E6" w:val="clear"/>
+        <w:spacing w:after="120" w:before="80"/>
+      </w:pPr>
+      <w:r>
+        <w:t xml:space="preserve">Herkunft [P-20]: Issue #81 mit dem fachlichen Gate vom 2026-08-14, das als minimalen Umfang ausdrücklich die Menge nennt. Die Baustellenstückliste war bis dahin in jeder Zeile unveränderlich abgeleitet – eine auf der Baustelle notwendige Abweichung ließ sich nur erzeugen, indem die Planung selbst verbogen wurde, was den Originalwert vernichtet hätte. Es fehlte die Regel, dass ein Zusatzwert </w:t>
+      </w:r>
+      <w:r>
+        <w:rPr>
+          <w:b/>
+          <w:bCs/>
+        </w:rPr>
+        <w:t xml:space="preserve">neben</w:t>
+      </w:r>
+      <w:r>
+        <w:t xml:space="preserve"> dem berechneten stehen darf, woran er gebunden ist, wie er zurückgenommen wird und was mit ihm geschieht, wenn seine Position nicht mehr existiert. Ausdrücklich </w:t>
+      </w:r>
+      <w:r>
+        <w:rPr>
+          <w:b/>
+          <w:bCs/>
+        </w:rPr>
+        <w:t xml:space="preserve">nicht</w:t>
+      </w:r>
+      <w:r>
+        <w:t xml:space="preserve"> Gegenstand dieser Fassung sind: übersteuerbare Bezeichnungen, Einheiten, Preise und Einbauteil-IDs, ein Kommentarfeld je Position, eine Auswahl zwischen berechneter und angepasster Stückliste im zentralen Export sowie die Behandlung übersteuerter Mengen in einer Geschoss- oder Projektaggregation.</w:t>
       </w:r>
     </w:p>
     <w:p>

</xml_diff>

<commit_message>
Mengenfassung auch fuer die Gesamtstueckliste waehlbar (#81)
Die im Exportdialog gewaehlte Mengenfassung gilt jetzt fuer alle
Stuecklistendateien eines Exportlaufs: auch die Gesamtstueckliste von
Geschoss, Gebaeude und Projekt entsteht wahlweise berechnet (Default)
oder angepasst. Gerechnet wird die wirksame Menge weiterhin nur in
wirksameMengen(), je Wand aus deren Uebersteuerung; die Datei benennt
die Fassung im Kopf und fuehrt in der angepassten Fassung die
berechnete Menge daneben. Nicht anwendbare Uebersteuerungen stehen mit
Wandbezug im Dateikopf und vor dem Download. Modul 4 bleibt einziger
Schreibweg, die Anzeige der Gesamtebenen bleibt berechnet, kein neues
gespeichertes Feld und kein Versionssprung.

Co-Authored-By: Claude Opus 5 <noreply@anthropic.com>
Claude-Session: https://claude.ai/code/session_01UDVEaZWEv8e3G1JWETdJpK
</commit_message>
<xml_diff>
--- a/doku/SEMBLA_Handbuch.docx
+++ b/doku/SEMBLA_Handbuch.docx
@@ -9279,7 +9279,17 @@
         <w:t xml:space="preserve">Mengenfassung</w:t>
       </w:r>
       <w:r>
-        <w:t xml:space="preserve"> die aggregierte Baustellenstückliste trägt – berechnet oder angepasst –, wird beim Export ausdrücklich gewählt und im Dateikopf benannt ([P-20]); die Einzelteilliste führt stets die abgeleiteten Einzelteile. Die Latten-Zuschnittliste ist eine getrennte Ausgabe von Modul 2 und Teil keiner Stückliste.</w:t>
+        <w:t xml:space="preserve"> eine Stücklistendatei trägt – berechnet oder angepasst –, wird beim Export ausdrücklich gewählt und im Dateikopf benannt ([P-20]); die Wahl gilt für </w:t>
+      </w:r>
+      <w:r>
+        <w:rPr>
+          <w:b/>
+          <w:bCs/>
+        </w:rPr>
+        <w:t xml:space="preserve">alle</w:t>
+      </w:r>
+      <w:r>
+        <w:t xml:space="preserve"> Stücklistendateien eines Exportlaufs, also auch für die Gesamtstückliste eines Geschosses, Gebäudes oder Projekts. Die Einzelteilliste führt stets die abgeleiteten Einzelteile. Die Latten-Zuschnittliste ist eine getrennte Ausgabe von Modul 2 und Teil keiner Stückliste.</w:t>
       </w:r>
     </w:p>
     <w:p>
@@ -9309,7 +9319,27 @@
         <w:t xml:space="preserve">einzige Schreibweg</w:t>
       </w:r>
       <w:r>
-        <w:t xml:space="preserve">; gespeichert wird wandbezogen unter eingaben.kosten, das Wandelement bleibt unberührt. Der Gesamtpreis der Zeile folgt der wirksamen Menge bei unverändertem Einzelpreis ([P-14]). Auf den Gesamtebenen stehen weiterhin die berechneten Mengen; für die Stücklistendateien des zentralen ZIP wird die Fassung beim Export ausdrücklich gewählt und im Dateikopf benannt – das Blatt sagt beides ausdrücklich. Eine gespeicherte Übersteuerung, die zu keiner gerechneten Position mehr passt, wird namentlich gemeldet und weder gelöscht noch umgehängt.</w:t>
+        <w:t xml:space="preserve">; gespeichert wird wandbezogen unter eingaben.kosten, das Wandelement bleibt unberührt. Der Gesamtpreis der Zeile folgt der wirksamen Menge bei unverändertem Einzelpreis ([P-14]). </w:t>
+      </w:r>
+      <w:r>
+        <w:rPr>
+          <w:b/>
+          <w:bCs/>
+        </w:rPr>
+        <w:t xml:space="preserve">In der Anzeige</w:t>
+      </w:r>
+      <w:r>
+        <w:t xml:space="preserve"> von Modul 4 wirkt die Übersteuerung nur auf der Wandebene; die Geschoss-, Gebäude- und Projektebene zeigen weiterhin die berechneten Mengen, und das Blatt sagt es ausdrücklich. </w:t>
+      </w:r>
+      <w:r>
+        <w:rPr>
+          <w:b/>
+          <w:bCs/>
+        </w:rPr>
+        <w:t xml:space="preserve">Für die Dateien</w:t>
+      </w:r>
+      <w:r>
+        <w:t xml:space="preserve"> des zentralen ZIP wird die Fassung dagegen beim Export gewählt und im Dateikopf benannt – für die Baustellenstückliste einer Wand ebenso wie für die Gesamtstückliste eines Geschosses, Gebäudes oder Projekts. Eine gespeicherte Übersteuerung, die zu keiner gerechneten Position mehr passt, wird namentlich gemeldet und weder gelöscht noch umgehängt.</w:t>
       </w:r>
     </w:p>
     <w:p>
@@ -14910,7 +14940,17 @@
         <w:t xml:space="preserve">nicht</w:t>
       </w:r>
       <w:r>
-        <w:t xml:space="preserve"> wirkt – auf den Mengenebenen über der Wand –, wird das am Blatt </w:t>
+        <w:t xml:space="preserve"> wirkt – in der </w:t>
+      </w:r>
+      <w:r>
+        <w:rPr>
+          <w:b/>
+          <w:bCs/>
+        </w:rPr>
+        <w:t xml:space="preserve">Anzeige</w:t>
+      </w:r>
+      <w:r>
+        <w:t xml:space="preserve"> der Mengenebenen über der Wand –, wird das am Blatt </w:t>
       </w:r>
       <w:r>
         <w:rPr>
@@ -14930,7 +14970,7 @@
         <w:t xml:space="preserve">Im zentralen Export ist die Fassung ausdrücklich zu wählen:</w:t>
       </w:r>
       <w:r>
-        <w:t xml:space="preserve"> die Baustellenstückliste einer Wand entsteht wahlweise als </w:t>
+        <w:t xml:space="preserve"> eine Stückliste entsteht wahlweise als </w:t>
       </w:r>
       <w:r>
         <w:rPr>
@@ -15020,7 +15060,17 @@
         <w:t xml:space="preserve">wirksame</w:t>
       </w:r>
       <w:r>
-        <w:t xml:space="preserve"> Menge, und der </w:t>
+        <w:t xml:space="preserve"> Menge, führt die </w:t>
+      </w:r>
+      <w:r>
+        <w:rPr>
+          <w:b/>
+          <w:bCs/>
+        </w:rPr>
+        <w:t xml:space="preserve">berechnete daneben</w:t>
+      </w:r>
+      <w:r>
+        <w:t xml:space="preserve"> und der </w:t>
       </w:r>
       <w:r>
         <w:rPr>
@@ -15030,7 +15080,7 @@
         <w:t xml:space="preserve">Gesamtpreis</w:t>
       </w:r>
       <w:r>
-        <w:t xml:space="preserve"> folgt ihr bei </w:t>
+        <w:t xml:space="preserve"> folgt der wirksamen Menge bei </w:t>
       </w:r>
       <w:r>
         <w:rPr>
@@ -15130,17 +15180,77 @@
         <w:t xml:space="preserve">[P-9]</w:t>
       </w:r>
       <w:r>
-        <w:t xml:space="preserve">); sie trägt den Fassungsvermerk mit genau diesem Zusatz. Die </w:t>
-      </w:r>
-      <w:r>
-        <w:rPr>
-          <w:b/>
-          <w:bCs/>
-        </w:rPr>
-        <w:t xml:space="preserve">Mengenebenen über der Wand</w:t>
-      </w:r>
-      <w:r>
-        <w:t xml:space="preserve"> – Geschoss- und Projektaggregation – bleiben unverändert </w:t>
+        <w:t xml:space="preserve">); sie trägt den Fassungsvermerk mit genau diesem Zusatz. </w:t>
+      </w:r>
+      <w:r>
+        <w:rPr>
+          <w:b/>
+          <w:bCs/>
+        </w:rPr>
+        <w:t xml:space="preserve">Die Aggregation über mehrere Wände folgt derselben Wahl:</w:t>
+      </w:r>
+      <w:r>
+        <w:t xml:space="preserve"> die Gesamtstückliste eines Geschosses, Gebäudes oder Projekts entsteht in </w:t>
+      </w:r>
+      <w:r>
+        <w:rPr>
+          <w:b/>
+          <w:bCs/>
+        </w:rPr>
+        <w:t xml:space="preserve">genau der</w:t>
+      </w:r>
+      <w:r>
+        <w:t xml:space="preserve"> Fassung, die für den Exportlauf gewählt wurde, und </w:t>
+      </w:r>
+      <w:r>
+        <w:rPr>
+          <w:b/>
+          <w:bCs/>
+        </w:rPr>
+        <w:t xml:space="preserve">ein Exportlauf verwendet für alle enthaltenen Stücklistendateien dieselbe Fassung</w:t>
+      </w:r>
+      <w:r>
+        <w:t xml:space="preserve"> – zwei Mengenfassungen nebeneinander in derselben Unterlage sind unzulässig. In der angepassten Fassung folgt dabei jede Zeile den </w:t>
+      </w:r>
+      <w:r>
+        <w:rPr>
+          <w:b/>
+          <w:bCs/>
+        </w:rPr>
+        <w:t xml:space="preserve">wirksamen</w:t>
+      </w:r>
+      <w:r>
+        <w:t xml:space="preserve"> Mengen </w:t>
+      </w:r>
+      <w:r>
+        <w:rPr>
+          <w:b/>
+          <w:bCs/>
+        </w:rPr>
+        <w:t xml:space="preserve">ihrer jeweiligen Wände</w:t>
+      </w:r>
+      <w:r>
+        <w:t xml:space="preserve"> – die Übersteuerung bleibt wandbezogen und wird nie auf eine andere Wand übertragen –, und die berechnete Menge steht daneben. Eine nicht anwendbare Übersteuerung wird dort </w:t>
+      </w:r>
+      <w:r>
+        <w:rPr>
+          <w:b/>
+          <w:bCs/>
+        </w:rPr>
+        <w:t xml:space="preserve">mit Wandbezug</w:t>
+      </w:r>
+      <w:r>
+        <w:t xml:space="preserve"> benannt, weil die Positionskennung allein über mehrere Wände hinweg nicht auflösbar wäre. </w:t>
+      </w:r>
+      <w:r>
+        <w:rPr>
+          <w:b/>
+          <w:bCs/>
+        </w:rPr>
+        <w:t xml:space="preserve">In der Anzeige</w:t>
+      </w:r>
+      <w:r>
+        <w:t xml:space="preserve"> von Modul 4 bleiben die Mengenebenen über der Wand unverändert </w:t>
       </w:r>
       <w:r>
         <w:rPr>
@@ -15150,7 +15260,7 @@
         <w:t xml:space="preserve">berechnet</w:t>
       </w:r>
       <w:r>
-        <w:t xml:space="preserve">; ihre Behandlung ist ausdrücklich noch offen. Im öffentlichen Projektformat ist der Abschnitt </w:t>
+        <w:t xml:space="preserve">; das ist eine Anzeigeentscheidung und steht am Blatt. Im öffentlichen Projektformat ist der Abschnitt </w:t>
       </w:r>
       <w:r>
         <w:rPr>
@@ -15232,14 +15342,14 @@
         <w:t xml:space="preserve">nicht</w:t>
       </w:r>
       <w:r>
-        <w:t xml:space="preserve"> Gegenstand sind weiterhin: übersteuerbare Bezeichnungen, Einheiten, Preise und Einbauteil-IDs, ein Kommentarfeld je Position sowie die Behandlung übersteuerter Mengen in einer Geschoss- oder Projektaggregation. </w:t>
-      </w:r>
-      <w:r>
-        <w:rPr>
-          <w:b/>
-          <w:bCs/>
-        </w:rPr>
-        <w:t xml:space="preserve">Nachtrag (Bearbeitung 2026-08-16, Issue #81):</w:t>
+        <w:t xml:space="preserve"> Gegenstand sind weiterhin: übersteuerbare Bezeichnungen, Einheiten, Preise und Einbauteil-IDs sowie ein Kommentarfeld je Position. </w:t>
+      </w:r>
+      <w:r>
+        <w:rPr>
+          <w:b/>
+          <w:bCs/>
+        </w:rPr>
+        <w:t xml:space="preserve">Nachtrag 1 (Bearbeitung 2026-08-16, Issue #81):</w:t>
       </w:r>
       <w:r>
         <w:t xml:space="preserve"> Die </w:t>
@@ -15262,7 +15372,87 @@
         <w:t xml:space="preserve">Wirkungsaussage</w:t>
       </w:r>
       <w:r>
-        <w:t xml:space="preserve"> von [P-20]; Bindung an die Positionskennung, Wertprüfung, Rücknahme, Meldung nicht zuordenbarer Einträge und der einzige Schreibweg in Modul 4 bleiben unverändert. Es entsteht </w:t>
+        <w:t xml:space="preserve"> von [P-20]; Bindung an die Positionskennung, Wertprüfung, Rücknahme, Meldung nicht zuordenbarer Einträge und der einzige Schreibweg in Modul 4 bleiben unverändert. </w:t>
+      </w:r>
+      <w:r>
+        <w:rPr>
+          <w:b/>
+          <w:bCs/>
+        </w:rPr>
+        <w:t xml:space="preserve">Nachtrag 2 (Bearbeitung 2026-08-16, Issue #81):</w:t>
+      </w:r>
+      <w:r>
+        <w:t xml:space="preserve"> Die </w:t>
+      </w:r>
+      <w:r>
+        <w:rPr>
+          <w:b/>
+          <w:bCs/>
+        </w:rPr>
+        <w:t xml:space="preserve">Aggregation über mehrere Wände</w:t>
+      </w:r>
+      <w:r>
+        <w:t xml:space="preserve"> – Geschoss-, Gebäude- und Projektstückliste – war in der Fassung davor noch als „unverändert berechnet, Behandlung offen“ ausgewiesen. Sie folgt jetzt derselben ausdrücklichen Fassungswahl, und ein Exportlauf verwendet für </w:t>
+      </w:r>
+      <w:r>
+        <w:rPr>
+          <w:b/>
+          <w:bCs/>
+        </w:rPr>
+        <w:t xml:space="preserve">alle</w:t>
+      </w:r>
+      <w:r>
+        <w:t xml:space="preserve"> enthaltenen Stücklistendateien </w:t>
+      </w:r>
+      <w:r>
+        <w:rPr>
+          <w:b/>
+          <w:bCs/>
+        </w:rPr>
+        <w:t xml:space="preserve">dieselbe</w:t>
+      </w:r>
+      <w:r>
+        <w:t xml:space="preserve"> Fassung. Grund: genau die Sammelliste, die auf die Baustelle geht, führte sonst zwangsläufig andere Mengen als die Einzelwandliste desselben ZIP – zwei Mengenstände in einer Unterlage. Gerechnet wird die wirksame Menge weiterhin an </w:t>
+      </w:r>
+      <w:r>
+        <w:rPr>
+          <w:b/>
+          <w:bCs/>
+        </w:rPr>
+        <w:t xml:space="preserve">einer</w:t>
+      </w:r>
+      <w:r>
+        <w:t xml:space="preserve"> Stelle, je Wand aus </w:t>
+      </w:r>
+      <w:r>
+        <w:rPr>
+          <w:b/>
+          <w:bCs/>
+        </w:rPr>
+        <w:t xml:space="preserve">deren</w:t>
+      </w:r>
+      <w:r>
+        <w:t xml:space="preserve"> Übersteuerung; die </w:t>
+      </w:r>
+      <w:r>
+        <w:rPr>
+          <w:b/>
+          <w:bCs/>
+        </w:rPr>
+        <w:t xml:space="preserve">Anzeige</w:t>
+      </w:r>
+      <w:r>
+        <w:t xml:space="preserve"> der Gesamtebenen in Modul 4 bleibt bewusst </w:t>
+      </w:r>
+      <w:r>
+        <w:rPr>
+          <w:b/>
+          <w:bCs/>
+        </w:rPr>
+        <w:t xml:space="preserve">berechnet</w:t>
+      </w:r>
+      <w:r>
+        <w:t xml:space="preserve"> und sagt das. Es entsteht </w:t>
       </w:r>
       <w:r>
         <w:rPr>

</xml_diff>

<commit_message>
Bodenblech in reale Teile zerlegen (#91)
</commit_message>
<xml_diff>
--- a/doku/SEMBLA_Handbuch.docx
+++ b/doku/SEMBLA_Handbuch.docx
@@ -1656,7 +1656,37 @@
         <w:t xml:space="preserve">Fuß immer Bodenblech</w:t>
       </w:r>
       <w:r>
-        <w:t xml:space="preserve"> (Stahlblech 15 mm, so lang/breit wie die Wand, in Modulen der Blechlänge). Je Strang von unten eine </w:t>
+        <w:t xml:space="preserve"> (Stahlblech 15 mm, so breit wie die Wand). Es liegt über die </w:t>
+      </w:r>
+      <w:r>
+        <w:rPr>
+          <w:b/>
+          <w:bCs/>
+        </w:rPr>
+        <w:t xml:space="preserve">volle Wandlänge</w:t>
+      </w:r>
+      <w:r>
+        <w:t xml:space="preserve">, ist aber </w:t>
+      </w:r>
+      <w:r>
+        <w:rPr>
+          <w:b/>
+          <w:bCs/>
+        </w:rPr>
+        <w:t xml:space="preserve">kein durchgehendes Blech</w:t>
+      </w:r>
+      <w:r>
+        <w:t xml:space="preserve">: es besteht aus </w:t>
+      </w:r>
+      <w:r>
+        <w:rPr>
+          <w:b/>
+          <w:bCs/>
+        </w:rPr>
+        <w:t xml:space="preserve">realen Blechteilen</w:t>
+      </w:r>
+      <w:r>
+        <w:t xml:space="preserve"> aus Standardlängen und gekennzeichneten Sonderzuschnitten, siehe [A-10]…[A-12]. Je Strang von unten eine </w:t>
       </w:r>
       <w:r>
         <w:rPr>
@@ -1706,7 +1736,17 @@
         <w:t xml:space="preserve">Kopfblech</w:t>
       </w:r>
       <w:r>
-        <w:t xml:space="preserve"> (Blechmodule wie unten, Standard) oder </w:t>
+        <w:t xml:space="preserve"> (weiterhin als </w:t>
+      </w:r>
+      <w:r>
+        <w:rPr>
+          <w:b/>
+          <w:bCs/>
+        </w:rPr>
+        <w:t xml:space="preserve">Modulzählung</w:t>
+      </w:r>
+      <w:r>
+        <w:t xml:space="preserve"> aus der Blechlänge – die Zerlegung in reale Teile gilt vorerst nur für das Bodenblech, siehe [A-13]) oder </w:t>
       </w:r>
       <w:r>
         <w:rPr>
@@ -1782,7 +1822,7 @@
         <w:spacing w:after="60"/>
       </w:pPr>
       <w:r>
-        <w:t xml:space="preserve">BOM je Wand: senkkopfschrauben, kopplungsmuttern_basis, spannplatten, spannmuttern, stahlblech_module (+ stahlblech_mm, dicke), Gewindestangen (Standard + Sonderlänge).</w:t>
+        <w:t xml:space="preserve">BOM je Wand: senkkopfschrauben, kopplungsmuttern_basis, spannplatten, spannmuttern, stahlblech_module (Anzahl Bodenblechteile + Kopfblechmodule; + stahlblech_mm, dicke), Bodenblechteile je Standardlänge und je Sonder-Fertigmaß, Gewindestangen (Standard + Sonderlänge).</w:t>
       </w:r>
     </w:p>
     <w:p>
@@ -11645,14 +11685,14 @@
         <w:t xml:space="preserve">[A-1]</w:t>
       </w:r>
       <w:r>
-        <w:t xml:space="preserve"> Fuß immer Bodenblech (Stahl 15 mm, wandlang, in Blechmodulen); je Strang unten Senkkopfschraube, oben Kopplungsmutter. Bodenblech und Kopfblech sind </w:t>
-      </w:r>
-      <w:r>
-        <w:rPr>
-          <w:b/>
-          <w:bCs/>
-        </w:rPr>
-        <w:t xml:space="preserve">physisch getrennte Bauteile mit eigener Modulzahl</w:t>
+        <w:t xml:space="preserve"> Fuß immer Bodenblech (Stahl 15 mm, wandbreit); je Strang unten Senkkopfschraube, oben Kopplungsmutter. Bodenblech und Kopfblech sind </w:t>
+      </w:r>
+      <w:r>
+        <w:rPr>
+          <w:b/>
+          <w:bCs/>
+        </w:rPr>
+        <w:t xml:space="preserve">physisch getrennte Bauteile</w:t>
       </w:r>
       <w:r>
         <w:t xml:space="preserve"> (base_plate/top_plate) und erscheinen in Stückliste und Kosten als </w:t>
@@ -11665,7 +11705,7 @@
         <w:t xml:space="preserve">getrennt bepreisbare Positionen</w:t>
       </w:r>
       <w:r>
-        <w:t xml:space="preserve">. Die Trennung wird in der gemeinsamen Ausgabeschicht aus den real vorhandenen Platten des Wandelements abgeleitet; die Summe beider Positionen bleibt gleich der Gesamtmodulzahl des Rechenkerns (keine Doppelzählung, kein Core-Eingriff). </w:t>
+        <w:t xml:space="preserve">. Die Trennung wird in der gemeinsamen Ausgabeschicht aus den real vorhandenen Platten des Wandelements abgeleitet (kein zweites Mengenmodell). </w:t>
       </w:r>
       <w:r>
         <w:rPr>
@@ -11695,7 +11735,47 @@
         <w:t xml:space="preserve">volle Wandlänge</w:t>
       </w:r>
       <w:r>
-        <w:t xml:space="preserve"> unter der Wand; das </w:t>
+        <w:t xml:space="preserve"> unter der Wand, ist dabei aber </w:t>
+      </w:r>
+      <w:r>
+        <w:rPr>
+          <w:b/>
+          <w:bCs/>
+        </w:rPr>
+        <w:t xml:space="preserve">kein durchgehendes Blech</w:t>
+      </w:r>
+      <w:r>
+        <w:t xml:space="preserve"> – es besteht aus </w:t>
+      </w:r>
+      <w:r>
+        <w:rPr>
+          <w:b/>
+          <w:bCs/>
+        </w:rPr>
+        <w:t xml:space="preserve">realen Blechteilen</w:t>
+      </w:r>
+      <w:r>
+        <w:t xml:space="preserve"> nach </w:t>
+      </w:r>
+      <w:r>
+        <w:rPr>
+          <w:b/>
+          <w:bCs/>
+        </w:rPr>
+        <w:t xml:space="preserve">[A-10]</w:t>
+      </w:r>
+      <w:r>
+        <w:t xml:space="preserve">…</w:t>
+      </w:r>
+      <w:r>
+        <w:rPr>
+          <w:b/>
+          <w:bCs/>
+        </w:rPr>
+        <w:t xml:space="preserve">[A-12]</w:t>
+      </w:r>
+      <w:r>
+        <w:t xml:space="preserve"> (Standardlängen und gekennzeichnete Sonderzuschnitte), und die Stückliste weist je Länge eine eigene Position statt einer Modulzählung aus. Das </w:t>
       </w:r>
       <w:r>
         <w:rPr>
@@ -11735,7 +11815,27 @@
         <w:t xml:space="preserve">ohne schwebendes oder überragendes</w:t>
       </w:r>
       <w:r>
-        <w:t xml:space="preserve"> Stück. Rasterspalten </w:t>
+        <w:t xml:space="preserve"> Stück – und bleibt vorerst eine </w:t>
+      </w:r>
+      <w:r>
+        <w:rPr>
+          <w:b/>
+          <w:bCs/>
+        </w:rPr>
+        <w:t xml:space="preserve">Modulzählung</w:t>
+      </w:r>
+      <w:r>
+        <w:t xml:space="preserve"> (</w:t>
+      </w:r>
+      <w:r>
+        <w:rPr>
+          <w:b/>
+          <w:bCs/>
+        </w:rPr>
+        <w:t xml:space="preserve">[A-13]</w:t>
+      </w:r>
+      <w:r>
+        <w:t xml:space="preserve">). Rasterspalten </w:t>
       </w:r>
       <w:r>
         <w:rPr>
@@ -11785,7 +11885,17 @@
         <w:t xml:space="preserve">gleich</w:t>
       </w:r>
       <w:r>
-        <w:t xml:space="preserve"> top_plate.laenge_mm (im Rechenkern die Zahl belegter Rasterspalten × 125 mm), sodass Mengen und Darstellung dieselbe Kontur benutzen. Die </w:t>
+        <w:t xml:space="preserve"> top_plate.laenge_mm (im Rechenkern die Zahl belegter Rasterspalten × 125 mm), sodass Mengen und Darstellung dieselbe Kontur benutzen. bom.stahlblech_module bleibt als Aggregat erhalten und zählt </w:t>
+      </w:r>
+      <w:r>
+        <w:rPr>
+          <w:b/>
+          <w:bCs/>
+        </w:rPr>
+        <w:t xml:space="preserve">Bodenblechteile + Kopfblechmodule</w:t>
+      </w:r>
+      <w:r>
+        <w:t xml:space="preserve">. Die </w:t>
       </w:r>
       <w:r>
         <w:rPr>
@@ -12076,6 +12186,526 @@
       </w:r>
       <w:r>
         <w:t xml:space="preserve">). Priorität: Darstellungsregel (Hierarchiestufe 5) – sie ändert weder Mengen noch Geometrie noch die Montagereihenfolge der Baugruppen und ist jeder Muss-Regel nachgeordnet.</w:t>
+      </w:r>
+    </w:p>
+    <w:p>
+      <w:pPr>
+        <w:pStyle w:val="ListParagraph"/>
+        <w:numPr>
+          <w:ilvl w:val="0"/>
+          <w:numId w:val="2"/>
+        </w:numPr>
+        <w:spacing w:after="60"/>
+      </w:pPr>
+      <w:r>
+        <w:rPr>
+          <w:b/>
+          <w:bCs/>
+        </w:rPr>
+        <w:t xml:space="preserve">[A-10]</w:t>
+      </w:r>
+      <w:r>
+        <w:t xml:space="preserve"> Das Bodenblech einer Wand wird </w:t>
+      </w:r>
+      <w:r>
+        <w:rPr>
+          <w:b/>
+          <w:bCs/>
+        </w:rPr>
+        <w:t xml:space="preserve">deterministisch in reale Blechteile zerlegt</w:t>
+      </w:r>
+      <w:r>
+        <w:t xml:space="preserve">: Teil-Rastermaße sind </w:t>
+      </w:r>
+      <w:r>
+        <w:rPr>
+          <w:b/>
+          <w:bCs/>
+        </w:rPr>
+        <w:t xml:space="preserve">Vielfache von 125 mm zwischen 375 und 1250 mm</w:t>
+      </w:r>
+      <w:r>
+        <w:t xml:space="preserve"> aus dem übergebenen </w:t>
+      </w:r>
+      <w:r>
+        <w:rPr>
+          <w:b/>
+          <w:bCs/>
+        </w:rPr>
+        <w:t xml:space="preserve">Vorratssatz</w:t>
+      </w:r>
+      <w:r>
+        <w:t xml:space="preserve"> der Standardlängen, und die </w:t>
+      </w:r>
+      <w:r>
+        <w:rPr>
+          <w:b/>
+          <w:bCs/>
+        </w:rPr>
+        <w:t xml:space="preserve">Summe der Rastermaße ist exakt die Wandlänge</w:t>
+      </w:r>
+      <w:r>
+        <w:t xml:space="preserve">. Der </w:t>
+      </w:r>
+      <w:r>
+        <w:rPr>
+          <w:b/>
+          <w:bCs/>
+        </w:rPr>
+        <w:t xml:space="preserve">Sonderzuschnitt ist die Ausnahme, keine Abkürzung:</w:t>
+      </w:r>
+      <w:r>
+        <w:t xml:space="preserve"> existiert </w:t>
+      </w:r>
+      <w:r>
+        <w:rPr>
+          <w:b/>
+          <w:bCs/>
+        </w:rPr>
+        <w:t xml:space="preserve">irgendeine</w:t>
+      </w:r>
+      <w:r>
+        <w:t xml:space="preserve"> exakte Kombination aus Standardlängen, entsteht </w:t>
+      </w:r>
+      <w:r>
+        <w:rPr>
+          <w:b/>
+          <w:bCs/>
+        </w:rPr>
+        <w:t xml:space="preserve">kein</w:t>
+      </w:r>
+      <w:r>
+        <w:t xml:space="preserve"> Sonderzuschnitt – auch dann nicht, wenn ein früher betrachteter Weg mit größeren Teilen einen Rest übrig ließe. Unter den </w:t>
+      </w:r>
+      <w:r>
+        <w:rPr>
+          <w:b/>
+          <w:bCs/>
+        </w:rPr>
+        <w:t xml:space="preserve">regelkonformen exakten</w:t>
+      </w:r>
+      <w:r>
+        <w:t xml:space="preserve"> Kombinationen gilt die Ordnung: zuerst die </w:t>
+      </w:r>
+      <w:r>
+        <w:rPr>
+          <w:b/>
+          <w:bCs/>
+        </w:rPr>
+        <w:t xml:space="preserve">geringste Teilezahl</w:t>
+      </w:r>
+      <w:r>
+        <w:t xml:space="preserve">, danach deterministisch die </w:t>
+      </w:r>
+      <w:r>
+        <w:rPr>
+          <w:b/>
+          <w:bCs/>
+        </w:rPr>
+        <w:t xml:space="preserve">größten Teile</w:t>
+      </w:r>
+      <w:r>
+        <w:t xml:space="preserve"> (größte Standardlänge zuerst, analog </w:t>
+      </w:r>
+      <w:r>
+        <w:rPr>
+          <w:b/>
+          <w:bCs/>
+        </w:rPr>
+        <w:t xml:space="preserve">[Z-2]</w:t>
+      </w:r>
+      <w:r>
+        <w:t xml:space="preserve">) – zusammen ist das „möglichst wenige und möglichst große Teile“. Erst wenn </w:t>
+      </w:r>
+      <w:r>
+        <w:rPr>
+          <w:b/>
+          <w:bCs/>
+        </w:rPr>
+        <w:t xml:space="preserve">keine</w:t>
+      </w:r>
+      <w:r>
+        <w:t xml:space="preserve"> exakte Kombination die Wandlänge deckt, entsteht </w:t>
+      </w:r>
+      <w:r>
+        <w:rPr>
+          <w:b/>
+          <w:bCs/>
+        </w:rPr>
+        <w:t xml:space="preserve">genau ein</w:t>
+      </w:r>
+      <w:r>
+        <w:t xml:space="preserve"> ausdrücklich </w:t>
+      </w:r>
+      <w:r>
+        <w:rPr>
+          <w:b/>
+          <w:bCs/>
+        </w:rPr>
+        <w:t xml:space="preserve">gekennzeichneter Sonderzuschnitt</w:t>
+      </w:r>
+      <w:r>
+        <w:t xml:space="preserve"> mit seinem Fertigmaß am Ende, und zwar für den Rest, in den keine Standardlänge mehr passt; auch dieser Weg folgt der Größenpräferenz und bleibt deterministisch – nie stilles Aufrunden, nie ein stiller Fehler und nie eine erfundene Länge. Fehlt der Vorratssatz ganz, gilt der deterministische Fallback mit der vollen Standardreihe 375…1250 mm; ist er ausdrücklich leer, wird keine Standardlänge erfunden und der Zustand gemeldet. Priorität: Mengen-/Baubarkeitsregel der Stufe 2 – sie ändert keine Geometrie und ist </w:t>
+      </w:r>
+      <w:r>
+        <w:rPr>
+          <w:b/>
+          <w:bCs/>
+        </w:rPr>
+        <w:t xml:space="preserve">[A-11]</w:t>
+      </w:r>
+      <w:r>
+        <w:t xml:space="preserve"> nachgeordnet.</w:t>
+      </w:r>
+    </w:p>
+    <w:p>
+      <w:pPr>
+        <w:pStyle w:val="ListParagraph"/>
+        <w:numPr>
+          <w:ilvl w:val="0"/>
+          <w:numId w:val="2"/>
+        </w:numPr>
+        <w:spacing w:after="60"/>
+      </w:pPr>
+      <w:r>
+        <w:rPr>
+          <w:b/>
+          <w:bCs/>
+        </w:rPr>
+        <w:t xml:space="preserve">[A-11]</w:t>
+      </w:r>
+      <w:r>
+        <w:t xml:space="preserve"> </w:t>
+      </w:r>
+      <w:r>
+        <w:rPr>
+          <w:b/>
+          <w:bCs/>
+        </w:rPr>
+        <w:t xml:space="preserve">Kein Blechstoß des Bodenblechs liegt auf einem Steinstoß der untersten Lage.</w:t>
+      </w:r>
+      <w:r>
+        <w:t xml:space="preserve"> Das ist ein </w:t>
+      </w:r>
+      <w:r>
+        <w:rPr>
+          <w:b/>
+          <w:bCs/>
+        </w:rPr>
+        <w:t xml:space="preserve">Muss</w:t>
+      </w:r>
+      <w:r>
+        <w:t xml:space="preserve"> und steht </w:t>
+      </w:r>
+      <w:r>
+        <w:rPr>
+          <w:b/>
+          <w:bCs/>
+        </w:rPr>
+        <w:t xml:space="preserve">über</w:t>
+      </w:r>
+      <w:r>
+        <w:t xml:space="preserve"> der Optimierung aus </w:t>
+      </w:r>
+      <w:r>
+        <w:rPr>
+          <w:b/>
+          <w:bCs/>
+        </w:rPr>
+        <w:t xml:space="preserve">[A-10]</w:t>
+      </w:r>
+      <w:r>
+        <w:t xml:space="preserve">: optimiert wird zuerst </w:t>
+      </w:r>
+      <w:r>
+        <w:rPr>
+          <w:b/>
+          <w:bCs/>
+        </w:rPr>
+        <w:t xml:space="preserve">unter den stoßfreien exakten</w:t>
+      </w:r>
+      <w:r>
+        <w:t xml:space="preserve"> Kombinationen – die beste stoßfreie schlägt also eine kürzere, die einen Stoß verletzen würde. Existieren exakte, aber </w:t>
+      </w:r>
+      <w:r>
+        <w:rPr>
+          <w:b/>
+          <w:bCs/>
+        </w:rPr>
+        <w:t xml:space="preserve">keine</w:t>
+      </w:r>
+      <w:r>
+        <w:t xml:space="preserve"> stoßfreie Kombination, wird die nach </w:t>
+      </w:r>
+      <w:r>
+        <w:rPr>
+          <w:b/>
+          <w:bCs/>
+        </w:rPr>
+        <w:t xml:space="preserve">[A-10]</w:t>
+      </w:r>
+      <w:r>
+        <w:t xml:space="preserve"> beste </w:t>
+      </w:r>
+      <w:r>
+        <w:rPr>
+          <w:b/>
+          <w:bCs/>
+        </w:rPr>
+        <w:t xml:space="preserve">exakte</w:t>
+      </w:r>
+      <w:r>
+        <w:t xml:space="preserve"> genommen und </w:t>
+      </w:r>
+      <w:r>
+        <w:rPr>
+          <w:b/>
+          <w:bCs/>
+        </w:rPr>
+        <w:t xml:space="preserve">jeder</w:t>
+      </w:r>
+      <w:r>
+        <w:t xml:space="preserve"> verletzte Stoß in der Validierung </w:t>
+      </w:r>
+      <w:r>
+        <w:rPr>
+          <w:b/>
+          <w:bCs/>
+        </w:rPr>
+        <w:t xml:space="preserve">benannt</w:t>
+      </w:r>
+      <w:r>
+        <w:t xml:space="preserve"> (validation.blech_konflikte, Muster </w:t>
+      </w:r>
+      <w:r>
+        <w:rPr>
+          <w:b/>
+          <w:bCs/>
+        </w:rPr>
+        <w:t xml:space="preserve">[Z-5]</w:t>
+      </w:r>
+      <w:r>
+        <w:t xml:space="preserve">) – </w:t>
+      </w:r>
+      <w:r>
+        <w:rPr>
+          <w:b/>
+          <w:bCs/>
+        </w:rPr>
+        <w:t xml:space="preserve">kein Baubarkeitsausschluss</w:t>
+      </w:r>
+      <w:r>
+        <w:t xml:space="preserve">, aber </w:t>
+      </w:r>
+      <w:r>
+        <w:rPr>
+          <w:b/>
+          <w:bCs/>
+        </w:rPr>
+        <w:t xml:space="preserve">nie</w:t>
+      </w:r>
+      <w:r>
+        <w:t xml:space="preserve"> eine stille Verletzung. Ein Sonderzuschnitt wird </w:t>
+      </w:r>
+      <w:r>
+        <w:rPr>
+          <w:b/>
+          <w:bCs/>
+        </w:rPr>
+        <w:t xml:space="preserve">nie</w:t>
+      </w:r>
+      <w:r>
+        <w:t xml:space="preserve"> benutzt, um einem Stoß auszuweichen; auch der Sonderweg nach </w:t>
+      </w:r>
+      <w:r>
+        <w:rPr>
+          <w:b/>
+          <w:bCs/>
+        </w:rPr>
+        <w:t xml:space="preserve">[A-10]</w:t>
+      </w:r>
+      <w:r>
+        <w:t xml:space="preserve"> weicht zuerst stoßfrei aus und meldet, was übrig bleibt.</w:t>
+      </w:r>
+    </w:p>
+    <w:p>
+      <w:pPr>
+        <w:pStyle w:val="ListParagraph"/>
+        <w:numPr>
+          <w:ilvl w:val="0"/>
+          <w:numId w:val="2"/>
+        </w:numPr>
+        <w:spacing w:after="60"/>
+      </w:pPr>
+      <w:r>
+        <w:rPr>
+          <w:b/>
+          <w:bCs/>
+        </w:rPr>
+        <w:t xml:space="preserve">[A-12]</w:t>
+      </w:r>
+      <w:r>
+        <w:t xml:space="preserve"> Jedes Bodenblechteil führt </w:t>
+      </w:r>
+      <w:r>
+        <w:rPr>
+          <w:b/>
+          <w:bCs/>
+        </w:rPr>
+        <w:t xml:space="preserve">zwei</w:t>
+      </w:r>
+      <w:r>
+        <w:t xml:space="preserve"> Maße: das </w:t>
+      </w:r>
+      <w:r>
+        <w:rPr>
+          <w:b/>
+          <w:bCs/>
+        </w:rPr>
+        <w:t xml:space="preserve">Rastermaß</w:t>
+      </w:r>
+      <w:r>
+        <w:t xml:space="preserve"> (Vielfaches von 125 mm, die belegte Wandstrecke) und das </w:t>
+      </w:r>
+      <w:r>
+        <w:rPr>
+          <w:b/>
+          <w:bCs/>
+        </w:rPr>
+        <w:t xml:space="preserve">Bauteilmaß</w:t>
+      </w:r>
+      <w:r>
+        <w:t xml:space="preserve"> = Rastermaß </w:t>
+      </w:r>
+      <w:r>
+        <w:rPr>
+          <w:b/>
+          <w:bCs/>
+        </w:rPr>
+        <w:t xml:space="preserve">− 2 mm</w:t>
+      </w:r>
+      <w:r>
+        <w:t xml:space="preserve"> (das real zu fertigende Blech; die 2 mm sind Einbauspiel). In der Stückliste trägt die Position </w:t>
+      </w:r>
+      <w:r>
+        <w:rPr>
+          <w:b/>
+          <w:bCs/>
+        </w:rPr>
+        <w:t xml:space="preserve">mass_mm = Rastermaß</w:t>
+      </w:r>
+      <w:r>
+        <w:t xml:space="preserve">, damit die Preisauflösung nach </w:t>
+      </w:r>
+      <w:r>
+        <w:rPr>
+          <w:b/>
+          <w:bCs/>
+        </w:rPr>
+        <w:t xml:space="preserve">[P-14]</w:t>
+      </w:r>
+      <w:r>
+        <w:t xml:space="preserve"> gegen das Katalogprodukt der Standardlänge eingrenzt; das </w:t>
+      </w:r>
+      <w:r>
+        <w:rPr>
+          <w:b/>
+          <w:bCs/>
+        </w:rPr>
+        <w:t xml:space="preserve">Bauteilmaß</w:t>
+      </w:r>
+      <w:r>
+        <w:t xml:space="preserve"> ist als eigene Angabe ausgewiesen (fertigmass_mm) und macht die Positionskennung nach </w:t>
+      </w:r>
+      <w:r>
+        <w:rPr>
+          <w:b/>
+          <w:bCs/>
+        </w:rPr>
+        <w:t xml:space="preserve">[P-20]</w:t>
+      </w:r>
+      <w:r>
+        <w:t xml:space="preserve"> je Länge eindeutig. Das 2-mm-Spiel wird </w:t>
+      </w:r>
+      <w:r>
+        <w:rPr>
+          <w:b/>
+          <w:bCs/>
+        </w:rPr>
+        <w:t xml:space="preserve">nicht</w:t>
+      </w:r>
+      <w:r>
+        <w:t xml:space="preserve"> maßstabsgetreu dargestellt. Priorität: Ausweisungsregel – sie ändert keine Menge.</w:t>
+      </w:r>
+    </w:p>
+    <w:p>
+      <w:pPr>
+        <w:pStyle w:val="ListParagraph"/>
+        <w:numPr>
+          <w:ilvl w:val="0"/>
+          <w:numId w:val="2"/>
+        </w:numPr>
+        <w:spacing w:after="60"/>
+      </w:pPr>
+      <w:r>
+        <w:rPr>
+          <w:b/>
+          <w:bCs/>
+        </w:rPr>
+        <w:t xml:space="preserve">[A-13 · ZIEL – OFFEN]</w:t>
+      </w:r>
+      <w:r>
+        <w:t xml:space="preserve"> Das </w:t>
+      </w:r>
+      <w:r>
+        <w:rPr>
+          <w:b/>
+          <w:bCs/>
+        </w:rPr>
+        <w:t xml:space="preserve">Kopfblech</w:t>
+      </w:r>
+      <w:r>
+        <w:t xml:space="preserve"> ist analog </w:t>
+      </w:r>
+      <w:r>
+        <w:rPr>
+          <w:b/>
+          <w:bCs/>
+        </w:rPr>
+        <w:t xml:space="preserve">[A-10]</w:t>
+      </w:r>
+      <w:r>
+        <w:t xml:space="preserve">…</w:t>
+      </w:r>
+      <w:r>
+        <w:rPr>
+          <w:b/>
+          <w:bCs/>
+        </w:rPr>
+        <w:t xml:space="preserve">[A-12]</w:t>
+      </w:r>
+      <w:r>
+        <w:t xml:space="preserve"> in reale Teile zu zerlegen. Derzeit ist es </w:t>
+      </w:r>
+      <w:r>
+        <w:rPr>
+          <w:b/>
+          <w:bCs/>
+        </w:rPr>
+        <w:t xml:space="preserve">unverändert eine Modulzählung</w:t>
+      </w:r>
+      <w:r>
+        <w:t xml:space="preserve"> aus der Blechlänge; die Regel ist als Folgeregel vermerkt und </w:t>
+      </w:r>
+      <w:r>
+        <w:rPr>
+          <w:b/>
+          <w:bCs/>
+        </w:rPr>
+        <w:t xml:space="preserve">nicht</w:t>
+      </w:r>
+      <w:r>
+        <w:t xml:space="preserve"> implementiert.</w:t>
       </w:r>
     </w:p>
     <w:p>

</xml_diff>

<commit_message>
Spannplatte als Standardanschluss setzen (#92)
</commit_message>
<xml_diff>
--- a/doku/SEMBLA_Handbuch.docx
+++ b/doku/SEMBLA_Handbuch.docx
@@ -11945,7 +11945,47 @@
         <w:t xml:space="preserve">[A-2]</w:t>
       </w:r>
       <w:r>
-        <w:t xml:space="preserve"> Oberer Anschluss: Kopfblech oder Spannplatte je Strang; der aktuelle Datenstand prestress.top_connection gilt global für die Wand.</w:t>
+        <w:t xml:space="preserve"> Oberer Anschluss: Kopfblech oder Spannplatte je Strang; der aktuelle Datenstand prestress.top_connection gilt global für die Wand. </w:t>
+      </w:r>
+      <w:r>
+        <w:rPr>
+          <w:b/>
+          <w:bCs/>
+        </w:rPr>
+        <w:t xml:space="preserve">Standard ist die Spannplatte:</w:t>
+      </w:r>
+      <w:r>
+        <w:t xml:space="preserve"> eine neu angelegte Wand schließt ohne weitere Bedienung mit Spannplatten ab – fehlt die Angabe oder ist sie unbekannt, gilt spannplatte. Das </w:t>
+      </w:r>
+      <w:r>
+        <w:rPr>
+          <w:b/>
+          <w:bCs/>
+        </w:rPr>
+        <w:t xml:space="preserve">Kopfblech bleibt eine gleichwertig wählbare Option</w:t>
+      </w:r>
+      <w:r>
+        <w:t xml:space="preserve"> (Modul 1); es muss dafür aber </w:t>
+      </w:r>
+      <w:r>
+        <w:rPr>
+          <w:b/>
+          <w:bCs/>
+        </w:rPr>
+        <w:t xml:space="preserve">ausdrücklich</w:t>
+      </w:r>
+      <w:r>
+        <w:t xml:space="preserve"> gewählt sein. Eine bereits gespeicherte Wahl wird </w:t>
+      </w:r>
+      <w:r>
+        <w:rPr>
+          <w:b/>
+          <w:bCs/>
+        </w:rPr>
+        <w:t xml:space="preserve">nie</w:t>
+      </w:r>
+      <w:r>
+        <w:t xml:space="preserve"> umgeschrieben – ein Bestand mit prestress.top_connection = blech behält das Kopfblech auch bei jedem Neuaufbau.</w:t>
       </w:r>
     </w:p>
     <w:p>

</xml_diff>

<commit_message>
Benenne die Fußschraube durchgehend als Sechskantschraube (#92)
Am Wandfuß wird real eine Sechskantschraube von unten durch das Bodenblech
gesteckt. Katalogrolle, Standardkatalog-Vorlage, Stücklistenposition,
Montagetext und Handbuch (Kapitel 2.5 und Regel [A-1]) nennen jetzt dieses
Bauteil statt der nicht mehr verbauten Senkkopfschraube.

Geändert ist ausschließlich Anzeigetext. Die Rollenkennung `senkkopf`, der
Stücklistenschlüssel `senkkopf`, die Rechenkernfelder `senkkopfschrauben`
und `kopplungsmuttern_basis` sowie die Produkt-ID
`verbrauch-senkkopfschraube-fuss` bleiben unverändert — bestehende Kataloge
und Projekte bleiben damit gültig, ohne Migration und ohne Formatversions-
sprung. Mengen, Einbaustellen und Preisauflösung sind unberührt; Core,
Python-Orakel und goldene Fixtures sind nicht angefasst.

Änderungsliste: chg-20260907-02

Co-Authored-By: Claude Opus 5 <noreply@anthropic.com>
Claude-Session: https://claude.ai/code/session_01PhcsKbZShTowzM2X5hx12U
</commit_message>
<xml_diff>
--- a/doku/SEMBLA_Handbuch.docx
+++ b/doku/SEMBLA_Handbuch.docx
@@ -1693,7 +1693,7 @@
           <w:b/>
           <w:bCs/>
         </w:rPr>
-        <w:t xml:space="preserve">Senkkopfschraube</w:t>
+        <w:t xml:space="preserve">Sechskantschraube</w:t>
       </w:r>
       <w:r>
         <w:t xml:space="preserve">, oben eine </w:t>
@@ -11685,7 +11685,7 @@
         <w:t xml:space="preserve">[A-1]</w:t>
       </w:r>
       <w:r>
-        <w:t xml:space="preserve"> Fuß immer Bodenblech (Stahl 15 mm, wandbreit); je Strang unten Senkkopfschraube, oben Kopplungsmutter. Bodenblech und Kopfblech sind </w:t>
+        <w:t xml:space="preserve"> Fuß immer Bodenblech (Stahl 15 mm, wandbreit); je Strang unten Sechskantschraube, oben Kopplungsmutter. Bodenblech und Kopfblech sind </w:t>
       </w:r>
       <w:r>
         <w:rPr>

</xml_diff>

<commit_message>
Setze mehrere ausgewählte Wände in einem Popup gemeinsam auf neun allgemeine Wandmerkmale (#111)
Der Sammel-Editor des Geschosseditors liegt hinter genau einer Schaltfläche
„Gemeinsam bearbeiten…" und bearbeitet dort neben Wandhöhe und Windsituation auch
Brandschutzklasse, Stoßfugen-Abdichtung, Funktion der Vorder- und Rückseite, oberen
Anschluss, Kopfblech-Modullänge und Überstand des Reststücks. Gemischte Ausgangswerte
stehen als „gemischt"; nur angekreuzte Merkmale wirken, die Bestätigung nennt Wandzahl
und Zielwerte, und die Übernahme läuft je Wand über den bestehenden kanonischen
Rechen- und Schreibpfad als genau ein Rückgängig-Schritt mit vollständigem Rollback.
Unzulässige Höhe, Modullänge und Überstand werden benannt abgewiesen statt geklemmt.

Co-Authored-By: Claude Opus 5 <noreply@anthropic.com>
Claude-Session: https://claude.ai/code/session_017UjQVNW9s2fRhAPygKkquC
</commit_message>
<xml_diff>
--- a/doku/SEMBLA_Handbuch.docx
+++ b/doku/SEMBLA_Handbuch.docx
@@ -1986,7 +1986,7 @@
         <w:spacing w:after="120"/>
       </w:pPr>
       <w:r>
-        <w:t xml:space="preserve">Ob abgedichtet wird, ist eine Entscheidung JE WAND: es gibt abgedichtete und nicht abgedichtete Wände. Das Merkmal (wandelement.abdichtung) gehört an das Wandelement und wird in Modul 1 gewählt („abgedichtet“ oder „nicht abgedichtet“); der Geschosseditor führt es beim Neuaufbau unverändert mit. Der Standard ist „nicht abgedichtet“ – auch für jede Wand ohne ausdrückliche Angabe. Vererbt wird nichts: weder Geschoss noch Projekt geben die Abdichtung vor, und ein bestehender Stand wird nie still auf „abgedichtet“ gesetzt. Die gezählten Mengen des Rechenkerns (bom.stossfugen, bom.dichtstreifen_mm) bleiben davon unberührt; die Abdichtung entscheidet allein, ob die Stückliste Dichtstreifen führt, siehe [A-6].</w:t>
+        <w:t xml:space="preserve">Ob abgedichtet wird, ist eine Entscheidung JE WAND: es gibt abgedichtete und nicht abgedichtete Wände. Das Merkmal (wandelement.abdichtung) gehört an das Wandelement und wird in Modul 1 gewählt („abgedichtet“ oder „nicht abgedichtet“) – seit Issue #111 zusätzlich für mehrere ausgewählte Wände gemeinsam im Sammel-Editor des Geschosseditors; das ist ein zweiter Bedienort, keine zweite Quelle: beide Wege schreiben denselben Wert an dasselbe Wandelement über denselben Neuberechnungspfad. Im Übrigen führt der Geschosseditor das Merkmal beim Neuaufbau unverändert mit. Der Standard ist „nicht abgedichtet“ – auch für jede Wand ohne ausdrückliche Angabe. Vererbt wird nichts: weder Geschoss noch Projekt geben die Abdichtung vor, und ein bestehender Stand wird nie still auf „abgedichtet“ gesetzt. Die gezählten Mengen des Rechenkerns (bom.stossfugen, bom.dichtstreifen_mm) bleiben davon unberührt; die Abdichtung entscheidet allein, ob die Stückliste Dichtstreifen führt, siehe [A-6].</w:t>
       </w:r>
     </w:p>
     <w:p>
@@ -2827,7 +2827,7 @@
                 <w:sz w:val="20"/>
                 <w:szCs w:val="20"/>
               </w:rPr>
-              <w:t xml:space="preserve">F0 | F30; Planungskennzeichnung, wird ausschließlich in Modul 1 gewählt; fehlt sie, gilt F0</w:t>
+              <w:t xml:space="preserve">F0 | F30; Planungskennzeichnung, gewählt in Modul 1 oder im Sammel-Editor des Geschosseditors; fehlt sie, gilt F0</w:t>
             </w:r>
           </w:p>
         </w:tc>
@@ -8719,17 +8719,27 @@
         <w:t xml:space="preserve">F30</w:t>
       </w:r>
       <w:r>
-        <w:t xml:space="preserve">; gewählt wird sie hier und </w:t>
-      </w:r>
-      <w:r>
-        <w:rPr>
-          <w:b/>
-          <w:bCs/>
-        </w:rPr>
-        <w:t xml:space="preserve">nur</w:t>
-      </w:r>
-      <w:r>
-        <w:t xml:space="preserve"> hier, der Geschosseditor führt sie beim Neuaufbau unverändert mit. Sie ist eine reine </w:t>
+        <w:t xml:space="preserve">; gewählt wird sie hier – und seit Issue #111 zusätzlich für mehrere ausgewählte Wände gemeinsam im </w:t>
+      </w:r>
+      <w:r>
+        <w:rPr>
+          <w:b/>
+          <w:bCs/>
+        </w:rPr>
+        <w:t xml:space="preserve">Sammel-Editor des Geschosseditors</w:t>
+      </w:r>
+      <w:r>
+        <w:t xml:space="preserve">, einem zweiten </w:t>
+      </w:r>
+      <w:r>
+        <w:rPr>
+          <w:b/>
+          <w:bCs/>
+        </w:rPr>
+        <w:t xml:space="preserve">Bedienort</w:t>
+      </w:r>
+      <w:r>
+        <w:t xml:space="preserve"> ohne zweite Quelle und ohne zweiten Schreibweg. Wo der Geschosseditor sie nicht ausdrücklich setzt, führt er sie beim Neuaufbau unverändert mit. Sie ist eine reine </w:t>
       </w:r>
       <w:r>
         <w:rPr>
@@ -17384,17 +17394,57 @@
         <w:t xml:space="preserve">nicht</w:t>
       </w:r>
       <w:r>
-        <w:t xml:space="preserve"> Teil des Rechenkerns. Gewählt wird sie </w:t>
-      </w:r>
-      <w:r>
-        <w:rPr>
-          <w:b/>
-          <w:bCs/>
-        </w:rPr>
-        <w:t xml:space="preserve">ausschließlich in Modul 1</w:t>
-      </w:r>
-      <w:r>
-        <w:t xml:space="preserve"> (ein Schreibweg, </w:t>
+        <w:t xml:space="preserve"> Teil des Rechenkerns. Gewählt wird sie in </w:t>
+      </w:r>
+      <w:r>
+        <w:rPr>
+          <w:b/>
+          <w:bCs/>
+        </w:rPr>
+        <w:t xml:space="preserve">Modul 1</w:t>
+      </w:r>
+      <w:r>
+        <w:t xml:space="preserve"> und – seit Issue #111 – für mehrere ausgewählte Wände gemeinsam im </w:t>
+      </w:r>
+      <w:r>
+        <w:rPr>
+          <w:b/>
+          <w:bCs/>
+        </w:rPr>
+        <w:t xml:space="preserve">Sammel-Editor des Geschosseditors</w:t>
+      </w:r>
+      <w:r>
+        <w:t xml:space="preserve">. Das sind zwei </w:t>
+      </w:r>
+      <w:r>
+        <w:rPr>
+          <w:b/>
+          <w:bCs/>
+        </w:rPr>
+        <w:t xml:space="preserve">Bedienorte</w:t>
+      </w:r>
+      <w:r>
+        <w:t xml:space="preserve">, aber </w:t>
+      </w:r>
+      <w:r>
+        <w:rPr>
+          <w:b/>
+          <w:bCs/>
+        </w:rPr>
+        <w:t xml:space="preserve">eine</w:t>
+      </w:r>
+      <w:r>
+        <w:t xml:space="preserve"> Quelle und </w:t>
+      </w:r>
+      <w:r>
+        <w:rPr>
+          <w:b/>
+          <w:bCs/>
+        </w:rPr>
+        <w:t xml:space="preserve">ein</w:t>
+      </w:r>
+      <w:r>
+        <w:t xml:space="preserve"> Schreibweg (</w:t>
       </w:r>
       <w:r>
         <w:rPr>
@@ -17404,17 +17454,17 @@
         <w:t xml:space="preserve">[P-1]</w:t>
       </w:r>
       <w:r>
-        <w:t xml:space="preserve">); der Geschosseditor </w:t>
-      </w:r>
-      <w:r>
-        <w:rPr>
-          <w:b/>
-          <w:bCs/>
-        </w:rPr>
-        <w:t xml:space="preserve">führt sie beim Neuaufbau unverändert mit</w:t>
-      </w:r>
-      <w:r>
-        <w:t xml:space="preserve">, ohne sie zu wählen. Der Standard ist der zurückhaltende Fall: fehlt das Feld – neu angelegte Wand, Altbestand, importierte Datei ohne das Feld –, gilt beim Lesen </w:t>
+        <w:t xml:space="preserve">): beide setzen denselben Wert am selben Wandelement, und zwar über denselben kanonischen Neuberechnungspfad. Wo der Geschosseditor sie nicht ausdrücklich setzt, </w:t>
+      </w:r>
+      <w:r>
+        <w:rPr>
+          <w:b/>
+          <w:bCs/>
+        </w:rPr>
+        <w:t xml:space="preserve">führt er sie beim Neuaufbau unverändert mit</w:t>
+      </w:r>
+      <w:r>
+        <w:t xml:space="preserve">. Der Standard ist der zurückhaltende Fall: fehlt das Feld – neu angelegte Wand, Altbestand, importierte Datei ohne das Feld –, gilt beim Lesen </w:t>
       </w:r>
       <w:r>
         <w:rPr>

</xml_diff>